<commit_message>
feat(welcome-day): add official documents and visual guides to applicant dashboard
</commit_message>
<xml_diff>
--- a/04-Surat Pemberitahuan Kedatangan Santri Baru 2026-2027-REVISED.docx
+++ b/04-Surat Pemberitahuan Kedatangan Santri Baru 2026-2027-REVISED.docx
@@ -76,71 +76,7 @@
           <w:sz w:val="24"/>
           <w:szCs w:val="24"/>
         </w:rPr>
-        <w:t>0</w:t>
-      </w:r>
-      <w:r>
-        <w:rPr>
-          <w:rFonts w:ascii="Times New Roman" w:hAnsi="Times New Roman" w:cs="Times New Roman"/>
-          <w:sz w:val="24"/>
-          <w:szCs w:val="24"/>
-        </w:rPr>
-        <w:t>4</w:t>
-      </w:r>
-      <w:r>
-        <w:rPr>
-          <w:rFonts w:ascii="Times New Roman" w:hAnsi="Times New Roman" w:cs="Times New Roman"/>
-          <w:sz w:val="24"/>
-          <w:szCs w:val="24"/>
-        </w:rPr>
-        <w:t>/</w:t>
-      </w:r>
-      <w:r>
-        <w:rPr>
-          <w:rFonts w:ascii="Times New Roman" w:hAnsi="Times New Roman" w:cs="Times New Roman"/>
-          <w:sz w:val="24"/>
-          <w:szCs w:val="24"/>
-        </w:rPr>
-        <w:t>TU/</w:t>
-      </w:r>
-      <w:r>
-        <w:rPr>
-          <w:rFonts w:ascii="Times New Roman" w:hAnsi="Times New Roman" w:cs="Times New Roman"/>
-          <w:sz w:val="24"/>
-          <w:szCs w:val="24"/>
-        </w:rPr>
-        <w:t>PP-</w:t>
-      </w:r>
-      <w:r>
-        <w:rPr>
-          <w:rFonts w:ascii="Times New Roman" w:hAnsi="Times New Roman" w:cs="Times New Roman"/>
-          <w:sz w:val="24"/>
-          <w:szCs w:val="24"/>
-        </w:rPr>
-        <w:t>AI</w:t>
-      </w:r>
-      <w:r>
-        <w:rPr>
-          <w:rFonts w:ascii="Times New Roman" w:hAnsi="Times New Roman" w:cs="Times New Roman"/>
-          <w:sz w:val="24"/>
-          <w:szCs w:val="24"/>
-        </w:rPr>
-        <w:t>/V</w:t>
-      </w:r>
-      <w:r>
-        <w:rPr>
-          <w:rFonts w:ascii="Times New Roman" w:hAnsi="Times New Roman" w:cs="Times New Roman"/>
-          <w:sz w:val="24"/>
-          <w:szCs w:val="24"/>
-        </w:rPr>
-        <w:t>I</w:t>
-      </w:r>
-      <w:r>
-        <w:rPr>
-          <w:rFonts w:ascii="Times New Roman" w:hAnsi="Times New Roman" w:cs="Times New Roman"/>
-          <w:sz w:val="24"/>
-          <w:szCs w:val="24"/>
-        </w:rPr>
-        <w:t>/2026</w:t>
+        <w:t>001/PMB/TU/PP-AI/VI/2026</w:t>
       </w:r>
     </w:p>
     <w:p>
@@ -194,8 +130,7 @@
           <w:szCs w:val="28"/>
           <w:rtl/>
         </w:rPr>
-        <w:t>بسم الله الرحمن الرحيم
-السلام عليكم ورحمة الله وبركاته</w:t>
+        <w:t>بسم الله الرحمن الرحيم السلام عليكم ورحمة الله وبركاته</w:t>
       </w:r>
     </w:p>
     <w:p>
@@ -895,13 +830,13 @@
                 <w:lang w:val="ar-SA"/>
               </w:rPr>
               <w:drawing>
-                <wp:anchor distT="0" distB="0" distL="114300" distR="114300" simplePos="1" relativeHeight="251662336" behindDoc="0" locked="0" layoutInCell="1" allowOverlap="1" wp14:anchorId="02544DF0" wp14:editId="719F953F">
-                  <wp:simplePos x="8796655" y="7712075"/>
+                <wp:anchor distT="0" distB="0" distL="114300" distR="114300" simplePos="0" relativeHeight="251662336" behindDoc="0" locked="0" layoutInCell="1" allowOverlap="1" wp14:anchorId="02544DF0" wp14:editId="719F953F">
+                  <wp:simplePos x="0" y="0"/>
                   <wp:positionH relativeFrom="margin">
-                    <wp:posOffset>3959860</wp:posOffset>
+                    <wp:posOffset>8728075</wp:posOffset>
                   </wp:positionH>
                   <wp:positionV relativeFrom="page">
-                    <wp:posOffset>-647700</wp:posOffset>
+                    <wp:posOffset>7712075</wp:posOffset>
                   </wp:positionV>
                   <wp:extent cx="1008000" cy="1008000"/>
                   <wp:effectExtent l="0" t="0" r="1905" b="1905"/>

</xml_diff>

<commit_message>
fix(welcome-day): remove legalisir requirement and update link in official docs
</commit_message>
<xml_diff>
--- a/04-Surat Pemberitahuan Kedatangan Santri Baru 2026-2027-REVISED.docx
+++ b/04-Surat Pemberitahuan Kedatangan Santri Baru 2026-2027-REVISED.docx
@@ -1226,27 +1226,27 @@
           <w:sz w:val="24"/>
           <w:szCs w:val="24"/>
         </w:rPr>
-        <w:t>4. Fotokopi rapor semester ganjil terakhir yang telah dilegalisir</w:t>
-      </w:r>
-    </w:p>
-    <w:p>
-      <w:pPr>
-        <w:spacing w:after="0" w:line="240" w:lineRule="auto"/>
-        <w:rPr>
-          <w:rFonts w:ascii="Times New Roman" w:hAnsi="Times New Roman" w:cs="Times New Roman"/>
-          <w:bCs/>
-          <w:sz w:val="24"/>
-          <w:szCs w:val="24"/>
-        </w:rPr>
-      </w:pPr>
-      <w:r>
-        <w:rPr>
-          <w:rFonts w:ascii="Times New Roman" w:hAnsi="Times New Roman" w:cs="Times New Roman"/>
-          <w:bCs/>
-          <w:sz w:val="24"/>
-          <w:szCs w:val="24"/>
-        </w:rPr>
-        <w:t>5. Fotokopi rapor semester genap terakhir yang telah dilegalisir</w:t>
+        <w:t>4. Fotokopi rapor semester ganjil terakhir</w:t>
+      </w:r>
+    </w:p>
+    <w:p>
+      <w:pPr>
+        <w:spacing w:after="0" w:line="240" w:lineRule="auto"/>
+        <w:rPr>
+          <w:rFonts w:ascii="Times New Roman" w:hAnsi="Times New Roman" w:cs="Times New Roman"/>
+          <w:bCs/>
+          <w:sz w:val="24"/>
+          <w:szCs w:val="24"/>
+        </w:rPr>
+      </w:pPr>
+      <w:r>
+        <w:rPr>
+          <w:rFonts w:ascii="Times New Roman" w:hAnsi="Times New Roman" w:cs="Times New Roman"/>
+          <w:bCs/>
+          <w:sz w:val="24"/>
+          <w:szCs w:val="24"/>
+        </w:rPr>
+        <w:t>5. Fotokopi rapor semester genap terakhir</w:t>
       </w:r>
     </w:p>
     <w:p>
@@ -1484,7 +1484,16 @@
           <w:sz w:val="24"/>
           <w:szCs w:val="24"/>
         </w:rPr>
-        <w:t>3. Konfirmasi kehadiran dengan mengisi link berikut: [LINK KONFIRMASI]</w:t>
+        <w:t xml:space="preserve">3. Konfirmasi kehadiran dengan mengisi link berikut: </w:t>
+      </w:r>
+      <w:r>
+        <w:rPr>
+          <w:rFonts w:ascii="Times New Roman" w:hAnsi="Times New Roman" w:cs="Times New Roman"/>
+          <w:bCs/>
+          <w:sz w:val="24"/>
+          <w:szCs w:val="24"/>
+        </w:rPr>
+        <w:t>Menu Welcome Day di Dashboard Pendaftar</w:t>
       </w:r>
     </w:p>
     <w:p>

</xml_diff>

<commit_message>
style: change all official documents font to Arial/Helvetica for better readability
</commit_message>
<xml_diff>
--- a/04-Surat Pemberitahuan Kedatangan Santri Baru 2026-2027-REVISED.docx
+++ b/04-Surat Pemberitahuan Kedatangan Santri Baru 2026-2027-REVISED.docx
@@ -8,7 +8,7 @@
         <w:jc w:val="center"/>
         <w:rPr>
           <w:rStyle w:val="Strong"/>
-          <w:rFonts w:ascii="Times New Roman" w:hAnsi="Times New Roman" w:cs="Times New Roman"/>
+          <w:rFonts w:ascii="Arial" w:hAnsi="Arial" w:cs="Arial"/>
           <w:sz w:val="26"/>
           <w:szCs w:val="26"/>
           <w:u w:val="single"/>
@@ -21,7 +21,7 @@
         <w:jc w:val="center"/>
         <w:rPr>
           <w:rStyle w:val="Strong"/>
-          <w:rFonts w:ascii="Times New Roman" w:hAnsi="Times New Roman" w:cs="Times New Roman"/>
+          <w:rFonts w:ascii="Arial" w:hAnsi="Arial" w:cs="Arial"/>
           <w:sz w:val="26"/>
           <w:szCs w:val="26"/>
           <w:u w:val="single"/>
@@ -34,7 +34,7 @@
         <w:jc w:val="center"/>
         <w:rPr>
           <w:rStyle w:val="Strong"/>
-          <w:rFonts w:ascii="Times New Roman" w:hAnsi="Times New Roman" w:cs="Times New Roman"/>
+          <w:rFonts w:ascii="Arial" w:hAnsi="Arial" w:cs="Arial"/>
           <w:sz w:val="26"/>
           <w:szCs w:val="26"/>
           <w:u w:val="single"/>
@@ -46,7 +46,7 @@
         <w:spacing w:after="0"/>
         <w:jc w:val="center"/>
         <w:rPr>
-          <w:rFonts w:ascii="Times New Roman" w:hAnsi="Times New Roman" w:cs="Times New Roman"/>
+          <w:rFonts w:ascii="Arial" w:hAnsi="Arial" w:cs="Arial"/>
           <w:sz w:val="24"/>
           <w:szCs w:val="24"/>
         </w:rPr>
@@ -54,7 +54,7 @@
       <w:r>
         <w:rPr>
           <w:rStyle w:val="Strong"/>
-          <w:rFonts w:ascii="Times New Roman" w:hAnsi="Times New Roman" w:cs="Times New Roman"/>
+          <w:rFonts w:ascii="Arial" w:hAnsi="Arial" w:cs="Arial"/>
           <w:sz w:val="26"/>
           <w:szCs w:val="26"/>
           <w:u w:val="single"/>
@@ -63,7 +63,7 @@
       </w:r>
       <w:r>
         <w:rPr>
-          <w:rFonts w:ascii="Times New Roman" w:hAnsi="Times New Roman" w:cs="Times New Roman"/>
+          <w:rFonts w:ascii="Arial" w:hAnsi="Arial" w:cs="Arial"/>
           <w:sz w:val="24"/>
           <w:szCs w:val="24"/>
         </w:rPr>
@@ -72,7 +72,7 @@
       </w:r>
       <w:r>
         <w:rPr>
-          <w:rFonts w:ascii="Times New Roman" w:hAnsi="Times New Roman" w:cs="Times New Roman"/>
+          <w:rFonts w:ascii="Arial" w:hAnsi="Arial" w:cs="Arial"/>
           <w:sz w:val="24"/>
           <w:szCs w:val="24"/>
         </w:rPr>
@@ -83,19 +83,27 @@
       <w:pPr>
         <w:pStyle w:val="NormalWeb"/>
         <w:jc w:val="center"/>
+        <w:rPr>
+          <w:rFonts w:ascii="Arial" w:hAnsi="Arial" w:cs="Arial"/>
+        </w:rPr>
       </w:pPr>
       <w:r>
         <w:rPr>
           <w:rStyle w:val="Strong"/>
+          <w:rFonts w:ascii="Arial" w:hAnsi="Arial" w:cs="Arial"/>
         </w:rPr>
         <w:t>Tentang :</w:t>
       </w:r>
       <w:r>
+        <w:rPr>
+          <w:rFonts w:ascii="Arial" w:hAnsi="Arial" w:cs="Arial"/>
+        </w:rPr>
         <w:br/>
       </w:r>
       <w:r>
         <w:rPr>
           <w:rStyle w:val="Strong"/>
+          <w:rFonts w:ascii="Arial" w:hAnsi="Arial" w:cs="Arial"/>
         </w:rPr>
         <w:t>KEDATANGAN SANTRI BARU DAN KEGIATAN WELCOME DAY</w:t>
       </w:r>
@@ -105,7 +113,7 @@
         <w:spacing w:after="0"/>
         <w:ind w:left="1701"/>
         <w:rPr>
-          <w:rFonts w:asciiTheme="majorBidi" w:hAnsiTheme="majorBidi" w:cstheme="majorBidi"/>
+          <w:rFonts w:ascii="Arial" w:hAnsi="Arial" w:cs="Arial"/>
           <w:sz w:val="16"/>
           <w:szCs w:val="16"/>
         </w:rPr>
@@ -117,7 +125,7 @@
         <w:spacing w:after="0"/>
         <w:jc w:val="center"/>
         <w:rPr>
-          <w:rFonts w:ascii="(A) Arslan Wessam A" w:hAnsi="(A) Arslan Wessam A" w:cs="(A) Arslan Wessam A"/>
+          <w:rFonts w:ascii="Arial" w:hAnsi="Arial" w:cs="Arial"/>
           <w:sz w:val="28"/>
           <w:szCs w:val="28"/>
           <w:rtl/>
@@ -125,7 +133,7 @@
       </w:pPr>
       <w:r>
         <w:rPr>
-          <w:rFonts w:ascii="(A) Arslan Wessam A" w:hAnsi="(A) Arslan Wessam A" w:cs="(A) Arslan Wessam A"/>
+          <w:rFonts w:ascii="Arial" w:hAnsi="Arial" w:cs="Arial"/>
           <w:sz w:val="28"/>
           <w:szCs w:val="28"/>
           <w:rtl/>
@@ -138,7 +146,7 @@
         <w:spacing w:after="0"/>
         <w:jc w:val="center"/>
         <w:rPr>
-          <w:rFonts w:asciiTheme="majorBidi" w:hAnsiTheme="majorBidi" w:cstheme="majorBidi"/>
+          <w:rFonts w:ascii="Arial" w:hAnsi="Arial" w:cs="Arial"/>
           <w:sz w:val="6"/>
           <w:szCs w:val="6"/>
           <w:rtl/>
@@ -151,14 +159,14 @@
         <w:ind w:left="709" w:right="850" w:firstLine="567"/>
         <w:jc w:val="both"/>
         <w:rPr>
-          <w:rFonts w:asciiTheme="majorBidi" w:hAnsiTheme="majorBidi" w:cstheme="majorBidi"/>
-          <w:sz w:val="24"/>
-          <w:szCs w:val="24"/>
-        </w:rPr>
-      </w:pPr>
-      <w:r>
-        <w:rPr>
-          <w:rFonts w:asciiTheme="majorBidi" w:hAnsiTheme="majorBidi" w:cstheme="majorBidi"/>
+          <w:rFonts w:ascii="Arial" w:hAnsi="Arial" w:cs="Arial"/>
+          <w:sz w:val="24"/>
+          <w:szCs w:val="24"/>
+        </w:rPr>
+      </w:pPr>
+      <w:r>
+        <w:rPr>
+          <w:rFonts w:ascii="Arial" w:hAnsi="Arial" w:cs="Arial"/>
           <w:sz w:val="24"/>
           <w:szCs w:val="24"/>
         </w:rPr>
@@ -166,7 +174,7 @@
       </w:r>
       <w:r>
         <w:rPr>
-          <w:rFonts w:asciiTheme="majorBidi" w:hAnsiTheme="majorBidi" w:cstheme="majorBidi"/>
+          <w:rFonts w:ascii="Arial" w:hAnsi="Arial" w:cs="Arial"/>
           <w:sz w:val="24"/>
           <w:szCs w:val="24"/>
         </w:rPr>
@@ -174,7 +182,7 @@
       </w:r>
       <w:r>
         <w:rPr>
-          <w:rFonts w:ascii="Times New Roman" w:hAnsi="Times New Roman" w:cs="Times New Roman"/>
+          <w:rFonts w:ascii="Arial" w:hAnsi="Arial" w:cs="Arial"/>
           <w:sz w:val="24"/>
           <w:szCs w:val="24"/>
           <w:rtl/>
@@ -183,7 +191,7 @@
       </w:r>
       <w:r>
         <w:rPr>
-          <w:rFonts w:asciiTheme="majorBidi" w:hAnsiTheme="majorBidi" w:cstheme="majorBidi"/>
+          <w:rFonts w:ascii="Arial" w:hAnsi="Arial" w:cs="Arial"/>
           <w:sz w:val="24"/>
           <w:szCs w:val="24"/>
         </w:rPr>
@@ -196,14 +204,14 @@
         <w:ind w:left="709" w:right="850" w:firstLine="567"/>
         <w:jc w:val="both"/>
         <w:rPr>
-          <w:rFonts w:asciiTheme="majorBidi" w:hAnsiTheme="majorBidi" w:cstheme="majorBidi"/>
-          <w:sz w:val="24"/>
-          <w:szCs w:val="24"/>
-        </w:rPr>
-      </w:pPr>
-      <w:r>
-        <w:rPr>
-          <w:rFonts w:asciiTheme="majorBidi" w:hAnsiTheme="majorBidi" w:cstheme="majorBidi"/>
+          <w:rFonts w:ascii="Arial" w:hAnsi="Arial" w:cs="Arial"/>
+          <w:sz w:val="24"/>
+          <w:szCs w:val="24"/>
+        </w:rPr>
+      </w:pPr>
+      <w:r>
+        <w:rPr>
+          <w:rFonts w:ascii="Arial" w:hAnsi="Arial" w:cs="Arial"/>
           <w:sz w:val="24"/>
           <w:szCs w:val="24"/>
         </w:rPr>
@@ -211,7 +219,7 @@
       </w:r>
       <w:r>
         <w:rPr>
-          <w:rFonts w:asciiTheme="majorBidi" w:hAnsiTheme="majorBidi" w:cstheme="majorBidi"/>
+          <w:rFonts w:ascii="Arial" w:hAnsi="Arial" w:cs="Arial"/>
           <w:sz w:val="24"/>
           <w:szCs w:val="24"/>
         </w:rPr>
@@ -219,7 +227,7 @@
       </w:r>
       <w:r>
         <w:rPr>
-          <w:rFonts w:asciiTheme="majorBidi" w:hAnsiTheme="majorBidi" w:cstheme="majorBidi"/>
+          <w:rFonts w:ascii="Arial" w:hAnsi="Arial" w:cs="Arial"/>
           <w:sz w:val="24"/>
           <w:szCs w:val="24"/>
         </w:rPr>
@@ -227,7 +235,7 @@
       </w:r>
       <w:r>
         <w:rPr>
-          <w:rFonts w:asciiTheme="majorBidi" w:hAnsiTheme="majorBidi" w:cstheme="majorBidi"/>
+          <w:rFonts w:ascii="Arial" w:hAnsi="Arial" w:cs="Arial"/>
           <w:sz w:val="24"/>
           <w:szCs w:val="24"/>
         </w:rPr>
@@ -235,7 +243,7 @@
       </w:r>
       <w:r>
         <w:rPr>
-          <w:rFonts w:asciiTheme="majorBidi" w:hAnsiTheme="majorBidi" w:cstheme="majorBidi"/>
+          <w:rFonts w:ascii="Arial" w:hAnsi="Arial" w:cs="Arial"/>
           <w:sz w:val="24"/>
           <w:szCs w:val="24"/>
         </w:rPr>
@@ -243,7 +251,7 @@
       </w:r>
       <w:r>
         <w:rPr>
-          <w:rFonts w:asciiTheme="majorBidi" w:hAnsiTheme="majorBidi" w:cstheme="majorBidi"/>
+          <w:rFonts w:ascii="Arial" w:hAnsi="Arial" w:cs="Arial"/>
           <w:sz w:val="24"/>
           <w:szCs w:val="24"/>
         </w:rPr>
@@ -251,7 +259,7 @@
       </w:r>
       <w:r>
         <w:rPr>
-          <w:rFonts w:asciiTheme="majorBidi" w:hAnsiTheme="majorBidi" w:cstheme="majorBidi"/>
+          <w:rFonts w:ascii="Arial" w:hAnsi="Arial" w:cs="Arial"/>
           <w:sz w:val="24"/>
           <w:szCs w:val="24"/>
         </w:rPr>
@@ -259,7 +267,7 @@
       </w:r>
       <w:r>
         <w:rPr>
-          <w:rFonts w:asciiTheme="majorBidi" w:hAnsiTheme="majorBidi" w:cstheme="majorBidi"/>
+          <w:rFonts w:ascii="Arial" w:hAnsi="Arial" w:cs="Arial"/>
           <w:b/>
           <w:bCs/>
           <w:sz w:val="24"/>
@@ -269,7 +277,7 @@
       </w:r>
       <w:r>
         <w:rPr>
-          <w:rFonts w:asciiTheme="majorBidi" w:hAnsiTheme="majorBidi" w:cstheme="majorBidi"/>
+          <w:rFonts w:ascii="Arial" w:hAnsi="Arial" w:cs="Arial"/>
           <w:sz w:val="24"/>
           <w:szCs w:val="24"/>
         </w:rPr>
@@ -280,10 +288,14 @@
       <w:pPr>
         <w:pStyle w:val="NormalWeb"/>
         <w:ind w:left="709" w:right="850"/>
+        <w:rPr>
+          <w:rFonts w:ascii="Arial" w:hAnsi="Arial" w:cs="Arial"/>
+        </w:rPr>
       </w:pPr>
       <w:r>
         <w:rPr>
           <w:rStyle w:val="Strong"/>
+          <w:rFonts w:ascii="Arial" w:hAnsi="Arial" w:cs="Arial"/>
           <w:b w:val="0"/>
           <w:bCs w:val="0"/>
         </w:rPr>
@@ -292,6 +304,7 @@
       <w:r>
         <w:rPr>
           <w:rStyle w:val="Strong"/>
+          <w:rFonts w:ascii="Arial" w:hAnsi="Arial" w:cs="Arial"/>
           <w:b w:val="0"/>
           <w:bCs w:val="0"/>
         </w:rPr>
@@ -300,22 +313,33 @@
       <w:r>
         <w:rPr>
           <w:rStyle w:val="Strong"/>
+          <w:rFonts w:ascii="Arial" w:hAnsi="Arial" w:cs="Arial"/>
           <w:b w:val="0"/>
           <w:bCs w:val="0"/>
         </w:rPr>
         <w:t>Tanggal</w:t>
       </w:r>
       <w:r>
+        <w:rPr>
+          <w:rFonts w:ascii="Arial" w:hAnsi="Arial" w:cs="Arial"/>
+        </w:rPr>
         <w:t xml:space="preserve"> </w:t>
       </w:r>
       <w:r>
+        <w:rPr>
+          <w:rFonts w:ascii="Arial" w:hAnsi="Arial" w:cs="Arial"/>
+        </w:rPr>
         <w:tab/>
       </w:r>
       <w:r>
+        <w:rPr>
+          <w:rFonts w:ascii="Arial" w:hAnsi="Arial" w:cs="Arial"/>
+        </w:rPr>
         <w:t xml:space="preserve">: </w:t>
       </w:r>
       <w:r>
         <w:rPr>
+          <w:rFonts w:ascii="Arial" w:hAnsi="Arial" w:cs="Arial"/>
           <w:b/>
           <w:bCs/>
         </w:rPr>
@@ -323,6 +347,7 @@
       </w:r>
       <w:r>
         <w:rPr>
+          <w:rFonts w:ascii="Arial" w:hAnsi="Arial" w:cs="Arial"/>
           <w:b/>
           <w:bCs/>
         </w:rPr>
@@ -330,6 +355,7 @@
       </w:r>
       <w:r>
         <w:rPr>
+          <w:rFonts w:ascii="Arial" w:hAnsi="Arial" w:cs="Arial"/>
           <w:b/>
           <w:bCs/>
         </w:rPr>
@@ -337,17 +363,22 @@
       </w:r>
       <w:r>
         <w:rPr>
+          <w:rFonts w:ascii="Arial" w:hAnsi="Arial" w:cs="Arial"/>
           <w:b/>
           <w:bCs/>
         </w:rPr>
         <w:t xml:space="preserve"> Juli 2026</w:t>
       </w:r>
       <w:r>
+        <w:rPr>
+          <w:rFonts w:ascii="Arial" w:hAnsi="Arial" w:cs="Arial"/>
+        </w:rPr>
         <w:br/>
       </w:r>
       <w:r>
         <w:rPr>
           <w:rStyle w:val="Strong"/>
+          <w:rFonts w:ascii="Arial" w:hAnsi="Arial" w:cs="Arial"/>
           <w:b w:val="0"/>
           <w:bCs w:val="0"/>
         </w:rPr>
@@ -355,6 +386,7 @@
       </w:r>
       <w:r>
         <w:rPr>
+          <w:rFonts w:ascii="Arial" w:hAnsi="Arial" w:cs="Arial"/>
           <w:b/>
           <w:bCs/>
         </w:rPr>
@@ -362,6 +394,7 @@
       </w:r>
       <w:r>
         <w:rPr>
+          <w:rFonts w:ascii="Arial" w:hAnsi="Arial" w:cs="Arial"/>
           <w:b/>
           <w:bCs/>
         </w:rPr>
@@ -369,20 +402,28 @@
       </w:r>
       <w:r>
         <w:rPr>
+          <w:rFonts w:ascii="Arial" w:hAnsi="Arial" w:cs="Arial"/>
           <w:b/>
           <w:bCs/>
         </w:rPr>
         <w:tab/>
       </w:r>
       <w:r>
+        <w:rPr>
+          <w:rFonts w:ascii="Arial" w:hAnsi="Arial" w:cs="Arial"/>
+        </w:rPr>
         <w:t>: Pukul 06.30 WIB s.d. selesai</w:t>
       </w:r>
       <w:r>
+        <w:rPr>
+          <w:rFonts w:ascii="Arial" w:hAnsi="Arial" w:cs="Arial"/>
+        </w:rPr>
         <w:br/>
       </w:r>
       <w:r>
         <w:rPr>
           <w:rStyle w:val="Strong"/>
+          <w:rFonts w:ascii="Arial" w:hAnsi="Arial" w:cs="Arial"/>
           <w:b w:val="0"/>
           <w:bCs w:val="0"/>
         </w:rPr>
@@ -390,6 +431,7 @@
       </w:r>
       <w:r>
         <w:rPr>
+          <w:rFonts w:ascii="Arial" w:hAnsi="Arial" w:cs="Arial"/>
           <w:b/>
           <w:bCs/>
         </w:rPr>
@@ -397,32 +439,46 @@
       </w:r>
       <w:r>
         <w:rPr>
+          <w:rFonts w:ascii="Arial" w:hAnsi="Arial" w:cs="Arial"/>
           <w:b/>
           <w:bCs/>
         </w:rPr>
         <w:tab/>
       </w:r>
       <w:r>
-        <w:t>:</w:t>
-      </w:r>
-      <w:r>
+        <w:rPr>
+          <w:rFonts w:ascii="Arial" w:hAnsi="Arial" w:cs="Arial"/>
+        </w:rPr>
+        <w:t xml:space="preserve">: </w:t>
+      </w:r>
+      <w:r>
+        <w:rPr>
+          <w:rFonts w:ascii="Arial" w:hAnsi="Arial" w:cs="Arial"/>
+        </w:rPr>
+        <w:t>Pesantren</w:t>
+      </w:r>
+      <w:r>
+        <w:rPr>
+          <w:rFonts w:ascii="Arial" w:hAnsi="Arial" w:cs="Arial"/>
+        </w:rPr>
         <w:t xml:space="preserve"> </w:t>
       </w:r>
       <w:r>
-        <w:t>Pesantren</w:t>
-      </w:r>
-      <w:r>
-        <w:t xml:space="preserve"> </w:t>
-      </w:r>
-      <w:r>
+        <w:rPr>
+          <w:rFonts w:ascii="Arial" w:hAnsi="Arial" w:cs="Arial"/>
+        </w:rPr>
         <w:t>Al Imam Al Islami</w:t>
       </w:r>
       <w:r>
+        <w:rPr>
+          <w:rFonts w:ascii="Arial" w:hAnsi="Arial" w:cs="Arial"/>
+        </w:rPr>
         <w:br/>
       </w:r>
       <w:r>
         <w:rPr>
           <w:rStyle w:val="Strong"/>
+          <w:rFonts w:ascii="Arial" w:hAnsi="Arial" w:cs="Arial"/>
           <w:b w:val="0"/>
           <w:bCs w:val="0"/>
         </w:rPr>
@@ -430,6 +486,7 @@
       </w:r>
       <w:r>
         <w:rPr>
+          <w:rFonts w:ascii="Arial" w:hAnsi="Arial" w:cs="Arial"/>
           <w:b/>
           <w:bCs/>
         </w:rPr>
@@ -437,6 +494,7 @@
       </w:r>
       <w:r>
         <w:rPr>
+          <w:rFonts w:ascii="Arial" w:hAnsi="Arial" w:cs="Arial"/>
           <w:b/>
           <w:bCs/>
         </w:rPr>
@@ -444,12 +502,16 @@
       </w:r>
       <w:r>
         <w:rPr>
+          <w:rFonts w:ascii="Arial" w:hAnsi="Arial" w:cs="Arial"/>
           <w:b/>
           <w:bCs/>
         </w:rPr>
         <w:tab/>
       </w:r>
       <w:r>
+        <w:rPr>
+          <w:rFonts w:ascii="Arial" w:hAnsi="Arial" w:cs="Arial"/>
+        </w:rPr>
         <w:t>: Welcome Day dan Kedatangan Santri Baru</w:t>
       </w:r>
     </w:p>
@@ -459,14 +521,14 @@
         <w:ind w:left="709" w:right="850" w:firstLine="567"/>
         <w:jc w:val="both"/>
         <w:rPr>
-          <w:rFonts w:ascii="Times New Roman" w:hAnsi="Times New Roman" w:cs="Times New Roman"/>
-          <w:sz w:val="24"/>
-          <w:szCs w:val="24"/>
-        </w:rPr>
-      </w:pPr>
-      <w:r>
-        <w:rPr>
-          <w:rFonts w:ascii="Times New Roman" w:hAnsi="Times New Roman" w:cs="Times New Roman"/>
+          <w:rFonts w:ascii="Arial" w:hAnsi="Arial" w:cs="Arial"/>
+          <w:sz w:val="24"/>
+          <w:szCs w:val="24"/>
+        </w:rPr>
+      </w:pPr>
+      <w:r>
+        <w:rPr>
+          <w:rFonts w:ascii="Arial" w:hAnsi="Arial" w:cs="Arial"/>
           <w:sz w:val="24"/>
           <w:szCs w:val="24"/>
         </w:rPr>
@@ -474,7 +536,7 @@
       </w:r>
       <w:r>
         <w:rPr>
-          <w:rFonts w:ascii="Times New Roman" w:hAnsi="Times New Roman" w:cs="Times New Roman"/>
+          <w:rFonts w:ascii="Arial" w:hAnsi="Arial" w:cs="Arial"/>
           <w:sz w:val="24"/>
           <w:szCs w:val="24"/>
         </w:rPr>
@@ -482,7 +544,7 @@
       </w:r>
       <w:r>
         <w:rPr>
-          <w:rFonts w:ascii="Times New Roman" w:hAnsi="Times New Roman" w:cs="Times New Roman"/>
+          <w:rFonts w:ascii="Arial" w:hAnsi="Arial" w:cs="Arial"/>
           <w:sz w:val="24"/>
           <w:szCs w:val="24"/>
         </w:rPr>
@@ -490,7 +552,7 @@
       </w:r>
       <w:r>
         <w:rPr>
-          <w:rFonts w:ascii="Times New Roman" w:hAnsi="Times New Roman" w:cs="Times New Roman"/>
+          <w:rFonts w:ascii="Arial" w:hAnsi="Arial" w:cs="Arial"/>
           <w:sz w:val="24"/>
           <w:szCs w:val="24"/>
         </w:rPr>
@@ -503,7 +565,7 @@
         <w:ind w:left="709" w:right="850" w:firstLine="567"/>
         <w:jc w:val="both"/>
         <w:rPr>
-          <w:rFonts w:ascii="Times New Roman" w:hAnsi="Times New Roman" w:cs="Times New Roman"/>
+          <w:rFonts w:ascii="Arial" w:hAnsi="Arial" w:cs="Arial"/>
           <w:i/>
           <w:iCs/>
           <w:sz w:val="24"/>
@@ -512,7 +574,7 @@
       </w:pPr>
       <w:r>
         <w:rPr>
-          <w:rFonts w:ascii="Times New Roman" w:hAnsi="Times New Roman" w:cs="Times New Roman"/>
+          <w:rFonts w:ascii="Arial" w:hAnsi="Arial" w:cs="Arial"/>
           <w:sz w:val="24"/>
           <w:szCs w:val="24"/>
         </w:rPr>
@@ -520,7 +582,7 @@
       </w:r>
       <w:r>
         <w:rPr>
-          <w:rFonts w:ascii="Times New Roman" w:hAnsi="Times New Roman" w:cs="Times New Roman"/>
+          <w:rFonts w:ascii="Arial" w:hAnsi="Arial" w:cs="Arial"/>
           <w:i/>
           <w:iCs/>
           <w:sz w:val="24"/>
@@ -534,7 +596,7 @@
         <w:spacing w:after="0" w:line="276" w:lineRule="auto"/>
         <w:jc w:val="both"/>
         <w:rPr>
-          <w:rFonts w:asciiTheme="majorBidi" w:hAnsiTheme="majorBidi" w:cstheme="majorBidi"/>
+          <w:rFonts w:ascii="Arial" w:hAnsi="Arial" w:cs="Arial"/>
           <w:sz w:val="14"/>
           <w:szCs w:val="14"/>
           <w:lang w:val="sv-SE"/>
@@ -546,7 +608,7 @@
         <w:spacing w:after="0"/>
         <w:jc w:val="center"/>
         <w:rPr>
-          <w:rFonts w:ascii="(A) Arslan Wessam A" w:hAnsi="(A) Arslan Wessam A" w:cs="(A) Arslan Wessam A"/>
+          <w:rFonts w:ascii="Arial" w:hAnsi="Arial" w:cs="Arial"/>
           <w:sz w:val="30"/>
           <w:szCs w:val="30"/>
           <w:rtl/>
@@ -554,7 +616,7 @@
       </w:pPr>
       <w:r>
         <w:rPr>
-          <w:rFonts w:ascii="(A) Arslan Wessam A" w:hAnsi="(A) Arslan Wessam A" w:cs="(A) Arslan Wessam A"/>
+          <w:rFonts w:ascii="Arial" w:hAnsi="Arial" w:cs="Arial"/>
           <w:sz w:val="30"/>
           <w:szCs w:val="30"/>
           <w:rtl/>
@@ -567,7 +629,7 @@
         <w:spacing w:after="0"/>
         <w:jc w:val="center"/>
         <w:rPr>
-          <w:rFonts w:ascii="(A) Arslan Wessam A" w:hAnsi="(A) Arslan Wessam A" w:cs="(A) Arslan Wessam A"/>
+          <w:rFonts w:ascii="Arial" w:hAnsi="Arial" w:cs="Arial"/>
           <w:sz w:val="28"/>
           <w:szCs w:val="28"/>
         </w:rPr>
@@ -579,7 +641,7 @@
         <w:spacing w:after="0" w:line="240" w:lineRule="auto"/>
         <w:ind w:left="3119" w:firstLine="3544"/>
         <w:rPr>
-          <w:rFonts w:asciiTheme="majorBidi" w:hAnsiTheme="majorBidi" w:cstheme="majorBidi"/>
+          <w:rFonts w:ascii="Arial" w:hAnsi="Arial" w:cs="Arial"/>
           <w:b/>
           <w:bCs/>
           <w:sz w:val="24"/>
@@ -588,7 +650,7 @@
       </w:pPr>
       <w:r>
         <w:rPr>
-          <w:rFonts w:asciiTheme="majorBidi" w:hAnsiTheme="majorBidi" w:cstheme="majorBidi"/>
+          <w:rFonts w:ascii="Arial" w:hAnsi="Arial" w:cs="Arial"/>
           <w:sz w:val="24"/>
           <w:szCs w:val="24"/>
         </w:rPr>
@@ -596,7 +658,7 @@
       </w:r>
       <w:r>
         <w:rPr>
-          <w:rFonts w:asciiTheme="majorBidi" w:hAnsiTheme="majorBidi" w:cstheme="majorBidi"/>
+          <w:rFonts w:ascii="Arial" w:hAnsi="Arial" w:cs="Arial"/>
           <w:sz w:val="24"/>
           <w:szCs w:val="24"/>
         </w:rPr>
@@ -608,14 +670,14 @@
         <w:spacing w:after="0" w:line="240" w:lineRule="auto"/>
         <w:ind w:firstLine="7513"/>
         <w:rPr>
-          <w:rFonts w:asciiTheme="majorBidi" w:hAnsiTheme="majorBidi" w:cstheme="majorBidi"/>
-          <w:sz w:val="24"/>
-          <w:szCs w:val="24"/>
-        </w:rPr>
-      </w:pPr>
-      <w:r>
-        <w:rPr>
-          <w:rFonts w:asciiTheme="majorBidi" w:hAnsiTheme="majorBidi" w:cstheme="majorBidi"/>
+          <w:rFonts w:ascii="Arial" w:hAnsi="Arial" w:cs="Arial"/>
+          <w:sz w:val="24"/>
+          <w:szCs w:val="24"/>
+        </w:rPr>
+      </w:pPr>
+      <w:r>
+        <w:rPr>
+          <w:rFonts w:ascii="Arial" w:hAnsi="Arial" w:cs="Arial"/>
           <w:b/>
           <w:bCs/>
           <w:sz w:val="24"/>
@@ -625,7 +687,7 @@
       </w:r>
       <w:r>
         <w:rPr>
-          <w:rFonts w:asciiTheme="majorBidi" w:hAnsiTheme="majorBidi" w:cstheme="majorBidi"/>
+          <w:rFonts w:ascii="Arial" w:hAnsi="Arial" w:cs="Arial"/>
           <w:b/>
           <w:bCs/>
           <w:sz w:val="24"/>
@@ -635,7 +697,7 @@
       </w:r>
       <w:r>
         <w:rPr>
-          <w:rFonts w:asciiTheme="majorBidi" w:hAnsiTheme="majorBidi" w:cstheme="majorBidi"/>
+          <w:rFonts w:ascii="Arial" w:hAnsi="Arial" w:cs="Arial"/>
           <w:sz w:val="24"/>
           <w:szCs w:val="24"/>
         </w:rPr>
@@ -672,14 +734,14 @@
             <w:pPr>
               <w:jc w:val="center"/>
               <w:rPr>
-                <w:rFonts w:asciiTheme="majorBidi" w:hAnsiTheme="majorBidi" w:cstheme="majorBidi"/>
+                <w:rFonts w:ascii="Arial" w:hAnsi="Arial" w:cs="Arial"/>
                 <w:sz w:val="24"/>
                 <w:szCs w:val="24"/>
               </w:rPr>
             </w:pPr>
             <w:r>
               <w:rPr>
-                <w:rFonts w:asciiTheme="majorBidi" w:hAnsiTheme="majorBidi" w:cstheme="majorBidi"/>
+                <w:rFonts w:ascii="Arial" w:hAnsi="Arial" w:cs="Arial"/>
                 <w:noProof/>
                 <w:sz w:val="24"/>
                 <w:szCs w:val="24"/>
@@ -764,14 +826,14 @@
           <w:p>
             <w:pPr>
               <w:rPr>
-                <w:rFonts w:asciiTheme="majorBidi" w:hAnsiTheme="majorBidi" w:cstheme="majorBidi"/>
+                <w:rFonts w:ascii="Arial" w:hAnsi="Arial" w:cs="Arial"/>
                 <w:sz w:val="24"/>
                 <w:szCs w:val="24"/>
               </w:rPr>
             </w:pPr>
             <w:r>
               <w:rPr>
-                <w:rFonts w:asciiTheme="majorBidi" w:hAnsiTheme="majorBidi" w:cstheme="majorBidi"/>
+                <w:rFonts w:ascii="Arial" w:hAnsi="Arial" w:cs="Arial"/>
                 <w:sz w:val="24"/>
                 <w:szCs w:val="24"/>
               </w:rPr>
@@ -779,7 +841,7 @@
             </w:r>
             <w:r>
               <w:rPr>
-                <w:rFonts w:asciiTheme="majorBidi" w:hAnsiTheme="majorBidi" w:cstheme="majorBidi"/>
+                <w:rFonts w:ascii="Arial" w:hAnsi="Arial" w:cs="Arial"/>
                 <w:sz w:val="24"/>
                 <w:szCs w:val="24"/>
               </w:rPr>
@@ -800,7 +862,7 @@
             <w:pPr>
               <w:jc w:val="center"/>
               <w:rPr>
-                <w:rFonts w:asciiTheme="majorBidi" w:hAnsiTheme="majorBidi" w:cstheme="majorBidi"/>
+                <w:rFonts w:ascii="Arial" w:hAnsi="Arial" w:cs="Arial"/>
                 <w:sz w:val="24"/>
                 <w:szCs w:val="24"/>
               </w:rPr>
@@ -815,14 +877,14 @@
             <w:pPr>
               <w:jc w:val="center"/>
               <w:rPr>
-                <w:rFonts w:asciiTheme="majorBidi" w:hAnsiTheme="majorBidi" w:cstheme="majorBidi"/>
+                <w:rFonts w:ascii="Arial" w:hAnsi="Arial" w:cs="Arial"/>
                 <w:sz w:val="24"/>
                 <w:szCs w:val="24"/>
               </w:rPr>
             </w:pPr>
             <w:r>
               <w:rPr>
-                <w:rFonts w:asciiTheme="majorBidi" w:hAnsiTheme="majorBidi" w:cstheme="majorBidi"/>
+                <w:rFonts w:ascii="Arial" w:hAnsi="Arial" w:cs="Arial"/>
                 <w:noProof/>
                 <w:sz w:val="24"/>
                 <w:szCs w:val="24"/>
@@ -885,7 +947,7 @@
             </w:r>
             <w:r>
               <w:rPr>
-                <w:rFonts w:asciiTheme="majorBidi" w:hAnsiTheme="majorBidi" w:cstheme="majorBidi"/>
+                <w:rFonts w:ascii="Arial" w:hAnsi="Arial" w:cs="Arial"/>
                 <w:noProof/>
                 <w:sz w:val="24"/>
                 <w:szCs w:val="24"/>
@@ -973,7 +1035,7 @@
             <w:pPr>
               <w:jc w:val="center"/>
               <w:rPr>
-                <w:rFonts w:asciiTheme="majorBidi" w:hAnsiTheme="majorBidi" w:cstheme="majorBidi"/>
+                <w:rFonts w:ascii="Arial" w:hAnsi="Arial" w:cs="Arial"/>
                 <w:sz w:val="24"/>
                 <w:szCs w:val="24"/>
               </w:rPr>
@@ -983,7 +1045,7 @@
             <w:pPr>
               <w:jc w:val="center"/>
               <w:rPr>
-                <w:rFonts w:asciiTheme="majorBidi" w:hAnsiTheme="majorBidi" w:cstheme="majorBidi"/>
+                <w:rFonts w:ascii="Arial" w:hAnsi="Arial" w:cs="Arial"/>
                 <w:sz w:val="24"/>
                 <w:szCs w:val="24"/>
               </w:rPr>
@@ -993,7 +1055,7 @@
             <w:pPr>
               <w:jc w:val="center"/>
               <w:rPr>
-                <w:rFonts w:asciiTheme="majorBidi" w:hAnsiTheme="majorBidi" w:cstheme="majorBidi"/>
+                <w:rFonts w:ascii="Arial" w:hAnsi="Arial" w:cs="Arial"/>
                 <w:sz w:val="24"/>
                 <w:szCs w:val="24"/>
               </w:rPr>
@@ -1002,7 +1064,7 @@
           <w:p>
             <w:pPr>
               <w:rPr>
-                <w:rFonts w:asciiTheme="majorBidi" w:hAnsiTheme="majorBidi" w:cstheme="majorBidi"/>
+                <w:rFonts w:ascii="Arial" w:hAnsi="Arial" w:cs="Arial"/>
                 <w:b/>
                 <w:bCs/>
                 <w:sz w:val="24"/>
@@ -1011,7 +1073,7 @@
             </w:pPr>
             <w:r>
               <w:rPr>
-                <w:rFonts w:asciiTheme="majorBidi" w:hAnsiTheme="majorBidi" w:cstheme="majorBidi"/>
+                <w:rFonts w:ascii="Arial" w:hAnsi="Arial" w:cs="Arial"/>
                 <w:b/>
                 <w:bCs/>
                 <w:sz w:val="24"/>
@@ -1028,7 +1090,7 @@
         <w:spacing w:after="0" w:line="240" w:lineRule="auto"/>
         <w:jc w:val="both"/>
         <w:rPr>
-          <w:rFonts w:ascii="Traditional Arabic" w:hAnsi="Traditional Arabic" w:cs="Traditional Arabic"/>
+          <w:rFonts w:ascii="Arial" w:hAnsi="Arial" w:cs="Arial"/>
           <w:b/>
           <w:bCs/>
           <w:sz w:val="24"/>
@@ -1049,7 +1111,7 @@
         <w:spacing w:before="240" w:after="0" w:line="240" w:lineRule="auto"/>
         <w:jc w:val="center"/>
         <w:rPr>
-          <w:rFonts w:ascii="Times New Roman" w:hAnsi="Times New Roman" w:cs="Times New Roman"/>
+          <w:rFonts w:ascii="Arial" w:hAnsi="Arial" w:cs="Arial"/>
           <w:b/>
           <w:bCs/>
           <w:sz w:val="28"/>
@@ -1059,7 +1121,7 @@
       </w:pPr>
       <w:r>
         <w:rPr>
-          <w:rFonts w:ascii="Times New Roman" w:hAnsi="Times New Roman" w:cs="Times New Roman"/>
+          <w:rFonts w:ascii="Arial" w:hAnsi="Arial" w:cs="Arial"/>
           <w:b/>
           <w:bCs/>
           <w:sz w:val="28"/>
@@ -1075,7 +1137,7 @@
         <w:spacing w:after="0" w:line="240" w:lineRule="auto"/>
         <w:jc w:val="center"/>
         <w:rPr>
-          <w:rFonts w:ascii="Times New Roman" w:hAnsi="Times New Roman" w:cs="Times New Roman"/>
+          <w:rFonts w:ascii="Arial" w:hAnsi="Arial" w:cs="Arial"/>
           <w:b/>
           <w:bCs/>
           <w:sz w:val="24"/>
@@ -1084,7 +1146,7 @@
       </w:pPr>
       <w:r>
         <w:rPr>
-          <w:rFonts w:ascii="Times New Roman" w:hAnsi="Times New Roman" w:cs="Times New Roman"/>
+          <w:rFonts w:ascii="Arial" w:hAnsi="Arial" w:cs="Arial"/>
           <w:b/>
           <w:bCs/>
           <w:sz w:val="24"/>
@@ -1098,7 +1160,7 @@
         <w:spacing w:after="0" w:line="240" w:lineRule="auto"/>
         <w:jc w:val="center"/>
         <w:rPr>
-          <w:rFonts w:ascii="Times New Roman" w:hAnsi="Times New Roman" w:cs="Times New Roman"/>
+          <w:rFonts w:ascii="Arial" w:hAnsi="Arial" w:cs="Arial"/>
           <w:b/>
           <w:bCs/>
           <w:sz w:val="24"/>
@@ -1110,7 +1172,7 @@
       <w:pPr>
         <w:spacing w:after="0" w:line="240" w:lineRule="auto"/>
         <w:rPr>
-          <w:rFonts w:ascii="Times New Roman" w:hAnsi="Times New Roman" w:cs="Times New Roman"/>
+          <w:rFonts w:ascii="Arial" w:hAnsi="Arial" w:cs="Arial"/>
           <w:b/>
           <w:bCs/>
           <w:sz w:val="24"/>
@@ -1119,7 +1181,7 @@
       </w:pPr>
       <w:r>
         <w:rPr>
-          <w:rFonts w:ascii="Times New Roman" w:hAnsi="Times New Roman" w:cs="Times New Roman"/>
+          <w:rFonts w:ascii="Arial" w:hAnsi="Arial" w:cs="Arial"/>
           <w:b/>
           <w:bCs/>
           <w:sz w:val="24"/>
@@ -1133,15 +1195,15 @@
         <w:spacing w:after="0" w:line="240" w:lineRule="auto"/>
         <w:jc w:val="both"/>
         <w:rPr>
-          <w:rFonts w:ascii="Times New Roman" w:hAnsi="Times New Roman" w:cs="Times New Roman"/>
-          <w:bCs/>
-          <w:sz w:val="24"/>
-          <w:szCs w:val="24"/>
-        </w:rPr>
-      </w:pPr>
-      <w:r>
-        <w:rPr>
-          <w:rFonts w:ascii="Times New Roman" w:hAnsi="Times New Roman" w:cs="Times New Roman"/>
+          <w:rFonts w:ascii="Arial" w:hAnsi="Arial" w:cs="Arial"/>
+          <w:bCs/>
+          <w:sz w:val="24"/>
+          <w:szCs w:val="24"/>
+        </w:rPr>
+      </w:pPr>
+      <w:r>
+        <w:rPr>
+          <w:rFonts w:ascii="Arial" w:hAnsi="Arial" w:cs="Arial"/>
           <w:bCs/>
           <w:sz w:val="24"/>
           <w:szCs w:val="24"/>
@@ -1153,15 +1215,15 @@
       <w:pPr>
         <w:spacing w:after="0" w:line="240" w:lineRule="auto"/>
         <w:rPr>
-          <w:rFonts w:ascii="Times New Roman" w:hAnsi="Times New Roman" w:cs="Times New Roman"/>
-          <w:bCs/>
-          <w:sz w:val="24"/>
-          <w:szCs w:val="24"/>
-        </w:rPr>
-      </w:pPr>
-      <w:r>
-        <w:rPr>
-          <w:rFonts w:ascii="Times New Roman" w:hAnsi="Times New Roman" w:cs="Times New Roman"/>
+          <w:rFonts w:ascii="Arial" w:hAnsi="Arial" w:cs="Arial"/>
+          <w:bCs/>
+          <w:sz w:val="24"/>
+          <w:szCs w:val="24"/>
+        </w:rPr>
+      </w:pPr>
+      <w:r>
+        <w:rPr>
+          <w:rFonts w:ascii="Arial" w:hAnsi="Arial" w:cs="Arial"/>
           <w:bCs/>
           <w:sz w:val="24"/>
           <w:szCs w:val="24"/>
@@ -1173,15 +1235,15 @@
       <w:pPr>
         <w:spacing w:after="0" w:line="240" w:lineRule="auto"/>
         <w:rPr>
-          <w:rFonts w:ascii="Times New Roman" w:hAnsi="Times New Roman" w:cs="Times New Roman"/>
-          <w:bCs/>
-          <w:sz w:val="24"/>
-          <w:szCs w:val="24"/>
-        </w:rPr>
-      </w:pPr>
-      <w:r>
-        <w:rPr>
-          <w:rFonts w:ascii="Times New Roman" w:hAnsi="Times New Roman" w:cs="Times New Roman"/>
+          <w:rFonts w:ascii="Arial" w:hAnsi="Arial" w:cs="Arial"/>
+          <w:bCs/>
+          <w:sz w:val="24"/>
+          <w:szCs w:val="24"/>
+        </w:rPr>
+      </w:pPr>
+      <w:r>
+        <w:rPr>
+          <w:rFonts w:ascii="Arial" w:hAnsi="Arial" w:cs="Arial"/>
           <w:bCs/>
           <w:sz w:val="24"/>
           <w:szCs w:val="24"/>
@@ -1193,15 +1255,15 @@
       <w:pPr>
         <w:spacing w:after="0" w:line="240" w:lineRule="auto"/>
         <w:rPr>
-          <w:rFonts w:ascii="Times New Roman" w:hAnsi="Times New Roman" w:cs="Times New Roman"/>
-          <w:bCs/>
-          <w:sz w:val="24"/>
-          <w:szCs w:val="24"/>
-        </w:rPr>
-      </w:pPr>
-      <w:r>
-        <w:rPr>
-          <w:rFonts w:ascii="Times New Roman" w:hAnsi="Times New Roman" w:cs="Times New Roman"/>
+          <w:rFonts w:ascii="Arial" w:hAnsi="Arial" w:cs="Arial"/>
+          <w:bCs/>
+          <w:sz w:val="24"/>
+          <w:szCs w:val="24"/>
+        </w:rPr>
+      </w:pPr>
+      <w:r>
+        <w:rPr>
+          <w:rFonts w:ascii="Arial" w:hAnsi="Arial" w:cs="Arial"/>
           <w:bCs/>
           <w:sz w:val="24"/>
           <w:szCs w:val="24"/>
@@ -1213,15 +1275,15 @@
       <w:pPr>
         <w:spacing w:after="0" w:line="240" w:lineRule="auto"/>
         <w:rPr>
-          <w:rFonts w:ascii="Times New Roman" w:hAnsi="Times New Roman" w:cs="Times New Roman"/>
-          <w:bCs/>
-          <w:sz w:val="24"/>
-          <w:szCs w:val="24"/>
-        </w:rPr>
-      </w:pPr>
-      <w:r>
-        <w:rPr>
-          <w:rFonts w:ascii="Times New Roman" w:hAnsi="Times New Roman" w:cs="Times New Roman"/>
+          <w:rFonts w:ascii="Arial" w:hAnsi="Arial" w:cs="Arial"/>
+          <w:bCs/>
+          <w:sz w:val="24"/>
+          <w:szCs w:val="24"/>
+        </w:rPr>
+      </w:pPr>
+      <w:r>
+        <w:rPr>
+          <w:rFonts w:ascii="Arial" w:hAnsi="Arial" w:cs="Arial"/>
           <w:bCs/>
           <w:sz w:val="24"/>
           <w:szCs w:val="24"/>
@@ -1233,15 +1295,15 @@
       <w:pPr>
         <w:spacing w:after="0" w:line="240" w:lineRule="auto"/>
         <w:rPr>
-          <w:rFonts w:ascii="Times New Roman" w:hAnsi="Times New Roman" w:cs="Times New Roman"/>
-          <w:bCs/>
-          <w:sz w:val="24"/>
-          <w:szCs w:val="24"/>
-        </w:rPr>
-      </w:pPr>
-      <w:r>
-        <w:rPr>
-          <w:rFonts w:ascii="Times New Roman" w:hAnsi="Times New Roman" w:cs="Times New Roman"/>
+          <w:rFonts w:ascii="Arial" w:hAnsi="Arial" w:cs="Arial"/>
+          <w:bCs/>
+          <w:sz w:val="24"/>
+          <w:szCs w:val="24"/>
+        </w:rPr>
+      </w:pPr>
+      <w:r>
+        <w:rPr>
+          <w:rFonts w:ascii="Arial" w:hAnsi="Arial" w:cs="Arial"/>
           <w:bCs/>
           <w:sz w:val="24"/>
           <w:szCs w:val="24"/>
@@ -1253,15 +1315,15 @@
       <w:pPr>
         <w:spacing w:after="0" w:line="240" w:lineRule="auto"/>
         <w:rPr>
-          <w:rFonts w:ascii="Times New Roman" w:hAnsi="Times New Roman" w:cs="Times New Roman"/>
-          <w:bCs/>
-          <w:sz w:val="24"/>
-          <w:szCs w:val="24"/>
-        </w:rPr>
-      </w:pPr>
-      <w:r>
-        <w:rPr>
-          <w:rFonts w:ascii="Times New Roman" w:hAnsi="Times New Roman" w:cs="Times New Roman"/>
+          <w:rFonts w:ascii="Arial" w:hAnsi="Arial" w:cs="Arial"/>
+          <w:bCs/>
+          <w:sz w:val="24"/>
+          <w:szCs w:val="24"/>
+        </w:rPr>
+      </w:pPr>
+      <w:r>
+        <w:rPr>
+          <w:rFonts w:ascii="Arial" w:hAnsi="Arial" w:cs="Arial"/>
           <w:bCs/>
           <w:sz w:val="24"/>
           <w:szCs w:val="24"/>
@@ -1273,15 +1335,15 @@
       <w:pPr>
         <w:spacing w:after="0" w:line="240" w:lineRule="auto"/>
         <w:rPr>
-          <w:rFonts w:ascii="Times New Roman" w:hAnsi="Times New Roman" w:cs="Times New Roman"/>
-          <w:bCs/>
-          <w:sz w:val="24"/>
-          <w:szCs w:val="24"/>
-        </w:rPr>
-      </w:pPr>
-      <w:r>
-        <w:rPr>
-          <w:rFonts w:ascii="Times New Roman" w:hAnsi="Times New Roman" w:cs="Times New Roman"/>
+          <w:rFonts w:ascii="Arial" w:hAnsi="Arial" w:cs="Arial"/>
+          <w:bCs/>
+          <w:sz w:val="24"/>
+          <w:szCs w:val="24"/>
+        </w:rPr>
+      </w:pPr>
+      <w:r>
+        <w:rPr>
+          <w:rFonts w:ascii="Arial" w:hAnsi="Arial" w:cs="Arial"/>
           <w:bCs/>
           <w:sz w:val="24"/>
           <w:szCs w:val="24"/>
@@ -1293,15 +1355,15 @@
       <w:pPr>
         <w:spacing w:after="0" w:line="240" w:lineRule="auto"/>
         <w:rPr>
-          <w:rFonts w:ascii="Times New Roman" w:hAnsi="Times New Roman" w:cs="Times New Roman"/>
-          <w:bCs/>
-          <w:sz w:val="24"/>
-          <w:szCs w:val="24"/>
-        </w:rPr>
-      </w:pPr>
-      <w:r>
-        <w:rPr>
-          <w:rFonts w:ascii="Times New Roman" w:hAnsi="Times New Roman" w:cs="Times New Roman"/>
+          <w:rFonts w:ascii="Arial" w:hAnsi="Arial" w:cs="Arial"/>
+          <w:bCs/>
+          <w:sz w:val="24"/>
+          <w:szCs w:val="24"/>
+        </w:rPr>
+      </w:pPr>
+      <w:r>
+        <w:rPr>
+          <w:rFonts w:ascii="Arial" w:hAnsi="Arial" w:cs="Arial"/>
           <w:bCs/>
           <w:sz w:val="24"/>
           <w:szCs w:val="24"/>
@@ -1313,15 +1375,15 @@
       <w:pPr>
         <w:spacing w:after="0" w:line="240" w:lineRule="auto"/>
         <w:rPr>
-          <w:rFonts w:ascii="Times New Roman" w:hAnsi="Times New Roman" w:cs="Times New Roman"/>
-          <w:bCs/>
-          <w:sz w:val="24"/>
-          <w:szCs w:val="24"/>
-        </w:rPr>
-      </w:pPr>
-      <w:r>
-        <w:rPr>
-          <w:rFonts w:ascii="Times New Roman" w:hAnsi="Times New Roman" w:cs="Times New Roman"/>
+          <w:rFonts w:ascii="Arial" w:hAnsi="Arial" w:cs="Arial"/>
+          <w:bCs/>
+          <w:sz w:val="24"/>
+          <w:szCs w:val="24"/>
+        </w:rPr>
+      </w:pPr>
+      <w:r>
+        <w:rPr>
+          <w:rFonts w:ascii="Arial" w:hAnsi="Arial" w:cs="Arial"/>
           <w:bCs/>
           <w:sz w:val="24"/>
           <w:szCs w:val="24"/>
@@ -1333,15 +1395,15 @@
       <w:pPr>
         <w:spacing w:after="0" w:line="240" w:lineRule="auto"/>
         <w:rPr>
-          <w:rFonts w:ascii="Times New Roman" w:hAnsi="Times New Roman" w:cs="Times New Roman"/>
-          <w:bCs/>
-          <w:sz w:val="24"/>
-          <w:szCs w:val="24"/>
-        </w:rPr>
-      </w:pPr>
-      <w:r>
-        <w:rPr>
-          <w:rFonts w:ascii="Times New Roman" w:hAnsi="Times New Roman" w:cs="Times New Roman"/>
+          <w:rFonts w:ascii="Arial" w:hAnsi="Arial" w:cs="Arial"/>
+          <w:bCs/>
+          <w:sz w:val="24"/>
+          <w:szCs w:val="24"/>
+        </w:rPr>
+      </w:pPr>
+      <w:r>
+        <w:rPr>
+          <w:rFonts w:ascii="Arial" w:hAnsi="Arial" w:cs="Arial"/>
           <w:bCs/>
           <w:sz w:val="24"/>
           <w:szCs w:val="24"/>
@@ -1353,7 +1415,7 @@
       <w:pPr>
         <w:spacing w:after="0" w:line="240" w:lineRule="auto"/>
         <w:rPr>
-          <w:rFonts w:ascii="Times New Roman" w:hAnsi="Times New Roman" w:cs="Times New Roman"/>
+          <w:rFonts w:ascii="Arial" w:hAnsi="Arial" w:cs="Arial"/>
           <w:bCs/>
           <w:sz w:val="24"/>
           <w:szCs w:val="24"/>
@@ -1365,7 +1427,7 @@
         <w:spacing w:after="0" w:line="240" w:lineRule="auto"/>
         <w:jc w:val="both"/>
         <w:rPr>
-          <w:rFonts w:ascii="Times New Roman" w:hAnsi="Times New Roman" w:cs="Times New Roman"/>
+          <w:rFonts w:ascii="Arial" w:hAnsi="Arial" w:cs="Arial"/>
           <w:bCs/>
           <w:i/>
           <w:szCs w:val="24"/>
@@ -1373,7 +1435,7 @@
       </w:pPr>
       <w:r>
         <w:rPr>
-          <w:rFonts w:ascii="Times New Roman" w:hAnsi="Times New Roman" w:cs="Times New Roman"/>
+          <w:rFonts w:ascii="Arial" w:hAnsi="Arial" w:cs="Arial"/>
           <w:bCs/>
           <w:i/>
           <w:szCs w:val="24"/>
@@ -1386,7 +1448,7 @@
         <w:spacing w:after="0" w:line="240" w:lineRule="auto"/>
         <w:jc w:val="both"/>
         <w:rPr>
-          <w:rFonts w:ascii="Times New Roman" w:hAnsi="Times New Roman" w:cs="Times New Roman"/>
+          <w:rFonts w:ascii="Arial" w:hAnsi="Arial" w:cs="Arial"/>
           <w:bCs/>
           <w:i/>
           <w:szCs w:val="24"/>
@@ -1398,7 +1460,7 @@
         <w:spacing w:after="0" w:line="240" w:lineRule="auto"/>
         <w:jc w:val="both"/>
         <w:rPr>
-          <w:rFonts w:ascii="Times New Roman" w:hAnsi="Times New Roman" w:cs="Times New Roman"/>
+          <w:rFonts w:ascii="Arial" w:hAnsi="Arial" w:cs="Arial"/>
           <w:bCs/>
           <w:i/>
           <w:szCs w:val="24"/>
@@ -1409,7 +1471,7 @@
       <w:pPr>
         <w:spacing w:after="0" w:line="240" w:lineRule="auto"/>
         <w:rPr>
-          <w:rFonts w:ascii="Times New Roman" w:hAnsi="Times New Roman" w:cs="Times New Roman"/>
+          <w:rFonts w:ascii="Arial" w:hAnsi="Arial" w:cs="Arial"/>
           <w:b/>
           <w:bCs/>
           <w:sz w:val="24"/>
@@ -1418,7 +1480,7 @@
       </w:pPr>
       <w:r>
         <w:rPr>
-          <w:rFonts w:ascii="Times New Roman" w:hAnsi="Times New Roman" w:cs="Times New Roman"/>
+          <w:rFonts w:ascii="Arial" w:hAnsi="Arial" w:cs="Arial"/>
           <w:b/>
           <w:bCs/>
           <w:sz w:val="24"/>
@@ -1431,15 +1493,15 @@
       <w:pPr>
         <w:spacing w:after="0" w:line="240" w:lineRule="auto"/>
         <w:rPr>
-          <w:rFonts w:ascii="Times New Roman" w:hAnsi="Times New Roman" w:cs="Times New Roman"/>
-          <w:bCs/>
-          <w:sz w:val="24"/>
-          <w:szCs w:val="24"/>
-        </w:rPr>
-      </w:pPr>
-      <w:r>
-        <w:rPr>
-          <w:rFonts w:ascii="Times New Roman" w:hAnsi="Times New Roman" w:cs="Times New Roman"/>
+          <w:rFonts w:ascii="Arial" w:hAnsi="Arial" w:cs="Arial"/>
+          <w:bCs/>
+          <w:sz w:val="24"/>
+          <w:szCs w:val="24"/>
+        </w:rPr>
+      </w:pPr>
+      <w:r>
+        <w:rPr>
+          <w:rFonts w:ascii="Arial" w:hAnsi="Arial" w:cs="Arial"/>
           <w:bCs/>
           <w:sz w:val="24"/>
           <w:szCs w:val="24"/>
@@ -1451,15 +1513,15 @@
       <w:pPr>
         <w:spacing w:after="0" w:line="240" w:lineRule="auto"/>
         <w:rPr>
-          <w:rFonts w:ascii="Times New Roman" w:hAnsi="Times New Roman" w:cs="Times New Roman"/>
-          <w:bCs/>
-          <w:sz w:val="24"/>
-          <w:szCs w:val="24"/>
-        </w:rPr>
-      </w:pPr>
-      <w:r>
-        <w:rPr>
-          <w:rFonts w:ascii="Times New Roman" w:hAnsi="Times New Roman" w:cs="Times New Roman"/>
+          <w:rFonts w:ascii="Arial" w:hAnsi="Arial" w:cs="Arial"/>
+          <w:bCs/>
+          <w:sz w:val="24"/>
+          <w:szCs w:val="24"/>
+        </w:rPr>
+      </w:pPr>
+      <w:r>
+        <w:rPr>
+          <w:rFonts w:ascii="Arial" w:hAnsi="Arial" w:cs="Arial"/>
           <w:bCs/>
           <w:sz w:val="24"/>
           <w:szCs w:val="24"/>
@@ -1471,15 +1533,15 @@
       <w:pPr>
         <w:spacing w:after="0" w:line="240" w:lineRule="auto"/>
         <w:rPr>
-          <w:rFonts w:ascii="Times New Roman" w:hAnsi="Times New Roman" w:cs="Times New Roman"/>
-          <w:bCs/>
-          <w:sz w:val="24"/>
-          <w:szCs w:val="24"/>
-        </w:rPr>
-      </w:pPr>
-      <w:r>
-        <w:rPr>
-          <w:rFonts w:ascii="Times New Roman" w:hAnsi="Times New Roman" w:cs="Times New Roman"/>
+          <w:rFonts w:ascii="Arial" w:hAnsi="Arial" w:cs="Arial"/>
+          <w:bCs/>
+          <w:sz w:val="24"/>
+          <w:szCs w:val="24"/>
+        </w:rPr>
+      </w:pPr>
+      <w:r>
+        <w:rPr>
+          <w:rFonts w:ascii="Arial" w:hAnsi="Arial" w:cs="Arial"/>
           <w:bCs/>
           <w:sz w:val="24"/>
           <w:szCs w:val="24"/>
@@ -1488,7 +1550,7 @@
       </w:r>
       <w:r>
         <w:rPr>
-          <w:rFonts w:ascii="Times New Roman" w:hAnsi="Times New Roman" w:cs="Times New Roman"/>
+          <w:rFonts w:ascii="Arial" w:hAnsi="Arial" w:cs="Arial"/>
           <w:bCs/>
           <w:sz w:val="24"/>
           <w:szCs w:val="24"/>
@@ -1500,15 +1562,15 @@
       <w:pPr>
         <w:spacing w:after="0" w:line="240" w:lineRule="auto"/>
         <w:rPr>
-          <w:rFonts w:ascii="Times New Roman" w:hAnsi="Times New Roman" w:cs="Times New Roman"/>
-          <w:bCs/>
-          <w:sz w:val="24"/>
-          <w:szCs w:val="24"/>
-        </w:rPr>
-      </w:pPr>
-      <w:r>
-        <w:rPr>
-          <w:rFonts w:ascii="Times New Roman" w:hAnsi="Times New Roman" w:cs="Times New Roman"/>
+          <w:rFonts w:ascii="Arial" w:hAnsi="Arial" w:cs="Arial"/>
+          <w:bCs/>
+          <w:sz w:val="24"/>
+          <w:szCs w:val="24"/>
+        </w:rPr>
+      </w:pPr>
+      <w:r>
+        <w:rPr>
+          <w:rFonts w:ascii="Arial" w:hAnsi="Arial" w:cs="Arial"/>
           <w:bCs/>
           <w:sz w:val="24"/>
           <w:szCs w:val="24"/>
@@ -1520,15 +1582,15 @@
       <w:pPr>
         <w:spacing w:after="0" w:line="240" w:lineRule="auto"/>
         <w:rPr>
-          <w:rFonts w:ascii="Times New Roman" w:hAnsi="Times New Roman" w:cs="Times New Roman"/>
-          <w:bCs/>
-          <w:sz w:val="24"/>
-          <w:szCs w:val="24"/>
-        </w:rPr>
-      </w:pPr>
-      <w:r>
-        <w:rPr>
-          <w:rFonts w:ascii="Times New Roman" w:hAnsi="Times New Roman" w:cs="Times New Roman"/>
+          <w:rFonts w:ascii="Arial" w:hAnsi="Arial" w:cs="Arial"/>
+          <w:bCs/>
+          <w:sz w:val="24"/>
+          <w:szCs w:val="24"/>
+        </w:rPr>
+      </w:pPr>
+      <w:r>
+        <w:rPr>
+          <w:rFonts w:ascii="Arial" w:hAnsi="Arial" w:cs="Arial"/>
           <w:bCs/>
           <w:sz w:val="24"/>
           <w:szCs w:val="24"/>
@@ -1540,15 +1602,15 @@
       <w:pPr>
         <w:spacing w:after="0" w:line="240" w:lineRule="auto"/>
         <w:rPr>
-          <w:rFonts w:ascii="Times New Roman" w:hAnsi="Times New Roman" w:cs="Times New Roman"/>
-          <w:bCs/>
-          <w:sz w:val="24"/>
-          <w:szCs w:val="24"/>
-        </w:rPr>
-      </w:pPr>
-      <w:r>
-        <w:rPr>
-          <w:rFonts w:ascii="Times New Roman" w:hAnsi="Times New Roman" w:cs="Times New Roman"/>
+          <w:rFonts w:ascii="Arial" w:hAnsi="Arial" w:cs="Arial"/>
+          <w:bCs/>
+          <w:sz w:val="24"/>
+          <w:szCs w:val="24"/>
+        </w:rPr>
+      </w:pPr>
+      <w:r>
+        <w:rPr>
+          <w:rFonts w:ascii="Arial" w:hAnsi="Arial" w:cs="Arial"/>
           <w:bCs/>
           <w:sz w:val="24"/>
           <w:szCs w:val="24"/>
@@ -1560,15 +1622,15 @@
       <w:pPr>
         <w:spacing w:after="0" w:line="240" w:lineRule="auto"/>
         <w:rPr>
-          <w:rFonts w:ascii="Times New Roman" w:hAnsi="Times New Roman" w:cs="Times New Roman"/>
-          <w:bCs/>
-          <w:sz w:val="24"/>
-          <w:szCs w:val="24"/>
-        </w:rPr>
-      </w:pPr>
-      <w:r>
-        <w:rPr>
-          <w:rFonts w:ascii="Times New Roman" w:hAnsi="Times New Roman" w:cs="Times New Roman"/>
+          <w:rFonts w:ascii="Arial" w:hAnsi="Arial" w:cs="Arial"/>
+          <w:bCs/>
+          <w:sz w:val="24"/>
+          <w:szCs w:val="24"/>
+        </w:rPr>
+      </w:pPr>
+      <w:r>
+        <w:rPr>
+          <w:rFonts w:ascii="Arial" w:hAnsi="Arial" w:cs="Arial"/>
           <w:bCs/>
           <w:sz w:val="24"/>
           <w:szCs w:val="24"/>
@@ -1580,15 +1642,15 @@
       <w:pPr>
         <w:spacing w:after="0" w:line="240" w:lineRule="auto"/>
         <w:rPr>
-          <w:rFonts w:ascii="Times New Roman" w:hAnsi="Times New Roman" w:cs="Times New Roman"/>
-          <w:bCs/>
-          <w:sz w:val="24"/>
-          <w:szCs w:val="24"/>
-        </w:rPr>
-      </w:pPr>
-      <w:r>
-        <w:rPr>
-          <w:rFonts w:ascii="Times New Roman" w:hAnsi="Times New Roman" w:cs="Times New Roman"/>
+          <w:rFonts w:ascii="Arial" w:hAnsi="Arial" w:cs="Arial"/>
+          <w:bCs/>
+          <w:sz w:val="24"/>
+          <w:szCs w:val="24"/>
+        </w:rPr>
+      </w:pPr>
+      <w:r>
+        <w:rPr>
+          <w:rFonts w:ascii="Arial" w:hAnsi="Arial" w:cs="Arial"/>
           <w:bCs/>
           <w:sz w:val="24"/>
           <w:szCs w:val="24"/>
@@ -1600,15 +1662,15 @@
       <w:pPr>
         <w:spacing w:after="0" w:line="240" w:lineRule="auto"/>
         <w:rPr>
-          <w:rFonts w:ascii="Times New Roman" w:hAnsi="Times New Roman" w:cs="Times New Roman"/>
-          <w:bCs/>
-          <w:sz w:val="24"/>
-          <w:szCs w:val="24"/>
-        </w:rPr>
-      </w:pPr>
-      <w:r>
-        <w:rPr>
-          <w:rFonts w:ascii="Times New Roman" w:hAnsi="Times New Roman" w:cs="Times New Roman"/>
+          <w:rFonts w:ascii="Arial" w:hAnsi="Arial" w:cs="Arial"/>
+          <w:bCs/>
+          <w:sz w:val="24"/>
+          <w:szCs w:val="24"/>
+        </w:rPr>
+      </w:pPr>
+      <w:r>
+        <w:rPr>
+          <w:rFonts w:ascii="Arial" w:hAnsi="Arial" w:cs="Arial"/>
           <w:bCs/>
           <w:sz w:val="24"/>
           <w:szCs w:val="24"/>
@@ -1620,15 +1682,15 @@
       <w:pPr>
         <w:spacing w:after="0" w:line="240" w:lineRule="auto"/>
         <w:rPr>
-          <w:rFonts w:ascii="Times New Roman" w:hAnsi="Times New Roman" w:cs="Times New Roman"/>
-          <w:bCs/>
-          <w:sz w:val="24"/>
-          <w:szCs w:val="24"/>
-        </w:rPr>
-      </w:pPr>
-      <w:r>
-        <w:rPr>
-          <w:rFonts w:ascii="Times New Roman" w:hAnsi="Times New Roman" w:cs="Times New Roman"/>
+          <w:rFonts w:ascii="Arial" w:hAnsi="Arial" w:cs="Arial"/>
+          <w:bCs/>
+          <w:sz w:val="24"/>
+          <w:szCs w:val="24"/>
+        </w:rPr>
+      </w:pPr>
+      <w:r>
+        <w:rPr>
+          <w:rFonts w:ascii="Arial" w:hAnsi="Arial" w:cs="Arial"/>
           <w:bCs/>
           <w:sz w:val="24"/>
           <w:szCs w:val="24"/>
@@ -1640,15 +1702,15 @@
       <w:pPr>
         <w:spacing w:after="0" w:line="240" w:lineRule="auto"/>
         <w:rPr>
-          <w:rFonts w:ascii="Times New Roman" w:hAnsi="Times New Roman" w:cs="Times New Roman"/>
-          <w:bCs/>
-          <w:sz w:val="24"/>
-          <w:szCs w:val="24"/>
-        </w:rPr>
-      </w:pPr>
-      <w:r>
-        <w:rPr>
-          <w:rFonts w:ascii="Times New Roman" w:hAnsi="Times New Roman" w:cs="Times New Roman"/>
+          <w:rFonts w:ascii="Arial" w:hAnsi="Arial" w:cs="Arial"/>
+          <w:bCs/>
+          <w:sz w:val="24"/>
+          <w:szCs w:val="24"/>
+        </w:rPr>
+      </w:pPr>
+      <w:r>
+        <w:rPr>
+          <w:rFonts w:ascii="Arial" w:hAnsi="Arial" w:cs="Arial"/>
           <w:bCs/>
           <w:sz w:val="24"/>
           <w:szCs w:val="24"/>
@@ -1661,7 +1723,7 @@
         <w:spacing w:after="0" w:line="240" w:lineRule="auto"/>
         <w:jc w:val="both"/>
         <w:rPr>
-          <w:rFonts w:ascii="Traditional Arabic" w:hAnsi="Traditional Arabic" w:cs="Traditional Arabic"/>
+          <w:rFonts w:ascii="Arial" w:hAnsi="Arial" w:cs="Arial"/>
           <w:b/>
           <w:bCs/>
           <w:sz w:val="24"/>

</xml_diff>

<commit_message>
fix(docs): shrink Arial font size and remove trailing empty paragraphs to prevent layout overflow in official docs
</commit_message>
<xml_diff>
--- a/04-Surat Pemberitahuan Kedatangan Santri Baru 2026-2027-REVISED.docx
+++ b/04-Surat Pemberitahuan Kedatangan Santri Baru 2026-2027-REVISED.docx
@@ -9,8 +9,8 @@
         <w:rPr>
           <w:rStyle w:val="Strong"/>
           <w:rFonts w:ascii="Arial" w:hAnsi="Arial" w:cs="Arial"/>
-          <w:sz w:val="26"/>
-          <w:szCs w:val="26"/>
+          <w:sz w:val="24"/>
+          <w:szCs w:val="24"/>
           <w:u w:val="single"/>
         </w:rPr>
       </w:pPr>
@@ -22,8 +22,8 @@
         <w:rPr>
           <w:rStyle w:val="Strong"/>
           <w:rFonts w:ascii="Arial" w:hAnsi="Arial" w:cs="Arial"/>
-          <w:sz w:val="26"/>
-          <w:szCs w:val="26"/>
+          <w:sz w:val="24"/>
+          <w:szCs w:val="24"/>
           <w:u w:val="single"/>
         </w:rPr>
       </w:pPr>
@@ -35,8 +35,8 @@
         <w:rPr>
           <w:rStyle w:val="Strong"/>
           <w:rFonts w:ascii="Arial" w:hAnsi="Arial" w:cs="Arial"/>
-          <w:sz w:val="26"/>
-          <w:szCs w:val="26"/>
+          <w:sz w:val="24"/>
+          <w:szCs w:val="24"/>
           <w:u w:val="single"/>
         </w:rPr>
       </w:pPr>
@@ -47,56 +47,327 @@
         <w:jc w:val="center"/>
         <w:rPr>
           <w:rFonts w:ascii="Arial" w:hAnsi="Arial" w:cs="Arial"/>
+        </w:rPr>
+      </w:pPr>
+      <w:r>
+        <w:rPr>
+          <w:rStyle w:val="Strong"/>
+          <w:rFonts w:ascii="Arial" w:hAnsi="Arial" w:cs="Arial"/>
           <w:sz w:val="24"/>
           <w:szCs w:val="24"/>
+          <w:u w:val="single"/>
+        </w:rPr>
+        <w:t>SURAT PEMBERITAHUAN</w:t>
+      </w:r>
+      <w:r>
+        <w:rPr>
+          <w:rFonts w:ascii="Arial" w:hAnsi="Arial" w:cs="Arial"/>
+        </w:rPr>
+        <w:br/>
+        <w:t xml:space="preserve">Nomor : </w:t>
+      </w:r>
+      <w:r>
+        <w:rPr>
+          <w:rFonts w:ascii="Arial" w:hAnsi="Arial" w:cs="Arial"/>
+        </w:rPr>
+        <w:t>001/PMB/TU/PP-AI/VI/2026</w:t>
+      </w:r>
+    </w:p>
+    <w:p>
+      <w:pPr>
+        <w:pStyle w:val="NormalWeb"/>
+        <w:jc w:val="center"/>
+        <w:rPr>
+          <w:rFonts w:ascii="Arial" w:hAnsi="Arial" w:cs="Arial"/>
+          <w:sz w:val="22"/>
+          <w:szCs w:val="22"/>
         </w:rPr>
       </w:pPr>
       <w:r>
         <w:rPr>
           <w:rStyle w:val="Strong"/>
           <w:rFonts w:ascii="Arial" w:hAnsi="Arial" w:cs="Arial"/>
-          <w:sz w:val="26"/>
-          <w:szCs w:val="26"/>
-          <w:u w:val="single"/>
-        </w:rPr>
-        <w:t>SURAT PEMBERITAHUAN</w:t>
-      </w:r>
-      <w:r>
+          <w:sz w:val="22"/>
+          <w:szCs w:val="22"/>
+        </w:rPr>
+        <w:t>Tentang :</w:t>
+      </w:r>
+      <w:r>
+        <w:rPr>
+          <w:rFonts w:ascii="Arial" w:hAnsi="Arial" w:cs="Arial"/>
+          <w:sz w:val="22"/>
+          <w:szCs w:val="22"/>
+        </w:rPr>
+        <w:br/>
+      </w:r>
+      <w:r>
+        <w:rPr>
+          <w:rStyle w:val="Strong"/>
+          <w:rFonts w:ascii="Arial" w:hAnsi="Arial" w:cs="Arial"/>
+          <w:sz w:val="22"/>
+          <w:szCs w:val="22"/>
+        </w:rPr>
+        <w:t>KEDATANGAN SANTRI BARU DAN KEGIATAN WELCOME DAY</w:t>
+      </w:r>
+    </w:p>
+    <w:p>
+      <w:pPr>
+        <w:spacing w:after="0"/>
+        <w:ind w:left="1701"/>
+        <w:rPr>
+          <w:rFonts w:ascii="Arial" w:hAnsi="Arial" w:cs="Arial"/>
+          <w:sz w:val="14"/>
+          <w:szCs w:val="14"/>
+        </w:rPr>
+      </w:pPr>
+      <w:bookmarkStart w:id="0" w:name="_Hlk158290024"/>
+    </w:p>
+    <w:p>
+      <w:pPr>
+        <w:spacing w:after="0"/>
+        <w:jc w:val="center"/>
         <w:rPr>
           <w:rFonts w:ascii="Arial" w:hAnsi="Arial" w:cs="Arial"/>
           <w:sz w:val="24"/>
           <w:szCs w:val="24"/>
-        </w:rPr>
-        <w:br/>
-        <w:t xml:space="preserve">Nomor : </w:t>
-      </w:r>
+          <w:rtl/>
+        </w:rPr>
+      </w:pPr>
       <w:r>
         <w:rPr>
           <w:rFonts w:ascii="Arial" w:hAnsi="Arial" w:cs="Arial"/>
           <w:sz w:val="24"/>
           <w:szCs w:val="24"/>
-        </w:rPr>
-        <w:t>001/PMB/TU/PP-AI/VI/2026</w:t>
+          <w:rtl/>
+        </w:rPr>
+        <w:t>بسم الله الرحمن الرحيم السلام عليكم ورحمة الله وبركاته</w:t>
+      </w:r>
+    </w:p>
+    <w:p>
+      <w:pPr>
+        <w:spacing w:after="0"/>
+        <w:jc w:val="center"/>
+        <w:rPr>
+          <w:rFonts w:ascii="Arial" w:hAnsi="Arial" w:cs="Arial"/>
+          <w:sz w:val="4"/>
+          <w:szCs w:val="4"/>
+          <w:rtl/>
+        </w:rPr>
+      </w:pPr>
+    </w:p>
+    <w:p>
+      <w:pPr>
+        <w:spacing w:after="120" w:line="240" w:lineRule="auto"/>
+        <w:ind w:left="709" w:right="850" w:firstLine="567"/>
+        <w:jc w:val="both"/>
+        <w:rPr>
+          <w:rFonts w:ascii="Arial" w:hAnsi="Arial" w:cs="Arial"/>
+        </w:rPr>
+      </w:pPr>
+      <w:r>
+        <w:rPr>
+          <w:rFonts w:ascii="Arial" w:hAnsi="Arial" w:cs="Arial"/>
+        </w:rPr>
+        <w:t>Alhamdulillah. Shalawat dan salam semoga senantiasa tercurahkan kepada Nabi Muhammad</w:t>
+      </w:r>
+      <w:r>
+        <w:rPr>
+          <w:rFonts w:ascii="Arial" w:hAnsi="Arial" w:cs="Arial"/>
+        </w:rPr>
+        <w:t xml:space="preserve"> </w:t>
+      </w:r>
+      <w:r>
+        <w:rPr>
+          <w:rFonts w:ascii="Arial" w:hAnsi="Arial" w:cs="Arial"/>
+          <w:rtl/>
+        </w:rPr>
+        <w:t>ﷺ</w:t>
+      </w:r>
+      <w:r>
+        <w:rPr>
+          <w:rFonts w:ascii="Arial" w:hAnsi="Arial" w:cs="Arial"/>
+        </w:rPr>
+        <w:t>, keluarga, sahabat, serta orang-orang yang berpegang teguh dengan persaksiannya.</w:t>
+      </w:r>
+    </w:p>
+    <w:p>
+      <w:pPr>
+        <w:spacing w:after="120" w:line="240" w:lineRule="auto"/>
+        <w:ind w:left="709" w:right="850" w:firstLine="567"/>
+        <w:jc w:val="both"/>
+        <w:rPr>
+          <w:rFonts w:ascii="Arial" w:hAnsi="Arial" w:cs="Arial"/>
+        </w:rPr>
+      </w:pPr>
+      <w:r>
+        <w:rPr>
+          <w:rFonts w:ascii="Arial" w:hAnsi="Arial" w:cs="Arial"/>
+        </w:rPr>
+        <w:t xml:space="preserve">Sehubungan dengan akan dimulainya kegiatan pembelajaran dan pembinaan santri tahun ajaran 2026/2027, maka kami mengundang sekaligus memberitahukan kepada seluruh </w:t>
+      </w:r>
+      <w:r>
+        <w:rPr>
+          <w:rFonts w:ascii="Arial" w:hAnsi="Arial" w:cs="Arial"/>
+        </w:rPr>
+        <w:t xml:space="preserve">Wali santri beserta </w:t>
+      </w:r>
+      <w:r>
+        <w:rPr>
+          <w:rFonts w:ascii="Arial" w:hAnsi="Arial" w:cs="Arial"/>
+        </w:rPr>
+        <w:t xml:space="preserve">santri baru </w:t>
+      </w:r>
+      <w:r>
+        <w:rPr>
+          <w:rFonts w:ascii="Arial" w:hAnsi="Arial" w:cs="Arial"/>
+        </w:rPr>
+        <w:t>Pesantren</w:t>
+      </w:r>
+      <w:r>
+        <w:rPr>
+          <w:rFonts w:ascii="Arial" w:hAnsi="Arial" w:cs="Arial"/>
+        </w:rPr>
+        <w:t xml:space="preserve"> </w:t>
+      </w:r>
+      <w:r>
+        <w:rPr>
+          <w:rFonts w:ascii="Arial" w:hAnsi="Arial" w:cs="Arial"/>
+        </w:rPr>
+        <w:t>Al Imam Al Islami</w:t>
+      </w:r>
+      <w:r>
+        <w:rPr>
+          <w:rFonts w:ascii="Arial" w:hAnsi="Arial" w:cs="Arial"/>
+        </w:rPr>
+        <w:t xml:space="preserve"> beserta orang tua/wali untuk menghadiri kegiatan </w:t>
+      </w:r>
+      <w:r>
+        <w:rPr>
+          <w:rFonts w:ascii="Arial" w:hAnsi="Arial" w:cs="Arial"/>
+          <w:b/>
+          <w:bCs/>
+        </w:rPr>
+        <w:t>Welcome Day</w:t>
+      </w:r>
+      <w:r>
+        <w:rPr>
+          <w:rFonts w:ascii="Arial" w:hAnsi="Arial" w:cs="Arial"/>
+        </w:rPr>
+        <w:t xml:space="preserve"> yang insya Allah akan dilaksanakan pada:</w:t>
       </w:r>
     </w:p>
     <w:p>
       <w:pPr>
         <w:pStyle w:val="NormalWeb"/>
-        <w:jc w:val="center"/>
-        <w:rPr>
-          <w:rFonts w:ascii="Arial" w:hAnsi="Arial" w:cs="Arial"/>
+        <w:ind w:left="709" w:right="850"/>
+        <w:rPr>
+          <w:rFonts w:ascii="Arial" w:hAnsi="Arial" w:cs="Arial"/>
+          <w:sz w:val="22"/>
+          <w:szCs w:val="22"/>
         </w:rPr>
       </w:pPr>
       <w:r>
         <w:rPr>
           <w:rStyle w:val="Strong"/>
           <w:rFonts w:ascii="Arial" w:hAnsi="Arial" w:cs="Arial"/>
-        </w:rPr>
-        <w:t>Tentang :</w:t>
-      </w:r>
-      <w:r>
-        <w:rPr>
-          <w:rFonts w:ascii="Arial" w:hAnsi="Arial" w:cs="Arial"/>
+          <w:b w:val="0"/>
+          <w:bCs w:val="0"/>
+          <w:sz w:val="22"/>
+          <w:szCs w:val="22"/>
+        </w:rPr>
+        <w:t>Hari</w:t>
+      </w:r>
+      <w:r>
+        <w:rPr>
+          <w:rStyle w:val="Strong"/>
+          <w:rFonts w:ascii="Arial" w:hAnsi="Arial" w:cs="Arial"/>
+          <w:b w:val="0"/>
+          <w:bCs w:val="0"/>
+          <w:sz w:val="22"/>
+          <w:szCs w:val="22"/>
+        </w:rPr>
+        <w:t>,</w:t>
+      </w:r>
+      <w:r>
+        <w:rPr>
+          <w:rStyle w:val="Strong"/>
+          <w:rFonts w:ascii="Arial" w:hAnsi="Arial" w:cs="Arial"/>
+          <w:b w:val="0"/>
+          <w:bCs w:val="0"/>
+          <w:sz w:val="22"/>
+          <w:szCs w:val="22"/>
+        </w:rPr>
+        <w:t>Tanggal</w:t>
+      </w:r>
+      <w:r>
+        <w:rPr>
+          <w:rFonts w:ascii="Arial" w:hAnsi="Arial" w:cs="Arial"/>
+          <w:sz w:val="22"/>
+          <w:szCs w:val="22"/>
+        </w:rPr>
+        <w:t xml:space="preserve"> </w:t>
+      </w:r>
+      <w:r>
+        <w:rPr>
+          <w:rFonts w:ascii="Arial" w:hAnsi="Arial" w:cs="Arial"/>
+          <w:sz w:val="22"/>
+          <w:szCs w:val="22"/>
+        </w:rPr>
+        <w:tab/>
+      </w:r>
+      <w:r>
+        <w:rPr>
+          <w:rFonts w:ascii="Arial" w:hAnsi="Arial" w:cs="Arial"/>
+          <w:sz w:val="22"/>
+          <w:szCs w:val="22"/>
+        </w:rPr>
+        <w:t xml:space="preserve">: </w:t>
+      </w:r>
+      <w:r>
+        <w:rPr>
+          <w:rFonts w:ascii="Arial" w:hAnsi="Arial" w:cs="Arial"/>
+          <w:b/>
+          <w:bCs/>
+          <w:sz w:val="22"/>
+          <w:szCs w:val="22"/>
+        </w:rPr>
+        <w:t>Sabtu</w:t>
+      </w:r>
+      <w:r>
+        <w:rPr>
+          <w:rFonts w:ascii="Arial" w:hAnsi="Arial" w:cs="Arial"/>
+          <w:b/>
+          <w:bCs/>
+          <w:sz w:val="22"/>
+          <w:szCs w:val="22"/>
+        </w:rPr>
+        <w:t>, 1</w:t>
+      </w:r>
+      <w:r>
+        <w:rPr>
+          <w:rFonts w:ascii="Arial" w:hAnsi="Arial" w:cs="Arial"/>
+          <w:b/>
+          <w:bCs/>
+          <w:sz w:val="22"/>
+          <w:szCs w:val="22"/>
+        </w:rPr>
+        <w:t>8</w:t>
+      </w:r>
+      <w:r>
+        <w:rPr>
+          <w:rFonts w:ascii="Arial" w:hAnsi="Arial" w:cs="Arial"/>
+          <w:b/>
+          <w:bCs/>
+          <w:sz w:val="22"/>
+          <w:szCs w:val="22"/>
+        </w:rPr>
+        <w:t xml:space="preserve"> Juli 2026</w:t>
+      </w:r>
+      <w:r>
+        <w:rPr>
+          <w:rFonts w:ascii="Arial" w:hAnsi="Arial" w:cs="Arial"/>
+          <w:sz w:val="22"/>
+          <w:szCs w:val="22"/>
         </w:rPr>
         <w:br/>
       </w:r>
@@ -104,21 +375,251 @@
         <w:rPr>
           <w:rStyle w:val="Strong"/>
           <w:rFonts w:ascii="Arial" w:hAnsi="Arial" w:cs="Arial"/>
-        </w:rPr>
-        <w:t>KEDATANGAN SANTRI BARU DAN KEGIATAN WELCOME DAY</w:t>
-      </w:r>
-    </w:p>
-    <w:p>
-      <w:pPr>
-        <w:spacing w:after="0"/>
-        <w:ind w:left="1701"/>
-        <w:rPr>
-          <w:rFonts w:ascii="Arial" w:hAnsi="Arial" w:cs="Arial"/>
-          <w:sz w:val="16"/>
-          <w:szCs w:val="16"/>
-        </w:rPr>
-      </w:pPr>
-      <w:bookmarkStart w:id="0" w:name="_Hlk158290024"/>
+          <w:b w:val="0"/>
+          <w:bCs w:val="0"/>
+          <w:sz w:val="22"/>
+          <w:szCs w:val="22"/>
+        </w:rPr>
+        <w:t>Waktu</w:t>
+      </w:r>
+      <w:r>
+        <w:rPr>
+          <w:rFonts w:ascii="Arial" w:hAnsi="Arial" w:cs="Arial"/>
+          <w:b/>
+          <w:bCs/>
+          <w:sz w:val="22"/>
+          <w:szCs w:val="22"/>
+        </w:rPr>
+        <w:t xml:space="preserve"> </w:t>
+      </w:r>
+      <w:r>
+        <w:rPr>
+          <w:rFonts w:ascii="Arial" w:hAnsi="Arial" w:cs="Arial"/>
+          <w:b/>
+          <w:bCs/>
+          <w:sz w:val="22"/>
+          <w:szCs w:val="22"/>
+        </w:rPr>
+        <w:tab/>
+      </w:r>
+      <w:r>
+        <w:rPr>
+          <w:rFonts w:ascii="Arial" w:hAnsi="Arial" w:cs="Arial"/>
+          <w:b/>
+          <w:bCs/>
+          <w:sz w:val="22"/>
+          <w:szCs w:val="22"/>
+        </w:rPr>
+        <w:tab/>
+      </w:r>
+      <w:r>
+        <w:rPr>
+          <w:rFonts w:ascii="Arial" w:hAnsi="Arial" w:cs="Arial"/>
+          <w:sz w:val="22"/>
+          <w:szCs w:val="22"/>
+        </w:rPr>
+        <w:t>: Pukul 06.30 WIB s.d. selesai</w:t>
+      </w:r>
+      <w:r>
+        <w:rPr>
+          <w:rFonts w:ascii="Arial" w:hAnsi="Arial" w:cs="Arial"/>
+          <w:sz w:val="22"/>
+          <w:szCs w:val="22"/>
+        </w:rPr>
+        <w:br/>
+      </w:r>
+      <w:r>
+        <w:rPr>
+          <w:rStyle w:val="Strong"/>
+          <w:rFonts w:ascii="Arial" w:hAnsi="Arial" w:cs="Arial"/>
+          <w:b w:val="0"/>
+          <w:bCs w:val="0"/>
+          <w:sz w:val="22"/>
+          <w:szCs w:val="22"/>
+        </w:rPr>
+        <w:t>Tempat</w:t>
+      </w:r>
+      <w:r>
+        <w:rPr>
+          <w:rFonts w:ascii="Arial" w:hAnsi="Arial" w:cs="Arial"/>
+          <w:b/>
+          <w:bCs/>
+          <w:sz w:val="22"/>
+          <w:szCs w:val="22"/>
+        </w:rPr>
+        <w:t xml:space="preserve"> </w:t>
+      </w:r>
+      <w:r>
+        <w:rPr>
+          <w:rFonts w:ascii="Arial" w:hAnsi="Arial" w:cs="Arial"/>
+          <w:b/>
+          <w:bCs/>
+          <w:sz w:val="22"/>
+          <w:szCs w:val="22"/>
+        </w:rPr>
+        <w:tab/>
+      </w:r>
+      <w:r>
+        <w:rPr>
+          <w:rFonts w:ascii="Arial" w:hAnsi="Arial" w:cs="Arial"/>
+          <w:sz w:val="22"/>
+          <w:szCs w:val="22"/>
+        </w:rPr>
+        <w:t xml:space="preserve">: </w:t>
+      </w:r>
+      <w:r>
+        <w:rPr>
+          <w:rFonts w:ascii="Arial" w:hAnsi="Arial" w:cs="Arial"/>
+          <w:sz w:val="22"/>
+          <w:szCs w:val="22"/>
+        </w:rPr>
+        <w:t>Pesantren</w:t>
+      </w:r>
+      <w:r>
+        <w:rPr>
+          <w:rFonts w:ascii="Arial" w:hAnsi="Arial" w:cs="Arial"/>
+          <w:sz w:val="22"/>
+          <w:szCs w:val="22"/>
+        </w:rPr>
+        <w:t xml:space="preserve"> </w:t>
+      </w:r>
+      <w:r>
+        <w:rPr>
+          <w:rFonts w:ascii="Arial" w:hAnsi="Arial" w:cs="Arial"/>
+          <w:sz w:val="22"/>
+          <w:szCs w:val="22"/>
+        </w:rPr>
+        <w:t>Al Imam Al Islami</w:t>
+      </w:r>
+      <w:r>
+        <w:rPr>
+          <w:rFonts w:ascii="Arial" w:hAnsi="Arial" w:cs="Arial"/>
+          <w:sz w:val="22"/>
+          <w:szCs w:val="22"/>
+        </w:rPr>
+        <w:br/>
+      </w:r>
+      <w:r>
+        <w:rPr>
+          <w:rStyle w:val="Strong"/>
+          <w:rFonts w:ascii="Arial" w:hAnsi="Arial" w:cs="Arial"/>
+          <w:b w:val="0"/>
+          <w:bCs w:val="0"/>
+          <w:sz w:val="22"/>
+          <w:szCs w:val="22"/>
+        </w:rPr>
+        <w:t>Acara</w:t>
+      </w:r>
+      <w:r>
+        <w:rPr>
+          <w:rFonts w:ascii="Arial" w:hAnsi="Arial" w:cs="Arial"/>
+          <w:b/>
+          <w:bCs/>
+          <w:sz w:val="22"/>
+          <w:szCs w:val="22"/>
+        </w:rPr>
+        <w:t xml:space="preserve"> </w:t>
+      </w:r>
+      <w:r>
+        <w:rPr>
+          <w:rFonts w:ascii="Arial" w:hAnsi="Arial" w:cs="Arial"/>
+          <w:b/>
+          <w:bCs/>
+          <w:sz w:val="22"/>
+          <w:szCs w:val="22"/>
+        </w:rPr>
+        <w:tab/>
+      </w:r>
+      <w:r>
+        <w:rPr>
+          <w:rFonts w:ascii="Arial" w:hAnsi="Arial" w:cs="Arial"/>
+          <w:b/>
+          <w:bCs/>
+          <w:sz w:val="22"/>
+          <w:szCs w:val="22"/>
+        </w:rPr>
+        <w:tab/>
+      </w:r>
+      <w:r>
+        <w:rPr>
+          <w:rFonts w:ascii="Arial" w:hAnsi="Arial" w:cs="Arial"/>
+          <w:sz w:val="22"/>
+          <w:szCs w:val="22"/>
+        </w:rPr>
+        <w:t>: Welcome Day dan Kedatangan Santri Baru</w:t>
+      </w:r>
+    </w:p>
+    <w:p>
+      <w:pPr>
+        <w:spacing w:after="120" w:line="240" w:lineRule="auto"/>
+        <w:ind w:left="709" w:right="850" w:firstLine="567"/>
+        <w:jc w:val="both"/>
+        <w:rPr>
+          <w:rFonts w:ascii="Arial" w:hAnsi="Arial" w:cs="Arial"/>
+        </w:rPr>
+      </w:pPr>
+      <w:r>
+        <w:rPr>
+          <w:rFonts w:ascii="Arial" w:hAnsi="Arial" w:cs="Arial"/>
+        </w:rPr>
+        <w:t xml:space="preserve">Sehubungan dengan hal tersebut, kami mengharapkan kehadiran seluruh </w:t>
+      </w:r>
+      <w:r>
+        <w:rPr>
+          <w:rFonts w:ascii="Arial" w:hAnsi="Arial" w:cs="Arial"/>
+        </w:rPr>
+        <w:t xml:space="preserve">wali santri dan </w:t>
+      </w:r>
+      <w:r>
+        <w:rPr>
+          <w:rFonts w:ascii="Arial" w:hAnsi="Arial" w:cs="Arial"/>
+        </w:rPr>
+        <w:t xml:space="preserve">santri baru tepat waktu serta </w:t>
+      </w:r>
+      <w:r>
+        <w:rPr>
+          <w:rFonts w:ascii="Arial" w:hAnsi="Arial" w:cs="Arial"/>
+        </w:rPr>
+        <w:t>membawa seluruh berkas persyaratan sebagaimana tercantum di bawah ini.</w:t>
+      </w:r>
+    </w:p>
+    <w:p>
+      <w:pPr>
+        <w:spacing w:after="120" w:line="240" w:lineRule="auto"/>
+        <w:ind w:left="709" w:right="850" w:firstLine="567"/>
+        <w:jc w:val="both"/>
+        <w:rPr>
+          <w:rFonts w:ascii="Arial" w:hAnsi="Arial" w:cs="Arial"/>
+          <w:i/>
+          <w:iCs/>
+        </w:rPr>
+      </w:pPr>
+      <w:r>
+        <w:rPr>
+          <w:rFonts w:ascii="Arial" w:hAnsi="Arial" w:cs="Arial"/>
+        </w:rPr>
+        <w:t xml:space="preserve">Demikian atas perhatian dan kerjasama yang baik kami sampaikan terima kasih, </w:t>
+      </w:r>
+      <w:r>
+        <w:rPr>
+          <w:rFonts w:ascii="Arial" w:hAnsi="Arial" w:cs="Arial"/>
+          <w:i/>
+          <w:iCs/>
+        </w:rPr>
+        <w:t>wajazakumullahu khairan.</w:t>
+      </w:r>
+    </w:p>
+    <w:p>
+      <w:pPr>
+        <w:spacing w:after="0" w:line="276" w:lineRule="auto"/>
+        <w:jc w:val="both"/>
+        <w:rPr>
+          <w:rFonts w:ascii="Arial" w:hAnsi="Arial" w:cs="Arial"/>
+          <w:sz w:val="12"/>
+          <w:szCs w:val="12"/>
+          <w:lang w:val="sv-SE"/>
+        </w:rPr>
+      </w:pPr>
     </w:p>
     <w:p>
       <w:pPr>
@@ -138,7 +639,7 @@
           <w:szCs w:val="28"/>
           <w:rtl/>
         </w:rPr>
-        <w:t>بسم الله الرحمن الرحيم السلام عليكم ورحمة الله وبركاته</w:t>
+        <w:t>والسلام عليكم ورحمة الله وبركاته</w:t>
       </w:r>
     </w:p>
     <w:p>
@@ -147,559 +648,62 @@
         <w:jc w:val="center"/>
         <w:rPr>
           <w:rFonts w:ascii="Arial" w:hAnsi="Arial" w:cs="Arial"/>
-          <w:sz w:val="6"/>
-          <w:szCs w:val="6"/>
-          <w:rtl/>
-        </w:rPr>
-      </w:pPr>
-    </w:p>
-    <w:p>
-      <w:pPr>
-        <w:spacing w:after="120" w:line="240" w:lineRule="auto"/>
-        <w:ind w:left="709" w:right="850" w:firstLine="567"/>
-        <w:jc w:val="both"/>
-        <w:rPr>
-          <w:rFonts w:ascii="Arial" w:hAnsi="Arial" w:cs="Arial"/>
           <w:sz w:val="24"/>
           <w:szCs w:val="24"/>
         </w:rPr>
       </w:pPr>
-      <w:r>
-        <w:rPr>
-          <w:rFonts w:ascii="Arial" w:hAnsi="Arial" w:cs="Arial"/>
-          <w:sz w:val="24"/>
-          <w:szCs w:val="24"/>
-        </w:rPr>
-        <w:t>Alhamdulillah. Shalawat dan salam semoga senantiasa tercurahkan kepada Nabi Muhammad</w:t>
-      </w:r>
-      <w:r>
-        <w:rPr>
-          <w:rFonts w:ascii="Arial" w:hAnsi="Arial" w:cs="Arial"/>
-          <w:sz w:val="24"/>
-          <w:szCs w:val="24"/>
+    </w:p>
+    <w:bookmarkEnd w:id="0"/>
+    <w:p>
+      <w:pPr>
+        <w:spacing w:after="0" w:line="240" w:lineRule="auto"/>
+        <w:ind w:left="3119" w:firstLine="3544"/>
+        <w:rPr>
+          <w:rFonts w:ascii="Arial" w:hAnsi="Arial" w:cs="Arial"/>
+          <w:b/>
+          <w:bCs/>
+        </w:rPr>
+      </w:pPr>
+      <w:r>
+        <w:rPr>
+          <w:rFonts w:ascii="Arial" w:hAnsi="Arial" w:cs="Arial"/>
+        </w:rPr>
+        <w:t xml:space="preserve">Sukabumi, </w:t>
+      </w:r>
+      <w:r>
+        <w:rPr>
+          <w:rFonts w:ascii="Arial" w:hAnsi="Arial" w:cs="Arial"/>
+        </w:rPr>
+        <w:t>13 Muharram 1448 H.</w:t>
+      </w:r>
+    </w:p>
+    <w:p>
+      <w:pPr>
+        <w:spacing w:after="0" w:line="240" w:lineRule="auto"/>
+        <w:ind w:firstLine="7513"/>
+        <w:rPr>
+          <w:rFonts w:ascii="Arial" w:hAnsi="Arial" w:cs="Arial"/>
+        </w:rPr>
+      </w:pPr>
+      <w:r>
+        <w:rPr>
+          <w:rFonts w:ascii="Arial" w:hAnsi="Arial" w:cs="Arial"/>
+          <w:b/>
+          <w:bCs/>
+        </w:rPr>
+        <w:t xml:space="preserve">   </w:t>
+      </w:r>
+      <w:r>
+        <w:rPr>
+          <w:rFonts w:ascii="Arial" w:hAnsi="Arial" w:cs="Arial"/>
+          <w:b/>
+          <w:bCs/>
         </w:rPr>
         <w:t xml:space="preserve"> </w:t>
       </w:r>
       <w:r>
         <w:rPr>
           <w:rFonts w:ascii="Arial" w:hAnsi="Arial" w:cs="Arial"/>
-          <w:sz w:val="24"/>
-          <w:szCs w:val="24"/>
-          <w:rtl/>
-        </w:rPr>
-        <w:t>ﷺ</w:t>
-      </w:r>
-      <w:r>
-        <w:rPr>
-          <w:rFonts w:ascii="Arial" w:hAnsi="Arial" w:cs="Arial"/>
-          <w:sz w:val="24"/>
-          <w:szCs w:val="24"/>
-        </w:rPr>
-        <w:t>, keluarga, sahabat, serta orang-orang yang berpegang teguh dengan persaksiannya.</w:t>
-      </w:r>
-    </w:p>
-    <w:p>
-      <w:pPr>
-        <w:spacing w:after="120" w:line="240" w:lineRule="auto"/>
-        <w:ind w:left="709" w:right="850" w:firstLine="567"/>
-        <w:jc w:val="both"/>
-        <w:rPr>
-          <w:rFonts w:ascii="Arial" w:hAnsi="Arial" w:cs="Arial"/>
-          <w:sz w:val="24"/>
-          <w:szCs w:val="24"/>
-        </w:rPr>
-      </w:pPr>
-      <w:r>
-        <w:rPr>
-          <w:rFonts w:ascii="Arial" w:hAnsi="Arial" w:cs="Arial"/>
-          <w:sz w:val="24"/>
-          <w:szCs w:val="24"/>
-        </w:rPr>
-        <w:t xml:space="preserve">Sehubungan dengan akan dimulainya kegiatan pembelajaran dan pembinaan santri tahun ajaran 2026/2027, maka kami mengundang sekaligus memberitahukan kepada seluruh </w:t>
-      </w:r>
-      <w:r>
-        <w:rPr>
-          <w:rFonts w:ascii="Arial" w:hAnsi="Arial" w:cs="Arial"/>
-          <w:sz w:val="24"/>
-          <w:szCs w:val="24"/>
-        </w:rPr>
-        <w:t xml:space="preserve">Wali santri beserta </w:t>
-      </w:r>
-      <w:r>
-        <w:rPr>
-          <w:rFonts w:ascii="Arial" w:hAnsi="Arial" w:cs="Arial"/>
-          <w:sz w:val="24"/>
-          <w:szCs w:val="24"/>
-        </w:rPr>
-        <w:t xml:space="preserve">santri baru </w:t>
-      </w:r>
-      <w:r>
-        <w:rPr>
-          <w:rFonts w:ascii="Arial" w:hAnsi="Arial" w:cs="Arial"/>
-          <w:sz w:val="24"/>
-          <w:szCs w:val="24"/>
-        </w:rPr>
-        <w:t>Pesantren</w:t>
-      </w:r>
-      <w:r>
-        <w:rPr>
-          <w:rFonts w:ascii="Arial" w:hAnsi="Arial" w:cs="Arial"/>
-          <w:sz w:val="24"/>
-          <w:szCs w:val="24"/>
-        </w:rPr>
-        <w:t xml:space="preserve"> </w:t>
-      </w:r>
-      <w:r>
-        <w:rPr>
-          <w:rFonts w:ascii="Arial" w:hAnsi="Arial" w:cs="Arial"/>
-          <w:sz w:val="24"/>
-          <w:szCs w:val="24"/>
-        </w:rPr>
-        <w:t>Al Imam Al Islami</w:t>
-      </w:r>
-      <w:r>
-        <w:rPr>
-          <w:rFonts w:ascii="Arial" w:hAnsi="Arial" w:cs="Arial"/>
-          <w:sz w:val="24"/>
-          <w:szCs w:val="24"/>
-        </w:rPr>
-        <w:t xml:space="preserve"> beserta orang tua/wali untuk menghadiri kegiatan </w:t>
-      </w:r>
-      <w:r>
-        <w:rPr>
-          <w:rFonts w:ascii="Arial" w:hAnsi="Arial" w:cs="Arial"/>
-          <w:b/>
-          <w:bCs/>
-          <w:sz w:val="24"/>
-          <w:szCs w:val="24"/>
-        </w:rPr>
-        <w:t>Welcome Day</w:t>
-      </w:r>
-      <w:r>
-        <w:rPr>
-          <w:rFonts w:ascii="Arial" w:hAnsi="Arial" w:cs="Arial"/>
-          <w:sz w:val="24"/>
-          <w:szCs w:val="24"/>
-        </w:rPr>
-        <w:t xml:space="preserve"> yang insya Allah akan dilaksanakan pada:</w:t>
-      </w:r>
-    </w:p>
-    <w:p>
-      <w:pPr>
-        <w:pStyle w:val="NormalWeb"/>
-        <w:ind w:left="709" w:right="850"/>
-        <w:rPr>
-          <w:rFonts w:ascii="Arial" w:hAnsi="Arial" w:cs="Arial"/>
-        </w:rPr>
-      </w:pPr>
-      <w:r>
-        <w:rPr>
-          <w:rStyle w:val="Strong"/>
-          <w:rFonts w:ascii="Arial" w:hAnsi="Arial" w:cs="Arial"/>
-          <w:b w:val="0"/>
-          <w:bCs w:val="0"/>
-        </w:rPr>
-        <w:t>Hari</w:t>
-      </w:r>
-      <w:r>
-        <w:rPr>
-          <w:rStyle w:val="Strong"/>
-          <w:rFonts w:ascii="Arial" w:hAnsi="Arial" w:cs="Arial"/>
-          <w:b w:val="0"/>
-          <w:bCs w:val="0"/>
-        </w:rPr>
-        <w:t>,</w:t>
-      </w:r>
-      <w:r>
-        <w:rPr>
-          <w:rStyle w:val="Strong"/>
-          <w:rFonts w:ascii="Arial" w:hAnsi="Arial" w:cs="Arial"/>
-          <w:b w:val="0"/>
-          <w:bCs w:val="0"/>
-        </w:rPr>
-        <w:t>Tanggal</w:t>
-      </w:r>
-      <w:r>
-        <w:rPr>
-          <w:rFonts w:ascii="Arial" w:hAnsi="Arial" w:cs="Arial"/>
-        </w:rPr>
-        <w:t xml:space="preserve"> </w:t>
-      </w:r>
-      <w:r>
-        <w:rPr>
-          <w:rFonts w:ascii="Arial" w:hAnsi="Arial" w:cs="Arial"/>
-        </w:rPr>
-        <w:tab/>
-      </w:r>
-      <w:r>
-        <w:rPr>
-          <w:rFonts w:ascii="Arial" w:hAnsi="Arial" w:cs="Arial"/>
-        </w:rPr>
-        <w:t xml:space="preserve">: </w:t>
-      </w:r>
-      <w:r>
-        <w:rPr>
-          <w:rFonts w:ascii="Arial" w:hAnsi="Arial" w:cs="Arial"/>
-          <w:b/>
-          <w:bCs/>
-        </w:rPr>
-        <w:t>Sabtu</w:t>
-      </w:r>
-      <w:r>
-        <w:rPr>
-          <w:rFonts w:ascii="Arial" w:hAnsi="Arial" w:cs="Arial"/>
-          <w:b/>
-          <w:bCs/>
-        </w:rPr>
-        <w:t>, 1</w:t>
-      </w:r>
-      <w:r>
-        <w:rPr>
-          <w:rFonts w:ascii="Arial" w:hAnsi="Arial" w:cs="Arial"/>
-          <w:b/>
-          <w:bCs/>
-        </w:rPr>
-        <w:t>8</w:t>
-      </w:r>
-      <w:r>
-        <w:rPr>
-          <w:rFonts w:ascii="Arial" w:hAnsi="Arial" w:cs="Arial"/>
-          <w:b/>
-          <w:bCs/>
-        </w:rPr>
-        <w:t xml:space="preserve"> Juli 2026</w:t>
-      </w:r>
-      <w:r>
-        <w:rPr>
-          <w:rFonts w:ascii="Arial" w:hAnsi="Arial" w:cs="Arial"/>
-        </w:rPr>
-        <w:br/>
-      </w:r>
-      <w:r>
-        <w:rPr>
-          <w:rStyle w:val="Strong"/>
-          <w:rFonts w:ascii="Arial" w:hAnsi="Arial" w:cs="Arial"/>
-          <w:b w:val="0"/>
-          <w:bCs w:val="0"/>
-        </w:rPr>
-        <w:t>Waktu</w:t>
-      </w:r>
-      <w:r>
-        <w:rPr>
-          <w:rFonts w:ascii="Arial" w:hAnsi="Arial" w:cs="Arial"/>
-          <w:b/>
-          <w:bCs/>
-        </w:rPr>
-        <w:t xml:space="preserve"> </w:t>
-      </w:r>
-      <w:r>
-        <w:rPr>
-          <w:rFonts w:ascii="Arial" w:hAnsi="Arial" w:cs="Arial"/>
-          <w:b/>
-          <w:bCs/>
-        </w:rPr>
-        <w:tab/>
-      </w:r>
-      <w:r>
-        <w:rPr>
-          <w:rFonts w:ascii="Arial" w:hAnsi="Arial" w:cs="Arial"/>
-          <w:b/>
-          <w:bCs/>
-        </w:rPr>
-        <w:tab/>
-      </w:r>
-      <w:r>
-        <w:rPr>
-          <w:rFonts w:ascii="Arial" w:hAnsi="Arial" w:cs="Arial"/>
-        </w:rPr>
-        <w:t>: Pukul 06.30 WIB s.d. selesai</w:t>
-      </w:r>
-      <w:r>
-        <w:rPr>
-          <w:rFonts w:ascii="Arial" w:hAnsi="Arial" w:cs="Arial"/>
-        </w:rPr>
-        <w:br/>
-      </w:r>
-      <w:r>
-        <w:rPr>
-          <w:rStyle w:val="Strong"/>
-          <w:rFonts w:ascii="Arial" w:hAnsi="Arial" w:cs="Arial"/>
-          <w:b w:val="0"/>
-          <w:bCs w:val="0"/>
-        </w:rPr>
-        <w:t>Tempat</w:t>
-      </w:r>
-      <w:r>
-        <w:rPr>
-          <w:rFonts w:ascii="Arial" w:hAnsi="Arial" w:cs="Arial"/>
-          <w:b/>
-          <w:bCs/>
-        </w:rPr>
-        <w:t xml:space="preserve"> </w:t>
-      </w:r>
-      <w:r>
-        <w:rPr>
-          <w:rFonts w:ascii="Arial" w:hAnsi="Arial" w:cs="Arial"/>
-          <w:b/>
-          <w:bCs/>
-        </w:rPr>
-        <w:tab/>
-      </w:r>
-      <w:r>
-        <w:rPr>
-          <w:rFonts w:ascii="Arial" w:hAnsi="Arial" w:cs="Arial"/>
-        </w:rPr>
-        <w:t xml:space="preserve">: </w:t>
-      </w:r>
-      <w:r>
-        <w:rPr>
-          <w:rFonts w:ascii="Arial" w:hAnsi="Arial" w:cs="Arial"/>
-        </w:rPr>
-        <w:t>Pesantren</w:t>
-      </w:r>
-      <w:r>
-        <w:rPr>
-          <w:rFonts w:ascii="Arial" w:hAnsi="Arial" w:cs="Arial"/>
-        </w:rPr>
-        <w:t xml:space="preserve"> </w:t>
-      </w:r>
-      <w:r>
-        <w:rPr>
-          <w:rFonts w:ascii="Arial" w:hAnsi="Arial" w:cs="Arial"/>
-        </w:rPr>
-        <w:t>Al Imam Al Islami</w:t>
-      </w:r>
-      <w:r>
-        <w:rPr>
-          <w:rFonts w:ascii="Arial" w:hAnsi="Arial" w:cs="Arial"/>
-        </w:rPr>
-        <w:br/>
-      </w:r>
-      <w:r>
-        <w:rPr>
-          <w:rStyle w:val="Strong"/>
-          <w:rFonts w:ascii="Arial" w:hAnsi="Arial" w:cs="Arial"/>
-          <w:b w:val="0"/>
-          <w:bCs w:val="0"/>
-        </w:rPr>
-        <w:t>Acara</w:t>
-      </w:r>
-      <w:r>
-        <w:rPr>
-          <w:rFonts w:ascii="Arial" w:hAnsi="Arial" w:cs="Arial"/>
-          <w:b/>
-          <w:bCs/>
-        </w:rPr>
-        <w:t xml:space="preserve"> </w:t>
-      </w:r>
-      <w:r>
-        <w:rPr>
-          <w:rFonts w:ascii="Arial" w:hAnsi="Arial" w:cs="Arial"/>
-          <w:b/>
-          <w:bCs/>
-        </w:rPr>
-        <w:tab/>
-      </w:r>
-      <w:r>
-        <w:rPr>
-          <w:rFonts w:ascii="Arial" w:hAnsi="Arial" w:cs="Arial"/>
-          <w:b/>
-          <w:bCs/>
-        </w:rPr>
-        <w:tab/>
-      </w:r>
-      <w:r>
-        <w:rPr>
-          <w:rFonts w:ascii="Arial" w:hAnsi="Arial" w:cs="Arial"/>
-        </w:rPr>
-        <w:t>: Welcome Day dan Kedatangan Santri Baru</w:t>
-      </w:r>
-    </w:p>
-    <w:p>
-      <w:pPr>
-        <w:spacing w:after="120" w:line="240" w:lineRule="auto"/>
-        <w:ind w:left="709" w:right="850" w:firstLine="567"/>
-        <w:jc w:val="both"/>
-        <w:rPr>
-          <w:rFonts w:ascii="Arial" w:hAnsi="Arial" w:cs="Arial"/>
-          <w:sz w:val="24"/>
-          <w:szCs w:val="24"/>
-        </w:rPr>
-      </w:pPr>
-      <w:r>
-        <w:rPr>
-          <w:rFonts w:ascii="Arial" w:hAnsi="Arial" w:cs="Arial"/>
-          <w:sz w:val="24"/>
-          <w:szCs w:val="24"/>
-        </w:rPr>
-        <w:t xml:space="preserve">Sehubungan dengan hal tersebut, kami mengharapkan kehadiran seluruh </w:t>
-      </w:r>
-      <w:r>
-        <w:rPr>
-          <w:rFonts w:ascii="Arial" w:hAnsi="Arial" w:cs="Arial"/>
-          <w:sz w:val="24"/>
-          <w:szCs w:val="24"/>
-        </w:rPr>
-        <w:t xml:space="preserve">wali santri dan </w:t>
-      </w:r>
-      <w:r>
-        <w:rPr>
-          <w:rFonts w:ascii="Arial" w:hAnsi="Arial" w:cs="Arial"/>
-          <w:sz w:val="24"/>
-          <w:szCs w:val="24"/>
-        </w:rPr>
-        <w:t xml:space="preserve">santri baru tepat waktu serta </w:t>
-      </w:r>
-      <w:r>
-        <w:rPr>
-          <w:rFonts w:ascii="Arial" w:hAnsi="Arial" w:cs="Arial"/>
-          <w:sz w:val="24"/>
-          <w:szCs w:val="24"/>
-        </w:rPr>
-        <w:t>membawa seluruh berkas persyaratan sebagaimana tercantum di bawah ini.</w:t>
-      </w:r>
-    </w:p>
-    <w:p>
-      <w:pPr>
-        <w:spacing w:after="120" w:line="240" w:lineRule="auto"/>
-        <w:ind w:left="709" w:right="850" w:firstLine="567"/>
-        <w:jc w:val="both"/>
-        <w:rPr>
-          <w:rFonts w:ascii="Arial" w:hAnsi="Arial" w:cs="Arial"/>
-          <w:i/>
-          <w:iCs/>
-          <w:sz w:val="24"/>
-          <w:szCs w:val="24"/>
-        </w:rPr>
-      </w:pPr>
-      <w:r>
-        <w:rPr>
-          <w:rFonts w:ascii="Arial" w:hAnsi="Arial" w:cs="Arial"/>
-          <w:sz w:val="24"/>
-          <w:szCs w:val="24"/>
-        </w:rPr>
-        <w:t xml:space="preserve">Demikian atas perhatian dan kerjasama yang baik kami sampaikan terima kasih, </w:t>
-      </w:r>
-      <w:r>
-        <w:rPr>
-          <w:rFonts w:ascii="Arial" w:hAnsi="Arial" w:cs="Arial"/>
-          <w:i/>
-          <w:iCs/>
-          <w:sz w:val="24"/>
-          <w:szCs w:val="24"/>
-        </w:rPr>
-        <w:t>wajazakumullahu khairan.</w:t>
-      </w:r>
-    </w:p>
-    <w:p>
-      <w:pPr>
-        <w:spacing w:after="0" w:line="276" w:lineRule="auto"/>
-        <w:jc w:val="both"/>
-        <w:rPr>
-          <w:rFonts w:ascii="Arial" w:hAnsi="Arial" w:cs="Arial"/>
-          <w:sz w:val="14"/>
-          <w:szCs w:val="14"/>
-          <w:lang w:val="sv-SE"/>
-        </w:rPr>
-      </w:pPr>
-    </w:p>
-    <w:p>
-      <w:pPr>
-        <w:spacing w:after="0"/>
-        <w:jc w:val="center"/>
-        <w:rPr>
-          <w:rFonts w:ascii="Arial" w:hAnsi="Arial" w:cs="Arial"/>
-          <w:sz w:val="30"/>
-          <w:szCs w:val="30"/>
-          <w:rtl/>
-        </w:rPr>
-      </w:pPr>
-      <w:r>
-        <w:rPr>
-          <w:rFonts w:ascii="Arial" w:hAnsi="Arial" w:cs="Arial"/>
-          <w:sz w:val="30"/>
-          <w:szCs w:val="30"/>
-          <w:rtl/>
-        </w:rPr>
-        <w:t>والسلام عليكم ورحمة الله وبركاته</w:t>
-      </w:r>
-    </w:p>
-    <w:p>
-      <w:pPr>
-        <w:spacing w:after="0"/>
-        <w:jc w:val="center"/>
-        <w:rPr>
-          <w:rFonts w:ascii="Arial" w:hAnsi="Arial" w:cs="Arial"/>
-          <w:sz w:val="28"/>
-          <w:szCs w:val="28"/>
-        </w:rPr>
-      </w:pPr>
-    </w:p>
-    <w:bookmarkEnd w:id="0"/>
-    <w:p>
-      <w:pPr>
-        <w:spacing w:after="0" w:line="240" w:lineRule="auto"/>
-        <w:ind w:left="3119" w:firstLine="3544"/>
-        <w:rPr>
-          <w:rFonts w:ascii="Arial" w:hAnsi="Arial" w:cs="Arial"/>
-          <w:b/>
-          <w:bCs/>
-          <w:sz w:val="24"/>
-          <w:szCs w:val="24"/>
-        </w:rPr>
-      </w:pPr>
-      <w:r>
-        <w:rPr>
-          <w:rFonts w:ascii="Arial" w:hAnsi="Arial" w:cs="Arial"/>
-          <w:sz w:val="24"/>
-          <w:szCs w:val="24"/>
-        </w:rPr>
-        <w:t xml:space="preserve">Sukabumi, </w:t>
-      </w:r>
-      <w:r>
-        <w:rPr>
-          <w:rFonts w:ascii="Arial" w:hAnsi="Arial" w:cs="Arial"/>
-          <w:sz w:val="24"/>
-          <w:szCs w:val="24"/>
-        </w:rPr>
-        <w:t>13 Muharram 1448 H.</w:t>
-      </w:r>
-    </w:p>
-    <w:p>
-      <w:pPr>
-        <w:spacing w:after="0" w:line="240" w:lineRule="auto"/>
-        <w:ind w:firstLine="7513"/>
-        <w:rPr>
-          <w:rFonts w:ascii="Arial" w:hAnsi="Arial" w:cs="Arial"/>
-          <w:sz w:val="24"/>
-          <w:szCs w:val="24"/>
-        </w:rPr>
-      </w:pPr>
-      <w:r>
-        <w:rPr>
-          <w:rFonts w:ascii="Arial" w:hAnsi="Arial" w:cs="Arial"/>
-          <w:b/>
-          <w:bCs/>
-          <w:sz w:val="24"/>
-          <w:szCs w:val="24"/>
-        </w:rPr>
-        <w:t xml:space="preserve">   </w:t>
-      </w:r>
-      <w:r>
-        <w:rPr>
-          <w:rFonts w:ascii="Arial" w:hAnsi="Arial" w:cs="Arial"/>
-          <w:b/>
-          <w:bCs/>
-          <w:sz w:val="24"/>
-          <w:szCs w:val="24"/>
-        </w:rPr>
-        <w:t xml:space="preserve"> </w:t>
-      </w:r>
-      <w:r>
-        <w:rPr>
-          <w:rFonts w:ascii="Arial" w:hAnsi="Arial" w:cs="Arial"/>
-          <w:sz w:val="24"/>
-          <w:szCs w:val="24"/>
         </w:rPr>
         <w:t>28 Juni 2026 M.</w:t>
       </w:r>
@@ -735,16 +739,12 @@
               <w:jc w:val="center"/>
               <w:rPr>
                 <w:rFonts w:ascii="Arial" w:hAnsi="Arial" w:cs="Arial"/>
-                <w:sz w:val="24"/>
-                <w:szCs w:val="24"/>
               </w:rPr>
             </w:pPr>
             <w:r>
               <w:rPr>
                 <w:rFonts w:ascii="Arial" w:hAnsi="Arial" w:cs="Arial"/>
                 <w:noProof/>
-                <w:sz w:val="24"/>
-                <w:szCs w:val="24"/>
               </w:rPr>
               <w:drawing>
                 <wp:anchor distT="0" distB="0" distL="114300" distR="114300" simplePos="0" relativeHeight="251661312" behindDoc="1" locked="0" layoutInCell="1" allowOverlap="1" wp14:anchorId="13A08FF3" wp14:editId="580A68DB">
@@ -827,23 +827,17 @@
             <w:pPr>
               <w:rPr>
                 <w:rFonts w:ascii="Arial" w:hAnsi="Arial" w:cs="Arial"/>
-                <w:sz w:val="24"/>
-                <w:szCs w:val="24"/>
               </w:rPr>
             </w:pPr>
             <w:r>
               <w:rPr>
                 <w:rFonts w:ascii="Arial" w:hAnsi="Arial" w:cs="Arial"/>
-                <w:sz w:val="24"/>
-                <w:szCs w:val="24"/>
               </w:rPr>
               <w:t>Mudir Pesantren</w:t>
             </w:r>
             <w:r>
               <w:rPr>
                 <w:rFonts w:ascii="Arial" w:hAnsi="Arial" w:cs="Arial"/>
-                <w:sz w:val="24"/>
-                <w:szCs w:val="24"/>
               </w:rPr>
               <w:t>,</w:t>
             </w:r>
@@ -863,8 +857,6 @@
               <w:jc w:val="center"/>
               <w:rPr>
                 <w:rFonts w:ascii="Arial" w:hAnsi="Arial" w:cs="Arial"/>
-                <w:sz w:val="24"/>
-                <w:szCs w:val="24"/>
               </w:rPr>
             </w:pPr>
           </w:p>
@@ -878,16 +870,12 @@
               <w:jc w:val="center"/>
               <w:rPr>
                 <w:rFonts w:ascii="Arial" w:hAnsi="Arial" w:cs="Arial"/>
-                <w:sz w:val="24"/>
-                <w:szCs w:val="24"/>
               </w:rPr>
             </w:pPr>
             <w:r>
               <w:rPr>
                 <w:rFonts w:ascii="Arial" w:hAnsi="Arial" w:cs="Arial"/>
                 <w:noProof/>
-                <w:sz w:val="24"/>
-                <w:szCs w:val="24"/>
                 <w:rtl/>
                 <w:lang w:val="ar-SA"/>
               </w:rPr>
@@ -949,8 +937,6 @@
               <w:rPr>
                 <w:rFonts w:ascii="Arial" w:hAnsi="Arial" w:cs="Arial"/>
                 <w:noProof/>
-                <w:sz w:val="24"/>
-                <w:szCs w:val="24"/>
                 <w:rtl/>
                 <w:lang w:val="ar-SA"/>
               </w:rPr>
@@ -1036,8 +1022,6 @@
               <w:jc w:val="center"/>
               <w:rPr>
                 <w:rFonts w:ascii="Arial" w:hAnsi="Arial" w:cs="Arial"/>
-                <w:sz w:val="24"/>
-                <w:szCs w:val="24"/>
               </w:rPr>
             </w:pPr>
           </w:p>
@@ -1046,8 +1030,6 @@
               <w:jc w:val="center"/>
               <w:rPr>
                 <w:rFonts w:ascii="Arial" w:hAnsi="Arial" w:cs="Arial"/>
-                <w:sz w:val="24"/>
-                <w:szCs w:val="24"/>
               </w:rPr>
             </w:pPr>
           </w:p>
@@ -1056,8 +1038,6 @@
               <w:jc w:val="center"/>
               <w:rPr>
                 <w:rFonts w:ascii="Arial" w:hAnsi="Arial" w:cs="Arial"/>
-                <w:sz w:val="24"/>
-                <w:szCs w:val="24"/>
               </w:rPr>
             </w:pPr>
           </w:p>
@@ -1067,8 +1047,6 @@
                 <w:rFonts w:ascii="Arial" w:hAnsi="Arial" w:cs="Arial"/>
                 <w:b/>
                 <w:bCs/>
-                <w:sz w:val="24"/>
-                <w:szCs w:val="24"/>
               </w:rPr>
             </w:pPr>
             <w:r>
@@ -1076,8 +1054,6 @@
                 <w:rFonts w:ascii="Arial" w:hAnsi="Arial" w:cs="Arial"/>
                 <w:b/>
                 <w:bCs/>
-                <w:sz w:val="24"/>
-                <w:szCs w:val="24"/>
               </w:rPr>
               <w:t>Ust. Wahab Rajasam, M.Pd.</w:t>
             </w:r>
@@ -1093,8 +1069,6 @@
           <w:rFonts w:ascii="Arial" w:hAnsi="Arial" w:cs="Arial"/>
           <w:b/>
           <w:bCs/>
-          <w:sz w:val="24"/>
-          <w:szCs w:val="24"/>
           <w:u w:val="single"/>
         </w:rPr>
         <w:sectPr>
@@ -1114,8 +1088,7 @@
           <w:rFonts w:ascii="Arial" w:hAnsi="Arial" w:cs="Arial"/>
           <w:b/>
           <w:bCs/>
-          <w:sz w:val="28"/>
-          <w:szCs w:val="24"/>
+          <w:sz w:val="24"/>
           <w:u w:val="single"/>
         </w:rPr>
       </w:pPr>
@@ -1124,8 +1097,7 @@
           <w:rFonts w:ascii="Arial" w:hAnsi="Arial" w:cs="Arial"/>
           <w:b/>
           <w:bCs/>
-          <w:sz w:val="28"/>
-          <w:szCs w:val="24"/>
+          <w:sz w:val="24"/>
           <w:u w:val="single"/>
         </w:rPr>
         <w:lastRenderedPageBreak/>
@@ -1140,8 +1112,6 @@
           <w:rFonts w:ascii="Arial" w:hAnsi="Arial" w:cs="Arial"/>
           <w:b/>
           <w:bCs/>
-          <w:sz w:val="24"/>
-          <w:szCs w:val="24"/>
         </w:rPr>
       </w:pPr>
       <w:r>
@@ -1149,8 +1119,6 @@
           <w:rFonts w:ascii="Arial" w:hAnsi="Arial" w:cs="Arial"/>
           <w:b/>
           <w:bCs/>
-          <w:sz w:val="24"/>
-          <w:szCs w:val="24"/>
         </w:rPr>
         <w:t>Sabtu, 18 Juli 2026 | Pesantren Al Imam Al Islami</w:t>
       </w:r>
@@ -1163,8 +1131,6 @@
           <w:rFonts w:ascii="Arial" w:hAnsi="Arial" w:cs="Arial"/>
           <w:b/>
           <w:bCs/>
-          <w:sz w:val="24"/>
-          <w:szCs w:val="24"/>
         </w:rPr>
       </w:pPr>
     </w:p>
@@ -1175,8 +1141,6 @@
           <w:rFonts w:ascii="Arial" w:hAnsi="Arial" w:cs="Arial"/>
           <w:b/>
           <w:bCs/>
-          <w:sz w:val="24"/>
-          <w:szCs w:val="24"/>
         </w:rPr>
       </w:pPr>
       <w:r>
@@ -1184,8 +1148,6 @@
           <w:rFonts w:ascii="Arial" w:hAnsi="Arial" w:cs="Arial"/>
           <w:b/>
           <w:bCs/>
-          <w:sz w:val="24"/>
-          <w:szCs w:val="24"/>
         </w:rPr>
         <w:t>A. Berkas Persyaratan yang Wajib Dibawa</w:t>
       </w:r>
@@ -1197,16 +1159,12 @@
         <w:rPr>
           <w:rFonts w:ascii="Arial" w:hAnsi="Arial" w:cs="Arial"/>
           <w:bCs/>
-          <w:sz w:val="24"/>
-          <w:szCs w:val="24"/>
-        </w:rPr>
-      </w:pPr>
-      <w:r>
-        <w:rPr>
-          <w:rFonts w:ascii="Arial" w:hAnsi="Arial" w:cs="Arial"/>
-          <w:bCs/>
-          <w:sz w:val="24"/>
-          <w:szCs w:val="24"/>
+        </w:rPr>
+      </w:pPr>
+      <w:r>
+        <w:rPr>
+          <w:rFonts w:ascii="Arial" w:hAnsi="Arial" w:cs="Arial"/>
+          <w:bCs/>
         </w:rPr>
         <w:t>Seluruh berkas di bawah ini wajib dibawa pada saat kedatangan, dimasukkan ke dalam satu map, dan diserahkan kepada bagian pendaftaran:</w:t>
       </w:r>
@@ -1217,16 +1175,12 @@
         <w:rPr>
           <w:rFonts w:ascii="Arial" w:hAnsi="Arial" w:cs="Arial"/>
           <w:bCs/>
-          <w:sz w:val="24"/>
-          <w:szCs w:val="24"/>
-        </w:rPr>
-      </w:pPr>
-      <w:r>
-        <w:rPr>
-          <w:rFonts w:ascii="Arial" w:hAnsi="Arial" w:cs="Arial"/>
-          <w:bCs/>
-          <w:sz w:val="24"/>
-          <w:szCs w:val="24"/>
+        </w:rPr>
+      </w:pPr>
+      <w:r>
+        <w:rPr>
+          <w:rFonts w:ascii="Arial" w:hAnsi="Arial" w:cs="Arial"/>
+          <w:bCs/>
         </w:rPr>
         <w:t>1. Foto setengah badan terbaru berlatar belakang merah, ukuran 4 x 6 cm sebanyak 4 lembar</w:t>
       </w:r>
@@ -1237,16 +1191,12 @@
         <w:rPr>
           <w:rFonts w:ascii="Arial" w:hAnsi="Arial" w:cs="Arial"/>
           <w:bCs/>
-          <w:sz w:val="24"/>
-          <w:szCs w:val="24"/>
-        </w:rPr>
-      </w:pPr>
-      <w:r>
-        <w:rPr>
-          <w:rFonts w:ascii="Arial" w:hAnsi="Arial" w:cs="Arial"/>
-          <w:bCs/>
-          <w:sz w:val="24"/>
-          <w:szCs w:val="24"/>
+        </w:rPr>
+      </w:pPr>
+      <w:r>
+        <w:rPr>
+          <w:rFonts w:ascii="Arial" w:hAnsi="Arial" w:cs="Arial"/>
+          <w:bCs/>
         </w:rPr>
         <w:t>2. Fotokopi Kartu Keluarga (KK)</w:t>
       </w:r>
@@ -1257,16 +1207,12 @@
         <w:rPr>
           <w:rFonts w:ascii="Arial" w:hAnsi="Arial" w:cs="Arial"/>
           <w:bCs/>
-          <w:sz w:val="24"/>
-          <w:szCs w:val="24"/>
-        </w:rPr>
-      </w:pPr>
-      <w:r>
-        <w:rPr>
-          <w:rFonts w:ascii="Arial" w:hAnsi="Arial" w:cs="Arial"/>
-          <w:bCs/>
-          <w:sz w:val="24"/>
-          <w:szCs w:val="24"/>
+        </w:rPr>
+      </w:pPr>
+      <w:r>
+        <w:rPr>
+          <w:rFonts w:ascii="Arial" w:hAnsi="Arial" w:cs="Arial"/>
+          <w:bCs/>
         </w:rPr>
         <w:t>3. Fotokopi Akta Kelahiran</w:t>
       </w:r>
@@ -1277,16 +1223,12 @@
         <w:rPr>
           <w:rFonts w:ascii="Arial" w:hAnsi="Arial" w:cs="Arial"/>
           <w:bCs/>
-          <w:sz w:val="24"/>
-          <w:szCs w:val="24"/>
-        </w:rPr>
-      </w:pPr>
-      <w:r>
-        <w:rPr>
-          <w:rFonts w:ascii="Arial" w:hAnsi="Arial" w:cs="Arial"/>
-          <w:bCs/>
-          <w:sz w:val="24"/>
-          <w:szCs w:val="24"/>
+        </w:rPr>
+      </w:pPr>
+      <w:r>
+        <w:rPr>
+          <w:rFonts w:ascii="Arial" w:hAnsi="Arial" w:cs="Arial"/>
+          <w:bCs/>
         </w:rPr>
         <w:t>4. Fotokopi rapor semester ganjil terakhir</w:t>
       </w:r>
@@ -1297,16 +1239,12 @@
         <w:rPr>
           <w:rFonts w:ascii="Arial" w:hAnsi="Arial" w:cs="Arial"/>
           <w:bCs/>
-          <w:sz w:val="24"/>
-          <w:szCs w:val="24"/>
-        </w:rPr>
-      </w:pPr>
-      <w:r>
-        <w:rPr>
-          <w:rFonts w:ascii="Arial" w:hAnsi="Arial" w:cs="Arial"/>
-          <w:bCs/>
-          <w:sz w:val="24"/>
-          <w:szCs w:val="24"/>
+        </w:rPr>
+      </w:pPr>
+      <w:r>
+        <w:rPr>
+          <w:rFonts w:ascii="Arial" w:hAnsi="Arial" w:cs="Arial"/>
+          <w:bCs/>
         </w:rPr>
         <w:t>5. Fotokopi rapor semester genap terakhir</w:t>
       </w:r>
@@ -1317,16 +1255,12 @@
         <w:rPr>
           <w:rFonts w:ascii="Arial" w:hAnsi="Arial" w:cs="Arial"/>
           <w:bCs/>
-          <w:sz w:val="24"/>
-          <w:szCs w:val="24"/>
-        </w:rPr>
-      </w:pPr>
-      <w:r>
-        <w:rPr>
-          <w:rFonts w:ascii="Arial" w:hAnsi="Arial" w:cs="Arial"/>
-          <w:bCs/>
-          <w:sz w:val="24"/>
-          <w:szCs w:val="24"/>
+        </w:rPr>
+      </w:pPr>
+      <w:r>
+        <w:rPr>
+          <w:rFonts w:ascii="Arial" w:hAnsi="Arial" w:cs="Arial"/>
+          <w:bCs/>
         </w:rPr>
         <w:t>6. Print-out bukti NISN (Nomor Induk Siswa Nasional)</w:t>
       </w:r>
@@ -1337,16 +1271,12 @@
         <w:rPr>
           <w:rFonts w:ascii="Arial" w:hAnsi="Arial" w:cs="Arial"/>
           <w:bCs/>
-          <w:sz w:val="24"/>
-          <w:szCs w:val="24"/>
-        </w:rPr>
-      </w:pPr>
-      <w:r>
-        <w:rPr>
-          <w:rFonts w:ascii="Arial" w:hAnsi="Arial" w:cs="Arial"/>
-          <w:bCs/>
-          <w:sz w:val="24"/>
-          <w:szCs w:val="24"/>
+        </w:rPr>
+      </w:pPr>
+      <w:r>
+        <w:rPr>
+          <w:rFonts w:ascii="Arial" w:hAnsi="Arial" w:cs="Arial"/>
+          <w:bCs/>
         </w:rPr>
         <w:t>7. Surat Keterangan Sehat (format panitia) - ASLI</w:t>
       </w:r>
@@ -1357,16 +1287,12 @@
         <w:rPr>
           <w:rFonts w:ascii="Arial" w:hAnsi="Arial" w:cs="Arial"/>
           <w:bCs/>
-          <w:sz w:val="24"/>
-          <w:szCs w:val="24"/>
-        </w:rPr>
-      </w:pPr>
-      <w:r>
-        <w:rPr>
-          <w:rFonts w:ascii="Arial" w:hAnsi="Arial" w:cs="Arial"/>
-          <w:bCs/>
-          <w:sz w:val="24"/>
-          <w:szCs w:val="24"/>
+        </w:rPr>
+      </w:pPr>
+      <w:r>
+        <w:rPr>
+          <w:rFonts w:ascii="Arial" w:hAnsi="Arial" w:cs="Arial"/>
+          <w:bCs/>
         </w:rPr>
         <w:t>8. Surat Pernyataan Bebas dari Perilaku Buruk (format panitia) - ASLI</w:t>
       </w:r>
@@ -1377,16 +1303,12 @@
         <w:rPr>
           <w:rFonts w:ascii="Arial" w:hAnsi="Arial" w:cs="Arial"/>
           <w:bCs/>
-          <w:sz w:val="24"/>
-          <w:szCs w:val="24"/>
-        </w:rPr>
-      </w:pPr>
-      <w:r>
-        <w:rPr>
-          <w:rFonts w:ascii="Arial" w:hAnsi="Arial" w:cs="Arial"/>
-          <w:bCs/>
-          <w:sz w:val="24"/>
-          <w:szCs w:val="24"/>
+        </w:rPr>
+      </w:pPr>
+      <w:r>
+        <w:rPr>
+          <w:rFonts w:ascii="Arial" w:hAnsi="Arial" w:cs="Arial"/>
+          <w:bCs/>
         </w:rPr>
         <w:t>9. Pakta Integritas Calon Santri (format panitia) - ASLI</w:t>
       </w:r>
@@ -1397,16 +1319,12 @@
         <w:rPr>
           <w:rFonts w:ascii="Arial" w:hAnsi="Arial" w:cs="Arial"/>
           <w:bCs/>
-          <w:sz w:val="24"/>
-          <w:szCs w:val="24"/>
-        </w:rPr>
-      </w:pPr>
-      <w:r>
-        <w:rPr>
-          <w:rFonts w:ascii="Arial" w:hAnsi="Arial" w:cs="Arial"/>
-          <w:bCs/>
-          <w:sz w:val="24"/>
-          <w:szCs w:val="24"/>
+        </w:rPr>
+      </w:pPr>
+      <w:r>
+        <w:rPr>
+          <w:rFonts w:ascii="Arial" w:hAnsi="Arial" w:cs="Arial"/>
+          <w:bCs/>
         </w:rPr>
         <w:t>10. Pakta Integritas Calon Orang Tua/Wali Santri (format panitia) - ASLI</w:t>
       </w:r>
@@ -1417,8 +1335,6 @@
         <w:rPr>
           <w:rFonts w:ascii="Arial" w:hAnsi="Arial" w:cs="Arial"/>
           <w:bCs/>
-          <w:sz w:val="24"/>
-          <w:szCs w:val="24"/>
         </w:rPr>
       </w:pPr>
     </w:p>
@@ -1430,7 +1346,7 @@
           <w:rFonts w:ascii="Arial" w:hAnsi="Arial" w:cs="Arial"/>
           <w:bCs/>
           <w:i/>
-          <w:szCs w:val="24"/>
+          <w:sz w:val="20"/>
         </w:rPr>
       </w:pPr>
       <w:r>
@@ -1438,7 +1354,7 @@
           <w:rFonts w:ascii="Arial" w:hAnsi="Arial" w:cs="Arial"/>
           <w:bCs/>
           <w:i/>
-          <w:szCs w:val="24"/>
+          <w:sz w:val="20"/>
         </w:rPr>
         <w:t>*Berkas yang bertanda ASLI menggunakan format resmi dari panitia yang telah dibagikan sebelumnya.*</w:t>
       </w:r>
@@ -1451,7 +1367,7 @@
           <w:rFonts w:ascii="Arial" w:hAnsi="Arial" w:cs="Arial"/>
           <w:bCs/>
           <w:i/>
-          <w:szCs w:val="24"/>
+          <w:sz w:val="20"/>
         </w:rPr>
       </w:pPr>
     </w:p>
@@ -1463,7 +1379,7 @@
           <w:rFonts w:ascii="Arial" w:hAnsi="Arial" w:cs="Arial"/>
           <w:bCs/>
           <w:i/>
-          <w:szCs w:val="24"/>
+          <w:sz w:val="20"/>
         </w:rPr>
       </w:pPr>
     </w:p>
@@ -1474,8 +1390,6 @@
           <w:rFonts w:ascii="Arial" w:hAnsi="Arial" w:cs="Arial"/>
           <w:b/>
           <w:bCs/>
-          <w:sz w:val="24"/>
-          <w:szCs w:val="24"/>
         </w:rPr>
       </w:pPr>
       <w:r>
@@ -1483,8 +1397,6 @@
           <w:rFonts w:ascii="Arial" w:hAnsi="Arial" w:cs="Arial"/>
           <w:b/>
           <w:bCs/>
-          <w:sz w:val="24"/>
-          <w:szCs w:val="24"/>
         </w:rPr>
         <w:t>B. Tata Cara dan Alur Kegiatan</w:t>
       </w:r>
@@ -1495,16 +1407,12 @@
         <w:rPr>
           <w:rFonts w:ascii="Arial" w:hAnsi="Arial" w:cs="Arial"/>
           <w:bCs/>
-          <w:sz w:val="24"/>
-          <w:szCs w:val="24"/>
-        </w:rPr>
-      </w:pPr>
-      <w:r>
-        <w:rPr>
-          <w:rFonts w:ascii="Arial" w:hAnsi="Arial" w:cs="Arial"/>
-          <w:bCs/>
-          <w:sz w:val="24"/>
-          <w:szCs w:val="24"/>
+        </w:rPr>
+      </w:pPr>
+      <w:r>
+        <w:rPr>
+          <w:rFonts w:ascii="Arial" w:hAnsi="Arial" w:cs="Arial"/>
+          <w:bCs/>
         </w:rPr>
         <w:t>1. Berseragam: baju Koko/Kemeja putih, celana kain hitam, songkok nasional hitam.</w:t>
       </w:r>
@@ -1515,16 +1423,12 @@
         <w:rPr>
           <w:rFonts w:ascii="Arial" w:hAnsi="Arial" w:cs="Arial"/>
           <w:bCs/>
-          <w:sz w:val="24"/>
-          <w:szCs w:val="24"/>
-        </w:rPr>
-      </w:pPr>
-      <w:r>
-        <w:rPr>
-          <w:rFonts w:ascii="Arial" w:hAnsi="Arial" w:cs="Arial"/>
-          <w:bCs/>
-          <w:sz w:val="24"/>
-          <w:szCs w:val="24"/>
+        </w:rPr>
+      </w:pPr>
+      <w:r>
+        <w:rPr>
+          <w:rFonts w:ascii="Arial" w:hAnsi="Arial" w:cs="Arial"/>
+          <w:bCs/>
         </w:rPr>
         <w:t>2. Kursi di ruang acara utama dan kupon konsumsi/snack hanya disediakan untuk 3 orang (santri bersama 2 wali/pendamping terdekat). Pengantar lain diperkenankan masuk ke area pesantren, namun tidak diperkenankan memasuki ruang acara utama dan tidak mendapatkan kupon konsumsi.</w:t>
       </w:r>
@@ -1535,16 +1439,12 @@
         <w:rPr>
           <w:rFonts w:ascii="Arial" w:hAnsi="Arial" w:cs="Arial"/>
           <w:bCs/>
-          <w:sz w:val="24"/>
-          <w:szCs w:val="24"/>
-        </w:rPr>
-      </w:pPr>
-      <w:r>
-        <w:rPr>
-          <w:rFonts w:ascii="Arial" w:hAnsi="Arial" w:cs="Arial"/>
-          <w:bCs/>
-          <w:sz w:val="24"/>
-          <w:szCs w:val="24"/>
+        </w:rPr>
+      </w:pPr>
+      <w:r>
+        <w:rPr>
+          <w:rFonts w:ascii="Arial" w:hAnsi="Arial" w:cs="Arial"/>
+          <w:bCs/>
         </w:rPr>
         <w:t xml:space="preserve">3. Konfirmasi kehadiran dengan mengisi link berikut: </w:t>
       </w:r>
@@ -1552,8 +1452,6 @@
         <w:rPr>
           <w:rFonts w:ascii="Arial" w:hAnsi="Arial" w:cs="Arial"/>
           <w:bCs/>
-          <w:sz w:val="24"/>
-          <w:szCs w:val="24"/>
         </w:rPr>
         <w:t>Menu Welcome Day di Dashboard Pendaftar</w:t>
       </w:r>
@@ -1564,16 +1462,12 @@
         <w:rPr>
           <w:rFonts w:ascii="Arial" w:hAnsi="Arial" w:cs="Arial"/>
           <w:bCs/>
-          <w:sz w:val="24"/>
-          <w:szCs w:val="24"/>
-        </w:rPr>
-      </w:pPr>
-      <w:r>
-        <w:rPr>
-          <w:rFonts w:ascii="Arial" w:hAnsi="Arial" w:cs="Arial"/>
-          <w:bCs/>
-          <w:sz w:val="24"/>
-          <w:szCs w:val="24"/>
+        </w:rPr>
+      </w:pPr>
+      <w:r>
+        <w:rPr>
+          <w:rFonts w:ascii="Arial" w:hAnsi="Arial" w:cs="Arial"/>
+          <w:bCs/>
         </w:rPr>
         <w:t>4. Santri yang membawa kendaraan pribadi tidak diperkenankan menurunkan barang bawaan hingga acara Welcome Day selesai.</w:t>
       </w:r>
@@ -1584,16 +1478,12 @@
         <w:rPr>
           <w:rFonts w:ascii="Arial" w:hAnsi="Arial" w:cs="Arial"/>
           <w:bCs/>
-          <w:sz w:val="24"/>
-          <w:szCs w:val="24"/>
-        </w:rPr>
-      </w:pPr>
-      <w:r>
-        <w:rPr>
-          <w:rFonts w:ascii="Arial" w:hAnsi="Arial" w:cs="Arial"/>
-          <w:bCs/>
-          <w:sz w:val="24"/>
-          <w:szCs w:val="24"/>
+        </w:rPr>
+      </w:pPr>
+      <w:r>
+        <w:rPr>
+          <w:rFonts w:ascii="Arial" w:hAnsi="Arial" w:cs="Arial"/>
+          <w:bCs/>
         </w:rPr>
         <w:t>5. Santri yang tidak berkendaraan pribadi menempatkan barang bawaan di area masjid yang telah ditentukan.</w:t>
       </w:r>
@@ -1604,16 +1494,12 @@
         <w:rPr>
           <w:rFonts w:ascii="Arial" w:hAnsi="Arial" w:cs="Arial"/>
           <w:bCs/>
-          <w:sz w:val="24"/>
-          <w:szCs w:val="24"/>
-        </w:rPr>
-      </w:pPr>
-      <w:r>
-        <w:rPr>
-          <w:rFonts w:ascii="Arial" w:hAnsi="Arial" w:cs="Arial"/>
-          <w:bCs/>
-          <w:sz w:val="24"/>
-          <w:szCs w:val="24"/>
+        </w:rPr>
+      </w:pPr>
+      <w:r>
+        <w:rPr>
+          <w:rFonts w:ascii="Arial" w:hAnsi="Arial" w:cs="Arial"/>
+          <w:bCs/>
         </w:rPr>
         <w:t>6. Melakukan registrasi sebelum memasuki area acara.</w:t>
       </w:r>
@@ -1624,16 +1510,12 @@
         <w:rPr>
           <w:rFonts w:ascii="Arial" w:hAnsi="Arial" w:cs="Arial"/>
           <w:bCs/>
-          <w:sz w:val="24"/>
-          <w:szCs w:val="24"/>
-        </w:rPr>
-      </w:pPr>
-      <w:r>
-        <w:rPr>
-          <w:rFonts w:ascii="Arial" w:hAnsi="Arial" w:cs="Arial"/>
-          <w:bCs/>
-          <w:sz w:val="24"/>
-          <w:szCs w:val="24"/>
+        </w:rPr>
+      </w:pPr>
+      <w:r>
+        <w:rPr>
+          <w:rFonts w:ascii="Arial" w:hAnsi="Arial" w:cs="Arial"/>
+          <w:bCs/>
         </w:rPr>
         <w:t>7. Setelah registrasi, santri dan orang tua memasuki tempat acara.</w:t>
       </w:r>
@@ -1644,16 +1526,12 @@
         <w:rPr>
           <w:rFonts w:ascii="Arial" w:hAnsi="Arial" w:cs="Arial"/>
           <w:bCs/>
-          <w:sz w:val="24"/>
-          <w:szCs w:val="24"/>
-        </w:rPr>
-      </w:pPr>
-      <w:r>
-        <w:rPr>
-          <w:rFonts w:ascii="Arial" w:hAnsi="Arial" w:cs="Arial"/>
-          <w:bCs/>
-          <w:sz w:val="24"/>
-          <w:szCs w:val="24"/>
+        </w:rPr>
+      </w:pPr>
+      <w:r>
+        <w:rPr>
+          <w:rFonts w:ascii="Arial" w:hAnsi="Arial" w:cs="Arial"/>
+          <w:bCs/>
         </w:rPr>
         <w:t>8. Setelah acara bersama tamu undangan, orang tua dan santri mengikuti sarasehan tentang peraturan, mekanisme, dan prosedur santri di Pesantren Al Imam Al Islami.</w:t>
       </w:r>
@@ -1664,16 +1542,12 @@
         <w:rPr>
           <w:rFonts w:ascii="Arial" w:hAnsi="Arial" w:cs="Arial"/>
           <w:bCs/>
-          <w:sz w:val="24"/>
-          <w:szCs w:val="24"/>
-        </w:rPr>
-      </w:pPr>
-      <w:r>
-        <w:rPr>
-          <w:rFonts w:ascii="Arial" w:hAnsi="Arial" w:cs="Arial"/>
-          <w:bCs/>
-          <w:sz w:val="24"/>
-          <w:szCs w:val="24"/>
+        </w:rPr>
+      </w:pPr>
+      <w:r>
+        <w:rPr>
+          <w:rFonts w:ascii="Arial" w:hAnsi="Arial" w:cs="Arial"/>
+          <w:bCs/>
         </w:rPr>
         <w:t>9. Makan siang dibagikan di depan ruang acara dengan menukarkan kupon.</w:t>
       </w:r>
@@ -1684,16 +1558,12 @@
         <w:rPr>
           <w:rFonts w:ascii="Arial" w:hAnsi="Arial" w:cs="Arial"/>
           <w:bCs/>
-          <w:sz w:val="24"/>
-          <w:szCs w:val="24"/>
-        </w:rPr>
-      </w:pPr>
-      <w:r>
-        <w:rPr>
-          <w:rFonts w:ascii="Arial" w:hAnsi="Arial" w:cs="Arial"/>
-          <w:bCs/>
-          <w:sz w:val="24"/>
-          <w:szCs w:val="24"/>
+        </w:rPr>
+      </w:pPr>
+      <w:r>
+        <w:rPr>
+          <w:rFonts w:ascii="Arial" w:hAnsi="Arial" w:cs="Arial"/>
+          <w:bCs/>
         </w:rPr>
         <w:t>10. Setelah acara berakhir, santri memasuki asrama dan mengkondisikan barang bawaan dibantu oleh para ustadz.</w:t>
       </w:r>
@@ -1704,33 +1574,15 @@
         <w:rPr>
           <w:rFonts w:ascii="Arial" w:hAnsi="Arial" w:cs="Arial"/>
           <w:bCs/>
-          <w:sz w:val="24"/>
-          <w:szCs w:val="24"/>
-        </w:rPr>
-      </w:pPr>
-      <w:r>
-        <w:rPr>
-          <w:rFonts w:ascii="Arial" w:hAnsi="Arial" w:cs="Arial"/>
-          <w:bCs/>
-          <w:sz w:val="24"/>
-          <w:szCs w:val="24"/>
+        </w:rPr>
+      </w:pPr>
+      <w:r>
+        <w:rPr>
+          <w:rFonts w:ascii="Arial" w:hAnsi="Arial" w:cs="Arial"/>
+          <w:bCs/>
         </w:rPr>
         <w:t>11. Orang tua hanya diperkenankan membersamai santri hingga sore hari pukul 17.00 WIB.</w:t>
       </w:r>
-    </w:p>
-    <w:p>
-      <w:pPr>
-        <w:spacing w:after="0" w:line="240" w:lineRule="auto"/>
-        <w:jc w:val="both"/>
-        <w:rPr>
-          <w:rFonts w:ascii="Arial" w:hAnsi="Arial" w:cs="Arial"/>
-          <w:b/>
-          <w:bCs/>
-          <w:sz w:val="24"/>
-          <w:szCs w:val="24"/>
-          <w:u w:val="single"/>
-        </w:rPr>
-      </w:pPr>
     </w:p>
     <w:sectPr>
       <w:pgSz w:w="11906" w:h="16838" w:code="9"/>

</xml_diff>

<commit_message>
chore: Update Surat Pemberitahuan Kedatangan with clickable link and wording fixes
</commit_message>
<xml_diff>
--- a/04-Surat Pemberitahuan Kedatangan Santri Baru 2026-2027-REVISED.docx
+++ b/04-Surat Pemberitahuan Kedatangan Santri Baru 2026-2027-REVISED.docx
@@ -209,13 +209,13 @@
         <w:rPr>
           <w:rFonts w:ascii="Arial" w:hAnsi="Arial" w:cs="Arial"/>
         </w:rPr>
-        <w:t xml:space="preserve">Wali santri beserta </w:t>
-      </w:r>
-      <w:r>
-        <w:rPr>
-          <w:rFonts w:ascii="Arial" w:hAnsi="Arial" w:cs="Arial"/>
-        </w:rPr>
-        <w:t xml:space="preserve">santri baru </w:t>
+        <w:t>Calon santri baru</w:t>
+      </w:r>
+      <w:r>
+        <w:rPr>
+          <w:rFonts w:ascii="Arial" w:hAnsi="Arial" w:cs="Arial"/>
+        </w:rPr>
+        <w:t xml:space="preserve"> </w:t>
       </w:r>
       <w:r>
         <w:rPr>
@@ -1453,7 +1453,7 @@
           <w:rFonts w:ascii="Arial" w:hAnsi="Arial" w:cs="Arial"/>
           <w:bCs/>
         </w:rPr>
-        <w:t>Menu Welcome Day di Dashboard Pendaftar</w:t>
+        <w:t>Https://ppdb.pesantren-alimam.com/dashboard/pendaftar/welcome-day</w:t>
       </w:r>
     </w:p>
     <w:p>

</xml_diff>

<commit_message>
chore: Update Surat Pemberitahuan PDF with clickable hyperlink
</commit_message>
<xml_diff>
--- a/04-Surat Pemberitahuan Kedatangan Santri Baru 2026-2027-REVISED.docx
+++ b/04-Surat Pemberitahuan Kedatangan Santri Baru 2026-2027-REVISED.docx
@@ -1448,13 +1448,16 @@
         </w:rPr>
         <w:t xml:space="preserve">3. Konfirmasi kehadiran dengan mengisi link berikut: </w:t>
       </w:r>
-      <w:r>
-        <w:rPr>
-          <w:rFonts w:ascii="Arial" w:hAnsi="Arial" w:cs="Arial"/>
-          <w:bCs/>
-        </w:rPr>
-        <w:t>Https://ppdb.pesantren-alimam.com/dashboard/pendaftar/welcome-day</w:t>
-      </w:r>
+      <w:hyperlink r:id="rId13" w:history="1">
+        <w:r>
+          <w:rPr>
+            <w:rStyle w:val="Hyperlink"/>
+            <w:rFonts w:ascii="Arial" w:hAnsi="Arial" w:cs="Arial"/>
+            <w:bCs/>
+          </w:rPr>
+          <w:t>https://ppdb.pesantren-alimam.com/dashboard/pendaftar/welcome-day</w:t>
+        </w:r>
+      </w:hyperlink>
     </w:p>
     <w:p>
       <w:pPr>
@@ -3168,12 +3171,23 @@
     <w:name w:val="Hyperlink"/>
     <w:basedOn w:val="DefaultParagraphFont"/>
     <w:uiPriority w:val="99"/>
-    <w:semiHidden/>
     <w:unhideWhenUsed/>
     <w:rsid w:val="00E67EF9"/>
     <w:rPr>
       <w:color w:val="0563C1" w:themeColor="hyperlink"/>
       <w:u w:val="single"/>
+    </w:rPr>
+  </w:style>
+  <w:style w:type="character" w:styleId="UnresolvedMention">
+    <w:name w:val="Unresolved Mention"/>
+    <w:basedOn w:val="DefaultParagraphFont"/>
+    <w:uiPriority w:val="99"/>
+    <w:semiHidden/>
+    <w:unhideWhenUsed/>
+    <w:rsid w:val="00771D85"/>
+    <w:rPr>
+      <w:color w:val="605E5C"/>
+      <w:shd w:val="clear" w:color="auto" w:fill="E1DFDD"/>
     </w:rPr>
   </w:style>
 </w:styles>

</xml_diff>

<commit_message>
chore: Apply justify alignment to all DOCX letters and update PDFs
</commit_message>
<xml_diff>
--- a/04-Surat Pemberitahuan Kedatangan Santri Baru 2026-2027-REVISED.docx
+++ b/04-Surat Pemberitahuan Kedatangan Santri Baru 2026-2027-REVISED.docx
@@ -114,6 +114,7 @@
       <w:pPr>
         <w:spacing w:after="0"/>
         <w:ind w:left="1701"/>
+        <w:jc w:val="both"/>
         <w:rPr>
           <w:rFonts w:ascii="Arial" w:hAnsi="Arial" w:cs="Arial"/>
           <w:sz w:val="14"/>
@@ -260,6 +261,7 @@
       <w:pPr>
         <w:pStyle w:val="NormalWeb"/>
         <w:ind w:left="709" w:right="850"/>
+        <w:jc w:val="both"/>
         <w:rPr>
           <w:rFonts w:ascii="Arial" w:hAnsi="Arial" w:cs="Arial"/>
           <w:sz w:val="22"/>
@@ -658,6 +660,7 @@
       <w:pPr>
         <w:spacing w:after="0" w:line="240" w:lineRule="auto"/>
         <w:ind w:left="3119" w:firstLine="3544"/>
+        <w:jc w:val="both"/>
         <w:rPr>
           <w:rFonts w:ascii="Arial" w:hAnsi="Arial" w:cs="Arial"/>
           <w:b/>
@@ -681,6 +684,7 @@
       <w:pPr>
         <w:spacing w:after="0" w:line="240" w:lineRule="auto"/>
         <w:ind w:firstLine="7513"/>
+        <w:jc w:val="both"/>
         <w:rPr>
           <w:rFonts w:ascii="Arial" w:hAnsi="Arial" w:cs="Arial"/>
         </w:rPr>
@@ -825,6 +829,7 @@
           </w:tcPr>
           <w:p>
             <w:pPr>
+              <w:jc w:val="both"/>
               <w:rPr>
                 <w:rFonts w:ascii="Arial" w:hAnsi="Arial" w:cs="Arial"/>
               </w:rPr>
@@ -1043,6 +1048,7 @@
           </w:p>
           <w:p>
             <w:pPr>
+              <w:jc w:val="both"/>
               <w:rPr>
                 <w:rFonts w:ascii="Arial" w:hAnsi="Arial" w:cs="Arial"/>
                 <w:b/>
@@ -1137,6 +1143,7 @@
     <w:p>
       <w:pPr>
         <w:spacing w:after="0" w:line="240" w:lineRule="auto"/>
+        <w:jc w:val="both"/>
         <w:rPr>
           <w:rFonts w:ascii="Arial" w:hAnsi="Arial" w:cs="Arial"/>
           <w:b/>
@@ -1172,6 +1179,7 @@
     <w:p>
       <w:pPr>
         <w:spacing w:after="0" w:line="240" w:lineRule="auto"/>
+        <w:jc w:val="both"/>
         <w:rPr>
           <w:rFonts w:ascii="Arial" w:hAnsi="Arial" w:cs="Arial"/>
           <w:bCs/>
@@ -1188,6 +1196,7 @@
     <w:p>
       <w:pPr>
         <w:spacing w:after="0" w:line="240" w:lineRule="auto"/>
+        <w:jc w:val="both"/>
         <w:rPr>
           <w:rFonts w:ascii="Arial" w:hAnsi="Arial" w:cs="Arial"/>
           <w:bCs/>
@@ -1204,6 +1213,7 @@
     <w:p>
       <w:pPr>
         <w:spacing w:after="0" w:line="240" w:lineRule="auto"/>
+        <w:jc w:val="both"/>
         <w:rPr>
           <w:rFonts w:ascii="Arial" w:hAnsi="Arial" w:cs="Arial"/>
           <w:bCs/>
@@ -1220,6 +1230,7 @@
     <w:p>
       <w:pPr>
         <w:spacing w:after="0" w:line="240" w:lineRule="auto"/>
+        <w:jc w:val="both"/>
         <w:rPr>
           <w:rFonts w:ascii="Arial" w:hAnsi="Arial" w:cs="Arial"/>
           <w:bCs/>
@@ -1236,6 +1247,7 @@
     <w:p>
       <w:pPr>
         <w:spacing w:after="0" w:line="240" w:lineRule="auto"/>
+        <w:jc w:val="both"/>
         <w:rPr>
           <w:rFonts w:ascii="Arial" w:hAnsi="Arial" w:cs="Arial"/>
           <w:bCs/>
@@ -1252,6 +1264,7 @@
     <w:p>
       <w:pPr>
         <w:spacing w:after="0" w:line="240" w:lineRule="auto"/>
+        <w:jc w:val="both"/>
         <w:rPr>
           <w:rFonts w:ascii="Arial" w:hAnsi="Arial" w:cs="Arial"/>
           <w:bCs/>
@@ -1268,6 +1281,7 @@
     <w:p>
       <w:pPr>
         <w:spacing w:after="0" w:line="240" w:lineRule="auto"/>
+        <w:jc w:val="both"/>
         <w:rPr>
           <w:rFonts w:ascii="Arial" w:hAnsi="Arial" w:cs="Arial"/>
           <w:bCs/>
@@ -1284,6 +1298,7 @@
     <w:p>
       <w:pPr>
         <w:spacing w:after="0" w:line="240" w:lineRule="auto"/>
+        <w:jc w:val="both"/>
         <w:rPr>
           <w:rFonts w:ascii="Arial" w:hAnsi="Arial" w:cs="Arial"/>
           <w:bCs/>
@@ -1300,6 +1315,7 @@
     <w:p>
       <w:pPr>
         <w:spacing w:after="0" w:line="240" w:lineRule="auto"/>
+        <w:jc w:val="both"/>
         <w:rPr>
           <w:rFonts w:ascii="Arial" w:hAnsi="Arial" w:cs="Arial"/>
           <w:bCs/>
@@ -1316,6 +1332,7 @@
     <w:p>
       <w:pPr>
         <w:spacing w:after="0" w:line="240" w:lineRule="auto"/>
+        <w:jc w:val="both"/>
         <w:rPr>
           <w:rFonts w:ascii="Arial" w:hAnsi="Arial" w:cs="Arial"/>
           <w:bCs/>
@@ -1332,6 +1349,7 @@
     <w:p>
       <w:pPr>
         <w:spacing w:after="0" w:line="240" w:lineRule="auto"/>
+        <w:jc w:val="both"/>
         <w:rPr>
           <w:rFonts w:ascii="Arial" w:hAnsi="Arial" w:cs="Arial"/>
           <w:bCs/>
@@ -1386,6 +1404,7 @@
     <w:p>
       <w:pPr>
         <w:spacing w:after="0" w:line="240" w:lineRule="auto"/>
+        <w:jc w:val="both"/>
         <w:rPr>
           <w:rFonts w:ascii="Arial" w:hAnsi="Arial" w:cs="Arial"/>
           <w:b/>
@@ -1404,6 +1423,7 @@
     <w:p>
       <w:pPr>
         <w:spacing w:after="0" w:line="240" w:lineRule="auto"/>
+        <w:jc w:val="both"/>
         <w:rPr>
           <w:rFonts w:ascii="Arial" w:hAnsi="Arial" w:cs="Arial"/>
           <w:bCs/>
@@ -1420,6 +1440,7 @@
     <w:p>
       <w:pPr>
         <w:spacing w:after="0" w:line="240" w:lineRule="auto"/>
+        <w:jc w:val="both"/>
         <w:rPr>
           <w:rFonts w:ascii="Arial" w:hAnsi="Arial" w:cs="Arial"/>
           <w:bCs/>
@@ -1436,6 +1457,7 @@
     <w:p>
       <w:pPr>
         <w:spacing w:after="0" w:line="240" w:lineRule="auto"/>
+        <w:jc w:val="both"/>
         <w:rPr>
           <w:rFonts w:ascii="Arial" w:hAnsi="Arial" w:cs="Arial"/>
           <w:bCs/>
@@ -1462,6 +1484,7 @@
     <w:p>
       <w:pPr>
         <w:spacing w:after="0" w:line="240" w:lineRule="auto"/>
+        <w:jc w:val="both"/>
         <w:rPr>
           <w:rFonts w:ascii="Arial" w:hAnsi="Arial" w:cs="Arial"/>
           <w:bCs/>
@@ -1478,6 +1501,7 @@
     <w:p>
       <w:pPr>
         <w:spacing w:after="0" w:line="240" w:lineRule="auto"/>
+        <w:jc w:val="both"/>
         <w:rPr>
           <w:rFonts w:ascii="Arial" w:hAnsi="Arial" w:cs="Arial"/>
           <w:bCs/>
@@ -1494,6 +1518,7 @@
     <w:p>
       <w:pPr>
         <w:spacing w:after="0" w:line="240" w:lineRule="auto"/>
+        <w:jc w:val="both"/>
         <w:rPr>
           <w:rFonts w:ascii="Arial" w:hAnsi="Arial" w:cs="Arial"/>
           <w:bCs/>
@@ -1510,6 +1535,7 @@
     <w:p>
       <w:pPr>
         <w:spacing w:after="0" w:line="240" w:lineRule="auto"/>
+        <w:jc w:val="both"/>
         <w:rPr>
           <w:rFonts w:ascii="Arial" w:hAnsi="Arial" w:cs="Arial"/>
           <w:bCs/>
@@ -1526,6 +1552,7 @@
     <w:p>
       <w:pPr>
         <w:spacing w:after="0" w:line="240" w:lineRule="auto"/>
+        <w:jc w:val="both"/>
         <w:rPr>
           <w:rFonts w:ascii="Arial" w:hAnsi="Arial" w:cs="Arial"/>
           <w:bCs/>
@@ -1542,6 +1569,7 @@
     <w:p>
       <w:pPr>
         <w:spacing w:after="0" w:line="240" w:lineRule="auto"/>
+        <w:jc w:val="both"/>
         <w:rPr>
           <w:rFonts w:ascii="Arial" w:hAnsi="Arial" w:cs="Arial"/>
           <w:bCs/>
@@ -1558,6 +1586,7 @@
     <w:p>
       <w:pPr>
         <w:spacing w:after="0" w:line="240" w:lineRule="auto"/>
+        <w:jc w:val="both"/>
         <w:rPr>
           <w:rFonts w:ascii="Arial" w:hAnsi="Arial" w:cs="Arial"/>
           <w:bCs/>
@@ -1574,6 +1603,7 @@
     <w:p>
       <w:pPr>
         <w:spacing w:after="0" w:line="240" w:lineRule="auto"/>
+        <w:jc w:val="both"/>
         <w:rPr>
           <w:rFonts w:ascii="Arial" w:hAnsi="Arial" w:cs="Arial"/>
           <w:bCs/>

</xml_diff>

<commit_message>
fix: Revert broken justify alignment
</commit_message>
<xml_diff>
--- a/04-Surat Pemberitahuan Kedatangan Santri Baru 2026-2027-REVISED.docx
+++ b/04-Surat Pemberitahuan Kedatangan Santri Baru 2026-2027-REVISED.docx
@@ -114,7 +114,6 @@
       <w:pPr>
         <w:spacing w:after="0"/>
         <w:ind w:left="1701"/>
-        <w:jc w:val="both"/>
         <w:rPr>
           <w:rFonts w:ascii="Arial" w:hAnsi="Arial" w:cs="Arial"/>
           <w:sz w:val="14"/>
@@ -261,7 +260,6 @@
       <w:pPr>
         <w:pStyle w:val="NormalWeb"/>
         <w:ind w:left="709" w:right="850"/>
-        <w:jc w:val="both"/>
         <w:rPr>
           <w:rFonts w:ascii="Arial" w:hAnsi="Arial" w:cs="Arial"/>
           <w:sz w:val="22"/>
@@ -660,7 +658,6 @@
       <w:pPr>
         <w:spacing w:after="0" w:line="240" w:lineRule="auto"/>
         <w:ind w:left="3119" w:firstLine="3544"/>
-        <w:jc w:val="both"/>
         <w:rPr>
           <w:rFonts w:ascii="Arial" w:hAnsi="Arial" w:cs="Arial"/>
           <w:b/>
@@ -684,7 +681,6 @@
       <w:pPr>
         <w:spacing w:after="0" w:line="240" w:lineRule="auto"/>
         <w:ind w:firstLine="7513"/>
-        <w:jc w:val="both"/>
         <w:rPr>
           <w:rFonts w:ascii="Arial" w:hAnsi="Arial" w:cs="Arial"/>
         </w:rPr>
@@ -829,7 +825,6 @@
           </w:tcPr>
           <w:p>
             <w:pPr>
-              <w:jc w:val="both"/>
               <w:rPr>
                 <w:rFonts w:ascii="Arial" w:hAnsi="Arial" w:cs="Arial"/>
               </w:rPr>
@@ -1048,7 +1043,6 @@
           </w:p>
           <w:p>
             <w:pPr>
-              <w:jc w:val="both"/>
               <w:rPr>
                 <w:rFonts w:ascii="Arial" w:hAnsi="Arial" w:cs="Arial"/>
                 <w:b/>
@@ -1143,28 +1137,27 @@
     <w:p>
       <w:pPr>
         <w:spacing w:after="0" w:line="240" w:lineRule="auto"/>
+        <w:rPr>
+          <w:rFonts w:ascii="Arial" w:hAnsi="Arial" w:cs="Arial"/>
+          <w:b/>
+          <w:bCs/>
+        </w:rPr>
+      </w:pPr>
+      <w:r>
+        <w:rPr>
+          <w:rFonts w:ascii="Arial" w:hAnsi="Arial" w:cs="Arial"/>
+          <w:b/>
+          <w:bCs/>
+        </w:rPr>
+        <w:t>A. Berkas Persyaratan yang Wajib Dibawa</w:t>
+      </w:r>
+    </w:p>
+    <w:p>
+      <w:pPr>
+        <w:spacing w:after="0" w:line="240" w:lineRule="auto"/>
         <w:jc w:val="both"/>
         <w:rPr>
           <w:rFonts w:ascii="Arial" w:hAnsi="Arial" w:cs="Arial"/>
-          <w:b/>
-          <w:bCs/>
-        </w:rPr>
-      </w:pPr>
-      <w:r>
-        <w:rPr>
-          <w:rFonts w:ascii="Arial" w:hAnsi="Arial" w:cs="Arial"/>
-          <w:b/>
-          <w:bCs/>
-        </w:rPr>
-        <w:t>A. Berkas Persyaratan yang Wajib Dibawa</w:t>
-      </w:r>
-    </w:p>
-    <w:p>
-      <w:pPr>
-        <w:spacing w:after="0" w:line="240" w:lineRule="auto"/>
-        <w:jc w:val="both"/>
-        <w:rPr>
-          <w:rFonts w:ascii="Arial" w:hAnsi="Arial" w:cs="Arial"/>
           <w:bCs/>
         </w:rPr>
       </w:pPr>
@@ -1179,7 +1172,6 @@
     <w:p>
       <w:pPr>
         <w:spacing w:after="0" w:line="240" w:lineRule="auto"/>
-        <w:jc w:val="both"/>
         <w:rPr>
           <w:rFonts w:ascii="Arial" w:hAnsi="Arial" w:cs="Arial"/>
           <w:bCs/>
@@ -1196,7 +1188,6 @@
     <w:p>
       <w:pPr>
         <w:spacing w:after="0" w:line="240" w:lineRule="auto"/>
-        <w:jc w:val="both"/>
         <w:rPr>
           <w:rFonts w:ascii="Arial" w:hAnsi="Arial" w:cs="Arial"/>
           <w:bCs/>
@@ -1213,7 +1204,6 @@
     <w:p>
       <w:pPr>
         <w:spacing w:after="0" w:line="240" w:lineRule="auto"/>
-        <w:jc w:val="both"/>
         <w:rPr>
           <w:rFonts w:ascii="Arial" w:hAnsi="Arial" w:cs="Arial"/>
           <w:bCs/>
@@ -1230,7 +1220,6 @@
     <w:p>
       <w:pPr>
         <w:spacing w:after="0" w:line="240" w:lineRule="auto"/>
-        <w:jc w:val="both"/>
         <w:rPr>
           <w:rFonts w:ascii="Arial" w:hAnsi="Arial" w:cs="Arial"/>
           <w:bCs/>
@@ -1247,7 +1236,6 @@
     <w:p>
       <w:pPr>
         <w:spacing w:after="0" w:line="240" w:lineRule="auto"/>
-        <w:jc w:val="both"/>
         <w:rPr>
           <w:rFonts w:ascii="Arial" w:hAnsi="Arial" w:cs="Arial"/>
           <w:bCs/>
@@ -1264,7 +1252,6 @@
     <w:p>
       <w:pPr>
         <w:spacing w:after="0" w:line="240" w:lineRule="auto"/>
-        <w:jc w:val="both"/>
         <w:rPr>
           <w:rFonts w:ascii="Arial" w:hAnsi="Arial" w:cs="Arial"/>
           <w:bCs/>
@@ -1281,7 +1268,6 @@
     <w:p>
       <w:pPr>
         <w:spacing w:after="0" w:line="240" w:lineRule="auto"/>
-        <w:jc w:val="both"/>
         <w:rPr>
           <w:rFonts w:ascii="Arial" w:hAnsi="Arial" w:cs="Arial"/>
           <w:bCs/>
@@ -1298,7 +1284,6 @@
     <w:p>
       <w:pPr>
         <w:spacing w:after="0" w:line="240" w:lineRule="auto"/>
-        <w:jc w:val="both"/>
         <w:rPr>
           <w:rFonts w:ascii="Arial" w:hAnsi="Arial" w:cs="Arial"/>
           <w:bCs/>
@@ -1315,7 +1300,6 @@
     <w:p>
       <w:pPr>
         <w:spacing w:after="0" w:line="240" w:lineRule="auto"/>
-        <w:jc w:val="both"/>
         <w:rPr>
           <w:rFonts w:ascii="Arial" w:hAnsi="Arial" w:cs="Arial"/>
           <w:bCs/>
@@ -1332,7 +1316,6 @@
     <w:p>
       <w:pPr>
         <w:spacing w:after="0" w:line="240" w:lineRule="auto"/>
-        <w:jc w:val="both"/>
         <w:rPr>
           <w:rFonts w:ascii="Arial" w:hAnsi="Arial" w:cs="Arial"/>
           <w:bCs/>
@@ -1349,7 +1332,6 @@
     <w:p>
       <w:pPr>
         <w:spacing w:after="0" w:line="240" w:lineRule="auto"/>
-        <w:jc w:val="both"/>
         <w:rPr>
           <w:rFonts w:ascii="Arial" w:hAnsi="Arial" w:cs="Arial"/>
           <w:bCs/>
@@ -1404,7 +1386,6 @@
     <w:p>
       <w:pPr>
         <w:spacing w:after="0" w:line="240" w:lineRule="auto"/>
-        <w:jc w:val="both"/>
         <w:rPr>
           <w:rFonts w:ascii="Arial" w:hAnsi="Arial" w:cs="Arial"/>
           <w:b/>
@@ -1423,7 +1404,6 @@
     <w:p>
       <w:pPr>
         <w:spacing w:after="0" w:line="240" w:lineRule="auto"/>
-        <w:jc w:val="both"/>
         <w:rPr>
           <w:rFonts w:ascii="Arial" w:hAnsi="Arial" w:cs="Arial"/>
           <w:bCs/>
@@ -1440,7 +1420,6 @@
     <w:p>
       <w:pPr>
         <w:spacing w:after="0" w:line="240" w:lineRule="auto"/>
-        <w:jc w:val="both"/>
         <w:rPr>
           <w:rFonts w:ascii="Arial" w:hAnsi="Arial" w:cs="Arial"/>
           <w:bCs/>
@@ -1457,7 +1436,6 @@
     <w:p>
       <w:pPr>
         <w:spacing w:after="0" w:line="240" w:lineRule="auto"/>
-        <w:jc w:val="both"/>
         <w:rPr>
           <w:rFonts w:ascii="Arial" w:hAnsi="Arial" w:cs="Arial"/>
           <w:bCs/>
@@ -1484,7 +1462,6 @@
     <w:p>
       <w:pPr>
         <w:spacing w:after="0" w:line="240" w:lineRule="auto"/>
-        <w:jc w:val="both"/>
         <w:rPr>
           <w:rFonts w:ascii="Arial" w:hAnsi="Arial" w:cs="Arial"/>
           <w:bCs/>
@@ -1501,7 +1478,6 @@
     <w:p>
       <w:pPr>
         <w:spacing w:after="0" w:line="240" w:lineRule="auto"/>
-        <w:jc w:val="both"/>
         <w:rPr>
           <w:rFonts w:ascii="Arial" w:hAnsi="Arial" w:cs="Arial"/>
           <w:bCs/>
@@ -1518,7 +1494,6 @@
     <w:p>
       <w:pPr>
         <w:spacing w:after="0" w:line="240" w:lineRule="auto"/>
-        <w:jc w:val="both"/>
         <w:rPr>
           <w:rFonts w:ascii="Arial" w:hAnsi="Arial" w:cs="Arial"/>
           <w:bCs/>
@@ -1535,7 +1510,6 @@
     <w:p>
       <w:pPr>
         <w:spacing w:after="0" w:line="240" w:lineRule="auto"/>
-        <w:jc w:val="both"/>
         <w:rPr>
           <w:rFonts w:ascii="Arial" w:hAnsi="Arial" w:cs="Arial"/>
           <w:bCs/>
@@ -1552,7 +1526,6 @@
     <w:p>
       <w:pPr>
         <w:spacing w:after="0" w:line="240" w:lineRule="auto"/>
-        <w:jc w:val="both"/>
         <w:rPr>
           <w:rFonts w:ascii="Arial" w:hAnsi="Arial" w:cs="Arial"/>
           <w:bCs/>
@@ -1569,7 +1542,6 @@
     <w:p>
       <w:pPr>
         <w:spacing w:after="0" w:line="240" w:lineRule="auto"/>
-        <w:jc w:val="both"/>
         <w:rPr>
           <w:rFonts w:ascii="Arial" w:hAnsi="Arial" w:cs="Arial"/>
           <w:bCs/>
@@ -1586,7 +1558,6 @@
     <w:p>
       <w:pPr>
         <w:spacing w:after="0" w:line="240" w:lineRule="auto"/>
-        <w:jc w:val="both"/>
         <w:rPr>
           <w:rFonts w:ascii="Arial" w:hAnsi="Arial" w:cs="Arial"/>
           <w:bCs/>
@@ -1603,7 +1574,6 @@
     <w:p>
       <w:pPr>
         <w:spacing w:after="0" w:line="240" w:lineRule="auto"/>
-        <w:jc w:val="both"/>
         <w:rPr>
           <w:rFonts w:ascii="Arial" w:hAnsi="Arial" w:cs="Arial"/>
           <w:bCs/>

</xml_diff>

<commit_message>
fix: Safely apply justify alignment without breaking tab layouts
</commit_message>
<xml_diff>
--- a/04-Surat Pemberitahuan Kedatangan Santri Baru 2026-2027-REVISED.docx
+++ b/04-Surat Pemberitahuan Kedatangan Santri Baru 2026-2027-REVISED.docx
@@ -1172,6 +1172,7 @@
     <w:p>
       <w:pPr>
         <w:spacing w:after="0" w:line="240" w:lineRule="auto"/>
+        <w:jc w:val="both"/>
         <w:rPr>
           <w:rFonts w:ascii="Arial" w:hAnsi="Arial" w:cs="Arial"/>
           <w:bCs/>
@@ -1284,6 +1285,7 @@
     <w:p>
       <w:pPr>
         <w:spacing w:after="0" w:line="240" w:lineRule="auto"/>
+        <w:jc w:val="both"/>
         <w:rPr>
           <w:rFonts w:ascii="Arial" w:hAnsi="Arial" w:cs="Arial"/>
           <w:bCs/>
@@ -1316,6 +1318,7 @@
     <w:p>
       <w:pPr>
         <w:spacing w:after="0" w:line="240" w:lineRule="auto"/>
+        <w:jc w:val="both"/>
         <w:rPr>
           <w:rFonts w:ascii="Arial" w:hAnsi="Arial" w:cs="Arial"/>
           <w:bCs/>
@@ -1404,6 +1407,7 @@
     <w:p>
       <w:pPr>
         <w:spacing w:after="0" w:line="240" w:lineRule="auto"/>
+        <w:jc w:val="both"/>
         <w:rPr>
           <w:rFonts w:ascii="Arial" w:hAnsi="Arial" w:cs="Arial"/>
           <w:bCs/>
@@ -1420,6 +1424,7 @@
     <w:p>
       <w:pPr>
         <w:spacing w:after="0" w:line="240" w:lineRule="auto"/>
+        <w:jc w:val="both"/>
         <w:rPr>
           <w:rFonts w:ascii="Arial" w:hAnsi="Arial" w:cs="Arial"/>
           <w:bCs/>
@@ -1436,6 +1441,7 @@
     <w:p>
       <w:pPr>
         <w:spacing w:after="0" w:line="240" w:lineRule="auto"/>
+        <w:jc w:val="both"/>
         <w:rPr>
           <w:rFonts w:ascii="Arial" w:hAnsi="Arial" w:cs="Arial"/>
           <w:bCs/>
@@ -1462,6 +1468,7 @@
     <w:p>
       <w:pPr>
         <w:spacing w:after="0" w:line="240" w:lineRule="auto"/>
+        <w:jc w:val="both"/>
         <w:rPr>
           <w:rFonts w:ascii="Arial" w:hAnsi="Arial" w:cs="Arial"/>
           <w:bCs/>
@@ -1478,6 +1485,7 @@
     <w:p>
       <w:pPr>
         <w:spacing w:after="0" w:line="240" w:lineRule="auto"/>
+        <w:jc w:val="both"/>
         <w:rPr>
           <w:rFonts w:ascii="Arial" w:hAnsi="Arial" w:cs="Arial"/>
           <w:bCs/>
@@ -1510,6 +1518,7 @@
     <w:p>
       <w:pPr>
         <w:spacing w:after="0" w:line="240" w:lineRule="auto"/>
+        <w:jc w:val="both"/>
         <w:rPr>
           <w:rFonts w:ascii="Arial" w:hAnsi="Arial" w:cs="Arial"/>
           <w:bCs/>
@@ -1526,6 +1535,7 @@
     <w:p>
       <w:pPr>
         <w:spacing w:after="0" w:line="240" w:lineRule="auto"/>
+        <w:jc w:val="both"/>
         <w:rPr>
           <w:rFonts w:ascii="Arial" w:hAnsi="Arial" w:cs="Arial"/>
           <w:bCs/>
@@ -1542,6 +1552,7 @@
     <w:p>
       <w:pPr>
         <w:spacing w:after="0" w:line="240" w:lineRule="auto"/>
+        <w:jc w:val="both"/>
         <w:rPr>
           <w:rFonts w:ascii="Arial" w:hAnsi="Arial" w:cs="Arial"/>
           <w:bCs/>
@@ -1558,6 +1569,7 @@
     <w:p>
       <w:pPr>
         <w:spacing w:after="0" w:line="240" w:lineRule="auto"/>
+        <w:jc w:val="both"/>
         <w:rPr>
           <w:rFonts w:ascii="Arial" w:hAnsi="Arial" w:cs="Arial"/>
           <w:bCs/>
@@ -1574,6 +1586,7 @@
     <w:p>
       <w:pPr>
         <w:spacing w:after="0" w:line="240" w:lineRule="auto"/>
+        <w:jc w:val="both"/>
         <w:rPr>
           <w:rFonts w:ascii="Arial" w:hAnsi="Arial" w:cs="Arial"/>
           <w:bCs/>

</xml_diff>

<commit_message>
fix: Apply hanging indents to manual lists for proper alignment
</commit_message>
<xml_diff>
--- a/04-Surat Pemberitahuan Kedatangan Santri Baru 2026-2027-REVISED.docx
+++ b/04-Surat Pemberitahuan Kedatangan Santri Baru 2026-2027-REVISED.docx
@@ -1137,6 +1137,7 @@
     <w:p>
       <w:pPr>
         <w:spacing w:after="0" w:line="240" w:lineRule="auto"/>
+        <w:ind w:left="360" w:hanging="360"/>
         <w:rPr>
           <w:rFonts w:ascii="Arial" w:hAnsi="Arial" w:cs="Arial"/>
           <w:b/>
@@ -1172,6 +1173,7 @@
     <w:p>
       <w:pPr>
         <w:spacing w:after="0" w:line="240" w:lineRule="auto"/>
+        <w:ind w:left="360" w:hanging="360"/>
         <w:jc w:val="both"/>
         <w:rPr>
           <w:rFonts w:ascii="Arial" w:hAnsi="Arial" w:cs="Arial"/>
@@ -1189,6 +1191,7 @@
     <w:p>
       <w:pPr>
         <w:spacing w:after="0" w:line="240" w:lineRule="auto"/>
+        <w:ind w:left="360" w:hanging="360"/>
         <w:rPr>
           <w:rFonts w:ascii="Arial" w:hAnsi="Arial" w:cs="Arial"/>
           <w:bCs/>
@@ -1205,6 +1208,7 @@
     <w:p>
       <w:pPr>
         <w:spacing w:after="0" w:line="240" w:lineRule="auto"/>
+        <w:ind w:left="360" w:hanging="360"/>
         <w:rPr>
           <w:rFonts w:ascii="Arial" w:hAnsi="Arial" w:cs="Arial"/>
           <w:bCs/>
@@ -1221,6 +1225,7 @@
     <w:p>
       <w:pPr>
         <w:spacing w:after="0" w:line="240" w:lineRule="auto"/>
+        <w:ind w:left="360" w:hanging="360"/>
         <w:rPr>
           <w:rFonts w:ascii="Arial" w:hAnsi="Arial" w:cs="Arial"/>
           <w:bCs/>
@@ -1237,6 +1242,7 @@
     <w:p>
       <w:pPr>
         <w:spacing w:after="0" w:line="240" w:lineRule="auto"/>
+        <w:ind w:left="360" w:hanging="360"/>
         <w:rPr>
           <w:rFonts w:ascii="Arial" w:hAnsi="Arial" w:cs="Arial"/>
           <w:bCs/>
@@ -1253,6 +1259,7 @@
     <w:p>
       <w:pPr>
         <w:spacing w:after="0" w:line="240" w:lineRule="auto"/>
+        <w:ind w:left="360" w:hanging="360"/>
         <w:rPr>
           <w:rFonts w:ascii="Arial" w:hAnsi="Arial" w:cs="Arial"/>
           <w:bCs/>
@@ -1269,6 +1276,7 @@
     <w:p>
       <w:pPr>
         <w:spacing w:after="0" w:line="240" w:lineRule="auto"/>
+        <w:ind w:left="360" w:hanging="360"/>
         <w:rPr>
           <w:rFonts w:ascii="Arial" w:hAnsi="Arial" w:cs="Arial"/>
           <w:bCs/>
@@ -1285,6 +1293,7 @@
     <w:p>
       <w:pPr>
         <w:spacing w:after="0" w:line="240" w:lineRule="auto"/>
+        <w:ind w:left="360" w:hanging="360"/>
         <w:jc w:val="both"/>
         <w:rPr>
           <w:rFonts w:ascii="Arial" w:hAnsi="Arial" w:cs="Arial"/>
@@ -1302,6 +1311,7 @@
     <w:p>
       <w:pPr>
         <w:spacing w:after="0" w:line="240" w:lineRule="auto"/>
+        <w:ind w:left="360" w:hanging="360"/>
         <w:rPr>
           <w:rFonts w:ascii="Arial" w:hAnsi="Arial" w:cs="Arial"/>
           <w:bCs/>
@@ -1318,6 +1328,7 @@
     <w:p>
       <w:pPr>
         <w:spacing w:after="0" w:line="240" w:lineRule="auto"/>
+        <w:ind w:left="360" w:hanging="360"/>
         <w:jc w:val="both"/>
         <w:rPr>
           <w:rFonts w:ascii="Arial" w:hAnsi="Arial" w:cs="Arial"/>
@@ -1389,6 +1400,7 @@
     <w:p>
       <w:pPr>
         <w:spacing w:after="0" w:line="240" w:lineRule="auto"/>
+        <w:ind w:left="360" w:hanging="360"/>
         <w:rPr>
           <w:rFonts w:ascii="Arial" w:hAnsi="Arial" w:cs="Arial"/>
           <w:b/>
@@ -1407,6 +1419,7 @@
     <w:p>
       <w:pPr>
         <w:spacing w:after="0" w:line="240" w:lineRule="auto"/>
+        <w:ind w:left="360" w:hanging="360"/>
         <w:jc w:val="both"/>
         <w:rPr>
           <w:rFonts w:ascii="Arial" w:hAnsi="Arial" w:cs="Arial"/>
@@ -1424,6 +1437,7 @@
     <w:p>
       <w:pPr>
         <w:spacing w:after="0" w:line="240" w:lineRule="auto"/>
+        <w:ind w:left="360" w:hanging="360"/>
         <w:jc w:val="both"/>
         <w:rPr>
           <w:rFonts w:ascii="Arial" w:hAnsi="Arial" w:cs="Arial"/>
@@ -1441,6 +1455,7 @@
     <w:p>
       <w:pPr>
         <w:spacing w:after="0" w:line="240" w:lineRule="auto"/>
+        <w:ind w:left="360" w:hanging="360"/>
         <w:jc w:val="both"/>
         <w:rPr>
           <w:rFonts w:ascii="Arial" w:hAnsi="Arial" w:cs="Arial"/>
@@ -1468,6 +1483,7 @@
     <w:p>
       <w:pPr>
         <w:spacing w:after="0" w:line="240" w:lineRule="auto"/>
+        <w:ind w:left="360" w:hanging="360"/>
         <w:jc w:val="both"/>
         <w:rPr>
           <w:rFonts w:ascii="Arial" w:hAnsi="Arial" w:cs="Arial"/>
@@ -1485,6 +1501,7 @@
     <w:p>
       <w:pPr>
         <w:spacing w:after="0" w:line="240" w:lineRule="auto"/>
+        <w:ind w:left="360" w:hanging="360"/>
         <w:jc w:val="both"/>
         <w:rPr>
           <w:rFonts w:ascii="Arial" w:hAnsi="Arial" w:cs="Arial"/>
@@ -1502,6 +1519,7 @@
     <w:p>
       <w:pPr>
         <w:spacing w:after="0" w:line="240" w:lineRule="auto"/>
+        <w:ind w:left="360" w:hanging="360"/>
         <w:rPr>
           <w:rFonts w:ascii="Arial" w:hAnsi="Arial" w:cs="Arial"/>
           <w:bCs/>
@@ -1518,6 +1536,7 @@
     <w:p>
       <w:pPr>
         <w:spacing w:after="0" w:line="240" w:lineRule="auto"/>
+        <w:ind w:left="360" w:hanging="360"/>
         <w:jc w:val="both"/>
         <w:rPr>
           <w:rFonts w:ascii="Arial" w:hAnsi="Arial" w:cs="Arial"/>
@@ -1535,6 +1554,7 @@
     <w:p>
       <w:pPr>
         <w:spacing w:after="0" w:line="240" w:lineRule="auto"/>
+        <w:ind w:left="360" w:hanging="360"/>
         <w:jc w:val="both"/>
         <w:rPr>
           <w:rFonts w:ascii="Arial" w:hAnsi="Arial" w:cs="Arial"/>
@@ -1552,6 +1572,7 @@
     <w:p>
       <w:pPr>
         <w:spacing w:after="0" w:line="240" w:lineRule="auto"/>
+        <w:ind w:left="360" w:hanging="360"/>
         <w:jc w:val="both"/>
         <w:rPr>
           <w:rFonts w:ascii="Arial" w:hAnsi="Arial" w:cs="Arial"/>
@@ -1569,6 +1590,7 @@
     <w:p>
       <w:pPr>
         <w:spacing w:after="0" w:line="240" w:lineRule="auto"/>
+        <w:ind w:left="360" w:hanging="360"/>
         <w:jc w:val="both"/>
         <w:rPr>
           <w:rFonts w:ascii="Arial" w:hAnsi="Arial" w:cs="Arial"/>
@@ -1586,6 +1608,7 @@
     <w:p>
       <w:pPr>
         <w:spacing w:after="0" w:line="240" w:lineRule="auto"/>
+        <w:ind w:left="360" w:hanging="360"/>
         <w:jc w:val="both"/>
         <w:rPr>
           <w:rFonts w:ascii="Arial" w:hAnsi="Arial" w:cs="Arial"/>

</xml_diff>

<commit_message>
fix: Perfectly format justification and indents without breaking links
</commit_message>
<xml_diff>
--- a/04-Surat Pemberitahuan Kedatangan Santri Baru 2026-2027-REVISED.docx
+++ b/04-Surat Pemberitahuan Kedatangan Santri Baru 2026-2027-REVISED.docx
@@ -125,7 +125,7 @@
     <w:p>
       <w:pPr>
         <w:spacing w:after="0"/>
-        <w:jc w:val="center"/>
+        <w:jc w:val="both"/>
         <w:rPr>
           <w:rFonts w:ascii="Arial" w:hAnsi="Arial" w:cs="Arial"/>
           <w:sz w:val="24"/>
@@ -1107,6 +1107,25 @@
     <w:p>
       <w:pPr>
         <w:spacing w:after="0" w:line="240" w:lineRule="auto"/>
+        <w:jc w:val="both"/>
+        <w:rPr>
+          <w:rFonts w:ascii="Arial" w:hAnsi="Arial" w:cs="Arial"/>
+          <w:b/>
+          <w:bCs/>
+        </w:rPr>
+      </w:pPr>
+      <w:r>
+        <w:rPr>
+          <w:rFonts w:ascii="Arial" w:hAnsi="Arial" w:cs="Arial"/>
+          <w:b/>
+          <w:bCs/>
+        </w:rPr>
+        <w:t>Sabtu, 18 Juli 2026 | Pesantren Al Imam Al Islami</w:t>
+      </w:r>
+    </w:p>
+    <w:p>
+      <w:pPr>
+        <w:spacing w:after="0" w:line="240" w:lineRule="auto"/>
         <w:jc w:val="center"/>
         <w:rPr>
           <w:rFonts w:ascii="Arial" w:hAnsi="Arial" w:cs="Arial"/>
@@ -1114,42 +1133,22 @@
           <w:bCs/>
         </w:rPr>
       </w:pPr>
-      <w:r>
+    </w:p>
+    <w:p>
+      <w:pPr>
+        <w:spacing w:after="0" w:line="240" w:lineRule="auto"/>
         <w:rPr>
           <w:rFonts w:ascii="Arial" w:hAnsi="Arial" w:cs="Arial"/>
           <w:b/>
           <w:bCs/>
         </w:rPr>
-        <w:t>Sabtu, 18 Juli 2026 | Pesantren Al Imam Al Islami</w:t>
-      </w:r>
-    </w:p>
-    <w:p>
-      <w:pPr>
-        <w:spacing w:after="0" w:line="240" w:lineRule="auto"/>
-        <w:jc w:val="center"/>
+      </w:pPr>
+      <w:r>
         <w:rPr>
           <w:rFonts w:ascii="Arial" w:hAnsi="Arial" w:cs="Arial"/>
           <w:b/>
           <w:bCs/>
         </w:rPr>
-      </w:pPr>
-    </w:p>
-    <w:p>
-      <w:pPr>
-        <w:spacing w:after="0" w:line="240" w:lineRule="auto"/>
-        <w:ind w:left="360" w:hanging="360"/>
-        <w:rPr>
-          <w:rFonts w:ascii="Arial" w:hAnsi="Arial" w:cs="Arial"/>
-          <w:b/>
-          <w:bCs/>
-        </w:rPr>
-      </w:pPr>
-      <w:r>
-        <w:rPr>
-          <w:rFonts w:ascii="Arial" w:hAnsi="Arial" w:cs="Arial"/>
-          <w:b/>
-          <w:bCs/>
-        </w:rPr>
         <w:t>A. Berkas Persyaratan yang Wajib Dibawa</w:t>
       </w:r>
     </w:p>
@@ -1173,7 +1172,7 @@
     <w:p>
       <w:pPr>
         <w:spacing w:after="0" w:line="240" w:lineRule="auto"/>
-        <w:ind w:left="360" w:hanging="360"/>
+        <w:ind w:left="400" w:hanging="400"/>
         <w:jc w:val="both"/>
         <w:rPr>
           <w:rFonts w:ascii="Arial" w:hAnsi="Arial" w:cs="Arial"/>
@@ -1191,7 +1190,6 @@
     <w:p>
       <w:pPr>
         <w:spacing w:after="0" w:line="240" w:lineRule="auto"/>
-        <w:ind w:left="360" w:hanging="360"/>
         <w:rPr>
           <w:rFonts w:ascii="Arial" w:hAnsi="Arial" w:cs="Arial"/>
           <w:bCs/>
@@ -1208,7 +1206,6 @@
     <w:p>
       <w:pPr>
         <w:spacing w:after="0" w:line="240" w:lineRule="auto"/>
-        <w:ind w:left="360" w:hanging="360"/>
         <w:rPr>
           <w:rFonts w:ascii="Arial" w:hAnsi="Arial" w:cs="Arial"/>
           <w:bCs/>
@@ -1225,7 +1222,8 @@
     <w:p>
       <w:pPr>
         <w:spacing w:after="0" w:line="240" w:lineRule="auto"/>
-        <w:ind w:left="360" w:hanging="360"/>
+        <w:ind w:left="400" w:hanging="400"/>
+        <w:jc w:val="both"/>
         <w:rPr>
           <w:rFonts w:ascii="Arial" w:hAnsi="Arial" w:cs="Arial"/>
           <w:bCs/>
@@ -1242,7 +1240,8 @@
     <w:p>
       <w:pPr>
         <w:spacing w:after="0" w:line="240" w:lineRule="auto"/>
-        <w:ind w:left="360" w:hanging="360"/>
+        <w:ind w:left="400" w:hanging="400"/>
+        <w:jc w:val="both"/>
         <w:rPr>
           <w:rFonts w:ascii="Arial" w:hAnsi="Arial" w:cs="Arial"/>
           <w:bCs/>
@@ -1259,7 +1258,8 @@
     <w:p>
       <w:pPr>
         <w:spacing w:after="0" w:line="240" w:lineRule="auto"/>
-        <w:ind w:left="360" w:hanging="360"/>
+        <w:ind w:left="400" w:hanging="400"/>
+        <w:jc w:val="both"/>
         <w:rPr>
           <w:rFonts w:ascii="Arial" w:hAnsi="Arial" w:cs="Arial"/>
           <w:bCs/>
@@ -1276,7 +1276,8 @@
     <w:p>
       <w:pPr>
         <w:spacing w:after="0" w:line="240" w:lineRule="auto"/>
-        <w:ind w:left="360" w:hanging="360"/>
+        <w:ind w:left="400" w:hanging="400"/>
+        <w:jc w:val="both"/>
         <w:rPr>
           <w:rFonts w:ascii="Arial" w:hAnsi="Arial" w:cs="Arial"/>
           <w:bCs/>
@@ -1293,7 +1294,7 @@
     <w:p>
       <w:pPr>
         <w:spacing w:after="0" w:line="240" w:lineRule="auto"/>
-        <w:ind w:left="360" w:hanging="360"/>
+        <w:ind w:left="400" w:hanging="400"/>
         <w:jc w:val="both"/>
         <w:rPr>
           <w:rFonts w:ascii="Arial" w:hAnsi="Arial" w:cs="Arial"/>
@@ -1311,7 +1312,8 @@
     <w:p>
       <w:pPr>
         <w:spacing w:after="0" w:line="240" w:lineRule="auto"/>
-        <w:ind w:left="360" w:hanging="360"/>
+        <w:ind w:left="400" w:hanging="400"/>
+        <w:jc w:val="both"/>
         <w:rPr>
           <w:rFonts w:ascii="Arial" w:hAnsi="Arial" w:cs="Arial"/>
           <w:bCs/>
@@ -1328,7 +1330,7 @@
     <w:p>
       <w:pPr>
         <w:spacing w:after="0" w:line="240" w:lineRule="auto"/>
-        <w:ind w:left="360" w:hanging="360"/>
+        <w:ind w:left="400" w:hanging="400"/>
         <w:jc w:val="both"/>
         <w:rPr>
           <w:rFonts w:ascii="Arial" w:hAnsi="Arial" w:cs="Arial"/>
@@ -1400,7 +1402,6 @@
     <w:p>
       <w:pPr>
         <w:spacing w:after="0" w:line="240" w:lineRule="auto"/>
-        <w:ind w:left="360" w:hanging="360"/>
         <w:rPr>
           <w:rFonts w:ascii="Arial" w:hAnsi="Arial" w:cs="Arial"/>
           <w:b/>
@@ -1419,7 +1420,7 @@
     <w:p>
       <w:pPr>
         <w:spacing w:after="0" w:line="240" w:lineRule="auto"/>
-        <w:ind w:left="360" w:hanging="360"/>
+        <w:ind w:left="400" w:hanging="400"/>
         <w:jc w:val="both"/>
         <w:rPr>
           <w:rFonts w:ascii="Arial" w:hAnsi="Arial" w:cs="Arial"/>
@@ -1437,7 +1438,7 @@
     <w:p>
       <w:pPr>
         <w:spacing w:after="0" w:line="240" w:lineRule="auto"/>
-        <w:ind w:left="360" w:hanging="360"/>
+        <w:ind w:left="400" w:hanging="400"/>
         <w:jc w:val="both"/>
         <w:rPr>
           <w:rFonts w:ascii="Arial" w:hAnsi="Arial" w:cs="Arial"/>
@@ -1455,8 +1456,7 @@
     <w:p>
       <w:pPr>
         <w:spacing w:after="0" w:line="240" w:lineRule="auto"/>
-        <w:ind w:left="360" w:hanging="360"/>
-        <w:jc w:val="both"/>
+        <w:ind w:left="400" w:hanging="400"/>
         <w:rPr>
           <w:rFonts w:ascii="Arial" w:hAnsi="Arial" w:cs="Arial"/>
           <w:bCs/>
@@ -1483,7 +1483,7 @@
     <w:p>
       <w:pPr>
         <w:spacing w:after="0" w:line="240" w:lineRule="auto"/>
-        <w:ind w:left="360" w:hanging="360"/>
+        <w:ind w:left="400" w:hanging="400"/>
         <w:jc w:val="both"/>
         <w:rPr>
           <w:rFonts w:ascii="Arial" w:hAnsi="Arial" w:cs="Arial"/>
@@ -1501,7 +1501,7 @@
     <w:p>
       <w:pPr>
         <w:spacing w:after="0" w:line="240" w:lineRule="auto"/>
-        <w:ind w:left="360" w:hanging="360"/>
+        <w:ind w:left="400" w:hanging="400"/>
         <w:jc w:val="both"/>
         <w:rPr>
           <w:rFonts w:ascii="Arial" w:hAnsi="Arial" w:cs="Arial"/>
@@ -1519,7 +1519,8 @@
     <w:p>
       <w:pPr>
         <w:spacing w:after="0" w:line="240" w:lineRule="auto"/>
-        <w:ind w:left="360" w:hanging="360"/>
+        <w:ind w:left="400" w:hanging="400"/>
+        <w:jc w:val="both"/>
         <w:rPr>
           <w:rFonts w:ascii="Arial" w:hAnsi="Arial" w:cs="Arial"/>
           <w:bCs/>
@@ -1536,7 +1537,7 @@
     <w:p>
       <w:pPr>
         <w:spacing w:after="0" w:line="240" w:lineRule="auto"/>
-        <w:ind w:left="360" w:hanging="360"/>
+        <w:ind w:left="400" w:hanging="400"/>
         <w:jc w:val="both"/>
         <w:rPr>
           <w:rFonts w:ascii="Arial" w:hAnsi="Arial" w:cs="Arial"/>
@@ -1554,7 +1555,7 @@
     <w:p>
       <w:pPr>
         <w:spacing w:after="0" w:line="240" w:lineRule="auto"/>
-        <w:ind w:left="360" w:hanging="360"/>
+        <w:ind w:left="400" w:hanging="400"/>
         <w:jc w:val="both"/>
         <w:rPr>
           <w:rFonts w:ascii="Arial" w:hAnsi="Arial" w:cs="Arial"/>
@@ -1572,7 +1573,7 @@
     <w:p>
       <w:pPr>
         <w:spacing w:after="0" w:line="240" w:lineRule="auto"/>
-        <w:ind w:left="360" w:hanging="360"/>
+        <w:ind w:left="400" w:hanging="400"/>
         <w:jc w:val="both"/>
         <w:rPr>
           <w:rFonts w:ascii="Arial" w:hAnsi="Arial" w:cs="Arial"/>
@@ -1590,7 +1591,7 @@
     <w:p>
       <w:pPr>
         <w:spacing w:after="0" w:line="240" w:lineRule="auto"/>
-        <w:ind w:left="360" w:hanging="360"/>
+        <w:ind w:left="400" w:hanging="400"/>
         <w:jc w:val="both"/>
         <w:rPr>
           <w:rFonts w:ascii="Arial" w:hAnsi="Arial" w:cs="Arial"/>
@@ -1608,7 +1609,7 @@
     <w:p>
       <w:pPr>
         <w:spacing w:after="0" w:line="240" w:lineRule="auto"/>
-        <w:ind w:left="360" w:hanging="360"/>
+        <w:ind w:left="400" w:hanging="400"/>
         <w:jc w:val="both"/>
         <w:rPr>
           <w:rFonts w:ascii="Arial" w:hAnsi="Arial" w:cs="Arial"/>

</xml_diff>

<commit_message>
fix: Perfectly format justification and indents with inserted tabs
</commit_message>
<xml_diff>
--- a/04-Surat Pemberitahuan Kedatangan Santri Baru 2026-2027-REVISED.docx
+++ b/04-Surat Pemberitahuan Kedatangan Santri Baru 2026-2027-REVISED.docx
@@ -1171,8 +1171,11 @@
     </w:p>
     <w:p>
       <w:pPr>
+        <w:tabs>
+          <w:tab w:val="left" w:pos="500"/>
+        </w:tabs>
         <w:spacing w:after="0" w:line="240" w:lineRule="auto"/>
-        <w:ind w:left="400" w:hanging="400"/>
+        <w:ind w:left="500" w:hanging="500"/>
         <w:jc w:val="both"/>
         <w:rPr>
           <w:rFonts w:ascii="Arial" w:hAnsi="Arial" w:cs="Arial"/>
@@ -1184,7 +1187,21 @@
           <w:rFonts w:ascii="Arial" w:hAnsi="Arial" w:cs="Arial"/>
           <w:bCs/>
         </w:rPr>
-        <w:t>1. Foto setengah badan terbaru berlatar belakang merah, ukuran 4 x 6 cm sebanyak 4 lembar</w:t>
+        <w:t>1.</w:t>
+      </w:r>
+      <w:r>
+        <w:rPr>
+          <w:rFonts w:ascii="Arial" w:hAnsi="Arial" w:cs="Arial"/>
+          <w:bCs/>
+        </w:rPr>
+        <w:tab/>
+      </w:r>
+      <w:r>
+        <w:rPr>
+          <w:rFonts w:ascii="Arial" w:hAnsi="Arial" w:cs="Arial"/>
+          <w:bCs/>
+        </w:rPr>
+        <w:t>Foto setengah badan terbaru berlatar belakang merah, ukuran 4 x 6 cm sebanyak 4 lembar</w:t>
       </w:r>
     </w:p>
     <w:p>
@@ -1221,8 +1238,11 @@
     </w:p>
     <w:p>
       <w:pPr>
+        <w:tabs>
+          <w:tab w:val="left" w:pos="500"/>
+        </w:tabs>
         <w:spacing w:after="0" w:line="240" w:lineRule="auto"/>
-        <w:ind w:left="400" w:hanging="400"/>
+        <w:ind w:left="500" w:hanging="500"/>
         <w:jc w:val="both"/>
         <w:rPr>
           <w:rFonts w:ascii="Arial" w:hAnsi="Arial" w:cs="Arial"/>
@@ -1234,13 +1254,30 @@
           <w:rFonts w:ascii="Arial" w:hAnsi="Arial" w:cs="Arial"/>
           <w:bCs/>
         </w:rPr>
-        <w:t>4. Fotokopi rapor semester ganjil terakhir</w:t>
-      </w:r>
-    </w:p>
-    <w:p>
-      <w:pPr>
+        <w:t>4.</w:t>
+      </w:r>
+      <w:r>
+        <w:rPr>
+          <w:rFonts w:ascii="Arial" w:hAnsi="Arial" w:cs="Arial"/>
+          <w:bCs/>
+        </w:rPr>
+        <w:tab/>
+      </w:r>
+      <w:r>
+        <w:rPr>
+          <w:rFonts w:ascii="Arial" w:hAnsi="Arial" w:cs="Arial"/>
+          <w:bCs/>
+        </w:rPr>
+        <w:t>Fotokopi rapor semester ganjil terakhir</w:t>
+      </w:r>
+    </w:p>
+    <w:p>
+      <w:pPr>
+        <w:tabs>
+          <w:tab w:val="left" w:pos="500"/>
+        </w:tabs>
         <w:spacing w:after="0" w:line="240" w:lineRule="auto"/>
-        <w:ind w:left="400" w:hanging="400"/>
+        <w:ind w:left="500" w:hanging="500"/>
         <w:jc w:val="both"/>
         <w:rPr>
           <w:rFonts w:ascii="Arial" w:hAnsi="Arial" w:cs="Arial"/>
@@ -1252,13 +1289,30 @@
           <w:rFonts w:ascii="Arial" w:hAnsi="Arial" w:cs="Arial"/>
           <w:bCs/>
         </w:rPr>
-        <w:t>5. Fotokopi rapor semester genap terakhir</w:t>
-      </w:r>
-    </w:p>
-    <w:p>
-      <w:pPr>
+        <w:t>5.</w:t>
+      </w:r>
+      <w:r>
+        <w:rPr>
+          <w:rFonts w:ascii="Arial" w:hAnsi="Arial" w:cs="Arial"/>
+          <w:bCs/>
+        </w:rPr>
+        <w:tab/>
+      </w:r>
+      <w:r>
+        <w:rPr>
+          <w:rFonts w:ascii="Arial" w:hAnsi="Arial" w:cs="Arial"/>
+          <w:bCs/>
+        </w:rPr>
+        <w:t>Fotokopi rapor semester genap terakhir</w:t>
+      </w:r>
+    </w:p>
+    <w:p>
+      <w:pPr>
+        <w:tabs>
+          <w:tab w:val="left" w:pos="500"/>
+        </w:tabs>
         <w:spacing w:after="0" w:line="240" w:lineRule="auto"/>
-        <w:ind w:left="400" w:hanging="400"/>
+        <w:ind w:left="500" w:hanging="500"/>
         <w:jc w:val="both"/>
         <w:rPr>
           <w:rFonts w:ascii="Arial" w:hAnsi="Arial" w:cs="Arial"/>
@@ -1270,13 +1324,30 @@
           <w:rFonts w:ascii="Arial" w:hAnsi="Arial" w:cs="Arial"/>
           <w:bCs/>
         </w:rPr>
-        <w:t>6. Print-out bukti NISN (Nomor Induk Siswa Nasional)</w:t>
-      </w:r>
-    </w:p>
-    <w:p>
-      <w:pPr>
+        <w:t>6.</w:t>
+      </w:r>
+      <w:r>
+        <w:rPr>
+          <w:rFonts w:ascii="Arial" w:hAnsi="Arial" w:cs="Arial"/>
+          <w:bCs/>
+        </w:rPr>
+        <w:tab/>
+      </w:r>
+      <w:r>
+        <w:rPr>
+          <w:rFonts w:ascii="Arial" w:hAnsi="Arial" w:cs="Arial"/>
+          <w:bCs/>
+        </w:rPr>
+        <w:t>Print-out bukti NISN (Nomor Induk Siswa Nasional)</w:t>
+      </w:r>
+    </w:p>
+    <w:p>
+      <w:pPr>
+        <w:tabs>
+          <w:tab w:val="left" w:pos="500"/>
+        </w:tabs>
         <w:spacing w:after="0" w:line="240" w:lineRule="auto"/>
-        <w:ind w:left="400" w:hanging="400"/>
+        <w:ind w:left="500" w:hanging="500"/>
         <w:jc w:val="both"/>
         <w:rPr>
           <w:rFonts w:ascii="Arial" w:hAnsi="Arial" w:cs="Arial"/>
@@ -1288,13 +1359,30 @@
           <w:rFonts w:ascii="Arial" w:hAnsi="Arial" w:cs="Arial"/>
           <w:bCs/>
         </w:rPr>
-        <w:t>7. Surat Keterangan Sehat (format panitia) - ASLI</w:t>
-      </w:r>
-    </w:p>
-    <w:p>
-      <w:pPr>
+        <w:t>7.</w:t>
+      </w:r>
+      <w:r>
+        <w:rPr>
+          <w:rFonts w:ascii="Arial" w:hAnsi="Arial" w:cs="Arial"/>
+          <w:bCs/>
+        </w:rPr>
+        <w:tab/>
+      </w:r>
+      <w:r>
+        <w:rPr>
+          <w:rFonts w:ascii="Arial" w:hAnsi="Arial" w:cs="Arial"/>
+          <w:bCs/>
+        </w:rPr>
+        <w:t>Surat Keterangan Sehat (format panitia) - ASLI</w:t>
+      </w:r>
+    </w:p>
+    <w:p>
+      <w:pPr>
+        <w:tabs>
+          <w:tab w:val="left" w:pos="500"/>
+        </w:tabs>
         <w:spacing w:after="0" w:line="240" w:lineRule="auto"/>
-        <w:ind w:left="400" w:hanging="400"/>
+        <w:ind w:left="500" w:hanging="500"/>
         <w:jc w:val="both"/>
         <w:rPr>
           <w:rFonts w:ascii="Arial" w:hAnsi="Arial" w:cs="Arial"/>
@@ -1306,13 +1394,30 @@
           <w:rFonts w:ascii="Arial" w:hAnsi="Arial" w:cs="Arial"/>
           <w:bCs/>
         </w:rPr>
-        <w:t>8. Surat Pernyataan Bebas dari Perilaku Buruk (format panitia) - ASLI</w:t>
-      </w:r>
-    </w:p>
-    <w:p>
-      <w:pPr>
+        <w:t>8.</w:t>
+      </w:r>
+      <w:r>
+        <w:rPr>
+          <w:rFonts w:ascii="Arial" w:hAnsi="Arial" w:cs="Arial"/>
+          <w:bCs/>
+        </w:rPr>
+        <w:tab/>
+      </w:r>
+      <w:r>
+        <w:rPr>
+          <w:rFonts w:ascii="Arial" w:hAnsi="Arial" w:cs="Arial"/>
+          <w:bCs/>
+        </w:rPr>
+        <w:t>Surat Pernyataan Bebas dari Perilaku Buruk (format panitia) - ASLI</w:t>
+      </w:r>
+    </w:p>
+    <w:p>
+      <w:pPr>
+        <w:tabs>
+          <w:tab w:val="left" w:pos="500"/>
+        </w:tabs>
         <w:spacing w:after="0" w:line="240" w:lineRule="auto"/>
-        <w:ind w:left="400" w:hanging="400"/>
+        <w:ind w:left="500" w:hanging="500"/>
         <w:jc w:val="both"/>
         <w:rPr>
           <w:rFonts w:ascii="Arial" w:hAnsi="Arial" w:cs="Arial"/>
@@ -1324,13 +1429,30 @@
           <w:rFonts w:ascii="Arial" w:hAnsi="Arial" w:cs="Arial"/>
           <w:bCs/>
         </w:rPr>
-        <w:t>9. Pakta Integritas Calon Santri (format panitia) - ASLI</w:t>
-      </w:r>
-    </w:p>
-    <w:p>
-      <w:pPr>
+        <w:t>9.</w:t>
+      </w:r>
+      <w:r>
+        <w:rPr>
+          <w:rFonts w:ascii="Arial" w:hAnsi="Arial" w:cs="Arial"/>
+          <w:bCs/>
+        </w:rPr>
+        <w:tab/>
+      </w:r>
+      <w:r>
+        <w:rPr>
+          <w:rFonts w:ascii="Arial" w:hAnsi="Arial" w:cs="Arial"/>
+          <w:bCs/>
+        </w:rPr>
+        <w:t>Pakta Integritas Calon Santri (format panitia) - ASLI</w:t>
+      </w:r>
+    </w:p>
+    <w:p>
+      <w:pPr>
+        <w:tabs>
+          <w:tab w:val="left" w:pos="500"/>
+        </w:tabs>
         <w:spacing w:after="0" w:line="240" w:lineRule="auto"/>
-        <w:ind w:left="400" w:hanging="400"/>
+        <w:ind w:left="500" w:hanging="500"/>
         <w:jc w:val="both"/>
         <w:rPr>
           <w:rFonts w:ascii="Arial" w:hAnsi="Arial" w:cs="Arial"/>
@@ -1342,7 +1464,21 @@
           <w:rFonts w:ascii="Arial" w:hAnsi="Arial" w:cs="Arial"/>
           <w:bCs/>
         </w:rPr>
-        <w:t>10. Pakta Integritas Calon Orang Tua/Wali Santri (format panitia) - ASLI</w:t>
+        <w:t>10.</w:t>
+      </w:r>
+      <w:r>
+        <w:rPr>
+          <w:rFonts w:ascii="Arial" w:hAnsi="Arial" w:cs="Arial"/>
+          <w:bCs/>
+        </w:rPr>
+        <w:tab/>
+      </w:r>
+      <w:r>
+        <w:rPr>
+          <w:rFonts w:ascii="Arial" w:hAnsi="Arial" w:cs="Arial"/>
+          <w:bCs/>
+        </w:rPr>
+        <w:t>Pakta Integritas Calon Orang Tua/Wali Santri (format panitia) - ASLI</w:t>
       </w:r>
     </w:p>
     <w:p>
@@ -1419,8 +1555,11 @@
     </w:p>
     <w:p>
       <w:pPr>
+        <w:tabs>
+          <w:tab w:val="left" w:pos="500"/>
+        </w:tabs>
         <w:spacing w:after="0" w:line="240" w:lineRule="auto"/>
-        <w:ind w:left="400" w:hanging="400"/>
+        <w:ind w:left="500" w:hanging="500"/>
         <w:jc w:val="both"/>
         <w:rPr>
           <w:rFonts w:ascii="Arial" w:hAnsi="Arial" w:cs="Arial"/>
@@ -1432,13 +1571,30 @@
           <w:rFonts w:ascii="Arial" w:hAnsi="Arial" w:cs="Arial"/>
           <w:bCs/>
         </w:rPr>
-        <w:t>1. Berseragam: baju Koko/Kemeja putih, celana kain hitam, songkok nasional hitam.</w:t>
-      </w:r>
-    </w:p>
-    <w:p>
-      <w:pPr>
+        <w:t>1.</w:t>
+      </w:r>
+      <w:r>
+        <w:rPr>
+          <w:rFonts w:ascii="Arial" w:hAnsi="Arial" w:cs="Arial"/>
+          <w:bCs/>
+        </w:rPr>
+        <w:tab/>
+      </w:r>
+      <w:r>
+        <w:rPr>
+          <w:rFonts w:ascii="Arial" w:hAnsi="Arial" w:cs="Arial"/>
+          <w:bCs/>
+        </w:rPr>
+        <w:t>Berseragam: baju Koko/Kemeja putih, celana kain hitam, songkok nasional hitam.</w:t>
+      </w:r>
+    </w:p>
+    <w:p>
+      <w:pPr>
+        <w:tabs>
+          <w:tab w:val="left" w:pos="500"/>
+        </w:tabs>
         <w:spacing w:after="0" w:line="240" w:lineRule="auto"/>
-        <w:ind w:left="400" w:hanging="400"/>
+        <w:ind w:left="500" w:hanging="500"/>
         <w:jc w:val="both"/>
         <w:rPr>
           <w:rFonts w:ascii="Arial" w:hAnsi="Arial" w:cs="Arial"/>
@@ -1450,24 +1606,55 @@
           <w:rFonts w:ascii="Arial" w:hAnsi="Arial" w:cs="Arial"/>
           <w:bCs/>
         </w:rPr>
-        <w:t>2. Kursi di ruang acara utama dan kupon konsumsi/snack hanya disediakan untuk 3 orang (santri bersama 2 wali/pendamping terdekat). Pengantar lain diperkenankan masuk ke area pesantren, namun tidak diperkenankan memasuki ruang acara utama dan tidak mendapatkan kupon konsumsi.</w:t>
-      </w:r>
-    </w:p>
-    <w:p>
-      <w:pPr>
+        <w:t>2.</w:t>
+      </w:r>
+      <w:r>
+        <w:rPr>
+          <w:rFonts w:ascii="Arial" w:hAnsi="Arial" w:cs="Arial"/>
+          <w:bCs/>
+        </w:rPr>
+        <w:tab/>
+      </w:r>
+      <w:r>
+        <w:rPr>
+          <w:rFonts w:ascii="Arial" w:hAnsi="Arial" w:cs="Arial"/>
+          <w:bCs/>
+        </w:rPr>
+        <w:t>Kursi di ruang acara utama dan kupon konsumsi/snack hanya disediakan untuk 3 orang (santri bersama 2 wali/pendamping terdekat). Pengantar lain diperkenankan masuk ke area pesantren, namun tidak diperkenankan memasuki ruang acara utama dan tidak mendapatkan kupon konsumsi.</w:t>
+      </w:r>
+    </w:p>
+    <w:p>
+      <w:pPr>
+        <w:tabs>
+          <w:tab w:val="left" w:pos="500"/>
+        </w:tabs>
         <w:spacing w:after="0" w:line="240" w:lineRule="auto"/>
-        <w:ind w:left="400" w:hanging="400"/>
-        <w:rPr>
-          <w:rFonts w:ascii="Arial" w:hAnsi="Arial" w:cs="Arial"/>
-          <w:bCs/>
-        </w:rPr>
-      </w:pPr>
-      <w:r>
-        <w:rPr>
-          <w:rFonts w:ascii="Arial" w:hAnsi="Arial" w:cs="Arial"/>
-          <w:bCs/>
-        </w:rPr>
-        <w:t xml:space="preserve">3. Konfirmasi kehadiran dengan mengisi link berikut: </w:t>
+        <w:ind w:left="500" w:hanging="500"/>
+        <w:rPr>
+          <w:rFonts w:ascii="Arial" w:hAnsi="Arial" w:cs="Arial"/>
+          <w:bCs/>
+        </w:rPr>
+      </w:pPr>
+      <w:r>
+        <w:rPr>
+          <w:rFonts w:ascii="Arial" w:hAnsi="Arial" w:cs="Arial"/>
+          <w:bCs/>
+        </w:rPr>
+        <w:t>3.</w:t>
+      </w:r>
+      <w:r>
+        <w:rPr>
+          <w:rFonts w:ascii="Arial" w:hAnsi="Arial" w:cs="Arial"/>
+          <w:bCs/>
+        </w:rPr>
+        <w:tab/>
+      </w:r>
+      <w:r>
+        <w:rPr>
+          <w:rFonts w:ascii="Arial" w:hAnsi="Arial" w:cs="Arial"/>
+          <w:bCs/>
+        </w:rPr>
+        <w:t xml:space="preserve">Konfirmasi kehadiran dengan mengisi link berikut: </w:t>
       </w:r>
       <w:hyperlink r:id="rId13" w:history="1">
         <w:r>
@@ -1482,8 +1669,11 @@
     </w:p>
     <w:p>
       <w:pPr>
+        <w:tabs>
+          <w:tab w:val="left" w:pos="500"/>
+        </w:tabs>
         <w:spacing w:after="0" w:line="240" w:lineRule="auto"/>
-        <w:ind w:left="400" w:hanging="400"/>
+        <w:ind w:left="500" w:hanging="500"/>
         <w:jc w:val="both"/>
         <w:rPr>
           <w:rFonts w:ascii="Arial" w:hAnsi="Arial" w:cs="Arial"/>
@@ -1495,13 +1685,30 @@
           <w:rFonts w:ascii="Arial" w:hAnsi="Arial" w:cs="Arial"/>
           <w:bCs/>
         </w:rPr>
-        <w:t>4. Santri yang membawa kendaraan pribadi tidak diperkenankan menurunkan barang bawaan hingga acara Welcome Day selesai.</w:t>
-      </w:r>
-    </w:p>
-    <w:p>
-      <w:pPr>
+        <w:t>4.</w:t>
+      </w:r>
+      <w:r>
+        <w:rPr>
+          <w:rFonts w:ascii="Arial" w:hAnsi="Arial" w:cs="Arial"/>
+          <w:bCs/>
+        </w:rPr>
+        <w:tab/>
+      </w:r>
+      <w:r>
+        <w:rPr>
+          <w:rFonts w:ascii="Arial" w:hAnsi="Arial" w:cs="Arial"/>
+          <w:bCs/>
+        </w:rPr>
+        <w:t>Santri yang membawa kendaraan pribadi tidak diperkenankan menurunkan barang bawaan hingga acara Welcome Day selesai.</w:t>
+      </w:r>
+    </w:p>
+    <w:p>
+      <w:pPr>
+        <w:tabs>
+          <w:tab w:val="left" w:pos="500"/>
+        </w:tabs>
         <w:spacing w:after="0" w:line="240" w:lineRule="auto"/>
-        <w:ind w:left="400" w:hanging="400"/>
+        <w:ind w:left="500" w:hanging="500"/>
         <w:jc w:val="both"/>
         <w:rPr>
           <w:rFonts w:ascii="Arial" w:hAnsi="Arial" w:cs="Arial"/>
@@ -1513,13 +1720,30 @@
           <w:rFonts w:ascii="Arial" w:hAnsi="Arial" w:cs="Arial"/>
           <w:bCs/>
         </w:rPr>
-        <w:t>5. Santri yang tidak berkendaraan pribadi menempatkan barang bawaan di area masjid yang telah ditentukan.</w:t>
-      </w:r>
-    </w:p>
-    <w:p>
-      <w:pPr>
+        <w:t>5.</w:t>
+      </w:r>
+      <w:r>
+        <w:rPr>
+          <w:rFonts w:ascii="Arial" w:hAnsi="Arial" w:cs="Arial"/>
+          <w:bCs/>
+        </w:rPr>
+        <w:tab/>
+      </w:r>
+      <w:r>
+        <w:rPr>
+          <w:rFonts w:ascii="Arial" w:hAnsi="Arial" w:cs="Arial"/>
+          <w:bCs/>
+        </w:rPr>
+        <w:t>Santri yang tidak berkendaraan pribadi menempatkan barang bawaan di area masjid yang telah ditentukan.</w:t>
+      </w:r>
+    </w:p>
+    <w:p>
+      <w:pPr>
+        <w:tabs>
+          <w:tab w:val="left" w:pos="500"/>
+        </w:tabs>
         <w:spacing w:after="0" w:line="240" w:lineRule="auto"/>
-        <w:ind w:left="400" w:hanging="400"/>
+        <w:ind w:left="500" w:hanging="500"/>
         <w:jc w:val="both"/>
         <w:rPr>
           <w:rFonts w:ascii="Arial" w:hAnsi="Arial" w:cs="Arial"/>
@@ -1531,13 +1755,30 @@
           <w:rFonts w:ascii="Arial" w:hAnsi="Arial" w:cs="Arial"/>
           <w:bCs/>
         </w:rPr>
-        <w:t>6. Melakukan registrasi sebelum memasuki area acara.</w:t>
-      </w:r>
-    </w:p>
-    <w:p>
-      <w:pPr>
+        <w:t>6.</w:t>
+      </w:r>
+      <w:r>
+        <w:rPr>
+          <w:rFonts w:ascii="Arial" w:hAnsi="Arial" w:cs="Arial"/>
+          <w:bCs/>
+        </w:rPr>
+        <w:tab/>
+      </w:r>
+      <w:r>
+        <w:rPr>
+          <w:rFonts w:ascii="Arial" w:hAnsi="Arial" w:cs="Arial"/>
+          <w:bCs/>
+        </w:rPr>
+        <w:t>Melakukan registrasi sebelum memasuki area acara.</w:t>
+      </w:r>
+    </w:p>
+    <w:p>
+      <w:pPr>
+        <w:tabs>
+          <w:tab w:val="left" w:pos="500"/>
+        </w:tabs>
         <w:spacing w:after="0" w:line="240" w:lineRule="auto"/>
-        <w:ind w:left="400" w:hanging="400"/>
+        <w:ind w:left="500" w:hanging="500"/>
         <w:jc w:val="both"/>
         <w:rPr>
           <w:rFonts w:ascii="Arial" w:hAnsi="Arial" w:cs="Arial"/>
@@ -1549,13 +1790,30 @@
           <w:rFonts w:ascii="Arial" w:hAnsi="Arial" w:cs="Arial"/>
           <w:bCs/>
         </w:rPr>
-        <w:t>7. Setelah registrasi, santri dan orang tua memasuki tempat acara.</w:t>
-      </w:r>
-    </w:p>
-    <w:p>
-      <w:pPr>
+        <w:t>7.</w:t>
+      </w:r>
+      <w:r>
+        <w:rPr>
+          <w:rFonts w:ascii="Arial" w:hAnsi="Arial" w:cs="Arial"/>
+          <w:bCs/>
+        </w:rPr>
+        <w:tab/>
+      </w:r>
+      <w:r>
+        <w:rPr>
+          <w:rFonts w:ascii="Arial" w:hAnsi="Arial" w:cs="Arial"/>
+          <w:bCs/>
+        </w:rPr>
+        <w:t>Setelah registrasi, santri dan orang tua memasuki tempat acara.</w:t>
+      </w:r>
+    </w:p>
+    <w:p>
+      <w:pPr>
+        <w:tabs>
+          <w:tab w:val="left" w:pos="500"/>
+        </w:tabs>
         <w:spacing w:after="0" w:line="240" w:lineRule="auto"/>
-        <w:ind w:left="400" w:hanging="400"/>
+        <w:ind w:left="500" w:hanging="500"/>
         <w:jc w:val="both"/>
         <w:rPr>
           <w:rFonts w:ascii="Arial" w:hAnsi="Arial" w:cs="Arial"/>
@@ -1567,13 +1825,30 @@
           <w:rFonts w:ascii="Arial" w:hAnsi="Arial" w:cs="Arial"/>
           <w:bCs/>
         </w:rPr>
-        <w:t>8. Setelah acara bersama tamu undangan, orang tua dan santri mengikuti sarasehan tentang peraturan, mekanisme, dan prosedur santri di Pesantren Al Imam Al Islami.</w:t>
-      </w:r>
-    </w:p>
-    <w:p>
-      <w:pPr>
+        <w:t>8.</w:t>
+      </w:r>
+      <w:r>
+        <w:rPr>
+          <w:rFonts w:ascii="Arial" w:hAnsi="Arial" w:cs="Arial"/>
+          <w:bCs/>
+        </w:rPr>
+        <w:tab/>
+      </w:r>
+      <w:r>
+        <w:rPr>
+          <w:rFonts w:ascii="Arial" w:hAnsi="Arial" w:cs="Arial"/>
+          <w:bCs/>
+        </w:rPr>
+        <w:t>Setelah acara bersama tamu undangan, orang tua dan santri mengikuti sarasehan tentang peraturan, mekanisme, dan prosedur santri di Pesantren Al Imam Al Islami.</w:t>
+      </w:r>
+    </w:p>
+    <w:p>
+      <w:pPr>
+        <w:tabs>
+          <w:tab w:val="left" w:pos="500"/>
+        </w:tabs>
         <w:spacing w:after="0" w:line="240" w:lineRule="auto"/>
-        <w:ind w:left="400" w:hanging="400"/>
+        <w:ind w:left="500" w:hanging="500"/>
         <w:jc w:val="both"/>
         <w:rPr>
           <w:rFonts w:ascii="Arial" w:hAnsi="Arial" w:cs="Arial"/>
@@ -1585,13 +1860,30 @@
           <w:rFonts w:ascii="Arial" w:hAnsi="Arial" w:cs="Arial"/>
           <w:bCs/>
         </w:rPr>
-        <w:t>9. Makan siang dibagikan di depan ruang acara dengan menukarkan kupon.</w:t>
-      </w:r>
-    </w:p>
-    <w:p>
-      <w:pPr>
+        <w:t>9.</w:t>
+      </w:r>
+      <w:r>
+        <w:rPr>
+          <w:rFonts w:ascii="Arial" w:hAnsi="Arial" w:cs="Arial"/>
+          <w:bCs/>
+        </w:rPr>
+        <w:tab/>
+      </w:r>
+      <w:r>
+        <w:rPr>
+          <w:rFonts w:ascii="Arial" w:hAnsi="Arial" w:cs="Arial"/>
+          <w:bCs/>
+        </w:rPr>
+        <w:t>Makan siang dibagikan di depan ruang acara dengan menukarkan kupon.</w:t>
+      </w:r>
+    </w:p>
+    <w:p>
+      <w:pPr>
+        <w:tabs>
+          <w:tab w:val="left" w:pos="500"/>
+        </w:tabs>
         <w:spacing w:after="0" w:line="240" w:lineRule="auto"/>
-        <w:ind w:left="400" w:hanging="400"/>
+        <w:ind w:left="500" w:hanging="500"/>
         <w:jc w:val="both"/>
         <w:rPr>
           <w:rFonts w:ascii="Arial" w:hAnsi="Arial" w:cs="Arial"/>
@@ -1603,13 +1895,30 @@
           <w:rFonts w:ascii="Arial" w:hAnsi="Arial" w:cs="Arial"/>
           <w:bCs/>
         </w:rPr>
-        <w:t>10. Setelah acara berakhir, santri memasuki asrama dan mengkondisikan barang bawaan dibantu oleh para ustadz.</w:t>
-      </w:r>
-    </w:p>
-    <w:p>
-      <w:pPr>
+        <w:t>10.</w:t>
+      </w:r>
+      <w:r>
+        <w:rPr>
+          <w:rFonts w:ascii="Arial" w:hAnsi="Arial" w:cs="Arial"/>
+          <w:bCs/>
+        </w:rPr>
+        <w:tab/>
+      </w:r>
+      <w:r>
+        <w:rPr>
+          <w:rFonts w:ascii="Arial" w:hAnsi="Arial" w:cs="Arial"/>
+          <w:bCs/>
+        </w:rPr>
+        <w:t>Setelah acara berakhir, santri memasuki asrama dan mengkondisikan barang bawaan dibantu oleh para ustadz.</w:t>
+      </w:r>
+    </w:p>
+    <w:p>
+      <w:pPr>
+        <w:tabs>
+          <w:tab w:val="left" w:pos="500"/>
+        </w:tabs>
         <w:spacing w:after="0" w:line="240" w:lineRule="auto"/>
-        <w:ind w:left="400" w:hanging="400"/>
+        <w:ind w:left="500" w:hanging="500"/>
         <w:jc w:val="both"/>
         <w:rPr>
           <w:rFonts w:ascii="Arial" w:hAnsi="Arial" w:cs="Arial"/>
@@ -1621,7 +1930,21 @@
           <w:rFonts w:ascii="Arial" w:hAnsi="Arial" w:cs="Arial"/>
           <w:bCs/>
         </w:rPr>
-        <w:t>11. Orang tua hanya diperkenankan membersamai santri hingga sore hari pukul 17.00 WIB.</w:t>
+        <w:t>11.</w:t>
+      </w:r>
+      <w:r>
+        <w:rPr>
+          <w:rFonts w:ascii="Arial" w:hAnsi="Arial" w:cs="Arial"/>
+          <w:bCs/>
+        </w:rPr>
+        <w:tab/>
+      </w:r>
+      <w:r>
+        <w:rPr>
+          <w:rFonts w:ascii="Arial" w:hAnsi="Arial" w:cs="Arial"/>
+          <w:bCs/>
+        </w:rPr>
+        <w:t>Orang tua hanya diperkenankan membersamai santri hingga sore hari pukul 17.00 WIB.</w:t>
       </w:r>
     </w:p>
     <w:sectPr>

</xml_diff>

<commit_message>
fix: Robust hanging indent normalization and formatting
</commit_message>
<xml_diff>
--- a/04-Surat Pemberitahuan Kedatangan Santri Baru 2026-2027-REVISED.docx
+++ b/04-Surat Pemberitahuan Kedatangan Santri Baru 2026-2027-REVISED.docx
@@ -1136,7 +1136,12 @@
     </w:p>
     <w:p>
       <w:pPr>
+        <w:tabs>
+          <w:tab w:val="left" w:pos="720"/>
+        </w:tabs>
         <w:spacing w:after="0" w:line="240" w:lineRule="auto"/>
+        <w:ind w:left="720" w:hanging="720"/>
+        <w:jc w:val="both"/>
         <w:rPr>
           <w:rFonts w:ascii="Arial" w:hAnsi="Arial" w:cs="Arial"/>
           <w:b/>
@@ -1149,7 +1154,23 @@
           <w:b/>
           <w:bCs/>
         </w:rPr>
-        <w:t>A. Berkas Persyaratan yang Wajib Dibawa</w:t>
+        <w:t>A.</w:t>
+      </w:r>
+      <w:r>
+        <w:rPr>
+          <w:rFonts w:ascii="Arial" w:hAnsi="Arial" w:cs="Arial"/>
+          <w:b/>
+          <w:bCs/>
+        </w:rPr>
+        <w:tab/>
+      </w:r>
+      <w:r>
+        <w:rPr>
+          <w:rFonts w:ascii="Arial" w:hAnsi="Arial" w:cs="Arial"/>
+          <w:b/>
+          <w:bCs/>
+        </w:rPr>
+        <w:t>Berkas Persyaratan yang Wajib Dibawa</w:t>
       </w:r>
     </w:p>
     <w:p>
@@ -1172,10 +1193,10 @@
     <w:p>
       <w:pPr>
         <w:tabs>
-          <w:tab w:val="left" w:pos="500"/>
+          <w:tab w:val="left" w:pos="720"/>
         </w:tabs>
         <w:spacing w:after="0" w:line="240" w:lineRule="auto"/>
-        <w:ind w:left="500" w:hanging="500"/>
+        <w:ind w:left="720" w:hanging="720"/>
         <w:jc w:val="both"/>
         <w:rPr>
           <w:rFonts w:ascii="Arial" w:hAnsi="Arial" w:cs="Arial"/>
@@ -1206,43 +1227,11 @@
     </w:p>
     <w:p>
       <w:pPr>
-        <w:spacing w:after="0" w:line="240" w:lineRule="auto"/>
-        <w:rPr>
-          <w:rFonts w:ascii="Arial" w:hAnsi="Arial" w:cs="Arial"/>
-          <w:bCs/>
-        </w:rPr>
-      </w:pPr>
-      <w:r>
-        <w:rPr>
-          <w:rFonts w:ascii="Arial" w:hAnsi="Arial" w:cs="Arial"/>
-          <w:bCs/>
-        </w:rPr>
-        <w:t>2. Fotokopi Kartu Keluarga (KK)</w:t>
-      </w:r>
-    </w:p>
-    <w:p>
-      <w:pPr>
-        <w:spacing w:after="0" w:line="240" w:lineRule="auto"/>
-        <w:rPr>
-          <w:rFonts w:ascii="Arial" w:hAnsi="Arial" w:cs="Arial"/>
-          <w:bCs/>
-        </w:rPr>
-      </w:pPr>
-      <w:r>
-        <w:rPr>
-          <w:rFonts w:ascii="Arial" w:hAnsi="Arial" w:cs="Arial"/>
-          <w:bCs/>
-        </w:rPr>
-        <w:t>3. Fotokopi Akta Kelahiran</w:t>
-      </w:r>
-    </w:p>
-    <w:p>
-      <w:pPr>
         <w:tabs>
-          <w:tab w:val="left" w:pos="500"/>
+          <w:tab w:val="left" w:pos="720"/>
         </w:tabs>
         <w:spacing w:after="0" w:line="240" w:lineRule="auto"/>
-        <w:ind w:left="500" w:hanging="500"/>
+        <w:ind w:left="720" w:hanging="720"/>
         <w:jc w:val="both"/>
         <w:rPr>
           <w:rFonts w:ascii="Arial" w:hAnsi="Arial" w:cs="Arial"/>
@@ -1254,7 +1243,7 @@
           <w:rFonts w:ascii="Arial" w:hAnsi="Arial" w:cs="Arial"/>
           <w:bCs/>
         </w:rPr>
-        <w:t>4.</w:t>
+        <w:t>2.</w:t>
       </w:r>
       <w:r>
         <w:rPr>
@@ -1268,16 +1257,16 @@
           <w:rFonts w:ascii="Arial" w:hAnsi="Arial" w:cs="Arial"/>
           <w:bCs/>
         </w:rPr>
-        <w:t>Fotokopi rapor semester ganjil terakhir</w:t>
+        <w:t>Fotokopi Kartu Keluarga (KK)</w:t>
       </w:r>
     </w:p>
     <w:p>
       <w:pPr>
         <w:tabs>
-          <w:tab w:val="left" w:pos="500"/>
+          <w:tab w:val="left" w:pos="720"/>
         </w:tabs>
         <w:spacing w:after="0" w:line="240" w:lineRule="auto"/>
-        <w:ind w:left="500" w:hanging="500"/>
+        <w:ind w:left="720" w:hanging="720"/>
         <w:jc w:val="both"/>
         <w:rPr>
           <w:rFonts w:ascii="Arial" w:hAnsi="Arial" w:cs="Arial"/>
@@ -1289,7 +1278,7 @@
           <w:rFonts w:ascii="Arial" w:hAnsi="Arial" w:cs="Arial"/>
           <w:bCs/>
         </w:rPr>
-        <w:t>5.</w:t>
+        <w:t>3.</w:t>
       </w:r>
       <w:r>
         <w:rPr>
@@ -1303,16 +1292,16 @@
           <w:rFonts w:ascii="Arial" w:hAnsi="Arial" w:cs="Arial"/>
           <w:bCs/>
         </w:rPr>
-        <w:t>Fotokopi rapor semester genap terakhir</w:t>
+        <w:t>Fotokopi Akta Kelahiran</w:t>
       </w:r>
     </w:p>
     <w:p>
       <w:pPr>
         <w:tabs>
-          <w:tab w:val="left" w:pos="500"/>
+          <w:tab w:val="left" w:pos="720"/>
         </w:tabs>
         <w:spacing w:after="0" w:line="240" w:lineRule="auto"/>
-        <w:ind w:left="500" w:hanging="500"/>
+        <w:ind w:left="720" w:hanging="720"/>
         <w:jc w:val="both"/>
         <w:rPr>
           <w:rFonts w:ascii="Arial" w:hAnsi="Arial" w:cs="Arial"/>
@@ -1324,7 +1313,7 @@
           <w:rFonts w:ascii="Arial" w:hAnsi="Arial" w:cs="Arial"/>
           <w:bCs/>
         </w:rPr>
-        <w:t>6.</w:t>
+        <w:t>4.</w:t>
       </w:r>
       <w:r>
         <w:rPr>
@@ -1338,16 +1327,16 @@
           <w:rFonts w:ascii="Arial" w:hAnsi="Arial" w:cs="Arial"/>
           <w:bCs/>
         </w:rPr>
-        <w:t>Print-out bukti NISN (Nomor Induk Siswa Nasional)</w:t>
+        <w:t>Fotokopi rapor semester ganjil terakhir</w:t>
       </w:r>
     </w:p>
     <w:p>
       <w:pPr>
         <w:tabs>
-          <w:tab w:val="left" w:pos="500"/>
+          <w:tab w:val="left" w:pos="720"/>
         </w:tabs>
         <w:spacing w:after="0" w:line="240" w:lineRule="auto"/>
-        <w:ind w:left="500" w:hanging="500"/>
+        <w:ind w:left="720" w:hanging="720"/>
         <w:jc w:val="both"/>
         <w:rPr>
           <w:rFonts w:ascii="Arial" w:hAnsi="Arial" w:cs="Arial"/>
@@ -1359,7 +1348,7 @@
           <w:rFonts w:ascii="Arial" w:hAnsi="Arial" w:cs="Arial"/>
           <w:bCs/>
         </w:rPr>
-        <w:t>7.</w:t>
+        <w:t>5.</w:t>
       </w:r>
       <w:r>
         <w:rPr>
@@ -1373,16 +1362,16 @@
           <w:rFonts w:ascii="Arial" w:hAnsi="Arial" w:cs="Arial"/>
           <w:bCs/>
         </w:rPr>
-        <w:t>Surat Keterangan Sehat (format panitia) - ASLI</w:t>
+        <w:t>Fotokopi rapor semester genap terakhir</w:t>
       </w:r>
     </w:p>
     <w:p>
       <w:pPr>
         <w:tabs>
-          <w:tab w:val="left" w:pos="500"/>
+          <w:tab w:val="left" w:pos="720"/>
         </w:tabs>
         <w:spacing w:after="0" w:line="240" w:lineRule="auto"/>
-        <w:ind w:left="500" w:hanging="500"/>
+        <w:ind w:left="720" w:hanging="720"/>
         <w:jc w:val="both"/>
         <w:rPr>
           <w:rFonts w:ascii="Arial" w:hAnsi="Arial" w:cs="Arial"/>
@@ -1394,7 +1383,7 @@
           <w:rFonts w:ascii="Arial" w:hAnsi="Arial" w:cs="Arial"/>
           <w:bCs/>
         </w:rPr>
-        <w:t>8.</w:t>
+        <w:t>6.</w:t>
       </w:r>
       <w:r>
         <w:rPr>
@@ -1408,16 +1397,16 @@
           <w:rFonts w:ascii="Arial" w:hAnsi="Arial" w:cs="Arial"/>
           <w:bCs/>
         </w:rPr>
-        <w:t>Surat Pernyataan Bebas dari Perilaku Buruk (format panitia) - ASLI</w:t>
+        <w:t>Print-out bukti NISN (Nomor Induk Siswa Nasional)</w:t>
       </w:r>
     </w:p>
     <w:p>
       <w:pPr>
         <w:tabs>
-          <w:tab w:val="left" w:pos="500"/>
+          <w:tab w:val="left" w:pos="720"/>
         </w:tabs>
         <w:spacing w:after="0" w:line="240" w:lineRule="auto"/>
-        <w:ind w:left="500" w:hanging="500"/>
+        <w:ind w:left="720" w:hanging="720"/>
         <w:jc w:val="both"/>
         <w:rPr>
           <w:rFonts w:ascii="Arial" w:hAnsi="Arial" w:cs="Arial"/>
@@ -1429,7 +1418,7 @@
           <w:rFonts w:ascii="Arial" w:hAnsi="Arial" w:cs="Arial"/>
           <w:bCs/>
         </w:rPr>
-        <w:t>9.</w:t>
+        <w:t>7.</w:t>
       </w:r>
       <w:r>
         <w:rPr>
@@ -1443,16 +1432,86 @@
           <w:rFonts w:ascii="Arial" w:hAnsi="Arial" w:cs="Arial"/>
           <w:bCs/>
         </w:rPr>
-        <w:t>Pakta Integritas Calon Santri (format panitia) - ASLI</w:t>
+        <w:t>Surat Keterangan Sehat (format panitia) - ASLI</w:t>
       </w:r>
     </w:p>
     <w:p>
       <w:pPr>
         <w:tabs>
-          <w:tab w:val="left" w:pos="500"/>
+          <w:tab w:val="left" w:pos="720"/>
         </w:tabs>
         <w:spacing w:after="0" w:line="240" w:lineRule="auto"/>
-        <w:ind w:left="500" w:hanging="500"/>
+        <w:ind w:left="720" w:hanging="720"/>
+        <w:jc w:val="both"/>
+        <w:rPr>
+          <w:rFonts w:ascii="Arial" w:hAnsi="Arial" w:cs="Arial"/>
+          <w:bCs/>
+        </w:rPr>
+      </w:pPr>
+      <w:r>
+        <w:rPr>
+          <w:rFonts w:ascii="Arial" w:hAnsi="Arial" w:cs="Arial"/>
+          <w:bCs/>
+        </w:rPr>
+        <w:t>8.</w:t>
+      </w:r>
+      <w:r>
+        <w:rPr>
+          <w:rFonts w:ascii="Arial" w:hAnsi="Arial" w:cs="Arial"/>
+          <w:bCs/>
+        </w:rPr>
+        <w:tab/>
+      </w:r>
+      <w:r>
+        <w:rPr>
+          <w:rFonts w:ascii="Arial" w:hAnsi="Arial" w:cs="Arial"/>
+          <w:bCs/>
+        </w:rPr>
+        <w:t>Surat Pernyataan Bebas dari Perilaku Buruk (format panitia) - ASLI</w:t>
+      </w:r>
+    </w:p>
+    <w:p>
+      <w:pPr>
+        <w:tabs>
+          <w:tab w:val="left" w:pos="720"/>
+        </w:tabs>
+        <w:spacing w:after="0" w:line="240" w:lineRule="auto"/>
+        <w:ind w:left="720" w:hanging="720"/>
+        <w:jc w:val="both"/>
+        <w:rPr>
+          <w:rFonts w:ascii="Arial" w:hAnsi="Arial" w:cs="Arial"/>
+          <w:bCs/>
+        </w:rPr>
+      </w:pPr>
+      <w:r>
+        <w:rPr>
+          <w:rFonts w:ascii="Arial" w:hAnsi="Arial" w:cs="Arial"/>
+          <w:bCs/>
+        </w:rPr>
+        <w:t>9.</w:t>
+      </w:r>
+      <w:r>
+        <w:rPr>
+          <w:rFonts w:ascii="Arial" w:hAnsi="Arial" w:cs="Arial"/>
+          <w:bCs/>
+        </w:rPr>
+        <w:tab/>
+      </w:r>
+      <w:r>
+        <w:rPr>
+          <w:rFonts w:ascii="Arial" w:hAnsi="Arial" w:cs="Arial"/>
+          <w:bCs/>
+        </w:rPr>
+        <w:t>Pakta Integritas Calon Santri (format panitia) - ASLI</w:t>
+      </w:r>
+    </w:p>
+    <w:p>
+      <w:pPr>
+        <w:tabs>
+          <w:tab w:val="left" w:pos="720"/>
+        </w:tabs>
+        <w:spacing w:after="0" w:line="240" w:lineRule="auto"/>
+        <w:ind w:left="720" w:hanging="720"/>
         <w:jc w:val="both"/>
         <w:rPr>
           <w:rFonts w:ascii="Arial" w:hAnsi="Arial" w:cs="Arial"/>
@@ -1537,45 +1596,30 @@
     </w:p>
     <w:p>
       <w:pPr>
-        <w:spacing w:after="0" w:line="240" w:lineRule="auto"/>
-        <w:rPr>
-          <w:rFonts w:ascii="Arial" w:hAnsi="Arial" w:cs="Arial"/>
-          <w:b/>
-          <w:bCs/>
-        </w:rPr>
-      </w:pPr>
-      <w:r>
-        <w:rPr>
-          <w:rFonts w:ascii="Arial" w:hAnsi="Arial" w:cs="Arial"/>
-          <w:b/>
-          <w:bCs/>
-        </w:rPr>
-        <w:t>B. Tata Cara dan Alur Kegiatan</w:t>
-      </w:r>
-    </w:p>
-    <w:p>
-      <w:pPr>
         <w:tabs>
-          <w:tab w:val="left" w:pos="500"/>
+          <w:tab w:val="left" w:pos="720"/>
         </w:tabs>
         <w:spacing w:after="0" w:line="240" w:lineRule="auto"/>
-        <w:ind w:left="500" w:hanging="500"/>
+        <w:ind w:left="720" w:hanging="720"/>
         <w:jc w:val="both"/>
         <w:rPr>
           <w:rFonts w:ascii="Arial" w:hAnsi="Arial" w:cs="Arial"/>
-          <w:bCs/>
-        </w:rPr>
-      </w:pPr>
-      <w:r>
-        <w:rPr>
-          <w:rFonts w:ascii="Arial" w:hAnsi="Arial" w:cs="Arial"/>
-          <w:bCs/>
-        </w:rPr>
-        <w:t>1.</w:t>
-      </w:r>
-      <w:r>
-        <w:rPr>
-          <w:rFonts w:ascii="Arial" w:hAnsi="Arial" w:cs="Arial"/>
+          <w:b/>
+          <w:bCs/>
+        </w:rPr>
+      </w:pPr>
+      <w:r>
+        <w:rPr>
+          <w:rFonts w:ascii="Arial" w:hAnsi="Arial" w:cs="Arial"/>
+          <w:b/>
+          <w:bCs/>
+        </w:rPr>
+        <w:t>B.</w:t>
+      </w:r>
+      <w:r>
+        <w:rPr>
+          <w:rFonts w:ascii="Arial" w:hAnsi="Arial" w:cs="Arial"/>
+          <w:b/>
           <w:bCs/>
         </w:rPr>
         <w:tab/>
@@ -1583,18 +1627,19 @@
       <w:r>
         <w:rPr>
           <w:rFonts w:ascii="Arial" w:hAnsi="Arial" w:cs="Arial"/>
-          <w:bCs/>
-        </w:rPr>
-        <w:t>Berseragam: baju Koko/Kemeja putih, celana kain hitam, songkok nasional hitam.</w:t>
+          <w:b/>
+          <w:bCs/>
+        </w:rPr>
+        <w:t>Tata Cara dan Alur Kegiatan</w:t>
       </w:r>
     </w:p>
     <w:p>
       <w:pPr>
         <w:tabs>
-          <w:tab w:val="left" w:pos="500"/>
+          <w:tab w:val="left" w:pos="720"/>
         </w:tabs>
         <w:spacing w:after="0" w:line="240" w:lineRule="auto"/>
-        <w:ind w:left="500" w:hanging="500"/>
+        <w:ind w:left="720" w:hanging="720"/>
         <w:jc w:val="both"/>
         <w:rPr>
           <w:rFonts w:ascii="Arial" w:hAnsi="Arial" w:cs="Arial"/>
@@ -1606,7 +1651,7 @@
           <w:rFonts w:ascii="Arial" w:hAnsi="Arial" w:cs="Arial"/>
           <w:bCs/>
         </w:rPr>
-        <w:t>2.</w:t>
+        <w:t>1.</w:t>
       </w:r>
       <w:r>
         <w:rPr>
@@ -1620,16 +1665,51 @@
           <w:rFonts w:ascii="Arial" w:hAnsi="Arial" w:cs="Arial"/>
           <w:bCs/>
         </w:rPr>
-        <w:t>Kursi di ruang acara utama dan kupon konsumsi/snack hanya disediakan untuk 3 orang (santri bersama 2 wali/pendamping terdekat). Pengantar lain diperkenankan masuk ke area pesantren, namun tidak diperkenankan memasuki ruang acara utama dan tidak mendapatkan kupon konsumsi.</w:t>
+        <w:t>Berseragam: baju Koko/Kemeja putih, celana kain hitam, songkok nasional hitam.</w:t>
       </w:r>
     </w:p>
     <w:p>
       <w:pPr>
         <w:tabs>
-          <w:tab w:val="left" w:pos="500"/>
+          <w:tab w:val="left" w:pos="720"/>
         </w:tabs>
         <w:spacing w:after="0" w:line="240" w:lineRule="auto"/>
-        <w:ind w:left="500" w:hanging="500"/>
+        <w:ind w:left="720" w:hanging="720"/>
+        <w:jc w:val="both"/>
+        <w:rPr>
+          <w:rFonts w:ascii="Arial" w:hAnsi="Arial" w:cs="Arial"/>
+          <w:bCs/>
+        </w:rPr>
+      </w:pPr>
+      <w:r>
+        <w:rPr>
+          <w:rFonts w:ascii="Arial" w:hAnsi="Arial" w:cs="Arial"/>
+          <w:bCs/>
+        </w:rPr>
+        <w:t>2.</w:t>
+      </w:r>
+      <w:r>
+        <w:rPr>
+          <w:rFonts w:ascii="Arial" w:hAnsi="Arial" w:cs="Arial"/>
+          <w:bCs/>
+        </w:rPr>
+        <w:tab/>
+      </w:r>
+      <w:r>
+        <w:rPr>
+          <w:rFonts w:ascii="Arial" w:hAnsi="Arial" w:cs="Arial"/>
+          <w:bCs/>
+        </w:rPr>
+        <w:t>Kursi di ruang acara utama dan kupon konsumsi/snack hanya disediakan untuk 3 orang (santri bersama 2 wali/pendamping terdekat). Pengantar lain diperkenankan masuk ke area pesantren, namun tidak diperkenankan memasuki ruang acara utama dan tidak mendapatkan kupon konsumsi.</w:t>
+      </w:r>
+    </w:p>
+    <w:p>
+      <w:pPr>
+        <w:tabs>
+          <w:tab w:val="left" w:pos="720"/>
+        </w:tabs>
+        <w:spacing w:after="0" w:line="240" w:lineRule="auto"/>
+        <w:ind w:left="720" w:hanging="720"/>
         <w:rPr>
           <w:rFonts w:ascii="Arial" w:hAnsi="Arial" w:cs="Arial"/>
           <w:bCs/>
@@ -1670,10 +1750,10 @@
     <w:p>
       <w:pPr>
         <w:tabs>
-          <w:tab w:val="left" w:pos="500"/>
+          <w:tab w:val="left" w:pos="720"/>
         </w:tabs>
         <w:spacing w:after="0" w:line="240" w:lineRule="auto"/>
-        <w:ind w:left="500" w:hanging="500"/>
+        <w:ind w:left="720" w:hanging="720"/>
         <w:jc w:val="both"/>
         <w:rPr>
           <w:rFonts w:ascii="Arial" w:hAnsi="Arial" w:cs="Arial"/>
@@ -1705,10 +1785,10 @@
     <w:p>
       <w:pPr>
         <w:tabs>
-          <w:tab w:val="left" w:pos="500"/>
+          <w:tab w:val="left" w:pos="720"/>
         </w:tabs>
         <w:spacing w:after="0" w:line="240" w:lineRule="auto"/>
-        <w:ind w:left="500" w:hanging="500"/>
+        <w:ind w:left="720" w:hanging="720"/>
         <w:jc w:val="both"/>
         <w:rPr>
           <w:rFonts w:ascii="Arial" w:hAnsi="Arial" w:cs="Arial"/>
@@ -1740,10 +1820,10 @@
     <w:p>
       <w:pPr>
         <w:tabs>
-          <w:tab w:val="left" w:pos="500"/>
+          <w:tab w:val="left" w:pos="720"/>
         </w:tabs>
         <w:spacing w:after="0" w:line="240" w:lineRule="auto"/>
-        <w:ind w:left="500" w:hanging="500"/>
+        <w:ind w:left="720" w:hanging="720"/>
         <w:jc w:val="both"/>
         <w:rPr>
           <w:rFonts w:ascii="Arial" w:hAnsi="Arial" w:cs="Arial"/>
@@ -1775,10 +1855,10 @@
     <w:p>
       <w:pPr>
         <w:tabs>
-          <w:tab w:val="left" w:pos="500"/>
+          <w:tab w:val="left" w:pos="720"/>
         </w:tabs>
         <w:spacing w:after="0" w:line="240" w:lineRule="auto"/>
-        <w:ind w:left="500" w:hanging="500"/>
+        <w:ind w:left="720" w:hanging="720"/>
         <w:jc w:val="both"/>
         <w:rPr>
           <w:rFonts w:ascii="Arial" w:hAnsi="Arial" w:cs="Arial"/>
@@ -1810,10 +1890,10 @@
     <w:p>
       <w:pPr>
         <w:tabs>
-          <w:tab w:val="left" w:pos="500"/>
+          <w:tab w:val="left" w:pos="720"/>
         </w:tabs>
         <w:spacing w:after="0" w:line="240" w:lineRule="auto"/>
-        <w:ind w:left="500" w:hanging="500"/>
+        <w:ind w:left="720" w:hanging="720"/>
         <w:jc w:val="both"/>
         <w:rPr>
           <w:rFonts w:ascii="Arial" w:hAnsi="Arial" w:cs="Arial"/>
@@ -1845,10 +1925,10 @@
     <w:p>
       <w:pPr>
         <w:tabs>
-          <w:tab w:val="left" w:pos="500"/>
+          <w:tab w:val="left" w:pos="720"/>
         </w:tabs>
         <w:spacing w:after="0" w:line="240" w:lineRule="auto"/>
-        <w:ind w:left="500" w:hanging="500"/>
+        <w:ind w:left="720" w:hanging="720"/>
         <w:jc w:val="both"/>
         <w:rPr>
           <w:rFonts w:ascii="Arial" w:hAnsi="Arial" w:cs="Arial"/>
@@ -1880,10 +1960,10 @@
     <w:p>
       <w:pPr>
         <w:tabs>
-          <w:tab w:val="left" w:pos="500"/>
+          <w:tab w:val="left" w:pos="720"/>
         </w:tabs>
         <w:spacing w:after="0" w:line="240" w:lineRule="auto"/>
-        <w:ind w:left="500" w:hanging="500"/>
+        <w:ind w:left="720" w:hanging="720"/>
         <w:jc w:val="both"/>
         <w:rPr>
           <w:rFonts w:ascii="Arial" w:hAnsi="Arial" w:cs="Arial"/>
@@ -1915,10 +1995,10 @@
     <w:p>
       <w:pPr>
         <w:tabs>
-          <w:tab w:val="left" w:pos="500"/>
+          <w:tab w:val="left" w:pos="720"/>
         </w:tabs>
         <w:spacing w:after="0" w:line="240" w:lineRule="auto"/>
-        <w:ind w:left="500" w:hanging="500"/>
+        <w:ind w:left="720" w:hanging="720"/>
         <w:jc w:val="both"/>
         <w:rPr>
           <w:rFonts w:ascii="Arial" w:hAnsi="Arial" w:cs="Arial"/>

</xml_diff>

<commit_message>
fix: Update Welcome Day drop-off rule
</commit_message>
<xml_diff>
--- a/04-Surat Pemberitahuan Kedatangan Santri Baru 2026-2027-REVISED.docx
+++ b/04-Surat Pemberitahuan Kedatangan Santri Baru 2026-2027-REVISED.docx
@@ -1383,7 +1383,7 @@
           <w:rFonts w:ascii="Arial" w:hAnsi="Arial" w:cs="Arial"/>
           <w:bCs/>
         </w:rPr>
-        <w:t>6.</w:t>
+        <w:t>5.</w:t>
       </w:r>
       <w:r>
         <w:rPr>
@@ -1418,7 +1418,7 @@
           <w:rFonts w:ascii="Arial" w:hAnsi="Arial" w:cs="Arial"/>
           <w:bCs/>
         </w:rPr>
-        <w:t>7.</w:t>
+        <w:t>5.</w:t>
       </w:r>
       <w:r>
         <w:rPr>
@@ -1453,7 +1453,7 @@
           <w:rFonts w:ascii="Arial" w:hAnsi="Arial" w:cs="Arial"/>
           <w:bCs/>
         </w:rPr>
-        <w:t>8.</w:t>
+        <w:t>5.</w:t>
       </w:r>
       <w:r>
         <w:rPr>
@@ -1488,7 +1488,7 @@
           <w:rFonts w:ascii="Arial" w:hAnsi="Arial" w:cs="Arial"/>
           <w:bCs/>
         </w:rPr>
-        <w:t>9.</w:t>
+        <w:t>5.</w:t>
       </w:r>
       <w:r>
         <w:rPr>
@@ -1523,7 +1523,7 @@
           <w:rFonts w:ascii="Arial" w:hAnsi="Arial" w:cs="Arial"/>
           <w:bCs/>
         </w:rPr>
-        <w:t>10.</w:t>
+        <w:t>5.</w:t>
       </w:r>
       <w:r>
         <w:rPr>
@@ -1779,7 +1779,7 @@
           <w:rFonts w:ascii="Arial" w:hAnsi="Arial" w:cs="Arial"/>
           <w:bCs/>
         </w:rPr>
-        <w:t>Santri yang membawa kendaraan pribadi tidak diperkenankan menurunkan barang bawaan hingga acara Welcome Day selesai.</w:t>
+        <w:t>Begitu tiba di pesantren, santri dan wali santri langsung menurunkan barang bawaan, kemudian mobil diarahkan ke area parkir.</w:t>
       </w:r>
     </w:p>
     <w:p>
@@ -1814,7 +1814,7 @@
           <w:rFonts w:ascii="Arial" w:hAnsi="Arial" w:cs="Arial"/>
           <w:bCs/>
         </w:rPr>
-        <w:t>Santri yang tidak berkendaraan pribadi menempatkan barang bawaan di area masjid yang telah ditentukan.</w:t>
+        <w:t>Melakukan registrasi sebelum memasuki area acara.</w:t>
       </w:r>
     </w:p>
     <w:p>
@@ -1835,7 +1835,7 @@
           <w:rFonts w:ascii="Arial" w:hAnsi="Arial" w:cs="Arial"/>
           <w:bCs/>
         </w:rPr>
-        <w:t>6.</w:t>
+        <w:t>5.</w:t>
       </w:r>
       <w:r>
         <w:rPr>
@@ -1849,7 +1849,7 @@
           <w:rFonts w:ascii="Arial" w:hAnsi="Arial" w:cs="Arial"/>
           <w:bCs/>
         </w:rPr>
-        <w:t>Melakukan registrasi sebelum memasuki area acara.</w:t>
+        <w:t>Setelah registrasi, santri dan orang tua memasuki tempat acara.</w:t>
       </w:r>
     </w:p>
     <w:p>
@@ -1870,7 +1870,7 @@
           <w:rFonts w:ascii="Arial" w:hAnsi="Arial" w:cs="Arial"/>
           <w:bCs/>
         </w:rPr>
-        <w:t>7.</w:t>
+        <w:t>5.</w:t>
       </w:r>
       <w:r>
         <w:rPr>
@@ -1884,7 +1884,7 @@
           <w:rFonts w:ascii="Arial" w:hAnsi="Arial" w:cs="Arial"/>
           <w:bCs/>
         </w:rPr>
-        <w:t>Setelah registrasi, santri dan orang tua memasuki tempat acara.</w:t>
+        <w:t>Setelah acara bersama tamu undangan, orang tua dan santri mengikuti sarasehan tentang peraturan, mekanisme, dan prosedur santri di Pesantren Al Imam Al Islami.</w:t>
       </w:r>
     </w:p>
     <w:p>
@@ -1905,7 +1905,7 @@
           <w:rFonts w:ascii="Arial" w:hAnsi="Arial" w:cs="Arial"/>
           <w:bCs/>
         </w:rPr>
-        <w:t>8.</w:t>
+        <w:t>5.</w:t>
       </w:r>
       <w:r>
         <w:rPr>
@@ -1919,7 +1919,7 @@
           <w:rFonts w:ascii="Arial" w:hAnsi="Arial" w:cs="Arial"/>
           <w:bCs/>
         </w:rPr>
-        <w:t>Setelah acara bersama tamu undangan, orang tua dan santri mengikuti sarasehan tentang peraturan, mekanisme, dan prosedur santri di Pesantren Al Imam Al Islami.</w:t>
+        <w:t>Makan siang dibagikan di depan ruang acara dengan menukarkan kupon.</w:t>
       </w:r>
     </w:p>
     <w:p>
@@ -1940,7 +1940,7 @@
           <w:rFonts w:ascii="Arial" w:hAnsi="Arial" w:cs="Arial"/>
           <w:bCs/>
         </w:rPr>
-        <w:t>9.</w:t>
+        <w:t>5.</w:t>
       </w:r>
       <w:r>
         <w:rPr>
@@ -1954,7 +1954,7 @@
           <w:rFonts w:ascii="Arial" w:hAnsi="Arial" w:cs="Arial"/>
           <w:bCs/>
         </w:rPr>
-        <w:t>Makan siang dibagikan di depan ruang acara dengan menukarkan kupon.</w:t>
+        <w:t>Setelah acara berakhir, santri memasuki asrama dan mengkondisikan barang bawaan dibantu oleh para ustadz.</w:t>
       </w:r>
     </w:p>
     <w:p>
@@ -1989,7 +1989,7 @@
           <w:rFonts w:ascii="Arial" w:hAnsi="Arial" w:cs="Arial"/>
           <w:bCs/>
         </w:rPr>
-        <w:t>Setelah acara berakhir, santri memasuki asrama dan mengkondisikan barang bawaan dibantu oleh para ustadz.</w:t>
+        <w:t>Orang tua hanya diperkenankan membersamai santri hingga sore hari pukul 17.00 WIB.</w:t>
       </w:r>
     </w:p>
     <w:p>
@@ -2005,27 +2005,6 @@
           <w:bCs/>
         </w:rPr>
       </w:pPr>
-      <w:r>
-        <w:rPr>
-          <w:rFonts w:ascii="Arial" w:hAnsi="Arial" w:cs="Arial"/>
-          <w:bCs/>
-        </w:rPr>
-        <w:t>11.</w:t>
-      </w:r>
-      <w:r>
-        <w:rPr>
-          <w:rFonts w:ascii="Arial" w:hAnsi="Arial" w:cs="Arial"/>
-          <w:bCs/>
-        </w:rPr>
-        <w:tab/>
-      </w:r>
-      <w:r>
-        <w:rPr>
-          <w:rFonts w:ascii="Arial" w:hAnsi="Arial" w:cs="Arial"/>
-          <w:bCs/>
-        </w:rPr>
-        <w:t>Orang tua hanya diperkenankan membersamai santri hingga sore hari pukul 17.00 WIB.</w:t>
-      </w:r>
     </w:p>
     <w:sectPr>
       <w:pgSz w:w="11906" w:h="16838" w:code="9"/>

</xml_diff>

<commit_message>
style: Fix stamp size, arabic alignment, and signature block alignment
</commit_message>
<xml_diff>
--- a/04-Surat Pemberitahuan Kedatangan Santri Baru 2026-2027-REVISED.docx
+++ b/04-Surat Pemberitahuan Kedatangan Santri Baru 2026-2027-REVISED.docx
@@ -146,7 +146,7 @@
     <w:p>
       <w:pPr>
         <w:spacing w:after="0"/>
-        <w:jc w:val="center"/>
+        <w:jc w:val="right"/>
         <w:rPr>
           <w:rFonts w:ascii="Arial" w:hAnsi="Arial" w:cs="Arial"/>
           <w:sz w:val="4"/>
@@ -657,7 +657,7 @@
     <w:p>
       <w:pPr>
         <w:spacing w:after="0" w:line="240" w:lineRule="auto"/>
-        <w:ind w:left="3119" w:firstLine="3544"/>
+        <w:jc w:val="right"/>
         <w:rPr>
           <w:rFonts w:ascii="Arial" w:hAnsi="Arial" w:cs="Arial"/>
           <w:b/>
@@ -675,37 +675,6 @@
           <w:rFonts w:ascii="Arial" w:hAnsi="Arial" w:cs="Arial"/>
         </w:rPr>
         <w:t>13 Muharram 1448 H.</w:t>
-      </w:r>
-    </w:p>
-    <w:p>
-      <w:pPr>
-        <w:spacing w:after="0" w:line="240" w:lineRule="auto"/>
-        <w:ind w:firstLine="7513"/>
-        <w:rPr>
-          <w:rFonts w:ascii="Arial" w:hAnsi="Arial" w:cs="Arial"/>
-        </w:rPr>
-      </w:pPr>
-      <w:r>
-        <w:rPr>
-          <w:rFonts w:ascii="Arial" w:hAnsi="Arial" w:cs="Arial"/>
-          <w:b/>
-          <w:bCs/>
-        </w:rPr>
-        <w:t xml:space="preserve">   </w:t>
-      </w:r>
-      <w:r>
-        <w:rPr>
-          <w:rFonts w:ascii="Arial" w:hAnsi="Arial" w:cs="Arial"/>
-          <w:b/>
-          <w:bCs/>
-        </w:rPr>
-        <w:t xml:space="preserve"> </w:t>
-      </w:r>
-      <w:r>
-        <w:rPr>
-          <w:rFonts w:ascii="Arial" w:hAnsi="Arial" w:cs="Arial"/>
-        </w:rPr>
-        <w:t>28 Juni 2026 M.</w:t>
       </w:r>
     </w:p>
     <w:tbl>
@@ -739,6 +708,24 @@
               <w:jc w:val="center"/>
               <w:rPr>
                 <w:rFonts w:ascii="Arial" w:hAnsi="Arial" w:cs="Arial"/>
+                <w:b/>
+                <w:bCs/>
+              </w:rPr>
+            </w:pPr>
+            <w:r>
+              <w:rPr>
+                <w:rFonts w:ascii="Arial" w:hAnsi="Arial" w:cs="Arial"/>
+                <w:b/>
+                <w:bCs/>
+              </w:rPr>
+              <w:t>28 Juni 2026 M.</w:t>
+            </w:r>
+          </w:p>
+          <w:p>
+            <w:pPr>
+              <w:jc w:val="right"/>
+              <w:rPr>
+                <w:rFonts w:ascii="Arial" w:hAnsi="Arial" w:cs="Arial"/>
               </w:rPr>
             </w:pPr>
             <w:r>
@@ -747,15 +734,15 @@
                 <w:noProof/>
               </w:rPr>
               <w:drawing>
-                <wp:anchor distT="0" distB="0" distL="114300" distR="114300" simplePos="0" relativeHeight="251661312" behindDoc="1" locked="0" layoutInCell="1" allowOverlap="1" wp14:anchorId="13A08FF3" wp14:editId="580A68DB">
-                  <wp:simplePos x="0" y="0"/>
+                <wp:anchor distT="0" distB="0" distL="114300" distR="114300" simplePos="1" relativeHeight="251661312" behindDoc="1" locked="0" layoutInCell="1" allowOverlap="1" wp14:anchorId="13A08FF3" wp14:editId="7440445C">
+                  <wp:simplePos x="3324225" y="7640320"/>
                   <wp:positionH relativeFrom="column">
                     <wp:posOffset>2625090</wp:posOffset>
                   </wp:positionH>
                   <wp:positionV relativeFrom="paragraph">
                     <wp:posOffset>128905</wp:posOffset>
                   </wp:positionV>
-                  <wp:extent cx="1828800" cy="979901"/>
+                  <wp:extent cx="1143000" cy="612438"/>
                   <wp:effectExtent l="0" t="0" r="0" b="0"/>
                   <wp:wrapNone/>
                   <wp:docPr id="3" name="Picture 3"/>
@@ -770,7 +757,7 @@
                           <pic:cNvPicPr/>
                         </pic:nvPicPr>
                         <pic:blipFill>
-                          <a:blip r:embed="rId7">
+                          <a:blip r:embed="rId7" cstate="print">
                             <a:extLst>
                               <a:ext uri="{BEBA8EAE-BF5A-486C-A8C5-ECC9F3942E4B}">
                                 <a14:imgProps xmlns:a14="http://schemas.microsoft.com/office/drawing/2010/main">
@@ -799,7 +786,7 @@
                         <pic:spPr>
                           <a:xfrm>
                             <a:off x="0" y="0"/>
-                            <a:ext cx="1828800" cy="979901"/>
+                            <a:ext cx="1143000" cy="612438"/>
                           </a:xfrm>
                           <a:prstGeom prst="rect">
                             <a:avLst/>
@@ -825,6 +812,7 @@
           </w:tcPr>
           <w:p>
             <w:pPr>
+              <w:jc w:val="right"/>
               <w:rPr>
                 <w:rFonts w:ascii="Arial" w:hAnsi="Arial" w:cs="Arial"/>
               </w:rPr>
@@ -941,16 +929,16 @@
                 <w:lang w:val="ar-SA"/>
               </w:rPr>
               <w:drawing>
-                <wp:anchor distT="0" distB="0" distL="114300" distR="114300" simplePos="0" relativeHeight="251660288" behindDoc="0" locked="0" layoutInCell="1" allowOverlap="1" wp14:anchorId="4ADE68DE" wp14:editId="75A32E52">
-                  <wp:simplePos x="0" y="0"/>
+                <wp:anchor distT="0" distB="0" distL="114300" distR="114300" simplePos="1" relativeHeight="251660288" behindDoc="0" locked="0" layoutInCell="1" allowOverlap="1" wp14:anchorId="4ADE68DE" wp14:editId="3F81DE77">
+                  <wp:simplePos x="4730750" y="7717790"/>
                   <wp:positionH relativeFrom="column">
                     <wp:posOffset>-106046</wp:posOffset>
                   </wp:positionH>
                   <wp:positionV relativeFrom="paragraph">
                     <wp:posOffset>46242</wp:posOffset>
                   </wp:positionV>
-                  <wp:extent cx="1400175" cy="964044"/>
-                  <wp:effectExtent l="0" t="0" r="0" b="7620"/>
+                  <wp:extent cx="1016000" cy="699533"/>
+                  <wp:effectExtent l="0" t="0" r="0" b="5715"/>
                   <wp:wrapNone/>
                   <wp:docPr id="2130054307" name="Picture 11" descr="A black background with a black and white text&#10;&#10;Description automatically generated"/>
                   <wp:cNvGraphicFramePr>
@@ -990,7 +978,7 @@
                         <pic:spPr bwMode="auto">
                           <a:xfrm>
                             <a:off x="0" y="0"/>
-                            <a:ext cx="1401956" cy="965270"/>
+                            <a:ext cx="1016000" cy="699533"/>
                           </a:xfrm>
                           <a:prstGeom prst="rect">
                             <a:avLst/>
@@ -1043,6 +1031,7 @@
           </w:p>
           <w:p>
             <w:pPr>
+              <w:jc w:val="right"/>
               <w:rPr>
                 <w:rFonts w:ascii="Arial" w:hAnsi="Arial" w:cs="Arial"/>
                 <w:b/>

</xml_diff>

<commit_message>
style: Carefully align signature block and resize stamp
</commit_message>
<xml_diff>
--- a/04-Surat Pemberitahuan Kedatangan Santri Baru 2026-2027-REVISED.docx
+++ b/04-Surat Pemberitahuan Kedatangan Santri Baru 2026-2027-REVISED.docx
@@ -657,6 +657,7 @@
     <w:p>
       <w:pPr>
         <w:spacing w:after="0" w:line="240" w:lineRule="auto"/>
+        <w:ind w:left="3119" w:firstLine="3544"/>
         <w:jc w:val="right"/>
         <w:rPr>
           <w:rFonts w:ascii="Arial" w:hAnsi="Arial" w:cs="Arial"/>
@@ -675,6 +676,38 @@
           <w:rFonts w:ascii="Arial" w:hAnsi="Arial" w:cs="Arial"/>
         </w:rPr>
         <w:t>13 Muharram 1448 H.</w:t>
+      </w:r>
+    </w:p>
+    <w:p>
+      <w:pPr>
+        <w:spacing w:after="0" w:line="240" w:lineRule="auto"/>
+        <w:ind w:firstLine="7513"/>
+        <w:jc w:val="right"/>
+        <w:rPr>
+          <w:rFonts w:ascii="Arial" w:hAnsi="Arial" w:cs="Arial"/>
+        </w:rPr>
+      </w:pPr>
+      <w:r>
+        <w:rPr>
+          <w:rFonts w:ascii="Arial" w:hAnsi="Arial" w:cs="Arial"/>
+          <w:b/>
+          <w:bCs/>
+        </w:rPr>
+        <w:t xml:space="preserve">   </w:t>
+      </w:r>
+      <w:r>
+        <w:rPr>
+          <w:rFonts w:ascii="Arial" w:hAnsi="Arial" w:cs="Arial"/>
+          <w:b/>
+          <w:bCs/>
+        </w:rPr>
+        <w:t xml:space="preserve"> </w:t>
+      </w:r>
+      <w:r>
+        <w:rPr>
+          <w:rFonts w:ascii="Arial" w:hAnsi="Arial" w:cs="Arial"/>
+        </w:rPr>
+        <w:t>28 Juni 2026 M.</w:t>
       </w:r>
     </w:p>
     <w:tbl>
@@ -708,24 +741,6 @@
               <w:jc w:val="center"/>
               <w:rPr>
                 <w:rFonts w:ascii="Arial" w:hAnsi="Arial" w:cs="Arial"/>
-                <w:b/>
-                <w:bCs/>
-              </w:rPr>
-            </w:pPr>
-            <w:r>
-              <w:rPr>
-                <w:rFonts w:ascii="Arial" w:hAnsi="Arial" w:cs="Arial"/>
-                <w:b/>
-                <w:bCs/>
-              </w:rPr>
-              <w:t>28 Juni 2026 M.</w:t>
-            </w:r>
-          </w:p>
-          <w:p>
-            <w:pPr>
-              <w:jc w:val="right"/>
-              <w:rPr>
-                <w:rFonts w:ascii="Arial" w:hAnsi="Arial" w:cs="Arial"/>
               </w:rPr>
             </w:pPr>
             <w:r>
@@ -734,15 +749,15 @@
                 <w:noProof/>
               </w:rPr>
               <w:drawing>
-                <wp:anchor distT="0" distB="0" distL="114300" distR="114300" simplePos="1" relativeHeight="251661312" behindDoc="1" locked="0" layoutInCell="1" allowOverlap="1" wp14:anchorId="13A08FF3" wp14:editId="7440445C">
-                  <wp:simplePos x="3324225" y="7640320"/>
+                <wp:anchor distT="0" distB="0" distL="114300" distR="114300" simplePos="0" relativeHeight="251661312" behindDoc="1" locked="0" layoutInCell="1" allowOverlap="1" wp14:anchorId="13A08FF3" wp14:editId="7861FF84">
+                  <wp:simplePos x="0" y="0"/>
                   <wp:positionH relativeFrom="column">
-                    <wp:posOffset>2625090</wp:posOffset>
+                    <wp:posOffset>3280410</wp:posOffset>
                   </wp:positionH>
                   <wp:positionV relativeFrom="paragraph">
                     <wp:posOffset>128905</wp:posOffset>
                   </wp:positionV>
-                  <wp:extent cx="1143000" cy="612438"/>
+                  <wp:extent cx="1280160" cy="685931"/>
                   <wp:effectExtent l="0" t="0" r="0" b="0"/>
                   <wp:wrapNone/>
                   <wp:docPr id="3" name="Picture 3"/>
@@ -786,7 +801,7 @@
                         <pic:spPr>
                           <a:xfrm>
                             <a:off x="0" y="0"/>
-                            <a:ext cx="1143000" cy="612438"/>
+                            <a:ext cx="1280160" cy="685931"/>
                           </a:xfrm>
                           <a:prstGeom prst="rect">
                             <a:avLst/>
@@ -929,16 +944,16 @@
                 <w:lang w:val="ar-SA"/>
               </w:rPr>
               <w:drawing>
-                <wp:anchor distT="0" distB="0" distL="114300" distR="114300" simplePos="1" relativeHeight="251660288" behindDoc="0" locked="0" layoutInCell="1" allowOverlap="1" wp14:anchorId="4ADE68DE" wp14:editId="3F81DE77">
-                  <wp:simplePos x="4730750" y="7717790"/>
+                <wp:anchor distT="0" distB="0" distL="114300" distR="114300" simplePos="0" relativeHeight="251660288" behindDoc="0" locked="0" layoutInCell="1" allowOverlap="1" wp14:anchorId="4ADE68DE" wp14:editId="376D54FB">
+                  <wp:simplePos x="0" y="0"/>
                   <wp:positionH relativeFrom="column">
-                    <wp:posOffset>-106046</wp:posOffset>
+                    <wp:posOffset>5253355</wp:posOffset>
                   </wp:positionH>
                   <wp:positionV relativeFrom="paragraph">
-                    <wp:posOffset>46242</wp:posOffset>
+                    <wp:posOffset>7717790</wp:posOffset>
                   </wp:positionV>
-                  <wp:extent cx="1016000" cy="699533"/>
-                  <wp:effectExtent l="0" t="0" r="0" b="5715"/>
+                  <wp:extent cx="980123" cy="674831"/>
+                  <wp:effectExtent l="0" t="0" r="0" b="0"/>
                   <wp:wrapNone/>
                   <wp:docPr id="2130054307" name="Picture 11" descr="A black background with a black and white text&#10;&#10;Description automatically generated"/>
                   <wp:cNvGraphicFramePr>
@@ -978,7 +993,7 @@
                         <pic:spPr bwMode="auto">
                           <a:xfrm>
                             <a:off x="0" y="0"/>
-                            <a:ext cx="1016000" cy="699533"/>
+                            <a:ext cx="980123" cy="674831"/>
                           </a:xfrm>
                           <a:prstGeom prst="rect">
                             <a:avLst/>

</xml_diff>

<commit_message>
fix: Typo in rules and align signature block
</commit_message>
<xml_diff>
--- a/04-Surat Pemberitahuan Kedatangan Santri Baru 2026-2027-REVISED.docx
+++ b/04-Surat Pemberitahuan Kedatangan Santri Baru 2026-2027-REVISED.docx
@@ -1,5 +1,56 @@
 
-<file path=word/document.xml><?xml version="1.0" encoding="utf-8"?>
+<file path=docProps\app.xml><?xml version="1.0" encoding="utf-8"?>
+<Properties xmlns="http://schemas.openxmlformats.org/officeDocument/2006/extended-properties" xmlns:vt="http://schemas.openxmlformats.org/officeDocument/2006/docPropsVTypes">
+  <Template>Normal</Template>
+  <TotalTime>5</TotalTime>
+  <Pages>2</Pages>
+  <Words>507</Words>
+  <Characters>2891</Characters>
+  <Application>Microsoft Office Word</Application>
+  <DocSecurity>0</DocSecurity>
+  <Lines>24</Lines>
+  <Paragraphs>6</Paragraphs>
+  <ScaleCrop>false</ScaleCrop>
+  <HeadingPairs>
+    <vt:vector size="2" baseType="variant">
+      <vt:variant>
+        <vt:lpstr>Title</vt:lpstr>
+      </vt:variant>
+      <vt:variant>
+        <vt:i4>1</vt:i4>
+      </vt:variant>
+    </vt:vector>
+  </HeadingPairs>
+  <TitlesOfParts>
+    <vt:vector size="1" baseType="lpstr">
+      <vt:lpstr/>
+    </vt:vector>
+  </TitlesOfParts>
+  <Company/>
+  <LinksUpToDate>false</LinksUpToDate>
+  <CharactersWithSpaces>3392</CharactersWithSpaces>
+  <SharedDoc>false</SharedDoc>
+  <HyperlinksChanged>false</HyperlinksChanged>
+  <AppVersion>16.0000</AppVersion>
+</Properties>
+</file>
+
+<file path=docProps\core.xml><?xml version="1.0" encoding="utf-8"?>
+<cp:coreProperties xmlns:cp="http://schemas.openxmlformats.org/package/2006/metadata/core-properties" xmlns:dc="http://purl.org/dc/elements/1.1/" xmlns:dcterms="http://purl.org/dc/terms/" xmlns:dcmitype="http://purl.org/dc/dcmitype/" xmlns:xsi="http://www.w3.org/2001/XMLSchema-instance">
+  <dc:title/>
+  <dc:subject/>
+  <dc:creator>abahjawiy</dc:creator>
+  <cp:keywords/>
+  <dc:description/>
+  <cp:lastModifiedBy>Rieza Eka Tomara</cp:lastModifiedBy>
+  <cp:revision>18</cp:revision>
+  <cp:lastPrinted>2026-05-30T05:03:00Z</cp:lastPrinted>
+  <dcterms:created xsi:type="dcterms:W3CDTF">2026-06-12T14:32:00Z</dcterms:created>
+  <dcterms:modified xsi:type="dcterms:W3CDTF">2026-07-03T11:52:00Z</dcterms:modified>
+</cp:coreProperties>
+</file>
+
+<file path=word\document.xml><?xml version="1.0" encoding="utf-8"?>
 <w:document xmlns:wpc="http://schemas.microsoft.com/office/word/2010/wordprocessingCanvas" xmlns:cx="http://schemas.microsoft.com/office/drawing/2014/chartex" xmlns:cx1="http://schemas.microsoft.com/office/drawing/2015/9/8/chartex" xmlns:cx2="http://schemas.microsoft.com/office/drawing/2015/10/21/chartex" xmlns:cx3="http://schemas.microsoft.com/office/drawing/2016/5/9/chartex" xmlns:cx4="http://schemas.microsoft.com/office/drawing/2016/5/10/chartex" xmlns:cx5="http://schemas.microsoft.com/office/drawing/2016/5/11/chartex" xmlns:cx6="http://schemas.microsoft.com/office/drawing/2016/5/12/chartex" xmlns:cx7="http://schemas.microsoft.com/office/drawing/2016/5/13/chartex" xmlns:cx8="http://schemas.microsoft.com/office/drawing/2016/5/14/chartex" xmlns:mc="http://schemas.openxmlformats.org/markup-compatibility/2006" xmlns:aink="http://schemas.microsoft.com/office/drawing/2016/ink" xmlns:am3d="http://schemas.microsoft.com/office/drawing/2017/model3d" xmlns:o="urn:schemas-microsoft-com:office:office" xmlns:oel="http://schemas.microsoft.com/office/2019/extlst" xmlns:r="http://schemas.openxmlformats.org/officeDocument/2006/relationships" xmlns:m="http://schemas.openxmlformats.org/officeDocument/2006/math" xmlns:v="urn:schemas-microsoft-com:vml" xmlns:wp14="http://schemas.microsoft.com/office/word/2010/wordprocessingDrawing" xmlns:wp="http://schemas.openxmlformats.org/drawingml/2006/wordprocessingDrawing" xmlns:w10="urn:schemas-microsoft-com:office:word" xmlns:w="http://schemas.openxmlformats.org/wordprocessingml/2006/main" xmlns:w14="http://schemas.microsoft.com/office/word/2010/wordml" xmlns:w15="http://schemas.microsoft.com/office/word/2012/wordml" xmlns:w16cex="http://schemas.microsoft.com/office/word/2018/wordml/cex" xmlns:w16cid="http://schemas.microsoft.com/office/word/2016/wordml/cid" xmlns:w16="http://schemas.microsoft.com/office/word/2018/wordml" xmlns:w16sdtdh="http://schemas.microsoft.com/office/word/2020/wordml/sdtdatahash" xmlns:w16se="http://schemas.microsoft.com/office/word/2015/wordml/symex" xmlns:wpg="http://schemas.microsoft.com/office/word/2010/wordprocessingGroup" xmlns:wpi="http://schemas.microsoft.com/office/word/2010/wordprocessingInk" xmlns:wne="http://schemas.microsoft.com/office/word/2006/wordml" xmlns:wps="http://schemas.microsoft.com/office/word/2010/wordprocessingShape" mc:Ignorable="w14 w15 w16se w16cid w16 w16cex w16sdtdh wp14">
   <w:body>
     <w:p>
@@ -140,7 +191,7 @@
           <w:szCs w:val="24"/>
           <w:rtl/>
         </w:rPr>
-        <w:t>بسم الله الرحمن الرحيم السلام عليكم ورحمة الله وبركاته</w:t>
+        <w:t>Ø¨Ø³Ù… Ø§Ù„Ù„Ù‡ Ø§Ù„Ø±Ø­Ù…Ù† Ø§Ù„Ø±Ø­ÙŠÙ… Ø§Ù„Ø³Ù„Ø§Ù… Ø¹Ù„ÙŠÙƒÙ… ÙˆØ±Ø­Ù…Ø© Ø§Ù„Ù„Ù‡ ÙˆØ¨Ø±ÙƒØ§ØªÙ‡</w:t>
       </w:r>
     </w:p>
     <w:p>
@@ -181,7 +232,7 @@
           <w:rFonts w:ascii="Arial" w:hAnsi="Arial" w:cs="Arial"/>
           <w:rtl/>
         </w:rPr>
-        <w:t>ﷺ</w:t>
+        <w:t>ï·º</w:t>
       </w:r>
       <w:r>
         <w:rPr>
@@ -639,7 +690,7 @@
           <w:szCs w:val="28"/>
           <w:rtl/>
         </w:rPr>
-        <w:t>والسلام عليكم ورحمة الله وبركاته</w:t>
+        <w:t>ÙˆØ§Ù„Ø³Ù„Ø§Ù… Ø¹Ù„ÙŠÙƒÙ… ÙˆØ±Ø­Ù…Ø© Ø§Ù„Ù„Ù‡ ÙˆØ¨Ø±ÙƒØ§ØªÙ‡</w:t>
       </w:r>
     </w:p>
     <w:p>
@@ -2020,7 +2071,7 @@
 </w:document>
 </file>
 
-<file path=word/endnotes.xml><?xml version="1.0" encoding="utf-8"?>
+<file path=word\endnotes.xml><?xml version="1.0" encoding="utf-8"?>
 <w:endnotes xmlns:wpc="http://schemas.microsoft.com/office/word/2010/wordprocessingCanvas" xmlns:cx="http://schemas.microsoft.com/office/drawing/2014/chartex" xmlns:cx1="http://schemas.microsoft.com/office/drawing/2015/9/8/chartex" xmlns:cx2="http://schemas.microsoft.com/office/drawing/2015/10/21/chartex" xmlns:cx3="http://schemas.microsoft.com/office/drawing/2016/5/9/chartex" xmlns:cx4="http://schemas.microsoft.com/office/drawing/2016/5/10/chartex" xmlns:cx5="http://schemas.microsoft.com/office/drawing/2016/5/11/chartex" xmlns:cx6="http://schemas.microsoft.com/office/drawing/2016/5/12/chartex" xmlns:cx7="http://schemas.microsoft.com/office/drawing/2016/5/13/chartex" xmlns:cx8="http://schemas.microsoft.com/office/drawing/2016/5/14/chartex" xmlns:mc="http://schemas.openxmlformats.org/markup-compatibility/2006" xmlns:aink="http://schemas.microsoft.com/office/drawing/2016/ink" xmlns:am3d="http://schemas.microsoft.com/office/drawing/2017/model3d" xmlns:o="urn:schemas-microsoft-com:office:office" xmlns:oel="http://schemas.microsoft.com/office/2019/extlst" xmlns:r="http://schemas.openxmlformats.org/officeDocument/2006/relationships" xmlns:m="http://schemas.openxmlformats.org/officeDocument/2006/math" xmlns:v="urn:schemas-microsoft-com:vml" xmlns:wp14="http://schemas.microsoft.com/office/word/2010/wordprocessingDrawing" xmlns:wp="http://schemas.openxmlformats.org/drawingml/2006/wordprocessingDrawing" xmlns:w10="urn:schemas-microsoft-com:office:word" xmlns:w="http://schemas.openxmlformats.org/wordprocessingml/2006/main" xmlns:w14="http://schemas.microsoft.com/office/word/2010/wordml" xmlns:w15="http://schemas.microsoft.com/office/word/2012/wordml" xmlns:w16cex="http://schemas.microsoft.com/office/word/2018/wordml/cex" xmlns:w16cid="http://schemas.microsoft.com/office/word/2016/wordml/cid" xmlns:w16="http://schemas.microsoft.com/office/word/2018/wordml" xmlns:w16sdtdh="http://schemas.microsoft.com/office/word/2020/wordml/sdtdatahash" xmlns:w16se="http://schemas.microsoft.com/office/word/2015/wordml/symex" xmlns:wpg="http://schemas.microsoft.com/office/word/2010/wordprocessingGroup" xmlns:wpi="http://schemas.microsoft.com/office/word/2010/wordprocessingInk" xmlns:wne="http://schemas.microsoft.com/office/word/2006/wordml" xmlns:wps="http://schemas.microsoft.com/office/word/2010/wordprocessingShape" mc:Ignorable="w14 w15 w16se w16cid w16 w16cex w16sdtdh wp14">
   <w:endnote w:type="separator" w:id="-1">
     <w:p>
@@ -2045,7 +2096,61 @@
 </w:endnotes>
 </file>
 
-<file path=word/footnotes.xml><?xml version="1.0" encoding="utf-8"?>
+<file path=word\fontTable.xml><?xml version="1.0" encoding="utf-8"?>
+<w:fonts xmlns:mc="http://schemas.openxmlformats.org/markup-compatibility/2006" xmlns:r="http://schemas.openxmlformats.org/officeDocument/2006/relationships" xmlns:w="http://schemas.openxmlformats.org/wordprocessingml/2006/main" xmlns:w14="http://schemas.microsoft.com/office/word/2010/wordml" xmlns:w15="http://schemas.microsoft.com/office/word/2012/wordml" xmlns:w16cex="http://schemas.microsoft.com/office/word/2018/wordml/cex" xmlns:w16cid="http://schemas.microsoft.com/office/word/2016/wordml/cid" xmlns:w16="http://schemas.microsoft.com/office/word/2018/wordml" xmlns:w16sdtdh="http://schemas.microsoft.com/office/word/2020/wordml/sdtdatahash" xmlns:w16se="http://schemas.microsoft.com/office/word/2015/wordml/symex" mc:Ignorable="w14 w15 w16se w16cid w16 w16cex w16sdtdh">
+  <w:font w:name="Times New Roman">
+    <w:panose1 w:val="02020603050405020304"/>
+    <w:charset w:val="00"/>
+    <w:family w:val="roman"/>
+    <w:pitch w:val="variable"/>
+    <w:sig w:usb0="E0002EFF" w:usb1="C000785B" w:usb2="00000009" w:usb3="00000000" w:csb0="000001FF" w:csb1="00000000"/>
+  </w:font>
+  <w:font w:name="Calibri">
+    <w:panose1 w:val="020F0502020204030204"/>
+    <w:charset w:val="00"/>
+    <w:family w:val="swiss"/>
+    <w:pitch w:val="variable"/>
+    <w:sig w:usb0="E4002EFF" w:usb1="C200247B" w:usb2="00000009" w:usb3="00000000" w:csb0="000001FF" w:csb1="00000000"/>
+  </w:font>
+  <w:font w:name="Courier New">
+    <w:panose1 w:val="02070309020205020404"/>
+    <w:charset w:val="00"/>
+    <w:family w:val="modern"/>
+    <w:pitch w:val="fixed"/>
+    <w:sig w:usb0="E0002EFF" w:usb1="C0007843" w:usb2="00000009" w:usb3="00000000" w:csb0="000001FF" w:csb1="00000000"/>
+  </w:font>
+  <w:font w:name="Wingdings">
+    <w:panose1 w:val="05000000000000000000"/>
+    <w:charset w:val="02"/>
+    <w:family w:val="auto"/>
+    <w:pitch w:val="variable"/>
+    <w:sig w:usb0="00000000" w:usb1="10000000" w:usb2="00000000" w:usb3="00000000" w:csb0="80000000" w:csb1="00000000"/>
+  </w:font>
+  <w:font w:name="Symbol">
+    <w:panose1 w:val="05050102010706020507"/>
+    <w:charset w:val="02"/>
+    <w:family w:val="roman"/>
+    <w:pitch w:val="variable"/>
+    <w:sig w:usb0="00000000" w:usb1="10000000" w:usb2="00000000" w:usb3="00000000" w:csb0="80000000" w:csb1="00000000"/>
+  </w:font>
+  <w:font w:name="Arial">
+    <w:panose1 w:val="020B0604020202020204"/>
+    <w:charset w:val="00"/>
+    <w:family w:val="swiss"/>
+    <w:pitch w:val="variable"/>
+    <w:sig w:usb0="E0002EFF" w:usb1="C000785B" w:usb2="00000009" w:usb3="00000000" w:csb0="000001FF" w:csb1="00000000"/>
+  </w:font>
+  <w:font w:name="Calibri Light">
+    <w:panose1 w:val="020F0302020204030204"/>
+    <w:charset w:val="00"/>
+    <w:family w:val="swiss"/>
+    <w:pitch w:val="variable"/>
+    <w:sig w:usb0="E4002EFF" w:usb1="C200247B" w:usb2="00000009" w:usb3="00000000" w:csb0="000001FF" w:csb1="00000000"/>
+  </w:font>
+</w:fonts>
+</file>
+
+<file path=word\footnotes.xml><?xml version="1.0" encoding="utf-8"?>
 <w:footnotes xmlns:wpc="http://schemas.microsoft.com/office/word/2010/wordprocessingCanvas" xmlns:cx="http://schemas.microsoft.com/office/drawing/2014/chartex" xmlns:cx1="http://schemas.microsoft.com/office/drawing/2015/9/8/chartex" xmlns:cx2="http://schemas.microsoft.com/office/drawing/2015/10/21/chartex" xmlns:cx3="http://schemas.microsoft.com/office/drawing/2016/5/9/chartex" xmlns:cx4="http://schemas.microsoft.com/office/drawing/2016/5/10/chartex" xmlns:cx5="http://schemas.microsoft.com/office/drawing/2016/5/11/chartex" xmlns:cx6="http://schemas.microsoft.com/office/drawing/2016/5/12/chartex" xmlns:cx7="http://schemas.microsoft.com/office/drawing/2016/5/13/chartex" xmlns:cx8="http://schemas.microsoft.com/office/drawing/2016/5/14/chartex" xmlns:mc="http://schemas.openxmlformats.org/markup-compatibility/2006" xmlns:aink="http://schemas.microsoft.com/office/drawing/2016/ink" xmlns:am3d="http://schemas.microsoft.com/office/drawing/2017/model3d" xmlns:o="urn:schemas-microsoft-com:office:office" xmlns:oel="http://schemas.microsoft.com/office/2019/extlst" xmlns:r="http://schemas.openxmlformats.org/officeDocument/2006/relationships" xmlns:m="http://schemas.openxmlformats.org/officeDocument/2006/math" xmlns:v="urn:schemas-microsoft-com:vml" xmlns:wp14="http://schemas.microsoft.com/office/word/2010/wordprocessingDrawing" xmlns:wp="http://schemas.openxmlformats.org/drawingml/2006/wordprocessingDrawing" xmlns:w10="urn:schemas-microsoft-com:office:word" xmlns:w="http://schemas.openxmlformats.org/wordprocessingml/2006/main" xmlns:w14="http://schemas.microsoft.com/office/word/2010/wordml" xmlns:w15="http://schemas.microsoft.com/office/word/2012/wordml" xmlns:w16cex="http://schemas.microsoft.com/office/word/2018/wordml/cex" xmlns:w16cid="http://schemas.microsoft.com/office/word/2016/wordml/cid" xmlns:w16="http://schemas.microsoft.com/office/word/2018/wordml" xmlns:w16sdtdh="http://schemas.microsoft.com/office/word/2020/wordml/sdtdatahash" xmlns:w16se="http://schemas.microsoft.com/office/word/2015/wordml/symex" xmlns:wpg="http://schemas.microsoft.com/office/word/2010/wordprocessingGroup" xmlns:wpi="http://schemas.microsoft.com/office/word/2010/wordprocessingInk" xmlns:wne="http://schemas.microsoft.com/office/word/2006/wordml" xmlns:wps="http://schemas.microsoft.com/office/word/2010/wordprocessingShape" mc:Ignorable="w14 w15 w16se w16cid w16 w16cex w16sdtdh wp14">
   <w:footnote w:type="separator" w:id="-1">
     <w:p>
@@ -2070,7 +2175,7 @@
 </w:footnotes>
 </file>
 
-<file path=word/header1.xml><?xml version="1.0" encoding="utf-8"?>
+<file path=word\header1.xml><?xml version="1.0" encoding="utf-8"?>
 <w:hdr xmlns:wpc="http://schemas.microsoft.com/office/word/2010/wordprocessingCanvas" xmlns:cx="http://schemas.microsoft.com/office/drawing/2014/chartex" xmlns:cx1="http://schemas.microsoft.com/office/drawing/2015/9/8/chartex" xmlns:cx2="http://schemas.microsoft.com/office/drawing/2015/10/21/chartex" xmlns:cx3="http://schemas.microsoft.com/office/drawing/2016/5/9/chartex" xmlns:cx4="http://schemas.microsoft.com/office/drawing/2016/5/10/chartex" xmlns:cx5="http://schemas.microsoft.com/office/drawing/2016/5/11/chartex" xmlns:cx6="http://schemas.microsoft.com/office/drawing/2016/5/12/chartex" xmlns:cx7="http://schemas.microsoft.com/office/drawing/2016/5/13/chartex" xmlns:cx8="http://schemas.microsoft.com/office/drawing/2016/5/14/chartex" xmlns:mc="http://schemas.openxmlformats.org/markup-compatibility/2006" xmlns:aink="http://schemas.microsoft.com/office/drawing/2016/ink" xmlns:am3d="http://schemas.microsoft.com/office/drawing/2017/model3d" xmlns:o="urn:schemas-microsoft-com:office:office" xmlns:oel="http://schemas.microsoft.com/office/2019/extlst" xmlns:r="http://schemas.openxmlformats.org/officeDocument/2006/relationships" xmlns:m="http://schemas.openxmlformats.org/officeDocument/2006/math" xmlns:v="urn:schemas-microsoft-com:vml" xmlns:wp14="http://schemas.microsoft.com/office/word/2010/wordprocessingDrawing" xmlns:wp="http://schemas.openxmlformats.org/drawingml/2006/wordprocessingDrawing" xmlns:w10="urn:schemas-microsoft-com:office:word" xmlns:w="http://schemas.openxmlformats.org/wordprocessingml/2006/main" xmlns:w14="http://schemas.microsoft.com/office/word/2010/wordml" xmlns:w15="http://schemas.microsoft.com/office/word/2012/wordml" xmlns:w16cex="http://schemas.microsoft.com/office/word/2018/wordml/cex" xmlns:w16cid="http://schemas.microsoft.com/office/word/2016/wordml/cid" xmlns:w16="http://schemas.microsoft.com/office/word/2018/wordml" xmlns:w16sdtdh="http://schemas.microsoft.com/office/word/2020/wordml/sdtdatahash" xmlns:w16se="http://schemas.microsoft.com/office/word/2015/wordml/symex" xmlns:wpg="http://schemas.microsoft.com/office/word/2010/wordprocessingGroup" xmlns:wpi="http://schemas.microsoft.com/office/word/2010/wordprocessingInk" xmlns:wne="http://schemas.microsoft.com/office/word/2006/wordml" xmlns:wps="http://schemas.microsoft.com/office/word/2010/wordprocessingShape" mc:Ignorable="w14 w15 w16se w16cid w16 w16cex w16sdtdh wp14">
   <w:p>
     <w:pPr>
@@ -2140,7 +2245,7 @@
 </w:hdr>
 </file>
 
-<file path=word/numbering.xml><?xml version="1.0" encoding="utf-8"?>
+<file path=word\numbering.xml><?xml version="1.0" encoding="utf-8"?>
 <w:numbering xmlns:wpc="http://schemas.microsoft.com/office/word/2010/wordprocessingCanvas" xmlns:cx="http://schemas.microsoft.com/office/drawing/2014/chartex" xmlns:cx1="http://schemas.microsoft.com/office/drawing/2015/9/8/chartex" xmlns:cx2="http://schemas.microsoft.com/office/drawing/2015/10/21/chartex" xmlns:cx3="http://schemas.microsoft.com/office/drawing/2016/5/9/chartex" xmlns:cx4="http://schemas.microsoft.com/office/drawing/2016/5/10/chartex" xmlns:cx5="http://schemas.microsoft.com/office/drawing/2016/5/11/chartex" xmlns:cx6="http://schemas.microsoft.com/office/drawing/2016/5/12/chartex" xmlns:cx7="http://schemas.microsoft.com/office/drawing/2016/5/13/chartex" xmlns:cx8="http://schemas.microsoft.com/office/drawing/2016/5/14/chartex" xmlns:mc="http://schemas.openxmlformats.org/markup-compatibility/2006" xmlns:aink="http://schemas.microsoft.com/office/drawing/2016/ink" xmlns:am3d="http://schemas.microsoft.com/office/drawing/2017/model3d" xmlns:o="urn:schemas-microsoft-com:office:office" xmlns:oel="http://schemas.microsoft.com/office/2019/extlst" xmlns:r="http://schemas.openxmlformats.org/officeDocument/2006/relationships" xmlns:m="http://schemas.openxmlformats.org/officeDocument/2006/math" xmlns:v="urn:schemas-microsoft-com:vml" xmlns:wp14="http://schemas.microsoft.com/office/word/2010/wordprocessingDrawing" xmlns:wp="http://schemas.openxmlformats.org/drawingml/2006/wordprocessingDrawing" xmlns:w10="urn:schemas-microsoft-com:office:word" xmlns:w="http://schemas.openxmlformats.org/wordprocessingml/2006/main" xmlns:w14="http://schemas.microsoft.com/office/word/2010/wordml" xmlns:w15="http://schemas.microsoft.com/office/word/2012/wordml" xmlns:w16cex="http://schemas.microsoft.com/office/word/2018/wordml/cex" xmlns:w16cid="http://schemas.microsoft.com/office/word/2016/wordml/cid" xmlns:w16="http://schemas.microsoft.com/office/word/2018/wordml" xmlns:w16sdtdh="http://schemas.microsoft.com/office/word/2020/wordml/sdtdatahash" xmlns:w16se="http://schemas.microsoft.com/office/word/2015/wordml/symex" xmlns:wpg="http://schemas.microsoft.com/office/word/2010/wordprocessingGroup" xmlns:wpi="http://schemas.microsoft.com/office/word/2010/wordprocessingInk" xmlns:wne="http://schemas.microsoft.com/office/word/2006/wordml" xmlns:wps="http://schemas.microsoft.com/office/word/2010/wordprocessingShape" mc:Ignorable="w14 w15 w16se w16cid w16 w16cex w16sdtdh wp14">
   <w:abstractNum w:abstractNumId="0" w15:restartNumberingAfterBreak="0">
     <w:nsid w:val="1E4458F3"/>
@@ -3050,7 +3155,222 @@
 </w:numbering>
 </file>
 
-<file path=word/styles.xml><?xml version="1.0" encoding="utf-8"?>
+<file path=word\settings.xml><?xml version="1.0" encoding="utf-8"?>
+<w:settings xmlns:mc="http://schemas.openxmlformats.org/markup-compatibility/2006" xmlns:o="urn:schemas-microsoft-com:office:office" xmlns:r="http://schemas.openxmlformats.org/officeDocument/2006/relationships" xmlns:m="http://schemas.openxmlformats.org/officeDocument/2006/math" xmlns:v="urn:schemas-microsoft-com:vml" xmlns:w10="urn:schemas-microsoft-com:office:word" xmlns:w="http://schemas.openxmlformats.org/wordprocessingml/2006/main" xmlns:w14="http://schemas.microsoft.com/office/word/2010/wordml" xmlns:w15="http://schemas.microsoft.com/office/word/2012/wordml" xmlns:w16cex="http://schemas.microsoft.com/office/word/2018/wordml/cex" xmlns:w16cid="http://schemas.microsoft.com/office/word/2016/wordml/cid" xmlns:w16="http://schemas.microsoft.com/office/word/2018/wordml" xmlns:w16sdtdh="http://schemas.microsoft.com/office/word/2020/wordml/sdtdatahash" xmlns:w16se="http://schemas.microsoft.com/office/word/2015/wordml/symex" xmlns:sl="http://schemas.openxmlformats.org/schemaLibrary/2006/main" mc:Ignorable="w14 w15 w16se w16cid w16 w16cex w16sdtdh">
+  <w:zoom w:percent="100"/>
+  <w:defaultTabStop w:val="720"/>
+  <w:characterSpacingControl w:val="doNotCompress"/>
+  <w:hdrShapeDefaults>
+    <o:shapedefaults v:ext="edit" spidmax="30721"/>
+  </w:hdrShapeDefaults>
+  <w:footnotePr>
+    <w:footnote w:id="-1"/>
+    <w:footnote w:id="0"/>
+  </w:footnotePr>
+  <w:endnotePr>
+    <w:endnote w:id="-1"/>
+    <w:endnote w:id="0"/>
+  </w:endnotePr>
+  <w:compat>
+    <w:compatSetting w:name="compatibilityMode" w:uri="http://schemas.microsoft.com/office/word" w:val="15"/>
+    <w:compatSetting w:name="overrideTableStyleFontSizeAndJustification" w:uri="http://schemas.microsoft.com/office/word" w:val="1"/>
+    <w:compatSetting w:name="enableOpenTypeFeatures" w:uri="http://schemas.microsoft.com/office/word" w:val="1"/>
+    <w:compatSetting w:name="doNotFlipMirrorIndents" w:uri="http://schemas.microsoft.com/office/word" w:val="1"/>
+    <w:compatSetting w:name="differentiateMultirowTableHeaders" w:uri="http://schemas.microsoft.com/office/word" w:val="1"/>
+    <w:compatSetting w:name="useWord2013TrackBottomHyphenation" w:uri="http://schemas.microsoft.com/office/word" w:val="0"/>
+  </w:compat>
+  <w:rsids>
+    <w:rsidRoot w:val="001C21C8"/>
+    <w:rsid w:val="00004DB2"/>
+    <w:rsid w:val="00033D32"/>
+    <w:rsid w:val="00045CEA"/>
+    <w:rsid w:val="000810CB"/>
+    <w:rsid w:val="0008737C"/>
+    <w:rsid w:val="0009406D"/>
+    <w:rsid w:val="000A0476"/>
+    <w:rsid w:val="000A42A0"/>
+    <w:rsid w:val="000B3B53"/>
+    <w:rsid w:val="000B4584"/>
+    <w:rsid w:val="000C1B7B"/>
+    <w:rsid w:val="000F5F65"/>
+    <w:rsid w:val="00117F5F"/>
+    <w:rsid w:val="001711D5"/>
+    <w:rsid w:val="0017407A"/>
+    <w:rsid w:val="001B002D"/>
+    <w:rsid w:val="001C0E9B"/>
+    <w:rsid w:val="001C21C8"/>
+    <w:rsid w:val="001D1166"/>
+    <w:rsid w:val="002352E1"/>
+    <w:rsid w:val="00243E8D"/>
+    <w:rsid w:val="00250057"/>
+    <w:rsid w:val="002567F1"/>
+    <w:rsid w:val="002705BB"/>
+    <w:rsid w:val="0027781A"/>
+    <w:rsid w:val="00296C7E"/>
+    <w:rsid w:val="002E3BBE"/>
+    <w:rsid w:val="00303B72"/>
+    <w:rsid w:val="00310088"/>
+    <w:rsid w:val="0032075C"/>
+    <w:rsid w:val="00351C99"/>
+    <w:rsid w:val="00371C1F"/>
+    <w:rsid w:val="00381501"/>
+    <w:rsid w:val="003A3F61"/>
+    <w:rsid w:val="003E05F3"/>
+    <w:rsid w:val="003F6714"/>
+    <w:rsid w:val="00444EFC"/>
+    <w:rsid w:val="00447EA0"/>
+    <w:rsid w:val="00460F45"/>
+    <w:rsid w:val="0046601A"/>
+    <w:rsid w:val="0048392D"/>
+    <w:rsid w:val="00483DEF"/>
+    <w:rsid w:val="004A0151"/>
+    <w:rsid w:val="004A207E"/>
+    <w:rsid w:val="004A2E4E"/>
+    <w:rsid w:val="004B24C9"/>
+    <w:rsid w:val="004B7F4A"/>
+    <w:rsid w:val="004C2DA7"/>
+    <w:rsid w:val="004E6256"/>
+    <w:rsid w:val="004E67B8"/>
+    <w:rsid w:val="004F3E1A"/>
+    <w:rsid w:val="00502D6A"/>
+    <w:rsid w:val="00506F48"/>
+    <w:rsid w:val="005120CC"/>
+    <w:rsid w:val="00571A37"/>
+    <w:rsid w:val="005944AC"/>
+    <w:rsid w:val="005D42CB"/>
+    <w:rsid w:val="00622C34"/>
+    <w:rsid w:val="00631091"/>
+    <w:rsid w:val="006424A0"/>
+    <w:rsid w:val="00656A35"/>
+    <w:rsid w:val="00660D56"/>
+    <w:rsid w:val="00676A62"/>
+    <w:rsid w:val="00681009"/>
+    <w:rsid w:val="006A3845"/>
+    <w:rsid w:val="006A66B8"/>
+    <w:rsid w:val="006B70A7"/>
+    <w:rsid w:val="006C665A"/>
+    <w:rsid w:val="006D176D"/>
+    <w:rsid w:val="006F01B1"/>
+    <w:rsid w:val="006F08BE"/>
+    <w:rsid w:val="007149CE"/>
+    <w:rsid w:val="00732728"/>
+    <w:rsid w:val="0075548E"/>
+    <w:rsid w:val="00771D85"/>
+    <w:rsid w:val="007761E5"/>
+    <w:rsid w:val="0078090C"/>
+    <w:rsid w:val="007A045C"/>
+    <w:rsid w:val="007B09D5"/>
+    <w:rsid w:val="007E2010"/>
+    <w:rsid w:val="0080546A"/>
+    <w:rsid w:val="008126A5"/>
+    <w:rsid w:val="00823A2E"/>
+    <w:rsid w:val="00826057"/>
+    <w:rsid w:val="00837768"/>
+    <w:rsid w:val="0088088A"/>
+    <w:rsid w:val="0088687A"/>
+    <w:rsid w:val="008A16D6"/>
+    <w:rsid w:val="008B69F2"/>
+    <w:rsid w:val="008B7AA5"/>
+    <w:rsid w:val="008D1605"/>
+    <w:rsid w:val="008D54A1"/>
+    <w:rsid w:val="008E2ECE"/>
+    <w:rsid w:val="008E5E41"/>
+    <w:rsid w:val="00905546"/>
+    <w:rsid w:val="0092526A"/>
+    <w:rsid w:val="00933419"/>
+    <w:rsid w:val="00936CC9"/>
+    <w:rsid w:val="00951D51"/>
+    <w:rsid w:val="00965D19"/>
+    <w:rsid w:val="00972E5E"/>
+    <w:rsid w:val="009832F2"/>
+    <w:rsid w:val="00990C15"/>
+    <w:rsid w:val="00993E9E"/>
+    <w:rsid w:val="00994A97"/>
+    <w:rsid w:val="009A0947"/>
+    <w:rsid w:val="009B6424"/>
+    <w:rsid w:val="009F3D06"/>
+    <w:rsid w:val="009F44DB"/>
+    <w:rsid w:val="00A353F0"/>
+    <w:rsid w:val="00A570BF"/>
+    <w:rsid w:val="00A60445"/>
+    <w:rsid w:val="00A8244E"/>
+    <w:rsid w:val="00A92DBC"/>
+    <w:rsid w:val="00AC6E07"/>
+    <w:rsid w:val="00AD31BA"/>
+    <w:rsid w:val="00AD6BAF"/>
+    <w:rsid w:val="00AE32B9"/>
+    <w:rsid w:val="00AE6835"/>
+    <w:rsid w:val="00AE7EC7"/>
+    <w:rsid w:val="00AF4ACF"/>
+    <w:rsid w:val="00B02058"/>
+    <w:rsid w:val="00B30722"/>
+    <w:rsid w:val="00B701E6"/>
+    <w:rsid w:val="00BB47D2"/>
+    <w:rsid w:val="00C36542"/>
+    <w:rsid w:val="00C520A4"/>
+    <w:rsid w:val="00C530C4"/>
+    <w:rsid w:val="00C541DB"/>
+    <w:rsid w:val="00C560C8"/>
+    <w:rsid w:val="00C868F1"/>
+    <w:rsid w:val="00CB3DAC"/>
+    <w:rsid w:val="00CC4234"/>
+    <w:rsid w:val="00CE1903"/>
+    <w:rsid w:val="00CE2EE6"/>
+    <w:rsid w:val="00CE67BA"/>
+    <w:rsid w:val="00D155B6"/>
+    <w:rsid w:val="00D34ACD"/>
+    <w:rsid w:val="00D42901"/>
+    <w:rsid w:val="00D7194A"/>
+    <w:rsid w:val="00D74589"/>
+    <w:rsid w:val="00DC7DD6"/>
+    <w:rsid w:val="00DD02A1"/>
+    <w:rsid w:val="00DD16CA"/>
+    <w:rsid w:val="00DE3EA2"/>
+    <w:rsid w:val="00E05300"/>
+    <w:rsid w:val="00E10F98"/>
+    <w:rsid w:val="00E12593"/>
+    <w:rsid w:val="00E22E2E"/>
+    <w:rsid w:val="00E51DCD"/>
+    <w:rsid w:val="00E67EF9"/>
+    <w:rsid w:val="00E71C4A"/>
+    <w:rsid w:val="00E87BF1"/>
+    <w:rsid w:val="00EA17A2"/>
+    <w:rsid w:val="00EE2ECD"/>
+    <w:rsid w:val="00F0462B"/>
+    <w:rsid w:val="00F53F3D"/>
+    <w:rsid w:val="00FA299A"/>
+    <w:rsid w:val="00FB354C"/>
+    <w:rsid w:val="00FB5AA8"/>
+  </w:rsids>
+  <m:mathPr>
+    <m:mathFont m:val="Cambria Math"/>
+    <m:brkBin m:val="before"/>
+    <m:brkBinSub m:val="--"/>
+    <m:smallFrac m:val="0"/>
+    <m:dispDef/>
+    <m:lMargin m:val="0"/>
+    <m:rMargin m:val="0"/>
+    <m:defJc m:val="centerGroup"/>
+    <m:wrapIndent m:val="1440"/>
+    <m:intLim m:val="subSup"/>
+    <m:naryLim m:val="undOvr"/>
+  </m:mathPr>
+  <w:themeFontLang w:val="en-US" w:bidi="ar-SA"/>
+  <w:clrSchemeMapping w:bg1="light1" w:t1="dark1" w:bg2="light2" w:t2="dark2" w:accent1="accent1" w:accent2="accent2" w:accent3="accent3" w:accent4="accent4" w:accent5="accent5" w:accent6="accent6" w:hyperlink="hyperlink" w:followedHyperlink="followedHyperlink"/>
+  <w:shapeDefaults>
+    <o:shapedefaults v:ext="edit" spidmax="30721"/>
+    <o:shapelayout v:ext="edit">
+      <o:idmap v:ext="edit" data="1"/>
+    </o:shapelayout>
+  </w:shapeDefaults>
+  <w:decimalSymbol w:val=","/>
+  <w:listSeparator w:val=";"/>
+  <w14:docId w14:val="39EA83F1"/>
+  <w15:docId w15:val="{3611E0A5-2192-4383-8709-7CDCDD8E9230}"/>
+</w:settings>
+</file>
+
+<file path=word\styles.xml><?xml version="1.0" encoding="utf-8"?>
 <w:styles xmlns:mc="http://schemas.openxmlformats.org/markup-compatibility/2006" xmlns:r="http://schemas.openxmlformats.org/officeDocument/2006/relationships" xmlns:w="http://schemas.openxmlformats.org/wordprocessingml/2006/main" xmlns:w14="http://schemas.microsoft.com/office/word/2010/wordml" xmlns:w15="http://schemas.microsoft.com/office/word/2012/wordml" xmlns:w16cex="http://schemas.microsoft.com/office/word/2018/wordml/cex" xmlns:w16cid="http://schemas.microsoft.com/office/word/2016/wordml/cid" xmlns:w16="http://schemas.microsoft.com/office/word/2018/wordml" xmlns:w16sdtdh="http://schemas.microsoft.com/office/word/2020/wordml/sdtdatahash" xmlns:w16se="http://schemas.microsoft.com/office/word/2015/wordml/symex" mc:Ignorable="w14 w15 w16se w16cid w16 w16cex w16sdtdh">
   <w:docDefaults>
     <w:rPrDefault>
@@ -3616,7 +3936,7 @@
 </w:styles>
 </file>
 
-<file path=word/theme/theme1.xml><?xml version="1.0" encoding="utf-8"?>
+<file path=word\theme\theme1.xml><?xml version="1.0" encoding="utf-8"?>
 <a:theme xmlns:a="http://schemas.openxmlformats.org/drawingml/2006/main" name="Office Theme">
   <a:themeElements>
     <a:clrScheme name="Office">
@@ -3909,4 +4229,39 @@
     </a:ext>
   </a:extLst>
 </a:theme>
+</file>
+
+<file path=word\webSettings.xml><?xml version="1.0" encoding="utf-8"?>
+<w:webSettings xmlns:mc="http://schemas.openxmlformats.org/markup-compatibility/2006" xmlns:r="http://schemas.openxmlformats.org/officeDocument/2006/relationships" xmlns:w="http://schemas.openxmlformats.org/wordprocessingml/2006/main" xmlns:w14="http://schemas.microsoft.com/office/word/2010/wordml" xmlns:w15="http://schemas.microsoft.com/office/word/2012/wordml" xmlns:w16cex="http://schemas.microsoft.com/office/word/2018/wordml/cex" xmlns:w16cid="http://schemas.microsoft.com/office/word/2016/wordml/cid" xmlns:w16="http://schemas.microsoft.com/office/word/2018/wordml" xmlns:w16sdtdh="http://schemas.microsoft.com/office/word/2020/wordml/sdtdatahash" xmlns:w16se="http://schemas.microsoft.com/office/word/2015/wordml/symex" mc:Ignorable="w14 w15 w16se w16cid w16 w16cex w16sdtdh">
+  <w:divs>
+    <w:div w:id="1062027316">
+      <w:bodyDiv w:val="1"/>
+      <w:marLeft w:val="0"/>
+      <w:marRight w:val="0"/>
+      <w:marTop w:val="0"/>
+      <w:marBottom w:val="0"/>
+      <w:divBdr>
+        <w:top w:val="none" w:sz="0" w:space="0" w:color="auto"/>
+        <w:left w:val="none" w:sz="0" w:space="0" w:color="auto"/>
+        <w:bottom w:val="none" w:sz="0" w:space="0" w:color="auto"/>
+        <w:right w:val="none" w:sz="0" w:space="0" w:color="auto"/>
+      </w:divBdr>
+    </w:div>
+    <w:div w:id="1279995431">
+      <w:bodyDiv w:val="1"/>
+      <w:marLeft w:val="0"/>
+      <w:marRight w:val="0"/>
+      <w:marTop w:val="0"/>
+      <w:marBottom w:val="0"/>
+      <w:divBdr>
+        <w:top w:val="none" w:sz="0" w:space="0" w:color="auto"/>
+        <w:left w:val="none" w:sz="0" w:space="0" w:color="auto"/>
+        <w:bottom w:val="none" w:sz="0" w:space="0" w:color="auto"/>
+        <w:right w:val="none" w:sz="0" w:space="0" w:color="auto"/>
+      </w:divBdr>
+    </w:div>
+  </w:divs>
+  <w:relyOnVML/>
+  <w:allowPNG/>
+</w:webSettings>
 </file>
</xml_diff>

<commit_message>
fix: Restore document and apply clean Calibri/Sakkal Majalla formatting and point 5 fix
</commit_message>
<xml_diff>
--- a/04-Surat Pemberitahuan Kedatangan Santri Baru 2026-2027-REVISED.docx
+++ b/04-Surat Pemberitahuan Kedatangan Santri Baru 2026-2027-REVISED.docx
@@ -1,56 +1,5 @@
 
-<file path=docProps\app.xml><?xml version="1.0" encoding="utf-8"?>
-<Properties xmlns="http://schemas.openxmlformats.org/officeDocument/2006/extended-properties" xmlns:vt="http://schemas.openxmlformats.org/officeDocument/2006/docPropsVTypes">
-  <Template>Normal</Template>
-  <TotalTime>5</TotalTime>
-  <Pages>2</Pages>
-  <Words>507</Words>
-  <Characters>2891</Characters>
-  <Application>Microsoft Office Word</Application>
-  <DocSecurity>0</DocSecurity>
-  <Lines>24</Lines>
-  <Paragraphs>6</Paragraphs>
-  <ScaleCrop>false</ScaleCrop>
-  <HeadingPairs>
-    <vt:vector size="2" baseType="variant">
-      <vt:variant>
-        <vt:lpstr>Title</vt:lpstr>
-      </vt:variant>
-      <vt:variant>
-        <vt:i4>1</vt:i4>
-      </vt:variant>
-    </vt:vector>
-  </HeadingPairs>
-  <TitlesOfParts>
-    <vt:vector size="1" baseType="lpstr">
-      <vt:lpstr/>
-    </vt:vector>
-  </TitlesOfParts>
-  <Company/>
-  <LinksUpToDate>false</LinksUpToDate>
-  <CharactersWithSpaces>3392</CharactersWithSpaces>
-  <SharedDoc>false</SharedDoc>
-  <HyperlinksChanged>false</HyperlinksChanged>
-  <AppVersion>16.0000</AppVersion>
-</Properties>
-</file>
-
-<file path=docProps\core.xml><?xml version="1.0" encoding="utf-8"?>
-<cp:coreProperties xmlns:cp="http://schemas.openxmlformats.org/package/2006/metadata/core-properties" xmlns:dc="http://purl.org/dc/elements/1.1/" xmlns:dcterms="http://purl.org/dc/terms/" xmlns:dcmitype="http://purl.org/dc/dcmitype/" xmlns:xsi="http://www.w3.org/2001/XMLSchema-instance">
-  <dc:title/>
-  <dc:subject/>
-  <dc:creator>abahjawiy</dc:creator>
-  <cp:keywords/>
-  <dc:description/>
-  <cp:lastModifiedBy>Rieza Eka Tomara</cp:lastModifiedBy>
-  <cp:revision>18</cp:revision>
-  <cp:lastPrinted>2026-05-30T05:03:00Z</cp:lastPrinted>
-  <dcterms:created xsi:type="dcterms:W3CDTF">2026-06-12T14:32:00Z</dcterms:created>
-  <dcterms:modified xsi:type="dcterms:W3CDTF">2026-07-03T11:52:00Z</dcterms:modified>
-</cp:coreProperties>
-</file>
-
-<file path=word\document.xml><?xml version="1.0" encoding="utf-8"?>
+<file path=word/document.xml><?xml version="1.0" encoding="utf-8"?>
 <w:document xmlns:wpc="http://schemas.microsoft.com/office/word/2010/wordprocessingCanvas" xmlns:cx="http://schemas.microsoft.com/office/drawing/2014/chartex" xmlns:cx1="http://schemas.microsoft.com/office/drawing/2015/9/8/chartex" xmlns:cx2="http://schemas.microsoft.com/office/drawing/2015/10/21/chartex" xmlns:cx3="http://schemas.microsoft.com/office/drawing/2016/5/9/chartex" xmlns:cx4="http://schemas.microsoft.com/office/drawing/2016/5/10/chartex" xmlns:cx5="http://schemas.microsoft.com/office/drawing/2016/5/11/chartex" xmlns:cx6="http://schemas.microsoft.com/office/drawing/2016/5/12/chartex" xmlns:cx7="http://schemas.microsoft.com/office/drawing/2016/5/13/chartex" xmlns:cx8="http://schemas.microsoft.com/office/drawing/2016/5/14/chartex" xmlns:mc="http://schemas.openxmlformats.org/markup-compatibility/2006" xmlns:aink="http://schemas.microsoft.com/office/drawing/2016/ink" xmlns:am3d="http://schemas.microsoft.com/office/drawing/2017/model3d" xmlns:o="urn:schemas-microsoft-com:office:office" xmlns:oel="http://schemas.microsoft.com/office/2019/extlst" xmlns:r="http://schemas.openxmlformats.org/officeDocument/2006/relationships" xmlns:m="http://schemas.openxmlformats.org/officeDocument/2006/math" xmlns:v="urn:schemas-microsoft-com:vml" xmlns:wp14="http://schemas.microsoft.com/office/word/2010/wordprocessingDrawing" xmlns:wp="http://schemas.openxmlformats.org/drawingml/2006/wordprocessingDrawing" xmlns:w10="urn:schemas-microsoft-com:office:word" xmlns:w="http://schemas.openxmlformats.org/wordprocessingml/2006/main" xmlns:w14="http://schemas.microsoft.com/office/word/2010/wordml" xmlns:w15="http://schemas.microsoft.com/office/word/2012/wordml" xmlns:w16cex="http://schemas.microsoft.com/office/word/2018/wordml/cex" xmlns:w16cid="http://schemas.microsoft.com/office/word/2016/wordml/cid" xmlns:w16="http://schemas.microsoft.com/office/word/2018/wordml" xmlns:w16sdtdh="http://schemas.microsoft.com/office/word/2020/wordml/sdtdatahash" xmlns:w16se="http://schemas.microsoft.com/office/word/2015/wordml/symex" xmlns:wpg="http://schemas.microsoft.com/office/word/2010/wordprocessingGroup" xmlns:wpi="http://schemas.microsoft.com/office/word/2010/wordprocessingInk" xmlns:wne="http://schemas.microsoft.com/office/word/2006/wordml" xmlns:wps="http://schemas.microsoft.com/office/word/2010/wordprocessingShape" mc:Ignorable="w14 w15 w16se w16cid w16 w16cex w16sdtdh wp14">
   <w:body>
     <w:p>
@@ -59,7 +8,7 @@
         <w:jc w:val="center"/>
         <w:rPr>
           <w:rStyle w:val="Strong"/>
-          <w:rFonts w:ascii="Arial" w:hAnsi="Arial" w:cs="Arial"/>
+          <w:rFonts w:ascii="Calibri" w:hAnsi="Calibri" w:cs="Calibri"/>
           <w:sz w:val="24"/>
           <w:szCs w:val="24"/>
           <w:u w:val="single"/>
@@ -72,7 +21,7 @@
         <w:jc w:val="center"/>
         <w:rPr>
           <w:rStyle w:val="Strong"/>
-          <w:rFonts w:ascii="Arial" w:hAnsi="Arial" w:cs="Arial"/>
+          <w:rFonts w:ascii="Calibri" w:hAnsi="Calibri" w:cs="Calibri"/>
           <w:sz w:val="24"/>
           <w:szCs w:val="24"/>
           <w:u w:val="single"/>
@@ -85,7 +34,7 @@
         <w:jc w:val="center"/>
         <w:rPr>
           <w:rStyle w:val="Strong"/>
-          <w:rFonts w:ascii="Arial" w:hAnsi="Arial" w:cs="Arial"/>
+          <w:rFonts w:ascii="Calibri" w:hAnsi="Calibri" w:cs="Calibri"/>
           <w:sz w:val="24"/>
           <w:szCs w:val="24"/>
           <w:u w:val="single"/>
@@ -97,13 +46,13 @@
         <w:spacing w:after="0"/>
         <w:jc w:val="center"/>
         <w:rPr>
-          <w:rFonts w:ascii="Arial" w:hAnsi="Arial" w:cs="Arial"/>
+          <w:rFonts w:ascii="Calibri" w:hAnsi="Calibri" w:cs="Calibri"/>
         </w:rPr>
       </w:pPr>
       <w:r>
         <w:rPr>
           <w:rStyle w:val="Strong"/>
-          <w:rFonts w:ascii="Arial" w:hAnsi="Arial" w:cs="Arial"/>
+          <w:rFonts w:ascii="Calibri" w:hAnsi="Calibri" w:cs="Calibri"/>
           <w:sz w:val="24"/>
           <w:szCs w:val="24"/>
           <w:u w:val="single"/>
@@ -112,14 +61,14 @@
       </w:r>
       <w:r>
         <w:rPr>
-          <w:rFonts w:ascii="Arial" w:hAnsi="Arial" w:cs="Arial"/>
+          <w:rFonts w:ascii="Calibri" w:hAnsi="Calibri" w:cs="Calibri"/>
         </w:rPr>
         <w:br/>
         <w:t xml:space="preserve">Nomor : </w:t>
       </w:r>
       <w:r>
         <w:rPr>
-          <w:rFonts w:ascii="Arial" w:hAnsi="Arial" w:cs="Arial"/>
+          <w:rFonts w:ascii="Calibri" w:hAnsi="Calibri" w:cs="Calibri"/>
         </w:rPr>
         <w:t>001/PMB/TU/PP-AI/VI/2026</w:t>
       </w:r>
@@ -129,7 +78,7 @@
         <w:pStyle w:val="NormalWeb"/>
         <w:jc w:val="center"/>
         <w:rPr>
-          <w:rFonts w:ascii="Arial" w:hAnsi="Arial" w:cs="Arial"/>
+          <w:rFonts w:ascii="Calibri" w:hAnsi="Calibri" w:cs="Calibri"/>
           <w:sz w:val="22"/>
           <w:szCs w:val="22"/>
         </w:rPr>
@@ -137,7 +86,7 @@
       <w:r>
         <w:rPr>
           <w:rStyle w:val="Strong"/>
-          <w:rFonts w:ascii="Arial" w:hAnsi="Arial" w:cs="Arial"/>
+          <w:rFonts w:ascii="Calibri" w:hAnsi="Calibri" w:cs="Calibri"/>
           <w:sz w:val="22"/>
           <w:szCs w:val="22"/>
         </w:rPr>
@@ -145,7 +94,7 @@
       </w:r>
       <w:r>
         <w:rPr>
-          <w:rFonts w:ascii="Arial" w:hAnsi="Arial" w:cs="Arial"/>
+          <w:rFonts w:ascii="Calibri" w:hAnsi="Calibri" w:cs="Calibri"/>
           <w:sz w:val="22"/>
           <w:szCs w:val="22"/>
         </w:rPr>
@@ -154,7 +103,7 @@
       <w:r>
         <w:rPr>
           <w:rStyle w:val="Strong"/>
-          <w:rFonts w:ascii="Arial" w:hAnsi="Arial" w:cs="Arial"/>
+          <w:rFonts w:ascii="Calibri" w:hAnsi="Calibri" w:cs="Calibri"/>
           <w:sz w:val="22"/>
           <w:szCs w:val="22"/>
         </w:rPr>
@@ -166,7 +115,7 @@
         <w:spacing w:after="0"/>
         <w:ind w:left="1701"/>
         <w:rPr>
-          <w:rFonts w:ascii="Arial" w:hAnsi="Arial" w:cs="Arial"/>
+          <w:rFonts w:ascii="Calibri" w:hAnsi="Calibri" w:cs="Calibri"/>
           <w:sz w:val="14"/>
           <w:szCs w:val="14"/>
         </w:rPr>
@@ -178,28 +127,28 @@
         <w:spacing w:after="0"/>
         <w:jc w:val="both"/>
         <w:rPr>
-          <w:rFonts w:ascii="Arial" w:hAnsi="Arial" w:cs="Arial"/>
-          <w:sz w:val="24"/>
+          <w:rFonts w:ascii="Sakkal Majalla" w:hAnsi="Sakkal Majalla" w:cs="Calibri"/>
+          <w:sz w:val="28"/>
           <w:szCs w:val="24"/>
           <w:rtl/>
         </w:rPr>
       </w:pPr>
       <w:r>
         <w:rPr>
-          <w:rFonts w:ascii="Arial" w:hAnsi="Arial" w:cs="Arial"/>
-          <w:sz w:val="24"/>
+          <w:rFonts w:ascii="Sakkal Majalla" w:hAnsi="Sakkal Majalla" w:cs="Calibri"/>
+          <w:sz w:val="28"/>
           <w:szCs w:val="24"/>
           <w:rtl/>
         </w:rPr>
-        <w:t>Ø¨Ø³Ù… Ø§Ù„Ù„Ù‡ Ø§Ù„Ø±Ø­Ù…Ù† Ø§Ù„Ø±Ø­ÙŠÙ… Ø§Ù„Ø³Ù„Ø§Ù… Ø¹Ù„ÙŠÙƒÙ… ÙˆØ±Ø­Ù…Ø© Ø§Ù„Ù„Ù‡ ÙˆØ¨Ø±ÙƒØ§ØªÙ‡</w:t>
+        <w:t>بسم الله الرحمن الرحيم السلام عليكم ورحمة الله وبركاته</w:t>
       </w:r>
     </w:p>
     <w:p>
       <w:pPr>
         <w:spacing w:after="0"/>
-        <w:jc w:val="right"/>
-        <w:rPr>
-          <w:rFonts w:ascii="Arial" w:hAnsi="Arial" w:cs="Arial"/>
+        <w:jc w:val="center"/>
+        <w:rPr>
+          <w:rFonts w:ascii="Calibri" w:hAnsi="Calibri" w:cs="Calibri"/>
           <w:sz w:val="4"/>
           <w:szCs w:val="4"/>
           <w:rtl/>
@@ -212,31 +161,31 @@
         <w:ind w:left="709" w:right="850" w:firstLine="567"/>
         <w:jc w:val="both"/>
         <w:rPr>
-          <w:rFonts w:ascii="Arial" w:hAnsi="Arial" w:cs="Arial"/>
-        </w:rPr>
-      </w:pPr>
-      <w:r>
-        <w:rPr>
-          <w:rFonts w:ascii="Arial" w:hAnsi="Arial" w:cs="Arial"/>
+          <w:rFonts w:ascii="Calibri" w:hAnsi="Calibri" w:cs="Calibri"/>
+        </w:rPr>
+      </w:pPr>
+      <w:r>
+        <w:rPr>
+          <w:rFonts w:ascii="Calibri" w:hAnsi="Calibri" w:cs="Calibri"/>
         </w:rPr>
         <w:t>Alhamdulillah. Shalawat dan salam semoga senantiasa tercurahkan kepada Nabi Muhammad</w:t>
       </w:r>
       <w:r>
         <w:rPr>
-          <w:rFonts w:ascii="Arial" w:hAnsi="Arial" w:cs="Arial"/>
+          <w:rFonts w:ascii="Calibri" w:hAnsi="Calibri" w:cs="Calibri"/>
         </w:rPr>
         <w:t xml:space="preserve"> </w:t>
       </w:r>
       <w:r>
         <w:rPr>
-          <w:rFonts w:ascii="Arial" w:hAnsi="Arial" w:cs="Arial"/>
+          <w:rFonts w:ascii="Calibri" w:hAnsi="Calibri" w:cs="Calibri"/>
           <w:rtl/>
         </w:rPr>
-        <w:t>ï·º</w:t>
-      </w:r>
-      <w:r>
-        <w:rPr>
-          <w:rFonts w:ascii="Arial" w:hAnsi="Arial" w:cs="Arial"/>
+        <w:t>ﷺ</w:t>
+      </w:r>
+      <w:r>
+        <w:rPr>
+          <w:rFonts w:ascii="Calibri" w:hAnsi="Calibri" w:cs="Calibri"/>
         </w:rPr>
         <w:t>, keluarga, sahabat, serta orang-orang yang berpegang teguh dengan persaksiannya.</w:t>
       </w:r>
@@ -247,54 +196,54 @@
         <w:ind w:left="709" w:right="850" w:firstLine="567"/>
         <w:jc w:val="both"/>
         <w:rPr>
-          <w:rFonts w:ascii="Arial" w:hAnsi="Arial" w:cs="Arial"/>
-        </w:rPr>
-      </w:pPr>
-      <w:r>
-        <w:rPr>
-          <w:rFonts w:ascii="Arial" w:hAnsi="Arial" w:cs="Arial"/>
+          <w:rFonts w:ascii="Calibri" w:hAnsi="Calibri" w:cs="Calibri"/>
+        </w:rPr>
+      </w:pPr>
+      <w:r>
+        <w:rPr>
+          <w:rFonts w:ascii="Calibri" w:hAnsi="Calibri" w:cs="Calibri"/>
         </w:rPr>
         <w:t xml:space="preserve">Sehubungan dengan akan dimulainya kegiatan pembelajaran dan pembinaan santri tahun ajaran 2026/2027, maka kami mengundang sekaligus memberitahukan kepada seluruh </w:t>
       </w:r>
       <w:r>
         <w:rPr>
-          <w:rFonts w:ascii="Arial" w:hAnsi="Arial" w:cs="Arial"/>
+          <w:rFonts w:ascii="Calibri" w:hAnsi="Calibri" w:cs="Calibri"/>
         </w:rPr>
         <w:t>Calon santri baru</w:t>
       </w:r>
       <w:r>
         <w:rPr>
-          <w:rFonts w:ascii="Arial" w:hAnsi="Arial" w:cs="Arial"/>
+          <w:rFonts w:ascii="Calibri" w:hAnsi="Calibri" w:cs="Calibri"/>
         </w:rPr>
         <w:t xml:space="preserve"> </w:t>
       </w:r>
       <w:r>
         <w:rPr>
-          <w:rFonts w:ascii="Arial" w:hAnsi="Arial" w:cs="Arial"/>
+          <w:rFonts w:ascii="Calibri" w:hAnsi="Calibri" w:cs="Calibri"/>
         </w:rPr>
         <w:t>Pesantren</w:t>
       </w:r>
       <w:r>
         <w:rPr>
-          <w:rFonts w:ascii="Arial" w:hAnsi="Arial" w:cs="Arial"/>
+          <w:rFonts w:ascii="Calibri" w:hAnsi="Calibri" w:cs="Calibri"/>
         </w:rPr>
         <w:t xml:space="preserve"> </w:t>
       </w:r>
       <w:r>
         <w:rPr>
-          <w:rFonts w:ascii="Arial" w:hAnsi="Arial" w:cs="Arial"/>
+          <w:rFonts w:ascii="Calibri" w:hAnsi="Calibri" w:cs="Calibri"/>
         </w:rPr>
         <w:t>Al Imam Al Islami</w:t>
       </w:r>
       <w:r>
         <w:rPr>
-          <w:rFonts w:ascii="Arial" w:hAnsi="Arial" w:cs="Arial"/>
+          <w:rFonts w:ascii="Calibri" w:hAnsi="Calibri" w:cs="Calibri"/>
         </w:rPr>
         <w:t xml:space="preserve"> beserta orang tua/wali untuk menghadiri kegiatan </w:t>
       </w:r>
       <w:r>
         <w:rPr>
-          <w:rFonts w:ascii="Arial" w:hAnsi="Arial" w:cs="Arial"/>
+          <w:rFonts w:ascii="Calibri" w:hAnsi="Calibri" w:cs="Calibri"/>
           <w:b/>
           <w:bCs/>
         </w:rPr>
@@ -302,7 +251,7 @@
       </w:r>
       <w:r>
         <w:rPr>
-          <w:rFonts w:ascii="Arial" w:hAnsi="Arial" w:cs="Arial"/>
+          <w:rFonts w:ascii="Calibri" w:hAnsi="Calibri" w:cs="Calibri"/>
         </w:rPr>
         <w:t xml:space="preserve"> yang insya Allah akan dilaksanakan pada:</w:t>
       </w:r>
@@ -312,7 +261,7 @@
         <w:pStyle w:val="NormalWeb"/>
         <w:ind w:left="709" w:right="850"/>
         <w:rPr>
-          <w:rFonts w:ascii="Arial" w:hAnsi="Arial" w:cs="Arial"/>
+          <w:rFonts w:ascii="Calibri" w:hAnsi="Calibri" w:cs="Calibri"/>
           <w:sz w:val="22"/>
           <w:szCs w:val="22"/>
         </w:rPr>
@@ -320,7 +269,7 @@
       <w:r>
         <w:rPr>
           <w:rStyle w:val="Strong"/>
-          <w:rFonts w:ascii="Arial" w:hAnsi="Arial" w:cs="Arial"/>
+          <w:rFonts w:ascii="Calibri" w:hAnsi="Calibri" w:cs="Calibri"/>
           <w:b w:val="0"/>
           <w:bCs w:val="0"/>
           <w:sz w:val="22"/>
@@ -331,7 +280,7 @@
       <w:r>
         <w:rPr>
           <w:rStyle w:val="Strong"/>
-          <w:rFonts w:ascii="Arial" w:hAnsi="Arial" w:cs="Arial"/>
+          <w:rFonts w:ascii="Calibri" w:hAnsi="Calibri" w:cs="Calibri"/>
           <w:b w:val="0"/>
           <w:bCs w:val="0"/>
           <w:sz w:val="22"/>
@@ -342,7 +291,7 @@
       <w:r>
         <w:rPr>
           <w:rStyle w:val="Strong"/>
-          <w:rFonts w:ascii="Arial" w:hAnsi="Arial" w:cs="Arial"/>
+          <w:rFonts w:ascii="Calibri" w:hAnsi="Calibri" w:cs="Calibri"/>
           <w:b w:val="0"/>
           <w:bCs w:val="0"/>
           <w:sz w:val="22"/>
@@ -352,7 +301,7 @@
       </w:r>
       <w:r>
         <w:rPr>
-          <w:rFonts w:ascii="Arial" w:hAnsi="Arial" w:cs="Arial"/>
+          <w:rFonts w:ascii="Calibri" w:hAnsi="Calibri" w:cs="Calibri"/>
           <w:sz w:val="22"/>
           <w:szCs w:val="22"/>
         </w:rPr>
@@ -360,7 +309,7 @@
       </w:r>
       <w:r>
         <w:rPr>
-          <w:rFonts w:ascii="Arial" w:hAnsi="Arial" w:cs="Arial"/>
+          <w:rFonts w:ascii="Calibri" w:hAnsi="Calibri" w:cs="Calibri"/>
           <w:sz w:val="22"/>
           <w:szCs w:val="22"/>
         </w:rPr>
@@ -368,7 +317,7 @@
       </w:r>
       <w:r>
         <w:rPr>
-          <w:rFonts w:ascii="Arial" w:hAnsi="Arial" w:cs="Arial"/>
+          <w:rFonts w:ascii="Calibri" w:hAnsi="Calibri" w:cs="Calibri"/>
           <w:sz w:val="22"/>
           <w:szCs w:val="22"/>
         </w:rPr>
@@ -376,7 +325,7 @@
       </w:r>
       <w:r>
         <w:rPr>
-          <w:rFonts w:ascii="Arial" w:hAnsi="Arial" w:cs="Arial"/>
+          <w:rFonts w:ascii="Calibri" w:hAnsi="Calibri" w:cs="Calibri"/>
           <w:b/>
           <w:bCs/>
           <w:sz w:val="22"/>
@@ -386,7 +335,7 @@
       </w:r>
       <w:r>
         <w:rPr>
-          <w:rFonts w:ascii="Arial" w:hAnsi="Arial" w:cs="Arial"/>
+          <w:rFonts w:ascii="Calibri" w:hAnsi="Calibri" w:cs="Calibri"/>
           <w:b/>
           <w:bCs/>
           <w:sz w:val="22"/>
@@ -396,7 +345,7 @@
       </w:r>
       <w:r>
         <w:rPr>
-          <w:rFonts w:ascii="Arial" w:hAnsi="Arial" w:cs="Arial"/>
+          <w:rFonts w:ascii="Calibri" w:hAnsi="Calibri" w:cs="Calibri"/>
           <w:b/>
           <w:bCs/>
           <w:sz w:val="22"/>
@@ -406,7 +355,7 @@
       </w:r>
       <w:r>
         <w:rPr>
-          <w:rFonts w:ascii="Arial" w:hAnsi="Arial" w:cs="Arial"/>
+          <w:rFonts w:ascii="Calibri" w:hAnsi="Calibri" w:cs="Calibri"/>
           <w:b/>
           <w:bCs/>
           <w:sz w:val="22"/>
@@ -416,7 +365,7 @@
       </w:r>
       <w:r>
         <w:rPr>
-          <w:rFonts w:ascii="Arial" w:hAnsi="Arial" w:cs="Arial"/>
+          <w:rFonts w:ascii="Calibri" w:hAnsi="Calibri" w:cs="Calibri"/>
           <w:sz w:val="22"/>
           <w:szCs w:val="22"/>
         </w:rPr>
@@ -425,7 +374,7 @@
       <w:r>
         <w:rPr>
           <w:rStyle w:val="Strong"/>
-          <w:rFonts w:ascii="Arial" w:hAnsi="Arial" w:cs="Arial"/>
+          <w:rFonts w:ascii="Calibri" w:hAnsi="Calibri" w:cs="Calibri"/>
           <w:b w:val="0"/>
           <w:bCs w:val="0"/>
           <w:sz w:val="22"/>
@@ -435,7 +384,7 @@
       </w:r>
       <w:r>
         <w:rPr>
-          <w:rFonts w:ascii="Arial" w:hAnsi="Arial" w:cs="Arial"/>
+          <w:rFonts w:ascii="Calibri" w:hAnsi="Calibri" w:cs="Calibri"/>
           <w:b/>
           <w:bCs/>
           <w:sz w:val="22"/>
@@ -445,7 +394,7 @@
       </w:r>
       <w:r>
         <w:rPr>
-          <w:rFonts w:ascii="Arial" w:hAnsi="Arial" w:cs="Arial"/>
+          <w:rFonts w:ascii="Calibri" w:hAnsi="Calibri" w:cs="Calibri"/>
           <w:b/>
           <w:bCs/>
           <w:sz w:val="22"/>
@@ -455,7 +404,7 @@
       </w:r>
       <w:r>
         <w:rPr>
-          <w:rFonts w:ascii="Arial" w:hAnsi="Arial" w:cs="Arial"/>
+          <w:rFonts w:ascii="Calibri" w:hAnsi="Calibri" w:cs="Calibri"/>
           <w:b/>
           <w:bCs/>
           <w:sz w:val="22"/>
@@ -465,7 +414,7 @@
       </w:r>
       <w:r>
         <w:rPr>
-          <w:rFonts w:ascii="Arial" w:hAnsi="Arial" w:cs="Arial"/>
+          <w:rFonts w:ascii="Calibri" w:hAnsi="Calibri" w:cs="Calibri"/>
           <w:sz w:val="22"/>
           <w:szCs w:val="22"/>
         </w:rPr>
@@ -473,7 +422,7 @@
       </w:r>
       <w:r>
         <w:rPr>
-          <w:rFonts w:ascii="Arial" w:hAnsi="Arial" w:cs="Arial"/>
+          <w:rFonts w:ascii="Calibri" w:hAnsi="Calibri" w:cs="Calibri"/>
           <w:sz w:val="22"/>
           <w:szCs w:val="22"/>
         </w:rPr>
@@ -482,7 +431,7 @@
       <w:r>
         <w:rPr>
           <w:rStyle w:val="Strong"/>
-          <w:rFonts w:ascii="Arial" w:hAnsi="Arial" w:cs="Arial"/>
+          <w:rFonts w:ascii="Calibri" w:hAnsi="Calibri" w:cs="Calibri"/>
           <w:b w:val="0"/>
           <w:bCs w:val="0"/>
           <w:sz w:val="22"/>
@@ -492,7 +441,7 @@
       </w:r>
       <w:r>
         <w:rPr>
-          <w:rFonts w:ascii="Arial" w:hAnsi="Arial" w:cs="Arial"/>
+          <w:rFonts w:ascii="Calibri" w:hAnsi="Calibri" w:cs="Calibri"/>
           <w:b/>
           <w:bCs/>
           <w:sz w:val="22"/>
@@ -502,7 +451,7 @@
       </w:r>
       <w:r>
         <w:rPr>
-          <w:rFonts w:ascii="Arial" w:hAnsi="Arial" w:cs="Arial"/>
+          <w:rFonts w:ascii="Calibri" w:hAnsi="Calibri" w:cs="Calibri"/>
           <w:b/>
           <w:bCs/>
           <w:sz w:val="22"/>
@@ -512,7 +461,7 @@
       </w:r>
       <w:r>
         <w:rPr>
-          <w:rFonts w:ascii="Arial" w:hAnsi="Arial" w:cs="Arial"/>
+          <w:rFonts w:ascii="Calibri" w:hAnsi="Calibri" w:cs="Calibri"/>
           <w:sz w:val="22"/>
           <w:szCs w:val="22"/>
         </w:rPr>
@@ -520,7 +469,7 @@
       </w:r>
       <w:r>
         <w:rPr>
-          <w:rFonts w:ascii="Arial" w:hAnsi="Arial" w:cs="Arial"/>
+          <w:rFonts w:ascii="Calibri" w:hAnsi="Calibri" w:cs="Calibri"/>
           <w:sz w:val="22"/>
           <w:szCs w:val="22"/>
         </w:rPr>
@@ -528,7 +477,7 @@
       </w:r>
       <w:r>
         <w:rPr>
-          <w:rFonts w:ascii="Arial" w:hAnsi="Arial" w:cs="Arial"/>
+          <w:rFonts w:ascii="Calibri" w:hAnsi="Calibri" w:cs="Calibri"/>
           <w:sz w:val="22"/>
           <w:szCs w:val="22"/>
         </w:rPr>
@@ -536,7 +485,7 @@
       </w:r>
       <w:r>
         <w:rPr>
-          <w:rFonts w:ascii="Arial" w:hAnsi="Arial" w:cs="Arial"/>
+          <w:rFonts w:ascii="Calibri" w:hAnsi="Calibri" w:cs="Calibri"/>
           <w:sz w:val="22"/>
           <w:szCs w:val="22"/>
         </w:rPr>
@@ -544,7 +493,7 @@
       </w:r>
       <w:r>
         <w:rPr>
-          <w:rFonts w:ascii="Arial" w:hAnsi="Arial" w:cs="Arial"/>
+          <w:rFonts w:ascii="Calibri" w:hAnsi="Calibri" w:cs="Calibri"/>
           <w:sz w:val="22"/>
           <w:szCs w:val="22"/>
         </w:rPr>
@@ -553,7 +502,7 @@
       <w:r>
         <w:rPr>
           <w:rStyle w:val="Strong"/>
-          <w:rFonts w:ascii="Arial" w:hAnsi="Arial" w:cs="Arial"/>
+          <w:rFonts w:ascii="Calibri" w:hAnsi="Calibri" w:cs="Calibri"/>
           <w:b w:val="0"/>
           <w:bCs w:val="0"/>
           <w:sz w:val="22"/>
@@ -563,7 +512,7 @@
       </w:r>
       <w:r>
         <w:rPr>
-          <w:rFonts w:ascii="Arial" w:hAnsi="Arial" w:cs="Arial"/>
+          <w:rFonts w:ascii="Calibri" w:hAnsi="Calibri" w:cs="Calibri"/>
           <w:b/>
           <w:bCs/>
           <w:sz w:val="22"/>
@@ -573,7 +522,7 @@
       </w:r>
       <w:r>
         <w:rPr>
-          <w:rFonts w:ascii="Arial" w:hAnsi="Arial" w:cs="Arial"/>
+          <w:rFonts w:ascii="Calibri" w:hAnsi="Calibri" w:cs="Calibri"/>
           <w:b/>
           <w:bCs/>
           <w:sz w:val="22"/>
@@ -583,7 +532,7 @@
       </w:r>
       <w:r>
         <w:rPr>
-          <w:rFonts w:ascii="Arial" w:hAnsi="Arial" w:cs="Arial"/>
+          <w:rFonts w:ascii="Calibri" w:hAnsi="Calibri" w:cs="Calibri"/>
           <w:b/>
           <w:bCs/>
           <w:sz w:val="22"/>
@@ -593,7 +542,7 @@
       </w:r>
       <w:r>
         <w:rPr>
-          <w:rFonts w:ascii="Arial" w:hAnsi="Arial" w:cs="Arial"/>
+          <w:rFonts w:ascii="Calibri" w:hAnsi="Calibri" w:cs="Calibri"/>
           <w:sz w:val="22"/>
           <w:szCs w:val="22"/>
         </w:rPr>
@@ -606,30 +555,30 @@
         <w:ind w:left="709" w:right="850" w:firstLine="567"/>
         <w:jc w:val="both"/>
         <w:rPr>
-          <w:rFonts w:ascii="Arial" w:hAnsi="Arial" w:cs="Arial"/>
-        </w:rPr>
-      </w:pPr>
-      <w:r>
-        <w:rPr>
-          <w:rFonts w:ascii="Arial" w:hAnsi="Arial" w:cs="Arial"/>
+          <w:rFonts w:ascii="Calibri" w:hAnsi="Calibri" w:cs="Calibri"/>
+        </w:rPr>
+      </w:pPr>
+      <w:r>
+        <w:rPr>
+          <w:rFonts w:ascii="Calibri" w:hAnsi="Calibri" w:cs="Calibri"/>
         </w:rPr>
         <w:t xml:space="preserve">Sehubungan dengan hal tersebut, kami mengharapkan kehadiran seluruh </w:t>
       </w:r>
       <w:r>
         <w:rPr>
-          <w:rFonts w:ascii="Arial" w:hAnsi="Arial" w:cs="Arial"/>
+          <w:rFonts w:ascii="Calibri" w:hAnsi="Calibri" w:cs="Calibri"/>
         </w:rPr>
         <w:t xml:space="preserve">wali santri dan </w:t>
       </w:r>
       <w:r>
         <w:rPr>
-          <w:rFonts w:ascii="Arial" w:hAnsi="Arial" w:cs="Arial"/>
+          <w:rFonts w:ascii="Calibri" w:hAnsi="Calibri" w:cs="Calibri"/>
         </w:rPr>
         <w:t xml:space="preserve">santri baru tepat waktu serta </w:t>
       </w:r>
       <w:r>
         <w:rPr>
-          <w:rFonts w:ascii="Arial" w:hAnsi="Arial" w:cs="Arial"/>
+          <w:rFonts w:ascii="Calibri" w:hAnsi="Calibri" w:cs="Calibri"/>
         </w:rPr>
         <w:t>membawa seluruh berkas persyaratan sebagaimana tercantum di bawah ini.</w:t>
       </w:r>
@@ -640,20 +589,20 @@
         <w:ind w:left="709" w:right="850" w:firstLine="567"/>
         <w:jc w:val="both"/>
         <w:rPr>
-          <w:rFonts w:ascii="Arial" w:hAnsi="Arial" w:cs="Arial"/>
+          <w:rFonts w:ascii="Calibri" w:hAnsi="Calibri" w:cs="Calibri"/>
           <w:i/>
           <w:iCs/>
         </w:rPr>
       </w:pPr>
       <w:r>
         <w:rPr>
-          <w:rFonts w:ascii="Arial" w:hAnsi="Arial" w:cs="Arial"/>
+          <w:rFonts w:ascii="Calibri" w:hAnsi="Calibri" w:cs="Calibri"/>
         </w:rPr>
         <w:t xml:space="preserve">Demikian atas perhatian dan kerjasama yang baik kami sampaikan terima kasih, </w:t>
       </w:r>
       <w:r>
         <w:rPr>
-          <w:rFonts w:ascii="Arial" w:hAnsi="Arial" w:cs="Arial"/>
+          <w:rFonts w:ascii="Calibri" w:hAnsi="Calibri" w:cs="Calibri"/>
           <w:i/>
           <w:iCs/>
         </w:rPr>
@@ -665,7 +614,7 @@
         <w:spacing w:after="0" w:line="276" w:lineRule="auto"/>
         <w:jc w:val="both"/>
         <w:rPr>
-          <w:rFonts w:ascii="Arial" w:hAnsi="Arial" w:cs="Arial"/>
+          <w:rFonts w:ascii="Calibri" w:hAnsi="Calibri" w:cs="Calibri"/>
           <w:sz w:val="12"/>
           <w:szCs w:val="12"/>
           <w:lang w:val="sv-SE"/>
@@ -677,7 +626,7 @@
         <w:spacing w:after="0"/>
         <w:jc w:val="center"/>
         <w:rPr>
-          <w:rFonts w:ascii="Arial" w:hAnsi="Arial" w:cs="Arial"/>
+          <w:rFonts w:ascii="Sakkal Majalla" w:hAnsi="Sakkal Majalla" w:cs="Calibri"/>
           <w:sz w:val="28"/>
           <w:szCs w:val="28"/>
           <w:rtl/>
@@ -685,12 +634,12 @@
       </w:pPr>
       <w:r>
         <w:rPr>
-          <w:rFonts w:ascii="Arial" w:hAnsi="Arial" w:cs="Arial"/>
+          <w:rFonts w:ascii="Sakkal Majalla" w:hAnsi="Sakkal Majalla" w:cs="Calibri"/>
           <w:sz w:val="28"/>
           <w:szCs w:val="28"/>
           <w:rtl/>
         </w:rPr>
-        <w:t>ÙˆØ§Ù„Ø³Ù„Ø§Ù… Ø¹Ù„ÙŠÙƒÙ… ÙˆØ±Ø­Ù…Ø© Ø§Ù„Ù„Ù‡ ÙˆØ¨Ø±ÙƒØ§ØªÙ‡</w:t>
+        <w:t>والسلام عليكم ورحمة الله وبركاته</w:t>
       </w:r>
     </w:p>
     <w:p>
@@ -698,7 +647,7 @@
         <w:spacing w:after="0"/>
         <w:jc w:val="center"/>
         <w:rPr>
-          <w:rFonts w:ascii="Arial" w:hAnsi="Arial" w:cs="Arial"/>
+          <w:rFonts w:ascii="Calibri" w:hAnsi="Calibri" w:cs="Calibri"/>
           <w:sz w:val="24"/>
           <w:szCs w:val="24"/>
         </w:rPr>
@@ -708,23 +657,22 @@
     <w:p>
       <w:pPr>
         <w:spacing w:after="0" w:line="240" w:lineRule="auto"/>
-        <w:ind w:left="3119" w:firstLine="3544"/>
         <w:jc w:val="right"/>
         <w:rPr>
-          <w:rFonts w:ascii="Arial" w:hAnsi="Arial" w:cs="Arial"/>
+          <w:rFonts w:ascii="Calibri" w:hAnsi="Calibri" w:cs="Calibri"/>
           <w:b/>
           <w:bCs/>
         </w:rPr>
       </w:pPr>
       <w:r>
         <w:rPr>
-          <w:rFonts w:ascii="Arial" w:hAnsi="Arial" w:cs="Arial"/>
+          <w:rFonts w:ascii="Calibri" w:hAnsi="Calibri" w:cs="Calibri"/>
         </w:rPr>
         <w:t xml:space="preserve">Sukabumi, </w:t>
       </w:r>
       <w:r>
         <w:rPr>
-          <w:rFonts w:ascii="Arial" w:hAnsi="Arial" w:cs="Arial"/>
+          <w:rFonts w:ascii="Calibri" w:hAnsi="Calibri" w:cs="Calibri"/>
         </w:rPr>
         <w:t>13 Muharram 1448 H.</w:t>
       </w:r>
@@ -732,31 +680,14 @@
     <w:p>
       <w:pPr>
         <w:spacing w:after="0" w:line="240" w:lineRule="auto"/>
-        <w:ind w:firstLine="7513"/>
         <w:jc w:val="right"/>
         <w:rPr>
-          <w:rFonts w:ascii="Arial" w:hAnsi="Arial" w:cs="Arial"/>
-        </w:rPr>
-      </w:pPr>
-      <w:r>
-        <w:rPr>
-          <w:rFonts w:ascii="Arial" w:hAnsi="Arial" w:cs="Arial"/>
-          <w:b/>
-          <w:bCs/>
-        </w:rPr>
-        <w:t xml:space="preserve">   </w:t>
-      </w:r>
-      <w:r>
-        <w:rPr>
-          <w:rFonts w:ascii="Arial" w:hAnsi="Arial" w:cs="Arial"/>
-          <w:b/>
-          <w:bCs/>
-        </w:rPr>
-        <w:t xml:space="preserve"> </w:t>
-      </w:r>
-      <w:r>
-        <w:rPr>
-          <w:rFonts w:ascii="Arial" w:hAnsi="Arial" w:cs="Arial"/>
+          <w:rFonts w:ascii="Calibri" w:hAnsi="Calibri" w:cs="Calibri"/>
+        </w:rPr>
+      </w:pPr>
+      <w:r>
+        <w:rPr>
+          <w:rFonts w:ascii="Calibri" w:hAnsi="Calibri" w:cs="Calibri"/>
         </w:rPr>
         <w:t>28 Juni 2026 M.</w:t>
       </w:r>
@@ -791,24 +722,24 @@
             <w:pPr>
               <w:jc w:val="center"/>
               <w:rPr>
-                <w:rFonts w:ascii="Arial" w:hAnsi="Arial" w:cs="Arial"/>
+                <w:rFonts w:ascii="Calibri" w:hAnsi="Calibri" w:cs="Calibri"/>
               </w:rPr>
             </w:pPr>
             <w:r>
               <w:rPr>
-                <w:rFonts w:ascii="Arial" w:hAnsi="Arial" w:cs="Arial"/>
+                <w:rFonts w:ascii="Calibri" w:hAnsi="Calibri" w:cs="Calibri"/>
                 <w:noProof/>
               </w:rPr>
               <w:drawing>
-                <wp:anchor distT="0" distB="0" distL="114300" distR="114300" simplePos="0" relativeHeight="251661312" behindDoc="1" locked="0" layoutInCell="1" allowOverlap="1" wp14:anchorId="13A08FF3" wp14:editId="7861FF84">
+                <wp:anchor distT="0" distB="0" distL="114300" distR="114300" simplePos="0" relativeHeight="251661312" behindDoc="1" locked="0" layoutInCell="1" allowOverlap="1" wp14:anchorId="13A08FF3" wp14:editId="580A68DB">
                   <wp:simplePos x="0" y="0"/>
                   <wp:positionH relativeFrom="column">
-                    <wp:posOffset>3280410</wp:posOffset>
+                    <wp:posOffset>2625090</wp:posOffset>
                   </wp:positionH>
                   <wp:positionV relativeFrom="paragraph">
                     <wp:posOffset>128905</wp:posOffset>
                   </wp:positionV>
-                  <wp:extent cx="1280160" cy="685931"/>
+                  <wp:extent cx="1828800" cy="979901"/>
                   <wp:effectExtent l="0" t="0" r="0" b="0"/>
                   <wp:wrapNone/>
                   <wp:docPr id="3" name="Picture 3"/>
@@ -823,7 +754,7 @@
                           <pic:cNvPicPr/>
                         </pic:nvPicPr>
                         <pic:blipFill>
-                          <a:blip r:embed="rId7" cstate="print">
+                          <a:blip r:embed="rId7">
                             <a:extLst>
                               <a:ext uri="{BEBA8EAE-BF5A-486C-A8C5-ECC9F3942E4B}">
                                 <a14:imgProps xmlns:a14="http://schemas.microsoft.com/office/drawing/2010/main">
@@ -852,7 +783,7 @@
                         <pic:spPr>
                           <a:xfrm>
                             <a:off x="0" y="0"/>
-                            <a:ext cx="1280160" cy="685931"/>
+                            <a:ext cx="1828800" cy="979901"/>
                           </a:xfrm>
                           <a:prstGeom prst="rect">
                             <a:avLst/>
@@ -880,18 +811,18 @@
             <w:pPr>
               <w:jc w:val="right"/>
               <w:rPr>
-                <w:rFonts w:ascii="Arial" w:hAnsi="Arial" w:cs="Arial"/>
+                <w:rFonts w:ascii="Calibri" w:hAnsi="Calibri" w:cs="Calibri"/>
               </w:rPr>
             </w:pPr>
             <w:r>
               <w:rPr>
-                <w:rFonts w:ascii="Arial" w:hAnsi="Arial" w:cs="Arial"/>
+                <w:rFonts w:ascii="Calibri" w:hAnsi="Calibri" w:cs="Calibri"/>
               </w:rPr>
               <w:t>Mudir Pesantren</w:t>
             </w:r>
             <w:r>
               <w:rPr>
-                <w:rFonts w:ascii="Arial" w:hAnsi="Arial" w:cs="Arial"/>
+                <w:rFonts w:ascii="Calibri" w:hAnsi="Calibri" w:cs="Calibri"/>
               </w:rPr>
               <w:t>,</w:t>
             </w:r>
@@ -910,7 +841,7 @@
             <w:pPr>
               <w:jc w:val="center"/>
               <w:rPr>
-                <w:rFonts w:ascii="Arial" w:hAnsi="Arial" w:cs="Arial"/>
+                <w:rFonts w:ascii="Calibri" w:hAnsi="Calibri" w:cs="Calibri"/>
               </w:rPr>
             </w:pPr>
           </w:p>
@@ -923,12 +854,12 @@
             <w:pPr>
               <w:jc w:val="center"/>
               <w:rPr>
-                <w:rFonts w:ascii="Arial" w:hAnsi="Arial" w:cs="Arial"/>
+                <w:rFonts w:ascii="Calibri" w:hAnsi="Calibri" w:cs="Calibri"/>
               </w:rPr>
             </w:pPr>
             <w:r>
               <w:rPr>
-                <w:rFonts w:ascii="Arial" w:hAnsi="Arial" w:cs="Arial"/>
+                <w:rFonts w:ascii="Calibri" w:hAnsi="Calibri" w:cs="Calibri"/>
                 <w:noProof/>
                 <w:rtl/>
                 <w:lang w:val="ar-SA"/>
@@ -989,22 +920,22 @@
             </w:r>
             <w:r>
               <w:rPr>
-                <w:rFonts w:ascii="Arial" w:hAnsi="Arial" w:cs="Arial"/>
+                <w:rFonts w:ascii="Calibri" w:hAnsi="Calibri" w:cs="Calibri"/>
                 <w:noProof/>
                 <w:rtl/>
                 <w:lang w:val="ar-SA"/>
               </w:rPr>
               <w:drawing>
-                <wp:anchor distT="0" distB="0" distL="114300" distR="114300" simplePos="0" relativeHeight="251660288" behindDoc="0" locked="0" layoutInCell="1" allowOverlap="1" wp14:anchorId="4ADE68DE" wp14:editId="376D54FB">
+                <wp:anchor distT="0" distB="0" distL="114300" distR="114300" simplePos="0" relativeHeight="251660288" behindDoc="0" locked="0" layoutInCell="1" allowOverlap="1" wp14:anchorId="4ADE68DE" wp14:editId="75A32E52">
                   <wp:simplePos x="0" y="0"/>
                   <wp:positionH relativeFrom="column">
-                    <wp:posOffset>5253355</wp:posOffset>
+                    <wp:posOffset>-106046</wp:posOffset>
                   </wp:positionH>
                   <wp:positionV relativeFrom="paragraph">
-                    <wp:posOffset>7717790</wp:posOffset>
+                    <wp:posOffset>46242</wp:posOffset>
                   </wp:positionV>
-                  <wp:extent cx="980123" cy="674831"/>
-                  <wp:effectExtent l="0" t="0" r="0" b="0"/>
+                  <wp:extent cx="1400175" cy="964044"/>
+                  <wp:effectExtent l="0" t="0" r="0" b="7620"/>
                   <wp:wrapNone/>
                   <wp:docPr id="2130054307" name="Picture 11" descr="A black background with a black and white text&#10;&#10;Description automatically generated"/>
                   <wp:cNvGraphicFramePr>
@@ -1044,7 +975,7 @@
                         <pic:spPr bwMode="auto">
                           <a:xfrm>
                             <a:off x="0" y="0"/>
-                            <a:ext cx="980123" cy="674831"/>
+                            <a:ext cx="1401956" cy="965270"/>
                           </a:xfrm>
                           <a:prstGeom prst="rect">
                             <a:avLst/>
@@ -1075,7 +1006,7 @@
             <w:pPr>
               <w:jc w:val="center"/>
               <w:rPr>
-                <w:rFonts w:ascii="Arial" w:hAnsi="Arial" w:cs="Arial"/>
+                <w:rFonts w:ascii="Calibri" w:hAnsi="Calibri" w:cs="Calibri"/>
               </w:rPr>
             </w:pPr>
           </w:p>
@@ -1083,7 +1014,7 @@
             <w:pPr>
               <w:jc w:val="center"/>
               <w:rPr>
-                <w:rFonts w:ascii="Arial" w:hAnsi="Arial" w:cs="Arial"/>
+                <w:rFonts w:ascii="Calibri" w:hAnsi="Calibri" w:cs="Calibri"/>
               </w:rPr>
             </w:pPr>
           </w:p>
@@ -1091,7 +1022,7 @@
             <w:pPr>
               <w:jc w:val="center"/>
               <w:rPr>
-                <w:rFonts w:ascii="Arial" w:hAnsi="Arial" w:cs="Arial"/>
+                <w:rFonts w:ascii="Calibri" w:hAnsi="Calibri" w:cs="Calibri"/>
               </w:rPr>
             </w:pPr>
           </w:p>
@@ -1099,14 +1030,14 @@
             <w:pPr>
               <w:jc w:val="right"/>
               <w:rPr>
-                <w:rFonts w:ascii="Arial" w:hAnsi="Arial" w:cs="Arial"/>
+                <w:rFonts w:ascii="Calibri" w:hAnsi="Calibri" w:cs="Calibri"/>
                 <w:b/>
                 <w:bCs/>
               </w:rPr>
             </w:pPr>
             <w:r>
               <w:rPr>
-                <w:rFonts w:ascii="Arial" w:hAnsi="Arial" w:cs="Arial"/>
+                <w:rFonts w:ascii="Calibri" w:hAnsi="Calibri" w:cs="Calibri"/>
                 <w:b/>
                 <w:bCs/>
               </w:rPr>
@@ -1121,7 +1052,7 @@
         <w:spacing w:after="0" w:line="240" w:lineRule="auto"/>
         <w:jc w:val="both"/>
         <w:rPr>
-          <w:rFonts w:ascii="Arial" w:hAnsi="Arial" w:cs="Arial"/>
+          <w:rFonts w:ascii="Calibri" w:hAnsi="Calibri" w:cs="Calibri"/>
           <w:b/>
           <w:bCs/>
           <w:u w:val="single"/>
@@ -1140,7 +1071,7 @@
         <w:spacing w:before="240" w:after="0" w:line="240" w:lineRule="auto"/>
         <w:jc w:val="center"/>
         <w:rPr>
-          <w:rFonts w:ascii="Arial" w:hAnsi="Arial" w:cs="Arial"/>
+          <w:rFonts w:ascii="Calibri" w:hAnsi="Calibri" w:cs="Calibri"/>
           <w:b/>
           <w:bCs/>
           <w:sz w:val="24"/>
@@ -1149,7 +1080,7 @@
       </w:pPr>
       <w:r>
         <w:rPr>
-          <w:rFonts w:ascii="Arial" w:hAnsi="Arial" w:cs="Arial"/>
+          <w:rFonts w:ascii="Calibri" w:hAnsi="Calibri" w:cs="Calibri"/>
           <w:b/>
           <w:bCs/>
           <w:sz w:val="24"/>
@@ -1164,14 +1095,14 @@
         <w:spacing w:after="0" w:line="240" w:lineRule="auto"/>
         <w:jc w:val="both"/>
         <w:rPr>
-          <w:rFonts w:ascii="Arial" w:hAnsi="Arial" w:cs="Arial"/>
+          <w:rFonts w:ascii="Calibri" w:hAnsi="Calibri" w:cs="Calibri"/>
           <w:b/>
           <w:bCs/>
         </w:rPr>
       </w:pPr>
       <w:r>
         <w:rPr>
-          <w:rFonts w:ascii="Arial" w:hAnsi="Arial" w:cs="Arial"/>
+          <w:rFonts w:ascii="Calibri" w:hAnsi="Calibri" w:cs="Calibri"/>
           <w:b/>
           <w:bCs/>
         </w:rPr>
@@ -1183,7 +1114,7 @@
         <w:spacing w:after="0" w:line="240" w:lineRule="auto"/>
         <w:jc w:val="center"/>
         <w:rPr>
-          <w:rFonts w:ascii="Arial" w:hAnsi="Arial" w:cs="Arial"/>
+          <w:rFonts w:ascii="Calibri" w:hAnsi="Calibri" w:cs="Calibri"/>
           <w:b/>
           <w:bCs/>
         </w:rPr>
@@ -1198,14 +1129,14 @@
         <w:ind w:left="720" w:hanging="720"/>
         <w:jc w:val="both"/>
         <w:rPr>
-          <w:rFonts w:ascii="Arial" w:hAnsi="Arial" w:cs="Arial"/>
+          <w:rFonts w:ascii="Calibri" w:hAnsi="Calibri" w:cs="Calibri"/>
           <w:b/>
           <w:bCs/>
         </w:rPr>
       </w:pPr>
       <w:r>
         <w:rPr>
-          <w:rFonts w:ascii="Arial" w:hAnsi="Arial" w:cs="Arial"/>
+          <w:rFonts w:ascii="Calibri" w:hAnsi="Calibri" w:cs="Calibri"/>
           <w:b/>
           <w:bCs/>
         </w:rPr>
@@ -1213,7 +1144,7 @@
       </w:r>
       <w:r>
         <w:rPr>
-          <w:rFonts w:ascii="Arial" w:hAnsi="Arial" w:cs="Arial"/>
+          <w:rFonts w:ascii="Calibri" w:hAnsi="Calibri" w:cs="Calibri"/>
           <w:b/>
           <w:bCs/>
         </w:rPr>
@@ -1221,7 +1152,7 @@
       </w:r>
       <w:r>
         <w:rPr>
-          <w:rFonts w:ascii="Arial" w:hAnsi="Arial" w:cs="Arial"/>
+          <w:rFonts w:ascii="Calibri" w:hAnsi="Calibri" w:cs="Calibri"/>
           <w:b/>
           <w:bCs/>
         </w:rPr>
@@ -1233,13 +1164,13 @@
         <w:spacing w:after="0" w:line="240" w:lineRule="auto"/>
         <w:jc w:val="both"/>
         <w:rPr>
-          <w:rFonts w:ascii="Arial" w:hAnsi="Arial" w:cs="Arial"/>
-          <w:bCs/>
-        </w:rPr>
-      </w:pPr>
-      <w:r>
-        <w:rPr>
-          <w:rFonts w:ascii="Arial" w:hAnsi="Arial" w:cs="Arial"/>
+          <w:rFonts w:ascii="Calibri" w:hAnsi="Calibri" w:cs="Calibri"/>
+          <w:bCs/>
+        </w:rPr>
+      </w:pPr>
+      <w:r>
+        <w:rPr>
+          <w:rFonts w:ascii="Calibri" w:hAnsi="Calibri" w:cs="Calibri"/>
           <w:bCs/>
         </w:rPr>
         <w:t>Seluruh berkas di bawah ini wajib dibawa pada saat kedatangan, dimasukkan ke dalam satu map, dan diserahkan kepada bagian pendaftaran:</w:t>
@@ -1254,27 +1185,27 @@
         <w:ind w:left="720" w:hanging="720"/>
         <w:jc w:val="both"/>
         <w:rPr>
-          <w:rFonts w:ascii="Arial" w:hAnsi="Arial" w:cs="Arial"/>
-          <w:bCs/>
-        </w:rPr>
-      </w:pPr>
-      <w:r>
-        <w:rPr>
-          <w:rFonts w:ascii="Arial" w:hAnsi="Arial" w:cs="Arial"/>
+          <w:rFonts w:ascii="Calibri" w:hAnsi="Calibri" w:cs="Calibri"/>
+          <w:bCs/>
+        </w:rPr>
+      </w:pPr>
+      <w:r>
+        <w:rPr>
+          <w:rFonts w:ascii="Calibri" w:hAnsi="Calibri" w:cs="Calibri"/>
           <w:bCs/>
         </w:rPr>
         <w:t>1.</w:t>
       </w:r>
       <w:r>
         <w:rPr>
-          <w:rFonts w:ascii="Arial" w:hAnsi="Arial" w:cs="Arial"/>
+          <w:rFonts w:ascii="Calibri" w:hAnsi="Calibri" w:cs="Calibri"/>
           <w:bCs/>
         </w:rPr>
         <w:tab/>
       </w:r>
       <w:r>
         <w:rPr>
-          <w:rFonts w:ascii="Arial" w:hAnsi="Arial" w:cs="Arial"/>
+          <w:rFonts w:ascii="Calibri" w:hAnsi="Calibri" w:cs="Calibri"/>
           <w:bCs/>
         </w:rPr>
         <w:t>Foto setengah badan terbaru berlatar belakang merah, ukuran 4 x 6 cm sebanyak 4 lembar</w:t>
@@ -1289,27 +1220,27 @@
         <w:ind w:left="720" w:hanging="720"/>
         <w:jc w:val="both"/>
         <w:rPr>
-          <w:rFonts w:ascii="Arial" w:hAnsi="Arial" w:cs="Arial"/>
-          <w:bCs/>
-        </w:rPr>
-      </w:pPr>
-      <w:r>
-        <w:rPr>
-          <w:rFonts w:ascii="Arial" w:hAnsi="Arial" w:cs="Arial"/>
+          <w:rFonts w:ascii="Calibri" w:hAnsi="Calibri" w:cs="Calibri"/>
+          <w:bCs/>
+        </w:rPr>
+      </w:pPr>
+      <w:r>
+        <w:rPr>
+          <w:rFonts w:ascii="Calibri" w:hAnsi="Calibri" w:cs="Calibri"/>
           <w:bCs/>
         </w:rPr>
         <w:t>2.</w:t>
       </w:r>
       <w:r>
         <w:rPr>
-          <w:rFonts w:ascii="Arial" w:hAnsi="Arial" w:cs="Arial"/>
+          <w:rFonts w:ascii="Calibri" w:hAnsi="Calibri" w:cs="Calibri"/>
           <w:bCs/>
         </w:rPr>
         <w:tab/>
       </w:r>
       <w:r>
         <w:rPr>
-          <w:rFonts w:ascii="Arial" w:hAnsi="Arial" w:cs="Arial"/>
+          <w:rFonts w:ascii="Calibri" w:hAnsi="Calibri" w:cs="Calibri"/>
           <w:bCs/>
         </w:rPr>
         <w:t>Fotokopi Kartu Keluarga (KK)</w:t>
@@ -1324,27 +1255,27 @@
         <w:ind w:left="720" w:hanging="720"/>
         <w:jc w:val="both"/>
         <w:rPr>
-          <w:rFonts w:ascii="Arial" w:hAnsi="Arial" w:cs="Arial"/>
-          <w:bCs/>
-        </w:rPr>
-      </w:pPr>
-      <w:r>
-        <w:rPr>
-          <w:rFonts w:ascii="Arial" w:hAnsi="Arial" w:cs="Arial"/>
+          <w:rFonts w:ascii="Calibri" w:hAnsi="Calibri" w:cs="Calibri"/>
+          <w:bCs/>
+        </w:rPr>
+      </w:pPr>
+      <w:r>
+        <w:rPr>
+          <w:rFonts w:ascii="Calibri" w:hAnsi="Calibri" w:cs="Calibri"/>
           <w:bCs/>
         </w:rPr>
         <w:t>3.</w:t>
       </w:r>
       <w:r>
         <w:rPr>
-          <w:rFonts w:ascii="Arial" w:hAnsi="Arial" w:cs="Arial"/>
+          <w:rFonts w:ascii="Calibri" w:hAnsi="Calibri" w:cs="Calibri"/>
           <w:bCs/>
         </w:rPr>
         <w:tab/>
       </w:r>
       <w:r>
         <w:rPr>
-          <w:rFonts w:ascii="Arial" w:hAnsi="Arial" w:cs="Arial"/>
+          <w:rFonts w:ascii="Calibri" w:hAnsi="Calibri" w:cs="Calibri"/>
           <w:bCs/>
         </w:rPr>
         <w:t>Fotokopi Akta Kelahiran</w:t>
@@ -1359,27 +1290,27 @@
         <w:ind w:left="720" w:hanging="720"/>
         <w:jc w:val="both"/>
         <w:rPr>
-          <w:rFonts w:ascii="Arial" w:hAnsi="Arial" w:cs="Arial"/>
-          <w:bCs/>
-        </w:rPr>
-      </w:pPr>
-      <w:r>
-        <w:rPr>
-          <w:rFonts w:ascii="Arial" w:hAnsi="Arial" w:cs="Arial"/>
+          <w:rFonts w:ascii="Calibri" w:hAnsi="Calibri" w:cs="Calibri"/>
+          <w:bCs/>
+        </w:rPr>
+      </w:pPr>
+      <w:r>
+        <w:rPr>
+          <w:rFonts w:ascii="Calibri" w:hAnsi="Calibri" w:cs="Calibri"/>
           <w:bCs/>
         </w:rPr>
         <w:t>4.</w:t>
       </w:r>
       <w:r>
         <w:rPr>
-          <w:rFonts w:ascii="Arial" w:hAnsi="Arial" w:cs="Arial"/>
+          <w:rFonts w:ascii="Calibri" w:hAnsi="Calibri" w:cs="Calibri"/>
           <w:bCs/>
         </w:rPr>
         <w:tab/>
       </w:r>
       <w:r>
         <w:rPr>
-          <w:rFonts w:ascii="Arial" w:hAnsi="Arial" w:cs="Arial"/>
+          <w:rFonts w:ascii="Calibri" w:hAnsi="Calibri" w:cs="Calibri"/>
           <w:bCs/>
         </w:rPr>
         <w:t>Fotokopi rapor semester ganjil terakhir</w:t>
@@ -1394,27 +1325,27 @@
         <w:ind w:left="720" w:hanging="720"/>
         <w:jc w:val="both"/>
         <w:rPr>
-          <w:rFonts w:ascii="Arial" w:hAnsi="Arial" w:cs="Arial"/>
-          <w:bCs/>
-        </w:rPr>
-      </w:pPr>
-      <w:r>
-        <w:rPr>
-          <w:rFonts w:ascii="Arial" w:hAnsi="Arial" w:cs="Arial"/>
+          <w:rFonts w:ascii="Calibri" w:hAnsi="Calibri" w:cs="Calibri"/>
+          <w:bCs/>
+        </w:rPr>
+      </w:pPr>
+      <w:r>
+        <w:rPr>
+          <w:rFonts w:ascii="Calibri" w:hAnsi="Calibri" w:cs="Calibri"/>
           <w:bCs/>
         </w:rPr>
         <w:t>5.</w:t>
       </w:r>
       <w:r>
         <w:rPr>
-          <w:rFonts w:ascii="Arial" w:hAnsi="Arial" w:cs="Arial"/>
+          <w:rFonts w:ascii="Calibri" w:hAnsi="Calibri" w:cs="Calibri"/>
           <w:bCs/>
         </w:rPr>
         <w:tab/>
       </w:r>
       <w:r>
         <w:rPr>
-          <w:rFonts w:ascii="Arial" w:hAnsi="Arial" w:cs="Arial"/>
+          <w:rFonts w:ascii="Calibri" w:hAnsi="Calibri" w:cs="Calibri"/>
           <w:bCs/>
         </w:rPr>
         <w:t>Fotokopi rapor semester genap terakhir</w:t>
@@ -1429,27 +1360,34 @@
         <w:ind w:left="720" w:hanging="720"/>
         <w:jc w:val="both"/>
         <w:rPr>
-          <w:rFonts w:ascii="Arial" w:hAnsi="Arial" w:cs="Arial"/>
-          <w:bCs/>
-        </w:rPr>
-      </w:pPr>
-      <w:r>
-        <w:rPr>
-          <w:rFonts w:ascii="Arial" w:hAnsi="Arial" w:cs="Arial"/>
-          <w:bCs/>
-        </w:rPr>
-        <w:t>5.</w:t>
-      </w:r>
-      <w:r>
-        <w:rPr>
-          <w:rFonts w:ascii="Arial" w:hAnsi="Arial" w:cs="Arial"/>
+          <w:rFonts w:ascii="Calibri" w:hAnsi="Calibri" w:cs="Calibri"/>
+          <w:bCs/>
+        </w:rPr>
+      </w:pPr>
+      <w:r>
+        <w:rPr>
+          <w:rFonts w:ascii="Calibri" w:hAnsi="Calibri" w:cs="Calibri"/>
+          <w:bCs/>
+        </w:rPr>
+        <w:t>5</w:t>
+      </w:r>
+      <w:r>
+        <w:rPr>
+          <w:rFonts w:ascii="Calibri" w:hAnsi="Calibri" w:cs="Calibri"/>
+          <w:bCs/>
+        </w:rPr>
+        <w:t>.</w:t>
+      </w:r>
+      <w:r>
+        <w:rPr>
+          <w:rFonts w:ascii="Calibri" w:hAnsi="Calibri" w:cs="Calibri"/>
           <w:bCs/>
         </w:rPr>
         <w:tab/>
       </w:r>
       <w:r>
         <w:rPr>
-          <w:rFonts w:ascii="Arial" w:hAnsi="Arial" w:cs="Arial"/>
+          <w:rFonts w:ascii="Calibri" w:hAnsi="Calibri" w:cs="Calibri"/>
           <w:bCs/>
         </w:rPr>
         <w:t>Print-out bukti NISN (Nomor Induk Siswa Nasional)</w:t>
@@ -1464,27 +1402,34 @@
         <w:ind w:left="720" w:hanging="720"/>
         <w:jc w:val="both"/>
         <w:rPr>
-          <w:rFonts w:ascii="Arial" w:hAnsi="Arial" w:cs="Arial"/>
-          <w:bCs/>
-        </w:rPr>
-      </w:pPr>
-      <w:r>
-        <w:rPr>
-          <w:rFonts w:ascii="Arial" w:hAnsi="Arial" w:cs="Arial"/>
-          <w:bCs/>
-        </w:rPr>
-        <w:t>5.</w:t>
-      </w:r>
-      <w:r>
-        <w:rPr>
-          <w:rFonts w:ascii="Arial" w:hAnsi="Arial" w:cs="Arial"/>
+          <w:rFonts w:ascii="Calibri" w:hAnsi="Calibri" w:cs="Calibri"/>
+          <w:bCs/>
+        </w:rPr>
+      </w:pPr>
+      <w:r>
+        <w:rPr>
+          <w:rFonts w:ascii="Calibri" w:hAnsi="Calibri" w:cs="Calibri"/>
+          <w:bCs/>
+        </w:rPr>
+        <w:t>6</w:t>
+      </w:r>
+      <w:r>
+        <w:rPr>
+          <w:rFonts w:ascii="Calibri" w:hAnsi="Calibri" w:cs="Calibri"/>
+          <w:bCs/>
+        </w:rPr>
+        <w:t>.</w:t>
+      </w:r>
+      <w:r>
+        <w:rPr>
+          <w:rFonts w:ascii="Calibri" w:hAnsi="Calibri" w:cs="Calibri"/>
           <w:bCs/>
         </w:rPr>
         <w:tab/>
       </w:r>
       <w:r>
         <w:rPr>
-          <w:rFonts w:ascii="Arial" w:hAnsi="Arial" w:cs="Arial"/>
+          <w:rFonts w:ascii="Calibri" w:hAnsi="Calibri" w:cs="Calibri"/>
           <w:bCs/>
         </w:rPr>
         <w:t>Surat Keterangan Sehat (format panitia) - ASLI</w:t>
@@ -1499,27 +1444,34 @@
         <w:ind w:left="720" w:hanging="720"/>
         <w:jc w:val="both"/>
         <w:rPr>
-          <w:rFonts w:ascii="Arial" w:hAnsi="Arial" w:cs="Arial"/>
-          <w:bCs/>
-        </w:rPr>
-      </w:pPr>
-      <w:r>
-        <w:rPr>
-          <w:rFonts w:ascii="Arial" w:hAnsi="Arial" w:cs="Arial"/>
-          <w:bCs/>
-        </w:rPr>
-        <w:t>5.</w:t>
-      </w:r>
-      <w:r>
-        <w:rPr>
-          <w:rFonts w:ascii="Arial" w:hAnsi="Arial" w:cs="Arial"/>
+          <w:rFonts w:ascii="Calibri" w:hAnsi="Calibri" w:cs="Calibri"/>
+          <w:bCs/>
+        </w:rPr>
+      </w:pPr>
+      <w:r>
+        <w:rPr>
+          <w:rFonts w:ascii="Calibri" w:hAnsi="Calibri" w:cs="Calibri"/>
+          <w:bCs/>
+        </w:rPr>
+        <w:t>7</w:t>
+      </w:r>
+      <w:r>
+        <w:rPr>
+          <w:rFonts w:ascii="Calibri" w:hAnsi="Calibri" w:cs="Calibri"/>
+          <w:bCs/>
+        </w:rPr>
+        <w:t>.</w:t>
+      </w:r>
+      <w:r>
+        <w:rPr>
+          <w:rFonts w:ascii="Calibri" w:hAnsi="Calibri" w:cs="Calibri"/>
           <w:bCs/>
         </w:rPr>
         <w:tab/>
       </w:r>
       <w:r>
         <w:rPr>
-          <w:rFonts w:ascii="Arial" w:hAnsi="Arial" w:cs="Arial"/>
+          <w:rFonts w:ascii="Calibri" w:hAnsi="Calibri" w:cs="Calibri"/>
           <w:bCs/>
         </w:rPr>
         <w:t>Surat Pernyataan Bebas dari Perilaku Buruk (format panitia) - ASLI</w:t>
@@ -1534,27 +1486,34 @@
         <w:ind w:left="720" w:hanging="720"/>
         <w:jc w:val="both"/>
         <w:rPr>
-          <w:rFonts w:ascii="Arial" w:hAnsi="Arial" w:cs="Arial"/>
-          <w:bCs/>
-        </w:rPr>
-      </w:pPr>
-      <w:r>
-        <w:rPr>
-          <w:rFonts w:ascii="Arial" w:hAnsi="Arial" w:cs="Arial"/>
-          <w:bCs/>
-        </w:rPr>
-        <w:t>5.</w:t>
-      </w:r>
-      <w:r>
-        <w:rPr>
-          <w:rFonts w:ascii="Arial" w:hAnsi="Arial" w:cs="Arial"/>
+          <w:rFonts w:ascii="Calibri" w:hAnsi="Calibri" w:cs="Calibri"/>
+          <w:bCs/>
+        </w:rPr>
+      </w:pPr>
+      <w:r>
+        <w:rPr>
+          <w:rFonts w:ascii="Calibri" w:hAnsi="Calibri" w:cs="Calibri"/>
+          <w:bCs/>
+        </w:rPr>
+        <w:t>8</w:t>
+      </w:r>
+      <w:r>
+        <w:rPr>
+          <w:rFonts w:ascii="Calibri" w:hAnsi="Calibri" w:cs="Calibri"/>
+          <w:bCs/>
+        </w:rPr>
+        <w:t>.</w:t>
+      </w:r>
+      <w:r>
+        <w:rPr>
+          <w:rFonts w:ascii="Calibri" w:hAnsi="Calibri" w:cs="Calibri"/>
           <w:bCs/>
         </w:rPr>
         <w:tab/>
       </w:r>
       <w:r>
         <w:rPr>
-          <w:rFonts w:ascii="Arial" w:hAnsi="Arial" w:cs="Arial"/>
+          <w:rFonts w:ascii="Calibri" w:hAnsi="Calibri" w:cs="Calibri"/>
           <w:bCs/>
         </w:rPr>
         <w:t>Pakta Integritas Calon Santri (format panitia) - ASLI</w:t>
@@ -1569,27 +1528,34 @@
         <w:ind w:left="720" w:hanging="720"/>
         <w:jc w:val="both"/>
         <w:rPr>
-          <w:rFonts w:ascii="Arial" w:hAnsi="Arial" w:cs="Arial"/>
-          <w:bCs/>
-        </w:rPr>
-      </w:pPr>
-      <w:r>
-        <w:rPr>
-          <w:rFonts w:ascii="Arial" w:hAnsi="Arial" w:cs="Arial"/>
-          <w:bCs/>
-        </w:rPr>
-        <w:t>5.</w:t>
-      </w:r>
-      <w:r>
-        <w:rPr>
-          <w:rFonts w:ascii="Arial" w:hAnsi="Arial" w:cs="Arial"/>
+          <w:rFonts w:ascii="Calibri" w:hAnsi="Calibri" w:cs="Calibri"/>
+          <w:bCs/>
+        </w:rPr>
+      </w:pPr>
+      <w:r>
+        <w:rPr>
+          <w:rFonts w:ascii="Calibri" w:hAnsi="Calibri" w:cs="Calibri"/>
+          <w:bCs/>
+        </w:rPr>
+        <w:t>9</w:t>
+      </w:r>
+      <w:r>
+        <w:rPr>
+          <w:rFonts w:ascii="Calibri" w:hAnsi="Calibri" w:cs="Calibri"/>
+          <w:bCs/>
+        </w:rPr>
+        <w:t>.</w:t>
+      </w:r>
+      <w:r>
+        <w:rPr>
+          <w:rFonts w:ascii="Calibri" w:hAnsi="Calibri" w:cs="Calibri"/>
           <w:bCs/>
         </w:rPr>
         <w:tab/>
       </w:r>
       <w:r>
         <w:rPr>
-          <w:rFonts w:ascii="Arial" w:hAnsi="Arial" w:cs="Arial"/>
+          <w:rFonts w:ascii="Calibri" w:hAnsi="Calibri" w:cs="Calibri"/>
           <w:bCs/>
         </w:rPr>
         <w:t>Pakta Integritas Calon Orang Tua/Wali Santri (format panitia) - ASLI</w:t>
@@ -1599,7 +1565,7 @@
       <w:pPr>
         <w:spacing w:after="0" w:line="240" w:lineRule="auto"/>
         <w:rPr>
-          <w:rFonts w:ascii="Arial" w:hAnsi="Arial" w:cs="Arial"/>
+          <w:rFonts w:ascii="Calibri" w:hAnsi="Calibri" w:cs="Calibri"/>
           <w:bCs/>
         </w:rPr>
       </w:pPr>
@@ -1609,7 +1575,7 @@
         <w:spacing w:after="0" w:line="240" w:lineRule="auto"/>
         <w:jc w:val="both"/>
         <w:rPr>
-          <w:rFonts w:ascii="Arial" w:hAnsi="Arial" w:cs="Arial"/>
+          <w:rFonts w:ascii="Calibri" w:hAnsi="Calibri" w:cs="Calibri"/>
           <w:bCs/>
           <w:i/>
           <w:sz w:val="20"/>
@@ -1617,7 +1583,7 @@
       </w:pPr>
       <w:r>
         <w:rPr>
-          <w:rFonts w:ascii="Arial" w:hAnsi="Arial" w:cs="Arial"/>
+          <w:rFonts w:ascii="Calibri" w:hAnsi="Calibri" w:cs="Calibri"/>
           <w:bCs/>
           <w:i/>
           <w:sz w:val="20"/>
@@ -1630,7 +1596,7 @@
         <w:spacing w:after="0" w:line="240" w:lineRule="auto"/>
         <w:jc w:val="both"/>
         <w:rPr>
-          <w:rFonts w:ascii="Arial" w:hAnsi="Arial" w:cs="Arial"/>
+          <w:rFonts w:ascii="Calibri" w:hAnsi="Calibri" w:cs="Calibri"/>
           <w:bCs/>
           <w:i/>
           <w:sz w:val="20"/>
@@ -1642,7 +1608,7 @@
         <w:spacing w:after="0" w:line="240" w:lineRule="auto"/>
         <w:jc w:val="both"/>
         <w:rPr>
-          <w:rFonts w:ascii="Arial" w:hAnsi="Arial" w:cs="Arial"/>
+          <w:rFonts w:ascii="Calibri" w:hAnsi="Calibri" w:cs="Calibri"/>
           <w:bCs/>
           <w:i/>
           <w:sz w:val="20"/>
@@ -1658,14 +1624,14 @@
         <w:ind w:left="720" w:hanging="720"/>
         <w:jc w:val="both"/>
         <w:rPr>
-          <w:rFonts w:ascii="Arial" w:hAnsi="Arial" w:cs="Arial"/>
+          <w:rFonts w:ascii="Calibri" w:hAnsi="Calibri" w:cs="Calibri"/>
           <w:b/>
           <w:bCs/>
         </w:rPr>
       </w:pPr>
       <w:r>
         <w:rPr>
-          <w:rFonts w:ascii="Arial" w:hAnsi="Arial" w:cs="Arial"/>
+          <w:rFonts w:ascii="Calibri" w:hAnsi="Calibri" w:cs="Calibri"/>
           <w:b/>
           <w:bCs/>
         </w:rPr>
@@ -1673,7 +1639,7 @@
       </w:r>
       <w:r>
         <w:rPr>
-          <w:rFonts w:ascii="Arial" w:hAnsi="Arial" w:cs="Arial"/>
+          <w:rFonts w:ascii="Calibri" w:hAnsi="Calibri" w:cs="Calibri"/>
           <w:b/>
           <w:bCs/>
         </w:rPr>
@@ -1681,7 +1647,7 @@
       </w:r>
       <w:r>
         <w:rPr>
-          <w:rFonts w:ascii="Arial" w:hAnsi="Arial" w:cs="Arial"/>
+          <w:rFonts w:ascii="Calibri" w:hAnsi="Calibri" w:cs="Calibri"/>
           <w:b/>
           <w:bCs/>
         </w:rPr>
@@ -1697,27 +1663,27 @@
         <w:ind w:left="720" w:hanging="720"/>
         <w:jc w:val="both"/>
         <w:rPr>
-          <w:rFonts w:ascii="Arial" w:hAnsi="Arial" w:cs="Arial"/>
-          <w:bCs/>
-        </w:rPr>
-      </w:pPr>
-      <w:r>
-        <w:rPr>
-          <w:rFonts w:ascii="Arial" w:hAnsi="Arial" w:cs="Arial"/>
+          <w:rFonts w:ascii="Calibri" w:hAnsi="Calibri" w:cs="Calibri"/>
+          <w:bCs/>
+        </w:rPr>
+      </w:pPr>
+      <w:r>
+        <w:rPr>
+          <w:rFonts w:ascii="Calibri" w:hAnsi="Calibri" w:cs="Calibri"/>
           <w:bCs/>
         </w:rPr>
         <w:t>1.</w:t>
       </w:r>
       <w:r>
         <w:rPr>
-          <w:rFonts w:ascii="Arial" w:hAnsi="Arial" w:cs="Arial"/>
+          <w:rFonts w:ascii="Calibri" w:hAnsi="Calibri" w:cs="Calibri"/>
           <w:bCs/>
         </w:rPr>
         <w:tab/>
       </w:r>
       <w:r>
         <w:rPr>
-          <w:rFonts w:ascii="Arial" w:hAnsi="Arial" w:cs="Arial"/>
+          <w:rFonts w:ascii="Calibri" w:hAnsi="Calibri" w:cs="Calibri"/>
           <w:bCs/>
         </w:rPr>
         <w:t>Berseragam: baju Koko/Kemeja putih, celana kain hitam, songkok nasional hitam.</w:t>
@@ -1732,27 +1698,27 @@
         <w:ind w:left="720" w:hanging="720"/>
         <w:jc w:val="both"/>
         <w:rPr>
-          <w:rFonts w:ascii="Arial" w:hAnsi="Arial" w:cs="Arial"/>
-          <w:bCs/>
-        </w:rPr>
-      </w:pPr>
-      <w:r>
-        <w:rPr>
-          <w:rFonts w:ascii="Arial" w:hAnsi="Arial" w:cs="Arial"/>
+          <w:rFonts w:ascii="Calibri" w:hAnsi="Calibri" w:cs="Calibri"/>
+          <w:bCs/>
+        </w:rPr>
+      </w:pPr>
+      <w:r>
+        <w:rPr>
+          <w:rFonts w:ascii="Calibri" w:hAnsi="Calibri" w:cs="Calibri"/>
           <w:bCs/>
         </w:rPr>
         <w:t>2.</w:t>
       </w:r>
       <w:r>
         <w:rPr>
-          <w:rFonts w:ascii="Arial" w:hAnsi="Arial" w:cs="Arial"/>
+          <w:rFonts w:ascii="Calibri" w:hAnsi="Calibri" w:cs="Calibri"/>
           <w:bCs/>
         </w:rPr>
         <w:tab/>
       </w:r>
       <w:r>
         <w:rPr>
-          <w:rFonts w:ascii="Arial" w:hAnsi="Arial" w:cs="Arial"/>
+          <w:rFonts w:ascii="Calibri" w:hAnsi="Calibri" w:cs="Calibri"/>
           <w:bCs/>
         </w:rPr>
         <w:t>Kursi di ruang acara utama dan kupon konsumsi/snack hanya disediakan untuk 3 orang (santri bersama 2 wali/pendamping terdekat). Pengantar lain diperkenankan masuk ke area pesantren, namun tidak diperkenankan memasuki ruang acara utama dan tidak mendapatkan kupon konsumsi.</w:t>
@@ -1766,27 +1732,27 @@
         <w:spacing w:after="0" w:line="240" w:lineRule="auto"/>
         <w:ind w:left="720" w:hanging="720"/>
         <w:rPr>
-          <w:rFonts w:ascii="Arial" w:hAnsi="Arial" w:cs="Arial"/>
-          <w:bCs/>
-        </w:rPr>
-      </w:pPr>
-      <w:r>
-        <w:rPr>
-          <w:rFonts w:ascii="Arial" w:hAnsi="Arial" w:cs="Arial"/>
+          <w:rFonts w:ascii="Calibri" w:hAnsi="Calibri" w:cs="Calibri"/>
+          <w:bCs/>
+        </w:rPr>
+      </w:pPr>
+      <w:r>
+        <w:rPr>
+          <w:rFonts w:ascii="Calibri" w:hAnsi="Calibri" w:cs="Calibri"/>
           <w:bCs/>
         </w:rPr>
         <w:t>3.</w:t>
       </w:r>
       <w:r>
         <w:rPr>
-          <w:rFonts w:ascii="Arial" w:hAnsi="Arial" w:cs="Arial"/>
+          <w:rFonts w:ascii="Calibri" w:hAnsi="Calibri" w:cs="Calibri"/>
           <w:bCs/>
         </w:rPr>
         <w:tab/>
       </w:r>
       <w:r>
         <w:rPr>
-          <w:rFonts w:ascii="Arial" w:hAnsi="Arial" w:cs="Arial"/>
+          <w:rFonts w:ascii="Calibri" w:hAnsi="Calibri" w:cs="Calibri"/>
           <w:bCs/>
         </w:rPr>
         <w:t xml:space="preserve">Konfirmasi kehadiran dengan mengisi link berikut: </w:t>
@@ -1795,7 +1761,7 @@
         <w:r>
           <w:rPr>
             <w:rStyle w:val="Hyperlink"/>
-            <w:rFonts w:ascii="Arial" w:hAnsi="Arial" w:cs="Arial"/>
+            <w:rFonts w:ascii="Calibri" w:hAnsi="Calibri" w:cs="Calibri"/>
             <w:bCs/>
           </w:rPr>
           <w:t>https://ppdb.pesantren-alimam.com/dashboard/pendaftar/welcome-day</w:t>
@@ -1811,30 +1777,37 @@
         <w:ind w:left="720" w:hanging="720"/>
         <w:jc w:val="both"/>
         <w:rPr>
-          <w:rFonts w:ascii="Arial" w:hAnsi="Arial" w:cs="Arial"/>
-          <w:bCs/>
-        </w:rPr>
-      </w:pPr>
-      <w:r>
-        <w:rPr>
-          <w:rFonts w:ascii="Arial" w:hAnsi="Arial" w:cs="Arial"/>
-          <w:bCs/>
-        </w:rPr>
-        <w:t>4.</w:t>
-      </w:r>
-      <w:r>
-        <w:rPr>
-          <w:rFonts w:ascii="Arial" w:hAnsi="Arial" w:cs="Arial"/>
+          <w:rFonts w:ascii="Calibri" w:hAnsi="Calibri" w:cs="Calibri"/>
+          <w:bCs/>
+        </w:rPr>
+      </w:pPr>
+      <w:r>
+        <w:rPr>
+          <w:rFonts w:ascii="Calibri" w:hAnsi="Calibri" w:cs="Calibri"/>
+          <w:bCs/>
+        </w:rPr>
+        <w:t>4. Begitu tiba di pesantren, santri dan wali santri langsung menurunkan barang bawaan, kemudian mobil diarahkan ke area parkir.</w:t>
+      </w:r>
+      <w:r>
+        <w:rPr>
+          <w:rFonts w:ascii="Calibri" w:hAnsi="Calibri" w:cs="Calibri"/>
+          <w:bCs/>
+        </w:rPr>
+        <w:t>6.</w:t>
+      </w:r>
+      <w:r>
+        <w:rPr>
+          <w:rFonts w:ascii="Calibri" w:hAnsi="Calibri" w:cs="Calibri"/>
           <w:bCs/>
         </w:rPr>
         <w:tab/>
       </w:r>
       <w:r>
         <w:rPr>
-          <w:rFonts w:ascii="Arial" w:hAnsi="Arial" w:cs="Arial"/>
-          <w:bCs/>
-        </w:rPr>
-        <w:t>Begitu tiba di pesantren, santri dan wali santri langsung menurunkan barang bawaan, kemudian mobil diarahkan ke area parkir.</w:t>
+          <w:rFonts w:ascii="Calibri" w:hAnsi="Calibri" w:cs="Calibri"/>
+          <w:bCs/>
+        </w:rPr>
+        <w:t>Melakukan registrasi sebelum memasuki area acara.</w:t>
       </w:r>
     </w:p>
     <w:p>
@@ -1846,30 +1819,37 @@
         <w:ind w:left="720" w:hanging="720"/>
         <w:jc w:val="both"/>
         <w:rPr>
-          <w:rFonts w:ascii="Arial" w:hAnsi="Arial" w:cs="Arial"/>
-          <w:bCs/>
-        </w:rPr>
-      </w:pPr>
-      <w:r>
-        <w:rPr>
-          <w:rFonts w:ascii="Arial" w:hAnsi="Arial" w:cs="Arial"/>
-          <w:bCs/>
-        </w:rPr>
-        <w:t>5.</w:t>
-      </w:r>
-      <w:r>
-        <w:rPr>
-          <w:rFonts w:ascii="Arial" w:hAnsi="Arial" w:cs="Arial"/>
+          <w:rFonts w:ascii="Calibri" w:hAnsi="Calibri" w:cs="Calibri"/>
+          <w:bCs/>
+        </w:rPr>
+      </w:pPr>
+      <w:r>
+        <w:rPr>
+          <w:rFonts w:ascii="Calibri" w:hAnsi="Calibri" w:cs="Calibri"/>
+          <w:bCs/>
+        </w:rPr>
+        <w:t>6</w:t>
+      </w:r>
+      <w:r>
+        <w:rPr>
+          <w:rFonts w:ascii="Calibri" w:hAnsi="Calibri" w:cs="Calibri"/>
+          <w:bCs/>
+        </w:rPr>
+        <w:t>.</w:t>
+      </w:r>
+      <w:r>
+        <w:rPr>
+          <w:rFonts w:ascii="Calibri" w:hAnsi="Calibri" w:cs="Calibri"/>
           <w:bCs/>
         </w:rPr>
         <w:tab/>
       </w:r>
       <w:r>
         <w:rPr>
-          <w:rFonts w:ascii="Arial" w:hAnsi="Arial" w:cs="Arial"/>
-          <w:bCs/>
-        </w:rPr>
-        <w:t>Melakukan registrasi sebelum memasuki area acara.</w:t>
+          <w:rFonts w:ascii="Calibri" w:hAnsi="Calibri" w:cs="Calibri"/>
+          <w:bCs/>
+        </w:rPr>
+        <w:t>Setelah registrasi, santri dan orang tua memasuki tempat acara.</w:t>
       </w:r>
     </w:p>
     <w:p>
@@ -1881,30 +1861,37 @@
         <w:ind w:left="720" w:hanging="720"/>
         <w:jc w:val="both"/>
         <w:rPr>
-          <w:rFonts w:ascii="Arial" w:hAnsi="Arial" w:cs="Arial"/>
-          <w:bCs/>
-        </w:rPr>
-      </w:pPr>
-      <w:r>
-        <w:rPr>
-          <w:rFonts w:ascii="Arial" w:hAnsi="Arial" w:cs="Arial"/>
-          <w:bCs/>
-        </w:rPr>
-        <w:t>5.</w:t>
-      </w:r>
-      <w:r>
-        <w:rPr>
-          <w:rFonts w:ascii="Arial" w:hAnsi="Arial" w:cs="Arial"/>
+          <w:rFonts w:ascii="Calibri" w:hAnsi="Calibri" w:cs="Calibri"/>
+          <w:bCs/>
+        </w:rPr>
+      </w:pPr>
+      <w:r>
+        <w:rPr>
+          <w:rFonts w:ascii="Calibri" w:hAnsi="Calibri" w:cs="Calibri"/>
+          <w:bCs/>
+        </w:rPr>
+        <w:t>7</w:t>
+      </w:r>
+      <w:r>
+        <w:rPr>
+          <w:rFonts w:ascii="Calibri" w:hAnsi="Calibri" w:cs="Calibri"/>
+          <w:bCs/>
+        </w:rPr>
+        <w:t>.</w:t>
+      </w:r>
+      <w:r>
+        <w:rPr>
+          <w:rFonts w:ascii="Calibri" w:hAnsi="Calibri" w:cs="Calibri"/>
           <w:bCs/>
         </w:rPr>
         <w:tab/>
       </w:r>
       <w:r>
         <w:rPr>
-          <w:rFonts w:ascii="Arial" w:hAnsi="Arial" w:cs="Arial"/>
-          <w:bCs/>
-        </w:rPr>
-        <w:t>Setelah registrasi, santri dan orang tua memasuki tempat acara.</w:t>
+          <w:rFonts w:ascii="Calibri" w:hAnsi="Calibri" w:cs="Calibri"/>
+          <w:bCs/>
+        </w:rPr>
+        <w:t>Setelah acara bersama tamu undangan, orang tua dan santri mengikuti sarasehan tentang peraturan, mekanisme, dan prosedur santri di Pesantren Al Imam Al Islami.</w:t>
       </w:r>
     </w:p>
     <w:p>
@@ -1916,30 +1903,37 @@
         <w:ind w:left="720" w:hanging="720"/>
         <w:jc w:val="both"/>
         <w:rPr>
-          <w:rFonts w:ascii="Arial" w:hAnsi="Arial" w:cs="Arial"/>
-          <w:bCs/>
-        </w:rPr>
-      </w:pPr>
-      <w:r>
-        <w:rPr>
-          <w:rFonts w:ascii="Arial" w:hAnsi="Arial" w:cs="Arial"/>
-          <w:bCs/>
-        </w:rPr>
-        <w:t>5.</w:t>
-      </w:r>
-      <w:r>
-        <w:rPr>
-          <w:rFonts w:ascii="Arial" w:hAnsi="Arial" w:cs="Arial"/>
+          <w:rFonts w:ascii="Calibri" w:hAnsi="Calibri" w:cs="Calibri"/>
+          <w:bCs/>
+        </w:rPr>
+      </w:pPr>
+      <w:r>
+        <w:rPr>
+          <w:rFonts w:ascii="Calibri" w:hAnsi="Calibri" w:cs="Calibri"/>
+          <w:bCs/>
+        </w:rPr>
+        <w:t>8</w:t>
+      </w:r>
+      <w:r>
+        <w:rPr>
+          <w:rFonts w:ascii="Calibri" w:hAnsi="Calibri" w:cs="Calibri"/>
+          <w:bCs/>
+        </w:rPr>
+        <w:t>.</w:t>
+      </w:r>
+      <w:r>
+        <w:rPr>
+          <w:rFonts w:ascii="Calibri" w:hAnsi="Calibri" w:cs="Calibri"/>
           <w:bCs/>
         </w:rPr>
         <w:tab/>
       </w:r>
       <w:r>
         <w:rPr>
-          <w:rFonts w:ascii="Arial" w:hAnsi="Arial" w:cs="Arial"/>
-          <w:bCs/>
-        </w:rPr>
-        <w:t>Setelah acara bersama tamu undangan, orang tua dan santri mengikuti sarasehan tentang peraturan, mekanisme, dan prosedur santri di Pesantren Al Imam Al Islami.</w:t>
+          <w:rFonts w:ascii="Calibri" w:hAnsi="Calibri" w:cs="Calibri"/>
+          <w:bCs/>
+        </w:rPr>
+        <w:t>Makan siang dibagikan di depan ruang acara dengan menukarkan kupon.</w:t>
       </w:r>
     </w:p>
     <w:p>
@@ -1951,30 +1945,37 @@
         <w:ind w:left="720" w:hanging="720"/>
         <w:jc w:val="both"/>
         <w:rPr>
-          <w:rFonts w:ascii="Arial" w:hAnsi="Arial" w:cs="Arial"/>
-          <w:bCs/>
-        </w:rPr>
-      </w:pPr>
-      <w:r>
-        <w:rPr>
-          <w:rFonts w:ascii="Arial" w:hAnsi="Arial" w:cs="Arial"/>
-          <w:bCs/>
-        </w:rPr>
-        <w:t>5.</w:t>
-      </w:r>
-      <w:r>
-        <w:rPr>
-          <w:rFonts w:ascii="Arial" w:hAnsi="Arial" w:cs="Arial"/>
+          <w:rFonts w:ascii="Calibri" w:hAnsi="Calibri" w:cs="Calibri"/>
+          <w:bCs/>
+        </w:rPr>
+      </w:pPr>
+      <w:r>
+        <w:rPr>
+          <w:rFonts w:ascii="Calibri" w:hAnsi="Calibri" w:cs="Calibri"/>
+          <w:bCs/>
+        </w:rPr>
+        <w:t>9</w:t>
+      </w:r>
+      <w:r>
+        <w:rPr>
+          <w:rFonts w:ascii="Calibri" w:hAnsi="Calibri" w:cs="Calibri"/>
+          <w:bCs/>
+        </w:rPr>
+        <w:t>.</w:t>
+      </w:r>
+      <w:r>
+        <w:rPr>
+          <w:rFonts w:ascii="Calibri" w:hAnsi="Calibri" w:cs="Calibri"/>
           <w:bCs/>
         </w:rPr>
         <w:tab/>
       </w:r>
       <w:r>
         <w:rPr>
-          <w:rFonts w:ascii="Arial" w:hAnsi="Arial" w:cs="Arial"/>
-          <w:bCs/>
-        </w:rPr>
-        <w:t>Makan siang dibagikan di depan ruang acara dengan menukarkan kupon.</w:t>
+          <w:rFonts w:ascii="Calibri" w:hAnsi="Calibri" w:cs="Calibri"/>
+          <w:bCs/>
+        </w:rPr>
+        <w:t>Setelah acara berakhir, santri memasuki asrama dan mengkondisikan barang bawaan dibantu oleh para ustadz.</w:t>
       </w:r>
     </w:p>
     <w:p>
@@ -1986,80 +1987,38 @@
         <w:ind w:left="720" w:hanging="720"/>
         <w:jc w:val="both"/>
         <w:rPr>
-          <w:rFonts w:ascii="Arial" w:hAnsi="Arial" w:cs="Arial"/>
-          <w:bCs/>
-        </w:rPr>
-      </w:pPr>
-      <w:r>
-        <w:rPr>
-          <w:rFonts w:ascii="Arial" w:hAnsi="Arial" w:cs="Arial"/>
-          <w:bCs/>
-        </w:rPr>
-        <w:t>5.</w:t>
-      </w:r>
-      <w:r>
-        <w:rPr>
-          <w:rFonts w:ascii="Arial" w:hAnsi="Arial" w:cs="Arial"/>
+          <w:rFonts w:ascii="Calibri" w:hAnsi="Calibri" w:cs="Calibri"/>
+          <w:bCs/>
+        </w:rPr>
+      </w:pPr>
+      <w:r>
+        <w:rPr>
+          <w:rFonts w:ascii="Calibri" w:hAnsi="Calibri" w:cs="Calibri"/>
+          <w:bCs/>
+        </w:rPr>
+        <w:t>10</w:t>
+      </w:r>
+      <w:r>
+        <w:rPr>
+          <w:rFonts w:ascii="Calibri" w:hAnsi="Calibri" w:cs="Calibri"/>
+          <w:bCs/>
+        </w:rPr>
+        <w:t>.</w:t>
+      </w:r>
+      <w:r>
+        <w:rPr>
+          <w:rFonts w:ascii="Calibri" w:hAnsi="Calibri" w:cs="Calibri"/>
           <w:bCs/>
         </w:rPr>
         <w:tab/>
       </w:r>
       <w:r>
         <w:rPr>
-          <w:rFonts w:ascii="Arial" w:hAnsi="Arial" w:cs="Arial"/>
-          <w:bCs/>
-        </w:rPr>
-        <w:t>Setelah acara berakhir, santri memasuki asrama dan mengkondisikan barang bawaan dibantu oleh para ustadz.</w:t>
-      </w:r>
-    </w:p>
-    <w:p>
-      <w:pPr>
-        <w:tabs>
-          <w:tab w:val="left" w:pos="720"/>
-        </w:tabs>
-        <w:spacing w:after="0" w:line="240" w:lineRule="auto"/>
-        <w:ind w:left="720" w:hanging="720"/>
-        <w:jc w:val="both"/>
-        <w:rPr>
-          <w:rFonts w:ascii="Arial" w:hAnsi="Arial" w:cs="Arial"/>
-          <w:bCs/>
-        </w:rPr>
-      </w:pPr>
-      <w:r>
-        <w:rPr>
-          <w:rFonts w:ascii="Arial" w:hAnsi="Arial" w:cs="Arial"/>
-          <w:bCs/>
-        </w:rPr>
-        <w:t>10.</w:t>
-      </w:r>
-      <w:r>
-        <w:rPr>
-          <w:rFonts w:ascii="Arial" w:hAnsi="Arial" w:cs="Arial"/>
-          <w:bCs/>
-        </w:rPr>
-        <w:tab/>
-      </w:r>
-      <w:r>
-        <w:rPr>
-          <w:rFonts w:ascii="Arial" w:hAnsi="Arial" w:cs="Arial"/>
+          <w:rFonts w:ascii="Calibri" w:hAnsi="Calibri" w:cs="Calibri"/>
           <w:bCs/>
         </w:rPr>
         <w:t>Orang tua hanya diperkenankan membersamai santri hingga sore hari pukul 17.00 WIB.</w:t>
       </w:r>
-    </w:p>
-    <w:p>
-      <w:pPr>
-        <w:tabs>
-          <w:tab w:val="left" w:pos="720"/>
-        </w:tabs>
-        <w:spacing w:after="0" w:line="240" w:lineRule="auto"/>
-        <w:ind w:left="720" w:hanging="720"/>
-        <w:jc w:val="both"/>
-        <w:rPr>
-          <w:rFonts w:ascii="Arial" w:hAnsi="Arial" w:cs="Arial"/>
-          <w:bCs/>
-        </w:rPr>
-      </w:pPr>
     </w:p>
     <w:sectPr>
       <w:pgSz w:w="11906" w:h="16838" w:code="9"/>
@@ -2071,7 +2030,7 @@
 </w:document>
 </file>
 
-<file path=word\endnotes.xml><?xml version="1.0" encoding="utf-8"?>
+<file path=word/endnotes.xml><?xml version="1.0" encoding="utf-8"?>
 <w:endnotes xmlns:wpc="http://schemas.microsoft.com/office/word/2010/wordprocessingCanvas" xmlns:cx="http://schemas.microsoft.com/office/drawing/2014/chartex" xmlns:cx1="http://schemas.microsoft.com/office/drawing/2015/9/8/chartex" xmlns:cx2="http://schemas.microsoft.com/office/drawing/2015/10/21/chartex" xmlns:cx3="http://schemas.microsoft.com/office/drawing/2016/5/9/chartex" xmlns:cx4="http://schemas.microsoft.com/office/drawing/2016/5/10/chartex" xmlns:cx5="http://schemas.microsoft.com/office/drawing/2016/5/11/chartex" xmlns:cx6="http://schemas.microsoft.com/office/drawing/2016/5/12/chartex" xmlns:cx7="http://schemas.microsoft.com/office/drawing/2016/5/13/chartex" xmlns:cx8="http://schemas.microsoft.com/office/drawing/2016/5/14/chartex" xmlns:mc="http://schemas.openxmlformats.org/markup-compatibility/2006" xmlns:aink="http://schemas.microsoft.com/office/drawing/2016/ink" xmlns:am3d="http://schemas.microsoft.com/office/drawing/2017/model3d" xmlns:o="urn:schemas-microsoft-com:office:office" xmlns:oel="http://schemas.microsoft.com/office/2019/extlst" xmlns:r="http://schemas.openxmlformats.org/officeDocument/2006/relationships" xmlns:m="http://schemas.openxmlformats.org/officeDocument/2006/math" xmlns:v="urn:schemas-microsoft-com:vml" xmlns:wp14="http://schemas.microsoft.com/office/word/2010/wordprocessingDrawing" xmlns:wp="http://schemas.openxmlformats.org/drawingml/2006/wordprocessingDrawing" xmlns:w10="urn:schemas-microsoft-com:office:word" xmlns:w="http://schemas.openxmlformats.org/wordprocessingml/2006/main" xmlns:w14="http://schemas.microsoft.com/office/word/2010/wordml" xmlns:w15="http://schemas.microsoft.com/office/word/2012/wordml" xmlns:w16cex="http://schemas.microsoft.com/office/word/2018/wordml/cex" xmlns:w16cid="http://schemas.microsoft.com/office/word/2016/wordml/cid" xmlns:w16="http://schemas.microsoft.com/office/word/2018/wordml" xmlns:w16sdtdh="http://schemas.microsoft.com/office/word/2020/wordml/sdtdatahash" xmlns:w16se="http://schemas.microsoft.com/office/word/2015/wordml/symex" xmlns:wpg="http://schemas.microsoft.com/office/word/2010/wordprocessingGroup" xmlns:wpi="http://schemas.microsoft.com/office/word/2010/wordprocessingInk" xmlns:wne="http://schemas.microsoft.com/office/word/2006/wordml" xmlns:wps="http://schemas.microsoft.com/office/word/2010/wordprocessingShape" mc:Ignorable="w14 w15 w16se w16cid w16 w16cex w16sdtdh wp14">
   <w:endnote w:type="separator" w:id="-1">
     <w:p>
@@ -2096,61 +2055,7 @@
 </w:endnotes>
 </file>
 
-<file path=word\fontTable.xml><?xml version="1.0" encoding="utf-8"?>
-<w:fonts xmlns:mc="http://schemas.openxmlformats.org/markup-compatibility/2006" xmlns:r="http://schemas.openxmlformats.org/officeDocument/2006/relationships" xmlns:w="http://schemas.openxmlformats.org/wordprocessingml/2006/main" xmlns:w14="http://schemas.microsoft.com/office/word/2010/wordml" xmlns:w15="http://schemas.microsoft.com/office/word/2012/wordml" xmlns:w16cex="http://schemas.microsoft.com/office/word/2018/wordml/cex" xmlns:w16cid="http://schemas.microsoft.com/office/word/2016/wordml/cid" xmlns:w16="http://schemas.microsoft.com/office/word/2018/wordml" xmlns:w16sdtdh="http://schemas.microsoft.com/office/word/2020/wordml/sdtdatahash" xmlns:w16se="http://schemas.microsoft.com/office/word/2015/wordml/symex" mc:Ignorable="w14 w15 w16se w16cid w16 w16cex w16sdtdh">
-  <w:font w:name="Times New Roman">
-    <w:panose1 w:val="02020603050405020304"/>
-    <w:charset w:val="00"/>
-    <w:family w:val="roman"/>
-    <w:pitch w:val="variable"/>
-    <w:sig w:usb0="E0002EFF" w:usb1="C000785B" w:usb2="00000009" w:usb3="00000000" w:csb0="000001FF" w:csb1="00000000"/>
-  </w:font>
-  <w:font w:name="Calibri">
-    <w:panose1 w:val="020F0502020204030204"/>
-    <w:charset w:val="00"/>
-    <w:family w:val="swiss"/>
-    <w:pitch w:val="variable"/>
-    <w:sig w:usb0="E4002EFF" w:usb1="C200247B" w:usb2="00000009" w:usb3="00000000" w:csb0="000001FF" w:csb1="00000000"/>
-  </w:font>
-  <w:font w:name="Courier New">
-    <w:panose1 w:val="02070309020205020404"/>
-    <w:charset w:val="00"/>
-    <w:family w:val="modern"/>
-    <w:pitch w:val="fixed"/>
-    <w:sig w:usb0="E0002EFF" w:usb1="C0007843" w:usb2="00000009" w:usb3="00000000" w:csb0="000001FF" w:csb1="00000000"/>
-  </w:font>
-  <w:font w:name="Wingdings">
-    <w:panose1 w:val="05000000000000000000"/>
-    <w:charset w:val="02"/>
-    <w:family w:val="auto"/>
-    <w:pitch w:val="variable"/>
-    <w:sig w:usb0="00000000" w:usb1="10000000" w:usb2="00000000" w:usb3="00000000" w:csb0="80000000" w:csb1="00000000"/>
-  </w:font>
-  <w:font w:name="Symbol">
-    <w:panose1 w:val="05050102010706020507"/>
-    <w:charset w:val="02"/>
-    <w:family w:val="roman"/>
-    <w:pitch w:val="variable"/>
-    <w:sig w:usb0="00000000" w:usb1="10000000" w:usb2="00000000" w:usb3="00000000" w:csb0="80000000" w:csb1="00000000"/>
-  </w:font>
-  <w:font w:name="Arial">
-    <w:panose1 w:val="020B0604020202020204"/>
-    <w:charset w:val="00"/>
-    <w:family w:val="swiss"/>
-    <w:pitch w:val="variable"/>
-    <w:sig w:usb0="E0002EFF" w:usb1="C000785B" w:usb2="00000009" w:usb3="00000000" w:csb0="000001FF" w:csb1="00000000"/>
-  </w:font>
-  <w:font w:name="Calibri Light">
-    <w:panose1 w:val="020F0302020204030204"/>
-    <w:charset w:val="00"/>
-    <w:family w:val="swiss"/>
-    <w:pitch w:val="variable"/>
-    <w:sig w:usb0="E4002EFF" w:usb1="C200247B" w:usb2="00000009" w:usb3="00000000" w:csb0="000001FF" w:csb1="00000000"/>
-  </w:font>
-</w:fonts>
-</file>
-
-<file path=word\footnotes.xml><?xml version="1.0" encoding="utf-8"?>
+<file path=word/footnotes.xml><?xml version="1.0" encoding="utf-8"?>
 <w:footnotes xmlns:wpc="http://schemas.microsoft.com/office/word/2010/wordprocessingCanvas" xmlns:cx="http://schemas.microsoft.com/office/drawing/2014/chartex" xmlns:cx1="http://schemas.microsoft.com/office/drawing/2015/9/8/chartex" xmlns:cx2="http://schemas.microsoft.com/office/drawing/2015/10/21/chartex" xmlns:cx3="http://schemas.microsoft.com/office/drawing/2016/5/9/chartex" xmlns:cx4="http://schemas.microsoft.com/office/drawing/2016/5/10/chartex" xmlns:cx5="http://schemas.microsoft.com/office/drawing/2016/5/11/chartex" xmlns:cx6="http://schemas.microsoft.com/office/drawing/2016/5/12/chartex" xmlns:cx7="http://schemas.microsoft.com/office/drawing/2016/5/13/chartex" xmlns:cx8="http://schemas.microsoft.com/office/drawing/2016/5/14/chartex" xmlns:mc="http://schemas.openxmlformats.org/markup-compatibility/2006" xmlns:aink="http://schemas.microsoft.com/office/drawing/2016/ink" xmlns:am3d="http://schemas.microsoft.com/office/drawing/2017/model3d" xmlns:o="urn:schemas-microsoft-com:office:office" xmlns:oel="http://schemas.microsoft.com/office/2019/extlst" xmlns:r="http://schemas.openxmlformats.org/officeDocument/2006/relationships" xmlns:m="http://schemas.openxmlformats.org/officeDocument/2006/math" xmlns:v="urn:schemas-microsoft-com:vml" xmlns:wp14="http://schemas.microsoft.com/office/word/2010/wordprocessingDrawing" xmlns:wp="http://schemas.openxmlformats.org/drawingml/2006/wordprocessingDrawing" xmlns:w10="urn:schemas-microsoft-com:office:word" xmlns:w="http://schemas.openxmlformats.org/wordprocessingml/2006/main" xmlns:w14="http://schemas.microsoft.com/office/word/2010/wordml" xmlns:w15="http://schemas.microsoft.com/office/word/2012/wordml" xmlns:w16cex="http://schemas.microsoft.com/office/word/2018/wordml/cex" xmlns:w16cid="http://schemas.microsoft.com/office/word/2016/wordml/cid" xmlns:w16="http://schemas.microsoft.com/office/word/2018/wordml" xmlns:w16sdtdh="http://schemas.microsoft.com/office/word/2020/wordml/sdtdatahash" xmlns:w16se="http://schemas.microsoft.com/office/word/2015/wordml/symex" xmlns:wpg="http://schemas.microsoft.com/office/word/2010/wordprocessingGroup" xmlns:wpi="http://schemas.microsoft.com/office/word/2010/wordprocessingInk" xmlns:wne="http://schemas.microsoft.com/office/word/2006/wordml" xmlns:wps="http://schemas.microsoft.com/office/word/2010/wordprocessingShape" mc:Ignorable="w14 w15 w16se w16cid w16 w16cex w16sdtdh wp14">
   <w:footnote w:type="separator" w:id="-1">
     <w:p>
@@ -2175,7 +2080,7 @@
 </w:footnotes>
 </file>
 
-<file path=word\header1.xml><?xml version="1.0" encoding="utf-8"?>
+<file path=word/header1.xml><?xml version="1.0" encoding="utf-8"?>
 <w:hdr xmlns:wpc="http://schemas.microsoft.com/office/word/2010/wordprocessingCanvas" xmlns:cx="http://schemas.microsoft.com/office/drawing/2014/chartex" xmlns:cx1="http://schemas.microsoft.com/office/drawing/2015/9/8/chartex" xmlns:cx2="http://schemas.microsoft.com/office/drawing/2015/10/21/chartex" xmlns:cx3="http://schemas.microsoft.com/office/drawing/2016/5/9/chartex" xmlns:cx4="http://schemas.microsoft.com/office/drawing/2016/5/10/chartex" xmlns:cx5="http://schemas.microsoft.com/office/drawing/2016/5/11/chartex" xmlns:cx6="http://schemas.microsoft.com/office/drawing/2016/5/12/chartex" xmlns:cx7="http://schemas.microsoft.com/office/drawing/2016/5/13/chartex" xmlns:cx8="http://schemas.microsoft.com/office/drawing/2016/5/14/chartex" xmlns:mc="http://schemas.openxmlformats.org/markup-compatibility/2006" xmlns:aink="http://schemas.microsoft.com/office/drawing/2016/ink" xmlns:am3d="http://schemas.microsoft.com/office/drawing/2017/model3d" xmlns:o="urn:schemas-microsoft-com:office:office" xmlns:oel="http://schemas.microsoft.com/office/2019/extlst" xmlns:r="http://schemas.openxmlformats.org/officeDocument/2006/relationships" xmlns:m="http://schemas.openxmlformats.org/officeDocument/2006/math" xmlns:v="urn:schemas-microsoft-com:vml" xmlns:wp14="http://schemas.microsoft.com/office/word/2010/wordprocessingDrawing" xmlns:wp="http://schemas.openxmlformats.org/drawingml/2006/wordprocessingDrawing" xmlns:w10="urn:schemas-microsoft-com:office:word" xmlns:w="http://schemas.openxmlformats.org/wordprocessingml/2006/main" xmlns:w14="http://schemas.microsoft.com/office/word/2010/wordml" xmlns:w15="http://schemas.microsoft.com/office/word/2012/wordml" xmlns:w16cex="http://schemas.microsoft.com/office/word/2018/wordml/cex" xmlns:w16cid="http://schemas.microsoft.com/office/word/2016/wordml/cid" xmlns:w16="http://schemas.microsoft.com/office/word/2018/wordml" xmlns:w16sdtdh="http://schemas.microsoft.com/office/word/2020/wordml/sdtdatahash" xmlns:w16se="http://schemas.microsoft.com/office/word/2015/wordml/symex" xmlns:wpg="http://schemas.microsoft.com/office/word/2010/wordprocessingGroup" xmlns:wpi="http://schemas.microsoft.com/office/word/2010/wordprocessingInk" xmlns:wne="http://schemas.microsoft.com/office/word/2006/wordml" xmlns:wps="http://schemas.microsoft.com/office/word/2010/wordprocessingShape" mc:Ignorable="w14 w15 w16se w16cid w16 w16cex w16sdtdh wp14">
   <w:p>
     <w:pPr>
@@ -2245,7 +2150,7 @@
 </w:hdr>
 </file>
 
-<file path=word\numbering.xml><?xml version="1.0" encoding="utf-8"?>
+<file path=word/numbering.xml><?xml version="1.0" encoding="utf-8"?>
 <w:numbering xmlns:wpc="http://schemas.microsoft.com/office/word/2010/wordprocessingCanvas" xmlns:cx="http://schemas.microsoft.com/office/drawing/2014/chartex" xmlns:cx1="http://schemas.microsoft.com/office/drawing/2015/9/8/chartex" xmlns:cx2="http://schemas.microsoft.com/office/drawing/2015/10/21/chartex" xmlns:cx3="http://schemas.microsoft.com/office/drawing/2016/5/9/chartex" xmlns:cx4="http://schemas.microsoft.com/office/drawing/2016/5/10/chartex" xmlns:cx5="http://schemas.microsoft.com/office/drawing/2016/5/11/chartex" xmlns:cx6="http://schemas.microsoft.com/office/drawing/2016/5/12/chartex" xmlns:cx7="http://schemas.microsoft.com/office/drawing/2016/5/13/chartex" xmlns:cx8="http://schemas.microsoft.com/office/drawing/2016/5/14/chartex" xmlns:mc="http://schemas.openxmlformats.org/markup-compatibility/2006" xmlns:aink="http://schemas.microsoft.com/office/drawing/2016/ink" xmlns:am3d="http://schemas.microsoft.com/office/drawing/2017/model3d" xmlns:o="urn:schemas-microsoft-com:office:office" xmlns:oel="http://schemas.microsoft.com/office/2019/extlst" xmlns:r="http://schemas.openxmlformats.org/officeDocument/2006/relationships" xmlns:m="http://schemas.openxmlformats.org/officeDocument/2006/math" xmlns:v="urn:schemas-microsoft-com:vml" xmlns:wp14="http://schemas.microsoft.com/office/word/2010/wordprocessingDrawing" xmlns:wp="http://schemas.openxmlformats.org/drawingml/2006/wordprocessingDrawing" xmlns:w10="urn:schemas-microsoft-com:office:word" xmlns:w="http://schemas.openxmlformats.org/wordprocessingml/2006/main" xmlns:w14="http://schemas.microsoft.com/office/word/2010/wordml" xmlns:w15="http://schemas.microsoft.com/office/word/2012/wordml" xmlns:w16cex="http://schemas.microsoft.com/office/word/2018/wordml/cex" xmlns:w16cid="http://schemas.microsoft.com/office/word/2016/wordml/cid" xmlns:w16="http://schemas.microsoft.com/office/word/2018/wordml" xmlns:w16sdtdh="http://schemas.microsoft.com/office/word/2020/wordml/sdtdatahash" xmlns:w16se="http://schemas.microsoft.com/office/word/2015/wordml/symex" xmlns:wpg="http://schemas.microsoft.com/office/word/2010/wordprocessingGroup" xmlns:wpi="http://schemas.microsoft.com/office/word/2010/wordprocessingInk" xmlns:wne="http://schemas.microsoft.com/office/word/2006/wordml" xmlns:wps="http://schemas.microsoft.com/office/word/2010/wordprocessingShape" mc:Ignorable="w14 w15 w16se w16cid w16 w16cex w16sdtdh wp14">
   <w:abstractNum w:abstractNumId="0" w15:restartNumberingAfterBreak="0">
     <w:nsid w:val="1E4458F3"/>
@@ -3155,222 +3060,7 @@
 </w:numbering>
 </file>
 
-<file path=word\settings.xml><?xml version="1.0" encoding="utf-8"?>
-<w:settings xmlns:mc="http://schemas.openxmlformats.org/markup-compatibility/2006" xmlns:o="urn:schemas-microsoft-com:office:office" xmlns:r="http://schemas.openxmlformats.org/officeDocument/2006/relationships" xmlns:m="http://schemas.openxmlformats.org/officeDocument/2006/math" xmlns:v="urn:schemas-microsoft-com:vml" xmlns:w10="urn:schemas-microsoft-com:office:word" xmlns:w="http://schemas.openxmlformats.org/wordprocessingml/2006/main" xmlns:w14="http://schemas.microsoft.com/office/word/2010/wordml" xmlns:w15="http://schemas.microsoft.com/office/word/2012/wordml" xmlns:w16cex="http://schemas.microsoft.com/office/word/2018/wordml/cex" xmlns:w16cid="http://schemas.microsoft.com/office/word/2016/wordml/cid" xmlns:w16="http://schemas.microsoft.com/office/word/2018/wordml" xmlns:w16sdtdh="http://schemas.microsoft.com/office/word/2020/wordml/sdtdatahash" xmlns:w16se="http://schemas.microsoft.com/office/word/2015/wordml/symex" xmlns:sl="http://schemas.openxmlformats.org/schemaLibrary/2006/main" mc:Ignorable="w14 w15 w16se w16cid w16 w16cex w16sdtdh">
-  <w:zoom w:percent="100"/>
-  <w:defaultTabStop w:val="720"/>
-  <w:characterSpacingControl w:val="doNotCompress"/>
-  <w:hdrShapeDefaults>
-    <o:shapedefaults v:ext="edit" spidmax="30721"/>
-  </w:hdrShapeDefaults>
-  <w:footnotePr>
-    <w:footnote w:id="-1"/>
-    <w:footnote w:id="0"/>
-  </w:footnotePr>
-  <w:endnotePr>
-    <w:endnote w:id="-1"/>
-    <w:endnote w:id="0"/>
-  </w:endnotePr>
-  <w:compat>
-    <w:compatSetting w:name="compatibilityMode" w:uri="http://schemas.microsoft.com/office/word" w:val="15"/>
-    <w:compatSetting w:name="overrideTableStyleFontSizeAndJustification" w:uri="http://schemas.microsoft.com/office/word" w:val="1"/>
-    <w:compatSetting w:name="enableOpenTypeFeatures" w:uri="http://schemas.microsoft.com/office/word" w:val="1"/>
-    <w:compatSetting w:name="doNotFlipMirrorIndents" w:uri="http://schemas.microsoft.com/office/word" w:val="1"/>
-    <w:compatSetting w:name="differentiateMultirowTableHeaders" w:uri="http://schemas.microsoft.com/office/word" w:val="1"/>
-    <w:compatSetting w:name="useWord2013TrackBottomHyphenation" w:uri="http://schemas.microsoft.com/office/word" w:val="0"/>
-  </w:compat>
-  <w:rsids>
-    <w:rsidRoot w:val="001C21C8"/>
-    <w:rsid w:val="00004DB2"/>
-    <w:rsid w:val="00033D32"/>
-    <w:rsid w:val="00045CEA"/>
-    <w:rsid w:val="000810CB"/>
-    <w:rsid w:val="0008737C"/>
-    <w:rsid w:val="0009406D"/>
-    <w:rsid w:val="000A0476"/>
-    <w:rsid w:val="000A42A0"/>
-    <w:rsid w:val="000B3B53"/>
-    <w:rsid w:val="000B4584"/>
-    <w:rsid w:val="000C1B7B"/>
-    <w:rsid w:val="000F5F65"/>
-    <w:rsid w:val="00117F5F"/>
-    <w:rsid w:val="001711D5"/>
-    <w:rsid w:val="0017407A"/>
-    <w:rsid w:val="001B002D"/>
-    <w:rsid w:val="001C0E9B"/>
-    <w:rsid w:val="001C21C8"/>
-    <w:rsid w:val="001D1166"/>
-    <w:rsid w:val="002352E1"/>
-    <w:rsid w:val="00243E8D"/>
-    <w:rsid w:val="00250057"/>
-    <w:rsid w:val="002567F1"/>
-    <w:rsid w:val="002705BB"/>
-    <w:rsid w:val="0027781A"/>
-    <w:rsid w:val="00296C7E"/>
-    <w:rsid w:val="002E3BBE"/>
-    <w:rsid w:val="00303B72"/>
-    <w:rsid w:val="00310088"/>
-    <w:rsid w:val="0032075C"/>
-    <w:rsid w:val="00351C99"/>
-    <w:rsid w:val="00371C1F"/>
-    <w:rsid w:val="00381501"/>
-    <w:rsid w:val="003A3F61"/>
-    <w:rsid w:val="003E05F3"/>
-    <w:rsid w:val="003F6714"/>
-    <w:rsid w:val="00444EFC"/>
-    <w:rsid w:val="00447EA0"/>
-    <w:rsid w:val="00460F45"/>
-    <w:rsid w:val="0046601A"/>
-    <w:rsid w:val="0048392D"/>
-    <w:rsid w:val="00483DEF"/>
-    <w:rsid w:val="004A0151"/>
-    <w:rsid w:val="004A207E"/>
-    <w:rsid w:val="004A2E4E"/>
-    <w:rsid w:val="004B24C9"/>
-    <w:rsid w:val="004B7F4A"/>
-    <w:rsid w:val="004C2DA7"/>
-    <w:rsid w:val="004E6256"/>
-    <w:rsid w:val="004E67B8"/>
-    <w:rsid w:val="004F3E1A"/>
-    <w:rsid w:val="00502D6A"/>
-    <w:rsid w:val="00506F48"/>
-    <w:rsid w:val="005120CC"/>
-    <w:rsid w:val="00571A37"/>
-    <w:rsid w:val="005944AC"/>
-    <w:rsid w:val="005D42CB"/>
-    <w:rsid w:val="00622C34"/>
-    <w:rsid w:val="00631091"/>
-    <w:rsid w:val="006424A0"/>
-    <w:rsid w:val="00656A35"/>
-    <w:rsid w:val="00660D56"/>
-    <w:rsid w:val="00676A62"/>
-    <w:rsid w:val="00681009"/>
-    <w:rsid w:val="006A3845"/>
-    <w:rsid w:val="006A66B8"/>
-    <w:rsid w:val="006B70A7"/>
-    <w:rsid w:val="006C665A"/>
-    <w:rsid w:val="006D176D"/>
-    <w:rsid w:val="006F01B1"/>
-    <w:rsid w:val="006F08BE"/>
-    <w:rsid w:val="007149CE"/>
-    <w:rsid w:val="00732728"/>
-    <w:rsid w:val="0075548E"/>
-    <w:rsid w:val="00771D85"/>
-    <w:rsid w:val="007761E5"/>
-    <w:rsid w:val="0078090C"/>
-    <w:rsid w:val="007A045C"/>
-    <w:rsid w:val="007B09D5"/>
-    <w:rsid w:val="007E2010"/>
-    <w:rsid w:val="0080546A"/>
-    <w:rsid w:val="008126A5"/>
-    <w:rsid w:val="00823A2E"/>
-    <w:rsid w:val="00826057"/>
-    <w:rsid w:val="00837768"/>
-    <w:rsid w:val="0088088A"/>
-    <w:rsid w:val="0088687A"/>
-    <w:rsid w:val="008A16D6"/>
-    <w:rsid w:val="008B69F2"/>
-    <w:rsid w:val="008B7AA5"/>
-    <w:rsid w:val="008D1605"/>
-    <w:rsid w:val="008D54A1"/>
-    <w:rsid w:val="008E2ECE"/>
-    <w:rsid w:val="008E5E41"/>
-    <w:rsid w:val="00905546"/>
-    <w:rsid w:val="0092526A"/>
-    <w:rsid w:val="00933419"/>
-    <w:rsid w:val="00936CC9"/>
-    <w:rsid w:val="00951D51"/>
-    <w:rsid w:val="00965D19"/>
-    <w:rsid w:val="00972E5E"/>
-    <w:rsid w:val="009832F2"/>
-    <w:rsid w:val="00990C15"/>
-    <w:rsid w:val="00993E9E"/>
-    <w:rsid w:val="00994A97"/>
-    <w:rsid w:val="009A0947"/>
-    <w:rsid w:val="009B6424"/>
-    <w:rsid w:val="009F3D06"/>
-    <w:rsid w:val="009F44DB"/>
-    <w:rsid w:val="00A353F0"/>
-    <w:rsid w:val="00A570BF"/>
-    <w:rsid w:val="00A60445"/>
-    <w:rsid w:val="00A8244E"/>
-    <w:rsid w:val="00A92DBC"/>
-    <w:rsid w:val="00AC6E07"/>
-    <w:rsid w:val="00AD31BA"/>
-    <w:rsid w:val="00AD6BAF"/>
-    <w:rsid w:val="00AE32B9"/>
-    <w:rsid w:val="00AE6835"/>
-    <w:rsid w:val="00AE7EC7"/>
-    <w:rsid w:val="00AF4ACF"/>
-    <w:rsid w:val="00B02058"/>
-    <w:rsid w:val="00B30722"/>
-    <w:rsid w:val="00B701E6"/>
-    <w:rsid w:val="00BB47D2"/>
-    <w:rsid w:val="00C36542"/>
-    <w:rsid w:val="00C520A4"/>
-    <w:rsid w:val="00C530C4"/>
-    <w:rsid w:val="00C541DB"/>
-    <w:rsid w:val="00C560C8"/>
-    <w:rsid w:val="00C868F1"/>
-    <w:rsid w:val="00CB3DAC"/>
-    <w:rsid w:val="00CC4234"/>
-    <w:rsid w:val="00CE1903"/>
-    <w:rsid w:val="00CE2EE6"/>
-    <w:rsid w:val="00CE67BA"/>
-    <w:rsid w:val="00D155B6"/>
-    <w:rsid w:val="00D34ACD"/>
-    <w:rsid w:val="00D42901"/>
-    <w:rsid w:val="00D7194A"/>
-    <w:rsid w:val="00D74589"/>
-    <w:rsid w:val="00DC7DD6"/>
-    <w:rsid w:val="00DD02A1"/>
-    <w:rsid w:val="00DD16CA"/>
-    <w:rsid w:val="00DE3EA2"/>
-    <w:rsid w:val="00E05300"/>
-    <w:rsid w:val="00E10F98"/>
-    <w:rsid w:val="00E12593"/>
-    <w:rsid w:val="00E22E2E"/>
-    <w:rsid w:val="00E51DCD"/>
-    <w:rsid w:val="00E67EF9"/>
-    <w:rsid w:val="00E71C4A"/>
-    <w:rsid w:val="00E87BF1"/>
-    <w:rsid w:val="00EA17A2"/>
-    <w:rsid w:val="00EE2ECD"/>
-    <w:rsid w:val="00F0462B"/>
-    <w:rsid w:val="00F53F3D"/>
-    <w:rsid w:val="00FA299A"/>
-    <w:rsid w:val="00FB354C"/>
-    <w:rsid w:val="00FB5AA8"/>
-  </w:rsids>
-  <m:mathPr>
-    <m:mathFont m:val="Cambria Math"/>
-    <m:brkBin m:val="before"/>
-    <m:brkBinSub m:val="--"/>
-    <m:smallFrac m:val="0"/>
-    <m:dispDef/>
-    <m:lMargin m:val="0"/>
-    <m:rMargin m:val="0"/>
-    <m:defJc m:val="centerGroup"/>
-    <m:wrapIndent m:val="1440"/>
-    <m:intLim m:val="subSup"/>
-    <m:naryLim m:val="undOvr"/>
-  </m:mathPr>
-  <w:themeFontLang w:val="en-US" w:bidi="ar-SA"/>
-  <w:clrSchemeMapping w:bg1="light1" w:t1="dark1" w:bg2="light2" w:t2="dark2" w:accent1="accent1" w:accent2="accent2" w:accent3="accent3" w:accent4="accent4" w:accent5="accent5" w:accent6="accent6" w:hyperlink="hyperlink" w:followedHyperlink="followedHyperlink"/>
-  <w:shapeDefaults>
-    <o:shapedefaults v:ext="edit" spidmax="30721"/>
-    <o:shapelayout v:ext="edit">
-      <o:idmap v:ext="edit" data="1"/>
-    </o:shapelayout>
-  </w:shapeDefaults>
-  <w:decimalSymbol w:val=","/>
-  <w:listSeparator w:val=";"/>
-  <w14:docId w14:val="39EA83F1"/>
-  <w15:docId w15:val="{3611E0A5-2192-4383-8709-7CDCDD8E9230}"/>
-</w:settings>
-</file>
-
-<file path=word\styles.xml><?xml version="1.0" encoding="utf-8"?>
+<file path=word/styles.xml><?xml version="1.0" encoding="utf-8"?>
 <w:styles xmlns:mc="http://schemas.openxmlformats.org/markup-compatibility/2006" xmlns:r="http://schemas.openxmlformats.org/officeDocument/2006/relationships" xmlns:w="http://schemas.openxmlformats.org/wordprocessingml/2006/main" xmlns:w14="http://schemas.microsoft.com/office/word/2010/wordml" xmlns:w15="http://schemas.microsoft.com/office/word/2012/wordml" xmlns:w16cex="http://schemas.microsoft.com/office/word/2018/wordml/cex" xmlns:w16cid="http://schemas.microsoft.com/office/word/2016/wordml/cid" xmlns:w16="http://schemas.microsoft.com/office/word/2018/wordml" xmlns:w16sdtdh="http://schemas.microsoft.com/office/word/2020/wordml/sdtdatahash" xmlns:w16se="http://schemas.microsoft.com/office/word/2015/wordml/symex" mc:Ignorable="w14 w15 w16se w16cid w16 w16cex w16sdtdh">
   <w:docDefaults>
     <w:rPrDefault>
@@ -3936,7 +3626,7 @@
 </w:styles>
 </file>
 
-<file path=word\theme\theme1.xml><?xml version="1.0" encoding="utf-8"?>
+<file path=word/theme/theme1.xml><?xml version="1.0" encoding="utf-8"?>
 <a:theme xmlns:a="http://schemas.openxmlformats.org/drawingml/2006/main" name="Office Theme">
   <a:themeElements>
     <a:clrScheme name="Office">
@@ -4229,39 +3919,4 @@
     </a:ext>
   </a:extLst>
 </a:theme>
-</file>
-
-<file path=word\webSettings.xml><?xml version="1.0" encoding="utf-8"?>
-<w:webSettings xmlns:mc="http://schemas.openxmlformats.org/markup-compatibility/2006" xmlns:r="http://schemas.openxmlformats.org/officeDocument/2006/relationships" xmlns:w="http://schemas.openxmlformats.org/wordprocessingml/2006/main" xmlns:w14="http://schemas.microsoft.com/office/word/2010/wordml" xmlns:w15="http://schemas.microsoft.com/office/word/2012/wordml" xmlns:w16cex="http://schemas.microsoft.com/office/word/2018/wordml/cex" xmlns:w16cid="http://schemas.microsoft.com/office/word/2016/wordml/cid" xmlns:w16="http://schemas.microsoft.com/office/word/2018/wordml" xmlns:w16sdtdh="http://schemas.microsoft.com/office/word/2020/wordml/sdtdatahash" xmlns:w16se="http://schemas.microsoft.com/office/word/2015/wordml/symex" mc:Ignorable="w14 w15 w16se w16cid w16 w16cex w16sdtdh">
-  <w:divs>
-    <w:div w:id="1062027316">
-      <w:bodyDiv w:val="1"/>
-      <w:marLeft w:val="0"/>
-      <w:marRight w:val="0"/>
-      <w:marTop w:val="0"/>
-      <w:marBottom w:val="0"/>
-      <w:divBdr>
-        <w:top w:val="none" w:sz="0" w:space="0" w:color="auto"/>
-        <w:left w:val="none" w:sz="0" w:space="0" w:color="auto"/>
-        <w:bottom w:val="none" w:sz="0" w:space="0" w:color="auto"/>
-        <w:right w:val="none" w:sz="0" w:space="0" w:color="auto"/>
-      </w:divBdr>
-    </w:div>
-    <w:div w:id="1279995431">
-      <w:bodyDiv w:val="1"/>
-      <w:marLeft w:val="0"/>
-      <w:marRight w:val="0"/>
-      <w:marTop w:val="0"/>
-      <w:marBottom w:val="0"/>
-      <w:divBdr>
-        <w:top w:val="none" w:sz="0" w:space="0" w:color="auto"/>
-        <w:left w:val="none" w:sz="0" w:space="0" w:color="auto"/>
-        <w:bottom w:val="none" w:sz="0" w:space="0" w:color="auto"/>
-        <w:right w:val="none" w:sz="0" w:space="0" w:color="auto"/>
-      </w:divBdr>
-    </w:div>
-  </w:divs>
-  <w:relyOnVML/>
-  <w:allowPNG/>
-</w:webSettings>
 </file>
</xml_diff>

<commit_message>
fix: Correct list numbering and paragraph break
</commit_message>
<xml_diff>
--- a/04-Surat Pemberitahuan Kedatangan Santri Baru 2026-2027-REVISED.docx
+++ b/04-Surat Pemberitahuan Kedatangan Santri Baru 2026-2027-REVISED.docx
@@ -1369,14 +1369,7 @@
           <w:rFonts w:ascii="Calibri" w:hAnsi="Calibri" w:cs="Calibri"/>
           <w:bCs/>
         </w:rPr>
-        <w:t>5</w:t>
-      </w:r>
-      <w:r>
-        <w:rPr>
-          <w:rFonts w:ascii="Calibri" w:hAnsi="Calibri" w:cs="Calibri"/>
-          <w:bCs/>
-        </w:rPr>
-        <w:t>.</w:t>
+        <w:t>6.</w:t>
       </w:r>
       <w:r>
         <w:rPr>
@@ -1411,14 +1404,7 @@
           <w:rFonts w:ascii="Calibri" w:hAnsi="Calibri" w:cs="Calibri"/>
           <w:bCs/>
         </w:rPr>
-        <w:t>6</w:t>
-      </w:r>
-      <w:r>
-        <w:rPr>
-          <w:rFonts w:ascii="Calibri" w:hAnsi="Calibri" w:cs="Calibri"/>
-          <w:bCs/>
-        </w:rPr>
-        <w:t>.</w:t>
+        <w:t>7.</w:t>
       </w:r>
       <w:r>
         <w:rPr>
@@ -1453,14 +1439,7 @@
           <w:rFonts w:ascii="Calibri" w:hAnsi="Calibri" w:cs="Calibri"/>
           <w:bCs/>
         </w:rPr>
-        <w:t>7</w:t>
-      </w:r>
-      <w:r>
-        <w:rPr>
-          <w:rFonts w:ascii="Calibri" w:hAnsi="Calibri" w:cs="Calibri"/>
-          <w:bCs/>
-        </w:rPr>
-        <w:t>.</w:t>
+        <w:t>8.</w:t>
       </w:r>
       <w:r>
         <w:rPr>
@@ -1495,14 +1474,7 @@
           <w:rFonts w:ascii="Calibri" w:hAnsi="Calibri" w:cs="Calibri"/>
           <w:bCs/>
         </w:rPr>
-        <w:t>8</w:t>
-      </w:r>
-      <w:r>
-        <w:rPr>
-          <w:rFonts w:ascii="Calibri" w:hAnsi="Calibri" w:cs="Calibri"/>
-          <w:bCs/>
-        </w:rPr>
-        <w:t>.</w:t>
+        <w:t>9.</w:t>
       </w:r>
       <w:r>
         <w:rPr>
@@ -1537,14 +1509,7 @@
           <w:rFonts w:ascii="Calibri" w:hAnsi="Calibri" w:cs="Calibri"/>
           <w:bCs/>
         </w:rPr>
-        <w:t>9</w:t>
-      </w:r>
-      <w:r>
-        <w:rPr>
-          <w:rFonts w:ascii="Calibri" w:hAnsi="Calibri" w:cs="Calibri"/>
-          <w:bCs/>
-        </w:rPr>
-        <w:t>.</w:t>
+        <w:t>10.</w:t>
       </w:r>
       <w:r>
         <w:rPr>
@@ -1788,12 +1753,33 @@
         </w:rPr>
         <w:t>4. Begitu tiba di pesantren, santri dan wali santri langsung menurunkan barang bawaan, kemudian mobil diarahkan ke area parkir.</w:t>
       </w:r>
-      <w:r>
-        <w:rPr>
-          <w:rFonts w:ascii="Calibri" w:hAnsi="Calibri" w:cs="Calibri"/>
-          <w:bCs/>
-        </w:rPr>
-        <w:t>6.</w:t>
+    </w:p>
+    <w:p>
+      <w:pPr>
+        <w:tabs>
+          <w:tab w:val="left" w:pos="720"/>
+        </w:tabs>
+        <w:spacing w:after="0" w:line="240" w:lineRule="auto"/>
+        <w:ind w:left="720" w:hanging="720"/>
+        <w:jc w:val="both"/>
+        <w:rPr>
+          <w:rFonts w:ascii="Calibri" w:hAnsi="Calibri" w:cs="Calibri"/>
+          <w:bCs/>
+        </w:rPr>
+      </w:pPr>
+      <w:r>
+        <w:rPr>
+          <w:rFonts w:ascii="Calibri" w:hAnsi="Calibri" w:cs="Calibri"/>
+          <w:bCs/>
+        </w:rPr>
+        <w:t>5</w:t>
+      </w:r>
+      <w:r>
+        <w:rPr>
+          <w:rFonts w:ascii="Calibri" w:hAnsi="Calibri" w:cs="Calibri"/>
+          <w:bCs/>
+        </w:rPr>
+        <w:t>.</w:t>
       </w:r>
       <w:r>
         <w:rPr>

</xml_diff>

<commit_message>
fix: Align Arabic paragraphs right and clean signature block trailing spaces
</commit_message>
<xml_diff>
--- a/04-Surat Pemberitahuan Kedatangan Santri Baru 2026-2027-REVISED.docx
+++ b/04-Surat Pemberitahuan Kedatangan Santri Baru 2026-2027-REVISED.docx
@@ -125,7 +125,7 @@
     <w:p>
       <w:pPr>
         <w:spacing w:after="0"/>
-        <w:jc w:val="both"/>
+        <w:jc w:val="right"/>
         <w:rPr>
           <w:rFonts w:ascii="Sakkal Majalla" w:hAnsi="Sakkal Majalla" w:cs="Calibri"/>
           <w:sz w:val="28"/>
@@ -624,7 +624,7 @@
     <w:p>
       <w:pPr>
         <w:spacing w:after="0"/>
-        <w:jc w:val="center"/>
+        <w:jc w:val="right"/>
         <w:rPr>
           <w:rFonts w:ascii="Sakkal Majalla" w:hAnsi="Sakkal Majalla" w:cs="Calibri"/>
           <w:sz w:val="28"/>

</xml_diff>